<commit_message>
mean variance and std deviation
</commit_message>
<xml_diff>
--- a/Trading algorithm.docx
+++ b/Trading algorithm.docx
@@ -4,9 +4,6 @@
   <w:body>
     <w:p>
       <w:r>
-        <w:rPr>
-          <w:noProof/>
-        </w:rPr>
         <w:drawing>
           <wp:inline distT="0" distB="0" distL="0" distR="0" wp14:anchorId="09ADED6E" wp14:editId="707A56AC">
             <wp:extent cx="5943600" cy="3075940"/>
@@ -340,9 +337,6 @@
     <w:p/>
     <w:p>
       <w:r>
-        <w:rPr>
-          <w:noProof/>
-        </w:rPr>
         <w:lastRenderedPageBreak/>
         <w:drawing>
           <wp:inline distT="0" distB="0" distL="0" distR="0" wp14:anchorId="205BE9CA" wp14:editId="0124B40B">
@@ -383,9 +377,6 @@
     </w:p>
     <w:p>
       <w:r>
-        <w:rPr>
-          <w:noProof/>
-        </w:rPr>
         <w:drawing>
           <wp:inline distT="0" distB="0" distL="0" distR="0" wp14:anchorId="781BAC4F" wp14:editId="58AE5A3F">
             <wp:extent cx="5943600" cy="3098165"/>
@@ -1246,9 +1237,6 @@
     </w:p>
     <w:p>
       <w:r>
-        <w:rPr>
-          <w:noProof/>
-        </w:rPr>
         <w:lastRenderedPageBreak/>
         <w:drawing>
           <wp:inline distT="0" distB="0" distL="0" distR="0" wp14:anchorId="72972308" wp14:editId="2B27EFE1">
@@ -1289,9 +1277,6 @@
     </w:p>
     <w:p>
       <w:r>
-        <w:rPr>
-          <w:noProof/>
-        </w:rPr>
         <w:drawing>
           <wp:inline distT="0" distB="0" distL="0" distR="0" wp14:anchorId="362A5BE3" wp14:editId="1213E271">
             <wp:extent cx="5943600" cy="1657985"/>
@@ -2004,9 +1989,6 @@
     </w:p>
     <w:p>
       <w:r>
-        <w:rPr>
-          <w:noProof/>
-        </w:rPr>
         <w:drawing>
           <wp:inline distT="0" distB="0" distL="0" distR="0" wp14:anchorId="46B970E0" wp14:editId="532C08C8">
             <wp:extent cx="5943600" cy="3340100"/>
@@ -4165,8 +4147,18 @@
           <w:sz w:val="20"/>
           <w:szCs w:val="20"/>
         </w:rPr>
-        <w:t>).cumprod</w:t>
-      </w:r>
+        <w:t>).</w:t>
+      </w:r>
+      <w:proofErr w:type="spellStart"/>
+      <w:r>
+        <w:rPr>
+          <w:rFonts w:ascii="Courier New" w:eastAsia="Times New Roman" w:hAnsi="Courier New" w:cs="Courier New"/>
+          <w:sz w:val="20"/>
+          <w:szCs w:val="20"/>
+        </w:rPr>
+        <w:t>cumprod</w:t>
+      </w:r>
+      <w:proofErr w:type="spellEnd"/>
       <w:proofErr w:type="gramEnd"/>
       <w:r>
         <w:rPr>
@@ -4323,9 +4315,6 @@
     </w:p>
     <w:p>
       <w:r>
-        <w:rPr>
-          <w:noProof/>
-        </w:rPr>
         <w:drawing>
           <wp:inline distT="0" distB="0" distL="0" distR="0" wp14:anchorId="254B3FF1" wp14:editId="52E0BA9F">
             <wp:extent cx="5943600" cy="2081530"/>
@@ -5852,9 +5841,6 @@
     </w:p>
     <w:p>
       <w:r>
-        <w:rPr>
-          <w:noProof/>
-        </w:rPr>
         <w:drawing>
           <wp:inline distT="0" distB="0" distL="0" distR="0" wp14:anchorId="40CF5A86" wp14:editId="6DD08C36">
             <wp:extent cx="5943600" cy="3312160"/>
@@ -7316,9 +7302,6 @@
     </w:p>
     <w:p>
       <w:r>
-        <w:rPr>
-          <w:noProof/>
-        </w:rPr>
         <w:lastRenderedPageBreak/>
         <w:drawing>
           <wp:inline distT="0" distB="0" distL="0" distR="0" wp14:anchorId="6A1A2294" wp14:editId="07AD8307">
@@ -7360,9 +7343,6 @@
     <w:p/>
     <w:p>
       <w:r>
-        <w:rPr>
-          <w:noProof/>
-        </w:rPr>
         <w:drawing>
           <wp:inline distT="0" distB="0" distL="0" distR="0" wp14:anchorId="26884F4E" wp14:editId="565719CF">
             <wp:extent cx="5943600" cy="3195955"/>
@@ -8599,9 +8579,6 @@
     </w:p>
     <w:p>
       <w:r>
-        <w:rPr>
-          <w:noProof/>
-        </w:rPr>
         <w:drawing>
           <wp:inline distT="0" distB="0" distL="0" distR="0" wp14:anchorId="621747D3" wp14:editId="322B48E3">
             <wp:extent cx="5943600" cy="3514725"/>
@@ -8641,9 +8618,6 @@
     </w:p>
     <w:p>
       <w:r>
-        <w:rPr>
-          <w:noProof/>
-        </w:rPr>
         <w:drawing>
           <wp:inline distT="0" distB="0" distL="0" distR="0" wp14:anchorId="41980122" wp14:editId="7F7058ED">
             <wp:extent cx="5943600" cy="2523490"/>
@@ -9407,14 +9381,12 @@
       <w:pPr>
         <w:pStyle w:val="code"/>
         <w:rPr>
-          <w:rFonts w:eastAsia="Times New Roman" w:cs="Times New Roman"/>
-          <w:szCs w:val="24"/>
-        </w:rPr>
-      </w:pPr>
-      <w:r>
-        <w:rPr>
-          <w:rFonts w:eastAsia="Times New Roman" w:cs="Times New Roman"/>
-          <w:szCs w:val="24"/>
+          <w:rFonts w:eastAsia="Times New Roman"/>
+        </w:rPr>
+      </w:pPr>
+      <w:r>
+        <w:rPr>
+          <w:rFonts w:eastAsia="Times New Roman"/>
         </w:rPr>
         <w:pict w14:anchorId="4F60C9EB">
           <v:rect id="_x0000_i1049" style="width:0;height:1.5pt" o:hralign="center" o:hrstd="t" o:hr="t" fillcolor="#a0a0a0" stroked="f"/>
@@ -9799,22 +9771,14 @@
       <w:pPr>
         <w:pStyle w:val="code"/>
         <w:rPr>
-          <w:rFonts w:eastAsia="Times New Roman" w:cs="Times New Roman"/>
-          <w:szCs w:val="24"/>
-        </w:rPr>
-      </w:pPr>
-      <w:r>
-        <w:rPr>
           <w:rFonts w:eastAsia="Times New Roman"/>
         </w:rPr>
-        <w:t>.to_flat_index()</w:t>
-      </w:r>
-      <w:r>
-        <w:rPr>
-          <w:rFonts w:eastAsia="Times New Roman" w:cs="Times New Roman"/>
-          <w:szCs w:val="24"/>
-        </w:rPr>
-        <w:t xml:space="preserve"> gives you tuples for each column (one step flatter than MultiIndex).</w:t>
+      </w:pPr>
+      <w:r>
+        <w:rPr>
+          <w:rFonts w:eastAsia="Times New Roman"/>
+        </w:rPr>
+        <w:t>.to_flat_index() gives you tuples for each column (one step flatter than MultiIndex).</w:t>
       </w:r>
     </w:p>
     <w:p>
@@ -9927,9 +9891,6 @@
         <w:ind w:firstLine="0"/>
       </w:pPr>
       <w:r>
-        <w:rPr>
-          <w:noProof/>
-        </w:rPr>
         <w:drawing>
           <wp:inline distT="0" distB="0" distL="0" distR="0" wp14:anchorId="5AB93B34" wp14:editId="0F21281D">
             <wp:extent cx="5943600" cy="2123440"/>
@@ -10852,9 +10813,6 @@
         <w:ind w:firstLine="0"/>
       </w:pPr>
       <w:r>
-        <w:rPr>
-          <w:noProof/>
-        </w:rPr>
         <w:drawing>
           <wp:inline distT="0" distB="0" distL="0" distR="0" wp14:anchorId="7A39A3AD" wp14:editId="10491B06">
             <wp:extent cx="5943600" cy="2798445"/>
@@ -10897,9 +10855,6 @@
         <w:ind w:firstLine="0"/>
       </w:pPr>
       <w:r>
-        <w:rPr>
-          <w:noProof/>
-        </w:rPr>
         <w:lastRenderedPageBreak/>
         <w:drawing>
           <wp:inline distT="0" distB="0" distL="0" distR="0" wp14:anchorId="5F9E7817" wp14:editId="5D71EC0F">
@@ -11376,9 +11331,6 @@
         <w:ind w:firstLine="0"/>
       </w:pPr>
       <w:r>
-        <w:rPr>
-          <w:noProof/>
-        </w:rPr>
         <w:drawing>
           <wp:inline distT="0" distB="0" distL="0" distR="0" wp14:anchorId="6B30A604" wp14:editId="445DCF01">
             <wp:extent cx="5943600" cy="4262755"/>
@@ -11894,9 +11846,6 @@
     </w:p>
     <w:p>
       <w:r>
-        <w:rPr>
-          <w:noProof/>
-        </w:rPr>
         <w:drawing>
           <wp:inline distT="0" distB="0" distL="0" distR="0" wp14:anchorId="4416DEDC" wp14:editId="3C707E0E">
             <wp:extent cx="5943600" cy="3830955"/>
@@ -12889,9 +12838,6 @@
     </w:p>
     <w:p>
       <w:r>
-        <w:rPr>
-          <w:noProof/>
-        </w:rPr>
         <w:drawing>
           <wp:inline distT="0" distB="0" distL="0" distR="0" wp14:anchorId="733B3743" wp14:editId="41C3EAF1">
             <wp:extent cx="5943600" cy="3368675"/>
@@ -13666,9 +13612,6 @@
         <w:ind w:firstLine="0"/>
       </w:pPr>
       <w:r>
-        <w:rPr>
-          <w:noProof/>
-        </w:rPr>
         <w:lastRenderedPageBreak/>
         <w:drawing>
           <wp:inline distT="0" distB="0" distL="0" distR="0" wp14:anchorId="53E90C10" wp14:editId="2E809AFB">
@@ -14240,9 +14183,6 @@
         </w:numPr>
       </w:pPr>
       <w:r>
-        <w:rPr>
-          <w:noProof/>
-        </w:rPr>
         <w:drawing>
           <wp:inline distT="0" distB="0" distL="0" distR="0" wp14:anchorId="0AAC00B8" wp14:editId="03A45875">
             <wp:extent cx="5943600" cy="3746500"/>
@@ -14867,9 +14807,6 @@
     </w:p>
     <w:p>
       <w:r>
-        <w:rPr>
-          <w:noProof/>
-        </w:rPr>
         <w:drawing>
           <wp:inline distT="0" distB="0" distL="0" distR="0" wp14:anchorId="2B0C7C46" wp14:editId="19084CF1">
             <wp:extent cx="5943600" cy="3005455"/>
@@ -15210,9 +15147,6 @@
         <w:ind w:firstLine="0"/>
       </w:pPr>
       <w:r>
-        <w:rPr>
-          <w:noProof/>
-        </w:rPr>
         <w:drawing>
           <wp:inline distT="0" distB="0" distL="0" distR="0" wp14:anchorId="17EEB79A" wp14:editId="3C0648F1">
             <wp:extent cx="5943600" cy="2747645"/>
@@ -15255,9 +15189,6 @@
         <w:ind w:firstLine="0"/>
       </w:pPr>
       <w:r>
-        <w:rPr>
-          <w:noProof/>
-        </w:rPr>
         <w:lastRenderedPageBreak/>
         <w:drawing>
           <wp:inline distT="0" distB="0" distL="0" distR="0" wp14:anchorId="58290FA7" wp14:editId="3A4A6C29">
@@ -15938,9 +15869,6 @@
         <w:ind w:firstLine="0"/>
       </w:pPr>
       <w:r>
-        <w:rPr>
-          <w:noProof/>
-        </w:rPr>
         <w:drawing>
           <wp:inline distT="0" distB="0" distL="0" distR="0" wp14:anchorId="0A532DFA" wp14:editId="34177FDA">
             <wp:extent cx="5943600" cy="2912110"/>
@@ -16060,11 +15988,19 @@
           <w:numId w:val="77"/>
         </w:numPr>
       </w:pPr>
-      <w:r>
-        <w:rPr>
-          <w:rStyle w:val="HTMLCode"/>
-        </w:rPr>
-        <w:t>aapl.lag1</w:t>
+      <w:proofErr w:type="gramStart"/>
+      <w:r>
+        <w:rPr>
+          <w:rStyle w:val="HTMLCode"/>
+        </w:rPr>
+        <w:t>aapl.lag</w:t>
+      </w:r>
+      <w:proofErr w:type="gramEnd"/>
+      <w:r>
+        <w:rPr>
+          <w:rStyle w:val="HTMLCode"/>
+        </w:rPr>
+        <w:t>1</w:t>
       </w:r>
       <w:r>
         <w:t xml:space="preserve"> → yesterday’s close price (created earlier with </w:t>
@@ -16095,11 +16031,19 @@
           <w:numId w:val="77"/>
         </w:numPr>
       </w:pPr>
-      <w:r>
-        <w:rPr>
-          <w:rStyle w:val="HTMLCode"/>
-        </w:rPr>
-        <w:t>.sub()</w:t>
+      <w:proofErr w:type="gramStart"/>
+      <w:r>
+        <w:rPr>
+          <w:rStyle w:val="HTMLCode"/>
+        </w:rPr>
+        <w:t>.sub</w:t>
+      </w:r>
+      <w:proofErr w:type="gramEnd"/>
+      <w:r>
+        <w:rPr>
+          <w:rStyle w:val="HTMLCode"/>
+        </w:rPr>
+        <w:t>()</w:t>
       </w:r>
       <w:r>
         <w:t xml:space="preserve"> → </w:t>
@@ -16846,9 +16790,6 @@
         <w:ind w:firstLine="0"/>
       </w:pPr>
       <w:r>
-        <w:rPr>
-          <w:noProof/>
-        </w:rPr>
         <w:lastRenderedPageBreak/>
         <w:drawing>
           <wp:inline distT="0" distB="0" distL="0" distR="0" wp14:anchorId="6923C2C1" wp14:editId="1BF360C6">
@@ -16916,12 +16857,14 @@
           <w:rStyle w:val="HTMLCode"/>
         </w:rPr>
       </w:pPr>
+      <w:proofErr w:type="gramStart"/>
       <w:r>
         <w:rPr>
           <w:rStyle w:val="HTMLCode"/>
         </w:rPr>
         <w:t>aapl[</w:t>
       </w:r>
+      <w:proofErr w:type="gramEnd"/>
       <w:r>
         <w:rPr>
           <w:rStyle w:val="hljs-string"/>
@@ -17001,11 +16944,19 @@
           <w:numId w:val="80"/>
         </w:numPr>
       </w:pPr>
-      <w:r>
-        <w:rPr>
-          <w:rStyle w:val="HTMLCode"/>
-        </w:rPr>
-        <w:t>.div()</w:t>
+      <w:proofErr w:type="gramStart"/>
+      <w:r>
+        <w:rPr>
+          <w:rStyle w:val="HTMLCode"/>
+        </w:rPr>
+        <w:t>.div</w:t>
+      </w:r>
+      <w:proofErr w:type="gramEnd"/>
+      <w:r>
+        <w:rPr>
+          <w:rStyle w:val="HTMLCode"/>
+        </w:rPr>
+        <w:t>()</w:t>
       </w:r>
       <w:r>
         <w:t xml:space="preserve"> → pandas division (</w:t>
@@ -17965,9 +17916,6 @@
         <w:ind w:firstLine="0"/>
       </w:pPr>
       <w:r>
-        <w:rPr>
-          <w:noProof/>
-        </w:rPr>
         <w:lastRenderedPageBreak/>
         <w:drawing>
           <wp:inline distT="0" distB="0" distL="0" distR="0" wp14:anchorId="49CF4ABA" wp14:editId="3072A321">
@@ -18069,6 +18017,7 @@
           <w:rFonts w:eastAsiaTheme="majorEastAsia"/>
         </w:rPr>
       </w:pPr>
+      <w:proofErr w:type="gramStart"/>
       <w:r>
         <w:rPr>
           <w:rStyle w:val="HTMLCode"/>
@@ -18076,6 +18025,7 @@
         </w:rPr>
         <w:t>aapl[</w:t>
       </w:r>
+      <w:proofErr w:type="gramEnd"/>
       <w:r>
         <w:rPr>
           <w:rStyle w:val="hljs-string"/>
@@ -19029,9 +18979,6 @@
         <w:ind w:firstLine="0"/>
       </w:pPr>
       <w:r>
-        <w:rPr>
-          <w:noProof/>
-        </w:rPr>
         <w:lastRenderedPageBreak/>
         <mc:AlternateContent>
           <mc:Choice Requires="wps">
@@ -19101,9 +19048,6 @@
         </mc:AlternateContent>
       </w:r>
       <w:r>
-        <w:rPr>
-          <w:noProof/>
-        </w:rPr>
         <w:drawing>
           <wp:inline distT="0" distB="0" distL="0" distR="0" wp14:anchorId="7059241D" wp14:editId="26CB5AE8">
             <wp:extent cx="6427609" cy="4486275"/>
@@ -20185,9 +20129,6 @@
         <w:ind w:firstLine="0"/>
       </w:pPr>
       <w:r>
-        <w:rPr>
-          <w:noProof/>
-        </w:rPr>
         <w:lastRenderedPageBreak/>
         <mc:AlternateContent>
           <mc:Choice Requires="wps">
@@ -20257,9 +20198,6 @@
         </mc:AlternateContent>
       </w:r>
       <w:r>
-        <w:rPr>
-          <w:noProof/>
-        </w:rPr>
         <w:drawing>
           <wp:inline distT="0" distB="0" distL="0" distR="0" wp14:anchorId="3356D4D9" wp14:editId="2530685E">
             <wp:extent cx="6206044" cy="3122295"/>
@@ -20730,9 +20668,6 @@
         <w:ind w:firstLine="0"/>
       </w:pPr>
       <w:r>
-        <w:rPr>
-          <w:noProof/>
-        </w:rPr>
         <w:drawing>
           <wp:inline distT="0" distB="0" distL="0" distR="0" wp14:anchorId="78E6719C" wp14:editId="3BA1585F">
             <wp:extent cx="5943600" cy="3182620"/>
@@ -20775,9 +20710,6 @@
         <w:ind w:firstLine="0"/>
       </w:pPr>
       <w:r>
-        <w:rPr>
-          <w:noProof/>
-        </w:rPr>
         <w:drawing>
           <wp:inline distT="0" distB="0" distL="0" distR="0" wp14:anchorId="37C8012A" wp14:editId="0EE17B22">
             <wp:extent cx="5943600" cy="3205480"/>
@@ -21833,9 +21765,6 @@
         <w:ind w:firstLine="0"/>
       </w:pPr>
       <w:r>
-        <w:rPr>
-          <w:noProof/>
-        </w:rPr>
         <w:drawing>
           <wp:inline distT="0" distB="0" distL="0" distR="0" wp14:anchorId="388381B0" wp14:editId="28130971">
             <wp:extent cx="5943600" cy="2821305"/>
@@ -22658,6 +22587,886 @@
         <w:t>plt.show()</w:t>
       </w:r>
     </w:p>
+    <w:p/>
+    <w:p>
+      <w:r>
+        <w:lastRenderedPageBreak/>
+        <w:drawing>
+          <wp:inline distT="0" distB="0" distL="0" distR="0" wp14:anchorId="50157024" wp14:editId="00712FAC">
+            <wp:extent cx="5943600" cy="2599690"/>
+            <wp:effectExtent l="0" t="0" r="0" b="0"/>
+            <wp:docPr id="979133735" name="Picture 1" descr="A screenshot of a phone&#10;&#10;AI-generated content may be incorrect."/>
+            <wp:cNvGraphicFramePr>
+              <a:graphicFrameLocks xmlns:a="http://schemas.openxmlformats.org/drawingml/2006/main" noChangeAspect="1"/>
+            </wp:cNvGraphicFramePr>
+            <a:graphic xmlns:a="http://schemas.openxmlformats.org/drawingml/2006/main">
+              <a:graphicData uri="http://schemas.openxmlformats.org/drawingml/2006/picture">
+                <pic:pic xmlns:pic="http://schemas.openxmlformats.org/drawingml/2006/picture">
+                  <pic:nvPicPr>
+                    <pic:cNvPr id="979133735" name="Picture 1" descr="A screenshot of a phone&#10;&#10;AI-generated content may be incorrect."/>
+                    <pic:cNvPicPr/>
+                  </pic:nvPicPr>
+                  <pic:blipFill>
+                    <a:blip r:embed="rId40"/>
+                    <a:stretch>
+                      <a:fillRect/>
+                    </a:stretch>
+                  </pic:blipFill>
+                  <pic:spPr>
+                    <a:xfrm>
+                      <a:off x="0" y="0"/>
+                      <a:ext cx="5943600" cy="2599690"/>
+                    </a:xfrm>
+                    <a:prstGeom prst="rect">
+                      <a:avLst/>
+                    </a:prstGeom>
+                  </pic:spPr>
+                </pic:pic>
+              </a:graphicData>
+            </a:graphic>
+          </wp:inline>
+        </w:drawing>
+      </w:r>
+    </w:p>
+    <w:p>
+      <w:r>
+        <w:t>Steps and Results:</w:t>
+      </w:r>
+    </w:p>
+    <w:p>
+      <w:r>
+        <w:t>Mean Calculation</w:t>
+      </w:r>
+      <w:r>
+        <w:t xml:space="preserve"> (daily_mean_return):</w:t>
+      </w:r>
+    </w:p>
+    <w:p>
+      <w:pPr>
+        <w:numPr>
+          <w:ilvl w:val="1"/>
+          <w:numId w:val="107"/>
+        </w:numPr>
+      </w:pPr>
+      <w:r>
+        <w:rPr>
+          <w:b/>
+          <w:bCs/>
+        </w:rPr>
+        <w:t>AAPL mean</w:t>
+      </w:r>
+      <w:r>
+        <w:t>: 0.000943 (average daily return for AAPL)</w:t>
+      </w:r>
+    </w:p>
+    <w:p>
+      <w:pPr>
+        <w:numPr>
+          <w:ilvl w:val="1"/>
+          <w:numId w:val="107"/>
+        </w:numPr>
+      </w:pPr>
+      <w:r>
+        <w:rPr>
+          <w:b/>
+          <w:bCs/>
+        </w:rPr>
+        <w:t>Change mean</w:t>
+      </w:r>
+      <w:r>
+        <w:t>: 0.670964 (average daily return for the change column)</w:t>
+      </w:r>
+    </w:p>
+    <w:p>
+      <w:r>
+        <w:t>The mean is simply the average value across all days for the respective columns.</w:t>
+      </w:r>
+    </w:p>
+    <w:p>
+      <w:pPr>
+        <w:numPr>
+          <w:ilvl w:val="0"/>
+          <w:numId w:val="107"/>
+        </w:numPr>
+      </w:pPr>
+      <w:r>
+        <w:rPr>
+          <w:b/>
+          <w:bCs/>
+        </w:rPr>
+        <w:t>Variance Calculation (var</w:t>
+      </w:r>
+      <w:r>
+        <w:t>_</w:t>
+      </w:r>
+      <w:r>
+        <w:rPr>
+          <w:b/>
+          <w:bCs/>
+        </w:rPr>
+        <w:t>daily)</w:t>
+      </w:r>
+      <w:r>
+        <w:t>:</w:t>
+      </w:r>
+    </w:p>
+    <w:p>
+      <w:pPr>
+        <w:numPr>
+          <w:ilvl w:val="1"/>
+          <w:numId w:val="107"/>
+        </w:numPr>
+      </w:pPr>
+      <w:r>
+        <w:rPr>
+          <w:b/>
+          <w:bCs/>
+        </w:rPr>
+        <w:t>AAPL variance</w:t>
+      </w:r>
+      <w:r>
+        <w:t>: 0.000308 (variance in daily returns for AAPL)</w:t>
+      </w:r>
+    </w:p>
+    <w:p>
+      <w:pPr>
+        <w:numPr>
+          <w:ilvl w:val="1"/>
+          <w:numId w:val="107"/>
+        </w:numPr>
+      </w:pPr>
+      <w:r>
+        <w:rPr>
+          <w:b/>
+          <w:bCs/>
+        </w:rPr>
+        <w:t>Change variance</w:t>
+      </w:r>
+      <w:r>
+        <w:t>: 0.115331 (variance in daily returns for the change column)</w:t>
+      </w:r>
+    </w:p>
+    <w:p>
+      <w:r>
+        <w:t>Variance measures the spread of data points from the mean. A higher variance indicates that the data is more spread out.</w:t>
+      </w:r>
+    </w:p>
+    <w:p>
+      <w:pPr>
+        <w:numPr>
+          <w:ilvl w:val="0"/>
+          <w:numId w:val="107"/>
+        </w:numPr>
+      </w:pPr>
+      <w:r>
+        <w:rPr>
+          <w:b/>
+          <w:bCs/>
+        </w:rPr>
+        <w:t>Standard Deviation Calculation (std_daily)</w:t>
+      </w:r>
+      <w:r>
+        <w:t>:</w:t>
+      </w:r>
+    </w:p>
+    <w:p>
+      <w:pPr>
+        <w:numPr>
+          <w:ilvl w:val="1"/>
+          <w:numId w:val="107"/>
+        </w:numPr>
+      </w:pPr>
+      <w:r>
+        <w:rPr>
+          <w:b/>
+          <w:bCs/>
+        </w:rPr>
+        <w:t>AAPL standard deviation</w:t>
+      </w:r>
+      <w:r>
+        <w:t>: 0.017550 (measures the daily return volatility for AAPL)</w:t>
+      </w:r>
+    </w:p>
+    <w:p>
+      <w:pPr>
+        <w:numPr>
+          <w:ilvl w:val="1"/>
+          <w:numId w:val="107"/>
+        </w:numPr>
+      </w:pPr>
+      <w:r>
+        <w:rPr>
+          <w:b/>
+          <w:bCs/>
+        </w:rPr>
+        <w:t>Change standard deviation</w:t>
+      </w:r>
+      <w:r>
+        <w:t>: 0.339604 (measures the daily return volatility for change)</w:t>
+      </w:r>
+    </w:p>
+    <w:p>
+      <w:r>
+        <w:lastRenderedPageBreak/>
+        <w:t>The standard deviation is the square root of the variance and gives a more interpretable measure of volatility.</w:t>
+      </w:r>
+    </w:p>
+    <w:p>
+      <w:pPr>
+        <w:rPr>
+          <w:b/>
+          <w:bCs/>
+        </w:rPr>
+      </w:pPr>
+      <w:r>
+        <w:rPr>
+          <w:b/>
+          <w:bCs/>
+        </w:rPr>
+        <w:t>Next Steps for You:</w:t>
+      </w:r>
+    </w:p>
+    <w:p>
+      <w:pPr>
+        <w:numPr>
+          <w:ilvl w:val="0"/>
+          <w:numId w:val="108"/>
+        </w:numPr>
+      </w:pPr>
+      <w:r>
+        <w:rPr>
+          <w:b/>
+          <w:bCs/>
+        </w:rPr>
+        <w:t>Interpreting the Results:</w:t>
+      </w:r>
+    </w:p>
+    <w:p>
+      <w:pPr>
+        <w:numPr>
+          <w:ilvl w:val="1"/>
+          <w:numId w:val="108"/>
+        </w:numPr>
+      </w:pPr>
+      <w:r>
+        <w:t xml:space="preserve">The daily returns for </w:t>
+      </w:r>
+      <w:r>
+        <w:rPr>
+          <w:b/>
+          <w:bCs/>
+        </w:rPr>
+        <w:t>AAPL</w:t>
+      </w:r>
+      <w:r>
+        <w:t xml:space="preserve"> have relatively low mean returns (0.000943) but a moderate level of volatility as indicated by the standard deviation (0.017550).</w:t>
+      </w:r>
+    </w:p>
+    <w:p>
+      <w:pPr>
+        <w:numPr>
+          <w:ilvl w:val="1"/>
+          <w:numId w:val="108"/>
+        </w:numPr>
+      </w:pPr>
+      <w:r>
+        <w:t xml:space="preserve">The </w:t>
+      </w:r>
+      <w:r>
+        <w:rPr>
+          <w:b/>
+          <w:bCs/>
+        </w:rPr>
+        <w:t>change</w:t>
+      </w:r>
+      <w:r>
+        <w:t xml:space="preserve"> data has much higher </w:t>
+      </w:r>
+      <w:proofErr w:type="gramStart"/>
+      <w:r>
+        <w:t>mean</w:t>
+      </w:r>
+      <w:proofErr w:type="gramEnd"/>
+      <w:r>
+        <w:t xml:space="preserve"> returns (0.670964) and a much higher standard deviation (0.339604), suggesting that the changes are more volatile.</w:t>
+      </w:r>
+    </w:p>
+    <w:p>
+      <w:r>
+        <w:drawing>
+          <wp:inline distT="0" distB="0" distL="0" distR="0" wp14:anchorId="7405F19E" wp14:editId="4DE07BFA">
+            <wp:extent cx="5943600" cy="4768850"/>
+            <wp:effectExtent l="0" t="0" r="0" b="0"/>
+            <wp:docPr id="196118408" name="Picture 1" descr="A screenshot of a computer&#10;&#10;AI-generated content may be incorrect."/>
+            <wp:cNvGraphicFramePr>
+              <a:graphicFrameLocks xmlns:a="http://schemas.openxmlformats.org/drawingml/2006/main" noChangeAspect="1"/>
+            </wp:cNvGraphicFramePr>
+            <a:graphic xmlns:a="http://schemas.openxmlformats.org/drawingml/2006/main">
+              <a:graphicData uri="http://schemas.openxmlformats.org/drawingml/2006/picture">
+                <pic:pic xmlns:pic="http://schemas.openxmlformats.org/drawingml/2006/picture">
+                  <pic:nvPicPr>
+                    <pic:cNvPr id="196118408" name="Picture 1" descr="A screenshot of a computer&#10;&#10;AI-generated content may be incorrect."/>
+                    <pic:cNvPicPr/>
+                  </pic:nvPicPr>
+                  <pic:blipFill>
+                    <a:blip r:embed="rId41"/>
+                    <a:stretch>
+                      <a:fillRect/>
+                    </a:stretch>
+                  </pic:blipFill>
+                  <pic:spPr>
+                    <a:xfrm>
+                      <a:off x="0" y="0"/>
+                      <a:ext cx="5943600" cy="4768850"/>
+                    </a:xfrm>
+                    <a:prstGeom prst="rect">
+                      <a:avLst/>
+                    </a:prstGeom>
+                  </pic:spPr>
+                </pic:pic>
+              </a:graphicData>
+            </a:graphic>
+          </wp:inline>
+        </w:drawing>
+      </w:r>
+    </w:p>
+    <w:p>
+      <w:pPr>
+        <w:ind w:firstLine="0"/>
+        <w:rPr>
+          <w:b/>
+          <w:bCs/>
+        </w:rPr>
+      </w:pPr>
+      <w:r>
+        <w:rPr>
+          <w:b/>
+          <w:bCs/>
+        </w:rPr>
+        <w:t>Notes on Annualizing Mean Return, Variance, and Standard Deviation</w:t>
+      </w:r>
+    </w:p>
+    <w:p>
+      <w:pPr>
+        <w:numPr>
+          <w:ilvl w:val="0"/>
+          <w:numId w:val="109"/>
+        </w:numPr>
+      </w:pPr>
+      <w:r>
+        <w:rPr>
+          <w:b/>
+          <w:bCs/>
+        </w:rPr>
+        <w:lastRenderedPageBreak/>
+        <w:t>Annualized Mean Return:</w:t>
+      </w:r>
+    </w:p>
+    <w:p>
+      <w:pPr>
+        <w:numPr>
+          <w:ilvl w:val="1"/>
+          <w:numId w:val="109"/>
+        </w:numPr>
+      </w:pPr>
+      <w:r>
+        <w:rPr>
+          <w:b/>
+          <w:bCs/>
+        </w:rPr>
+        <w:t>Formula</w:t>
+      </w:r>
+      <w:r>
+        <w:t>:</w:t>
+      </w:r>
+    </w:p>
+    <w:p>
+      <w:pPr>
+        <w:numPr>
+          <w:ilvl w:val="1"/>
+          <w:numId w:val="109"/>
+        </w:numPr>
+        <w:tabs>
+          <w:tab w:val="clear" w:pos="1440"/>
+        </w:tabs>
+      </w:pPr>
+      <w:r>
+        <w:t>annual_mean_ret = daily_mean_return * 252</w:t>
+      </w:r>
+    </w:p>
+    <w:p>
+      <w:pPr>
+        <w:numPr>
+          <w:ilvl w:val="1"/>
+          <w:numId w:val="109"/>
+        </w:numPr>
+      </w:pPr>
+      <w:r>
+        <w:t xml:space="preserve">The </w:t>
+      </w:r>
+      <w:r>
+        <w:rPr>
+          <w:b/>
+          <w:bCs/>
+        </w:rPr>
+        <w:t>annualized mean return</w:t>
+      </w:r>
+      <w:r>
+        <w:t xml:space="preserve"> is calculated by multiplying the </w:t>
+      </w:r>
+      <w:r>
+        <w:rPr>
+          <w:b/>
+          <w:bCs/>
+        </w:rPr>
+        <w:t>daily mean return</w:t>
+      </w:r>
+      <w:r>
+        <w:t xml:space="preserve"> by 252 (the typical number of trading days in a year).</w:t>
+      </w:r>
+    </w:p>
+    <w:p>
+      <w:pPr>
+        <w:numPr>
+          <w:ilvl w:val="1"/>
+          <w:numId w:val="109"/>
+        </w:numPr>
+      </w:pPr>
+      <w:r>
+        <w:rPr>
+          <w:b/>
+          <w:bCs/>
+        </w:rPr>
+        <w:t>AAPL Annualized Mean Return</w:t>
+      </w:r>
+      <w:r>
+        <w:t>:</w:t>
+      </w:r>
+    </w:p>
+    <w:p>
+      <w:pPr>
+        <w:numPr>
+          <w:ilvl w:val="1"/>
+          <w:numId w:val="109"/>
+        </w:numPr>
+        <w:tabs>
+          <w:tab w:val="clear" w:pos="1440"/>
+        </w:tabs>
+      </w:pPr>
+      <w:r>
+        <w:t>0.237515</w:t>
+      </w:r>
+    </w:p>
+    <w:p>
+      <w:pPr>
+        <w:numPr>
+          <w:ilvl w:val="1"/>
+          <w:numId w:val="109"/>
+        </w:numPr>
+      </w:pPr>
+      <w:r>
+        <w:rPr>
+          <w:b/>
+          <w:bCs/>
+        </w:rPr>
+        <w:t>Change Annualized Mean Return</w:t>
+      </w:r>
+      <w:r>
+        <w:t>:</w:t>
+      </w:r>
+    </w:p>
+    <w:p>
+      <w:pPr>
+        <w:numPr>
+          <w:ilvl w:val="1"/>
+          <w:numId w:val="109"/>
+        </w:numPr>
+        <w:tabs>
+          <w:tab w:val="clear" w:pos="1440"/>
+        </w:tabs>
+      </w:pPr>
+      <w:r>
+        <w:t>169.083454</w:t>
+      </w:r>
+    </w:p>
+    <w:p>
+      <w:pPr>
+        <w:ind w:firstLine="0"/>
+      </w:pPr>
+      <w:r>
+        <w:t>This value represents the yearly return for the stock's change column.</w:t>
+      </w:r>
+    </w:p>
+    <w:p>
+      <w:pPr>
+        <w:numPr>
+          <w:ilvl w:val="0"/>
+          <w:numId w:val="109"/>
+        </w:numPr>
+      </w:pPr>
+      <w:r>
+        <w:rPr>
+          <w:b/>
+          <w:bCs/>
+        </w:rPr>
+        <w:t>Annualized Variance:</w:t>
+      </w:r>
+    </w:p>
+    <w:p>
+      <w:pPr>
+        <w:numPr>
+          <w:ilvl w:val="1"/>
+          <w:numId w:val="109"/>
+        </w:numPr>
+      </w:pPr>
+      <w:r>
+        <w:rPr>
+          <w:b/>
+          <w:bCs/>
+        </w:rPr>
+        <w:t>Formula</w:t>
+      </w:r>
+      <w:r>
+        <w:t>:</w:t>
+      </w:r>
+    </w:p>
+    <w:p>
+      <w:pPr>
+        <w:numPr>
+          <w:ilvl w:val="1"/>
+          <w:numId w:val="109"/>
+        </w:numPr>
+        <w:tabs>
+          <w:tab w:val="clear" w:pos="1440"/>
+        </w:tabs>
+      </w:pPr>
+      <w:r>
+        <w:t>annual_var = var_daily * 252</w:t>
+      </w:r>
+    </w:p>
+    <w:p>
+      <w:pPr>
+        <w:numPr>
+          <w:ilvl w:val="1"/>
+          <w:numId w:val="109"/>
+        </w:numPr>
+      </w:pPr>
+      <w:r>
+        <w:t xml:space="preserve">The </w:t>
+      </w:r>
+      <w:r>
+        <w:rPr>
+          <w:b/>
+          <w:bCs/>
+        </w:rPr>
+        <w:t>annualized variance</w:t>
+      </w:r>
+      <w:r>
+        <w:t xml:space="preserve"> is calculated by multiplying the </w:t>
+      </w:r>
+      <w:r>
+        <w:rPr>
+          <w:b/>
+          <w:bCs/>
+        </w:rPr>
+        <w:t>daily variance</w:t>
+      </w:r>
+      <w:r>
+        <w:t xml:space="preserve"> by 252 to scale it to a yearly measure.</w:t>
+      </w:r>
+    </w:p>
+    <w:p>
+      <w:pPr>
+        <w:numPr>
+          <w:ilvl w:val="1"/>
+          <w:numId w:val="109"/>
+        </w:numPr>
+      </w:pPr>
+      <w:r>
+        <w:rPr>
+          <w:b/>
+          <w:bCs/>
+        </w:rPr>
+        <w:t>AAPL Annualized Variance</w:t>
+      </w:r>
+      <w:r>
+        <w:t>:</w:t>
+      </w:r>
+    </w:p>
+    <w:p>
+      <w:pPr>
+        <w:numPr>
+          <w:ilvl w:val="1"/>
+          <w:numId w:val="109"/>
+        </w:numPr>
+        <w:tabs>
+          <w:tab w:val="clear" w:pos="1440"/>
+        </w:tabs>
+      </w:pPr>
+      <w:r>
+        <w:t>0.077615</w:t>
+      </w:r>
+    </w:p>
+    <w:p>
+      <w:pPr>
+        <w:numPr>
+          <w:ilvl w:val="1"/>
+          <w:numId w:val="109"/>
+        </w:numPr>
+      </w:pPr>
+      <w:r>
+        <w:rPr>
+          <w:b/>
+          <w:bCs/>
+        </w:rPr>
+        <w:t>Change Annualized Variance</w:t>
+      </w:r>
+      <w:r>
+        <w:t>:</w:t>
+      </w:r>
+    </w:p>
+    <w:p>
+      <w:pPr>
+        <w:numPr>
+          <w:ilvl w:val="1"/>
+          <w:numId w:val="109"/>
+        </w:numPr>
+        <w:tabs>
+          <w:tab w:val="clear" w:pos="1440"/>
+        </w:tabs>
+      </w:pPr>
+      <w:r>
+        <w:t>29.063450</w:t>
+      </w:r>
+    </w:p>
+    <w:p>
+      <w:pPr>
+        <w:numPr>
+          <w:ilvl w:val="0"/>
+          <w:numId w:val="109"/>
+        </w:numPr>
+      </w:pPr>
+      <w:r>
+        <w:rPr>
+          <w:b/>
+          <w:bCs/>
+        </w:rPr>
+        <w:t>Annualized Standard Deviation:</w:t>
+      </w:r>
+    </w:p>
+    <w:p>
+      <w:pPr>
+        <w:numPr>
+          <w:ilvl w:val="1"/>
+          <w:numId w:val="109"/>
+        </w:numPr>
+      </w:pPr>
+      <w:r>
+        <w:rPr>
+          <w:b/>
+          <w:bCs/>
+        </w:rPr>
+        <w:t>Formula</w:t>
+      </w:r>
+      <w:r>
+        <w:t>:</w:t>
+      </w:r>
+    </w:p>
+    <w:p>
+      <w:pPr>
+        <w:numPr>
+          <w:ilvl w:val="1"/>
+          <w:numId w:val="109"/>
+        </w:numPr>
+        <w:tabs>
+          <w:tab w:val="clear" w:pos="1440"/>
+        </w:tabs>
+      </w:pPr>
+      <w:r>
+        <w:t>annual_std = np.sqrt(annual_var)</w:t>
+      </w:r>
+    </w:p>
+    <w:p>
+      <w:pPr>
+        <w:numPr>
+          <w:ilvl w:val="1"/>
+          <w:numId w:val="109"/>
+        </w:numPr>
+      </w:pPr>
+      <w:r>
+        <w:lastRenderedPageBreak/>
+        <w:t xml:space="preserve">The </w:t>
+      </w:r>
+      <w:r>
+        <w:rPr>
+          <w:b/>
+          <w:bCs/>
+        </w:rPr>
+        <w:t>annualized standard deviation</w:t>
+      </w:r>
+      <w:r>
+        <w:t xml:space="preserve"> is calculated by taking the square root of the </w:t>
+      </w:r>
+      <w:r>
+        <w:rPr>
+          <w:b/>
+          <w:bCs/>
+        </w:rPr>
+        <w:t>annualized variance</w:t>
+      </w:r>
+      <w:r>
+        <w:t>. It provides a measure of volatility on an annual basis.</w:t>
+      </w:r>
+    </w:p>
+    <w:p>
+      <w:pPr>
+        <w:numPr>
+          <w:ilvl w:val="1"/>
+          <w:numId w:val="109"/>
+        </w:numPr>
+      </w:pPr>
+      <w:r>
+        <w:rPr>
+          <w:b/>
+          <w:bCs/>
+        </w:rPr>
+        <w:t>AAPL Annualized Standard Deviation</w:t>
+      </w:r>
+      <w:r>
+        <w:t>:</w:t>
+      </w:r>
+    </w:p>
+    <w:p>
+      <w:pPr>
+        <w:numPr>
+          <w:ilvl w:val="1"/>
+          <w:numId w:val="109"/>
+        </w:numPr>
+        <w:tabs>
+          <w:tab w:val="clear" w:pos="1440"/>
+        </w:tabs>
+      </w:pPr>
+      <w:r>
+        <w:t>0.278594</w:t>
+      </w:r>
+    </w:p>
+    <w:p>
+      <w:pPr>
+        <w:numPr>
+          <w:ilvl w:val="1"/>
+          <w:numId w:val="109"/>
+        </w:numPr>
+      </w:pPr>
+      <w:r>
+        <w:rPr>
+          <w:b/>
+          <w:bCs/>
+        </w:rPr>
+        <w:t>Change Annualized Standard Deviation</w:t>
+      </w:r>
+      <w:r>
+        <w:t>:</w:t>
+      </w:r>
+    </w:p>
+    <w:p>
+      <w:pPr>
+        <w:numPr>
+          <w:ilvl w:val="1"/>
+          <w:numId w:val="109"/>
+        </w:numPr>
+        <w:tabs>
+          <w:tab w:val="clear" w:pos="1440"/>
+        </w:tabs>
+      </w:pPr>
+      <w:r>
+        <w:t>5.391053</w:t>
+      </w:r>
+    </w:p>
+    <w:p>
+      <w:pPr>
+        <w:ind w:firstLine="0"/>
+      </w:pPr>
+      <w:r>
+        <w:pict w14:anchorId="224CD52D">
+          <v:rect id="_x0000_i1105" style="width:0;height:1.5pt" o:hralign="center" o:hrstd="t" o:hr="t" fillcolor="#a0a0a0" stroked="f"/>
+        </w:pict>
+      </w:r>
+    </w:p>
+    <w:p>
+      <w:pPr>
+        <w:ind w:firstLine="0"/>
+        <w:rPr>
+          <w:b/>
+          <w:bCs/>
+        </w:rPr>
+      </w:pPr>
+      <w:r>
+        <w:rPr>
+          <w:b/>
+          <w:bCs/>
+        </w:rPr>
+        <w:t>Key Points to Remember:</w:t>
+      </w:r>
+    </w:p>
+    <w:p>
+      <w:pPr>
+        <w:numPr>
+          <w:ilvl w:val="0"/>
+          <w:numId w:val="110"/>
+        </w:numPr>
+      </w:pPr>
+      <w:r>
+        <w:rPr>
+          <w:b/>
+          <w:bCs/>
+        </w:rPr>
+        <w:t>Annualized Mean Return</w:t>
+      </w:r>
+      <w:r>
+        <w:t>: Shows the expected return if the average daily return continues over the course of a year.</w:t>
+      </w:r>
+    </w:p>
+    <w:p>
+      <w:pPr>
+        <w:numPr>
+          <w:ilvl w:val="0"/>
+          <w:numId w:val="110"/>
+        </w:numPr>
+      </w:pPr>
+      <w:r>
+        <w:rPr>
+          <w:b/>
+          <w:bCs/>
+        </w:rPr>
+        <w:t>Annualized Variance</w:t>
+      </w:r>
+      <w:r>
+        <w:t>: Measures the spread of the stock's returns over the year; higher variance indicates more risk.</w:t>
+      </w:r>
+    </w:p>
+    <w:p>
+      <w:pPr>
+        <w:numPr>
+          <w:ilvl w:val="0"/>
+          <w:numId w:val="110"/>
+        </w:numPr>
+      </w:pPr>
+      <w:r>
+        <w:rPr>
+          <w:b/>
+          <w:bCs/>
+        </w:rPr>
+        <w:t>Annualized Standard Deviation</w:t>
+      </w:r>
+      <w:r>
+        <w:t>: Indicates the volatility of the stock over the year; higher values mean more fluctuation in stock price.</w:t>
+      </w:r>
+    </w:p>
+    <w:p>
+      <w:pPr>
+        <w:ind w:firstLine="0"/>
+      </w:pPr>
+    </w:p>
     <w:sectPr>
       <w:pgSz w:w="12240" w:h="15840"/>
       <w:pgMar w:top="1440" w:right="1440" w:bottom="1440" w:left="1440" w:header="720" w:footer="720" w:gutter="0"/>
@@ -25615,6 +26424,123 @@
     </w:lvl>
   </w:abstractNum>
   <w:abstractNum w:abstractNumId="20" w15:restartNumberingAfterBreak="0">
+    <w:nsid w:val="20A520F8"/>
+    <w:multiLevelType w:val="multilevel"/>
+    <w:tmpl w:val="E3AE063A"/>
+    <w:lvl w:ilvl="0">
+      <w:start w:val="1"/>
+      <w:numFmt w:val="decimal"/>
+      <w:lvlText w:val="%1."/>
+      <w:lvlJc w:val="left"/>
+      <w:pPr>
+        <w:tabs>
+          <w:tab w:val="num" w:pos="720"/>
+        </w:tabs>
+        <w:ind w:left="720" w:hanging="360"/>
+      </w:pPr>
+    </w:lvl>
+    <w:lvl w:ilvl="1">
+      <w:start w:val="1"/>
+      <w:numFmt w:val="bullet"/>
+      <w:lvlText w:val="o"/>
+      <w:lvlJc w:val="left"/>
+      <w:pPr>
+        <w:tabs>
+          <w:tab w:val="num" w:pos="1440"/>
+        </w:tabs>
+        <w:ind w:left="1440" w:hanging="360"/>
+      </w:pPr>
+      <w:rPr>
+        <w:rFonts w:ascii="Courier New" w:hAnsi="Courier New" w:hint="default"/>
+        <w:sz w:val="20"/>
+      </w:rPr>
+    </w:lvl>
+    <w:lvl w:ilvl="2" w:tentative="1">
+      <w:start w:val="1"/>
+      <w:numFmt w:val="decimal"/>
+      <w:lvlText w:val="%3."/>
+      <w:lvlJc w:val="left"/>
+      <w:pPr>
+        <w:tabs>
+          <w:tab w:val="num" w:pos="2160"/>
+        </w:tabs>
+        <w:ind w:left="2160" w:hanging="360"/>
+      </w:pPr>
+    </w:lvl>
+    <w:lvl w:ilvl="3" w:tentative="1">
+      <w:start w:val="1"/>
+      <w:numFmt w:val="decimal"/>
+      <w:lvlText w:val="%4."/>
+      <w:lvlJc w:val="left"/>
+      <w:pPr>
+        <w:tabs>
+          <w:tab w:val="num" w:pos="2880"/>
+        </w:tabs>
+        <w:ind w:left="2880" w:hanging="360"/>
+      </w:pPr>
+    </w:lvl>
+    <w:lvl w:ilvl="4" w:tentative="1">
+      <w:start w:val="1"/>
+      <w:numFmt w:val="decimal"/>
+      <w:lvlText w:val="%5."/>
+      <w:lvlJc w:val="left"/>
+      <w:pPr>
+        <w:tabs>
+          <w:tab w:val="num" w:pos="3600"/>
+        </w:tabs>
+        <w:ind w:left="3600" w:hanging="360"/>
+      </w:pPr>
+    </w:lvl>
+    <w:lvl w:ilvl="5" w:tentative="1">
+      <w:start w:val="1"/>
+      <w:numFmt w:val="decimal"/>
+      <w:lvlText w:val="%6."/>
+      <w:lvlJc w:val="left"/>
+      <w:pPr>
+        <w:tabs>
+          <w:tab w:val="num" w:pos="4320"/>
+        </w:tabs>
+        <w:ind w:left="4320" w:hanging="360"/>
+      </w:pPr>
+    </w:lvl>
+    <w:lvl w:ilvl="6" w:tentative="1">
+      <w:start w:val="1"/>
+      <w:numFmt w:val="decimal"/>
+      <w:lvlText w:val="%7."/>
+      <w:lvlJc w:val="left"/>
+      <w:pPr>
+        <w:tabs>
+          <w:tab w:val="num" w:pos="5040"/>
+        </w:tabs>
+        <w:ind w:left="5040" w:hanging="360"/>
+      </w:pPr>
+    </w:lvl>
+    <w:lvl w:ilvl="7" w:tentative="1">
+      <w:start w:val="1"/>
+      <w:numFmt w:val="decimal"/>
+      <w:lvlText w:val="%8."/>
+      <w:lvlJc w:val="left"/>
+      <w:pPr>
+        <w:tabs>
+          <w:tab w:val="num" w:pos="5760"/>
+        </w:tabs>
+        <w:ind w:left="5760" w:hanging="360"/>
+      </w:pPr>
+    </w:lvl>
+    <w:lvl w:ilvl="8" w:tentative="1">
+      <w:start w:val="1"/>
+      <w:numFmt w:val="decimal"/>
+      <w:lvlText w:val="%9."/>
+      <w:lvlJc w:val="left"/>
+      <w:pPr>
+        <w:tabs>
+          <w:tab w:val="num" w:pos="6480"/>
+        </w:tabs>
+        <w:ind w:left="6480" w:hanging="360"/>
+      </w:pPr>
+    </w:lvl>
+  </w:abstractNum>
+  <w:abstractNum w:abstractNumId="21" w15:restartNumberingAfterBreak="0">
     <w:nsid w:val="21527DBF"/>
     <w:multiLevelType w:val="multilevel"/>
     <w:tmpl w:val="A8C065B4"/>
@@ -25763,7 +26689,7 @@
       </w:rPr>
     </w:lvl>
   </w:abstractNum>
-  <w:abstractNum w:abstractNumId="21" w15:restartNumberingAfterBreak="0">
+  <w:abstractNum w:abstractNumId="22" w15:restartNumberingAfterBreak="0">
     <w:nsid w:val="216838D8"/>
     <w:multiLevelType w:val="multilevel"/>
     <w:tmpl w:val="F87C41E2"/>
@@ -25912,7 +26838,7 @@
       </w:rPr>
     </w:lvl>
   </w:abstractNum>
-  <w:abstractNum w:abstractNumId="22" w15:restartNumberingAfterBreak="0">
+  <w:abstractNum w:abstractNumId="23" w15:restartNumberingAfterBreak="0">
     <w:nsid w:val="22D7528E"/>
     <w:multiLevelType w:val="multilevel"/>
     <w:tmpl w:val="B45E2DA2"/>
@@ -26061,7 +26987,7 @@
       </w:rPr>
     </w:lvl>
   </w:abstractNum>
-  <w:abstractNum w:abstractNumId="23" w15:restartNumberingAfterBreak="0">
+  <w:abstractNum w:abstractNumId="24" w15:restartNumberingAfterBreak="0">
     <w:nsid w:val="22F3033E"/>
     <w:multiLevelType w:val="multilevel"/>
     <w:tmpl w:val="1D14DB68"/>
@@ -26182,7 +27108,7 @@
       </w:pPr>
     </w:lvl>
   </w:abstractNum>
-  <w:abstractNum w:abstractNumId="24" w15:restartNumberingAfterBreak="0">
+  <w:abstractNum w:abstractNumId="25" w15:restartNumberingAfterBreak="0">
     <w:nsid w:val="262A5CD1"/>
     <w:multiLevelType w:val="multilevel"/>
     <w:tmpl w:val="0030AD14"/>
@@ -26331,7 +27257,7 @@
       </w:rPr>
     </w:lvl>
   </w:abstractNum>
-  <w:abstractNum w:abstractNumId="25" w15:restartNumberingAfterBreak="0">
+  <w:abstractNum w:abstractNumId="26" w15:restartNumberingAfterBreak="0">
     <w:nsid w:val="27C850EE"/>
     <w:multiLevelType w:val="multilevel"/>
     <w:tmpl w:val="DEACF4A6"/>
@@ -26480,7 +27406,7 @@
       </w:rPr>
     </w:lvl>
   </w:abstractNum>
-  <w:abstractNum w:abstractNumId="26" w15:restartNumberingAfterBreak="0">
+  <w:abstractNum w:abstractNumId="27" w15:restartNumberingAfterBreak="0">
     <w:nsid w:val="292B7E68"/>
     <w:multiLevelType w:val="multilevel"/>
     <w:tmpl w:val="7E16B122"/>
@@ -26629,7 +27555,7 @@
       </w:rPr>
     </w:lvl>
   </w:abstractNum>
-  <w:abstractNum w:abstractNumId="27" w15:restartNumberingAfterBreak="0">
+  <w:abstractNum w:abstractNumId="28" w15:restartNumberingAfterBreak="0">
     <w:nsid w:val="293C1D4A"/>
     <w:multiLevelType w:val="multilevel"/>
     <w:tmpl w:val="AE30152E"/>
@@ -26778,7 +27704,7 @@
       </w:rPr>
     </w:lvl>
   </w:abstractNum>
-  <w:abstractNum w:abstractNumId="28" w15:restartNumberingAfterBreak="0">
+  <w:abstractNum w:abstractNumId="29" w15:restartNumberingAfterBreak="0">
     <w:nsid w:val="297B1D2B"/>
     <w:multiLevelType w:val="multilevel"/>
     <w:tmpl w:val="DEACF4A6"/>
@@ -26927,7 +27853,7 @@
       </w:rPr>
     </w:lvl>
   </w:abstractNum>
-  <w:abstractNum w:abstractNumId="29" w15:restartNumberingAfterBreak="0">
+  <w:abstractNum w:abstractNumId="30" w15:restartNumberingAfterBreak="0">
     <w:nsid w:val="2D037575"/>
     <w:multiLevelType w:val="multilevel"/>
     <w:tmpl w:val="B9CC6152"/>
@@ -27076,7 +28002,7 @@
       </w:rPr>
     </w:lvl>
   </w:abstractNum>
-  <w:abstractNum w:abstractNumId="30" w15:restartNumberingAfterBreak="0">
+  <w:abstractNum w:abstractNumId="31" w15:restartNumberingAfterBreak="0">
     <w:nsid w:val="2F7852F2"/>
     <w:multiLevelType w:val="multilevel"/>
     <w:tmpl w:val="A5542A08"/>
@@ -27225,7 +28151,7 @@
       </w:rPr>
     </w:lvl>
   </w:abstractNum>
-  <w:abstractNum w:abstractNumId="31" w15:restartNumberingAfterBreak="0">
+  <w:abstractNum w:abstractNumId="32" w15:restartNumberingAfterBreak="0">
     <w:nsid w:val="30031988"/>
     <w:multiLevelType w:val="multilevel"/>
     <w:tmpl w:val="69D456D8"/>
@@ -27374,7 +28300,7 @@
       </w:rPr>
     </w:lvl>
   </w:abstractNum>
-  <w:abstractNum w:abstractNumId="32" w15:restartNumberingAfterBreak="0">
+  <w:abstractNum w:abstractNumId="33" w15:restartNumberingAfterBreak="0">
     <w:nsid w:val="30806B48"/>
     <w:multiLevelType w:val="multilevel"/>
     <w:tmpl w:val="DEACF4A6"/>
@@ -27523,7 +28449,7 @@
       </w:rPr>
     </w:lvl>
   </w:abstractNum>
-  <w:abstractNum w:abstractNumId="33" w15:restartNumberingAfterBreak="0">
+  <w:abstractNum w:abstractNumId="34" w15:restartNumberingAfterBreak="0">
     <w:nsid w:val="30E86102"/>
     <w:multiLevelType w:val="multilevel"/>
     <w:tmpl w:val="97DC36DC"/>
@@ -27672,7 +28598,7 @@
       </w:rPr>
     </w:lvl>
   </w:abstractNum>
-  <w:abstractNum w:abstractNumId="34" w15:restartNumberingAfterBreak="0">
+  <w:abstractNum w:abstractNumId="35" w15:restartNumberingAfterBreak="0">
     <w:nsid w:val="320D68E2"/>
     <w:multiLevelType w:val="multilevel"/>
     <w:tmpl w:val="DEACF4A6"/>
@@ -27821,7 +28747,7 @@
       </w:rPr>
     </w:lvl>
   </w:abstractNum>
-  <w:abstractNum w:abstractNumId="35" w15:restartNumberingAfterBreak="0">
+  <w:abstractNum w:abstractNumId="36" w15:restartNumberingAfterBreak="0">
     <w:nsid w:val="32D025FC"/>
     <w:multiLevelType w:val="multilevel"/>
     <w:tmpl w:val="E0F6F884"/>
@@ -27970,7 +28896,7 @@
       </w:rPr>
     </w:lvl>
   </w:abstractNum>
-  <w:abstractNum w:abstractNumId="36" w15:restartNumberingAfterBreak="0">
+  <w:abstractNum w:abstractNumId="37" w15:restartNumberingAfterBreak="0">
     <w:nsid w:val="34460E44"/>
     <w:multiLevelType w:val="multilevel"/>
     <w:tmpl w:val="E056F696"/>
@@ -28119,7 +29045,7 @@
       </w:rPr>
     </w:lvl>
   </w:abstractNum>
-  <w:abstractNum w:abstractNumId="37" w15:restartNumberingAfterBreak="0">
+  <w:abstractNum w:abstractNumId="38" w15:restartNumberingAfterBreak="0">
     <w:nsid w:val="353D32ED"/>
     <w:multiLevelType w:val="multilevel"/>
     <w:tmpl w:val="DEACF4A6"/>
@@ -28268,7 +29194,7 @@
       </w:rPr>
     </w:lvl>
   </w:abstractNum>
-  <w:abstractNum w:abstractNumId="38" w15:restartNumberingAfterBreak="0">
+  <w:abstractNum w:abstractNumId="39" w15:restartNumberingAfterBreak="0">
     <w:nsid w:val="358567C2"/>
     <w:multiLevelType w:val="multilevel"/>
     <w:tmpl w:val="A3986F94"/>
@@ -28417,7 +29343,156 @@
       </w:rPr>
     </w:lvl>
   </w:abstractNum>
-  <w:abstractNum w:abstractNumId="39" w15:restartNumberingAfterBreak="0">
+  <w:abstractNum w:abstractNumId="40" w15:restartNumberingAfterBreak="0">
+    <w:nsid w:val="359011B4"/>
+    <w:multiLevelType w:val="multilevel"/>
+    <w:tmpl w:val="A1DCF1AC"/>
+    <w:lvl w:ilvl="0">
+      <w:start w:val="1"/>
+      <w:numFmt w:val="bullet"/>
+      <w:lvlText w:val=""/>
+      <w:lvlJc w:val="left"/>
+      <w:pPr>
+        <w:tabs>
+          <w:tab w:val="num" w:pos="720"/>
+        </w:tabs>
+        <w:ind w:left="720" w:hanging="360"/>
+      </w:pPr>
+      <w:rPr>
+        <w:rFonts w:ascii="Symbol" w:hAnsi="Symbol" w:hint="default"/>
+        <w:sz w:val="20"/>
+      </w:rPr>
+    </w:lvl>
+    <w:lvl w:ilvl="1">
+      <w:start w:val="1"/>
+      <w:numFmt w:val="bullet"/>
+      <w:lvlText w:val="o"/>
+      <w:lvlJc w:val="left"/>
+      <w:pPr>
+        <w:tabs>
+          <w:tab w:val="num" w:pos="1440"/>
+        </w:tabs>
+        <w:ind w:left="1440" w:hanging="360"/>
+      </w:pPr>
+      <w:rPr>
+        <w:rFonts w:ascii="Courier New" w:hAnsi="Courier New" w:hint="default"/>
+        <w:sz w:val="20"/>
+      </w:rPr>
+    </w:lvl>
+    <w:lvl w:ilvl="2" w:tentative="1">
+      <w:start w:val="1"/>
+      <w:numFmt w:val="bullet"/>
+      <w:lvlText w:val=""/>
+      <w:lvlJc w:val="left"/>
+      <w:pPr>
+        <w:tabs>
+          <w:tab w:val="num" w:pos="2160"/>
+        </w:tabs>
+        <w:ind w:left="2160" w:hanging="360"/>
+      </w:pPr>
+      <w:rPr>
+        <w:rFonts w:ascii="Wingdings" w:hAnsi="Wingdings" w:hint="default"/>
+        <w:sz w:val="20"/>
+      </w:rPr>
+    </w:lvl>
+    <w:lvl w:ilvl="3" w:tentative="1">
+      <w:start w:val="1"/>
+      <w:numFmt w:val="bullet"/>
+      <w:lvlText w:val=""/>
+      <w:lvlJc w:val="left"/>
+      <w:pPr>
+        <w:tabs>
+          <w:tab w:val="num" w:pos="2880"/>
+        </w:tabs>
+        <w:ind w:left="2880" w:hanging="360"/>
+      </w:pPr>
+      <w:rPr>
+        <w:rFonts w:ascii="Wingdings" w:hAnsi="Wingdings" w:hint="default"/>
+        <w:sz w:val="20"/>
+      </w:rPr>
+    </w:lvl>
+    <w:lvl w:ilvl="4" w:tentative="1">
+      <w:start w:val="1"/>
+      <w:numFmt w:val="bullet"/>
+      <w:lvlText w:val=""/>
+      <w:lvlJc w:val="left"/>
+      <w:pPr>
+        <w:tabs>
+          <w:tab w:val="num" w:pos="3600"/>
+        </w:tabs>
+        <w:ind w:left="3600" w:hanging="360"/>
+      </w:pPr>
+      <w:rPr>
+        <w:rFonts w:ascii="Wingdings" w:hAnsi="Wingdings" w:hint="default"/>
+        <w:sz w:val="20"/>
+      </w:rPr>
+    </w:lvl>
+    <w:lvl w:ilvl="5" w:tentative="1">
+      <w:start w:val="1"/>
+      <w:numFmt w:val="bullet"/>
+      <w:lvlText w:val=""/>
+      <w:lvlJc w:val="left"/>
+      <w:pPr>
+        <w:tabs>
+          <w:tab w:val="num" w:pos="4320"/>
+        </w:tabs>
+        <w:ind w:left="4320" w:hanging="360"/>
+      </w:pPr>
+      <w:rPr>
+        <w:rFonts w:ascii="Wingdings" w:hAnsi="Wingdings" w:hint="default"/>
+        <w:sz w:val="20"/>
+      </w:rPr>
+    </w:lvl>
+    <w:lvl w:ilvl="6" w:tentative="1">
+      <w:start w:val="1"/>
+      <w:numFmt w:val="bullet"/>
+      <w:lvlText w:val=""/>
+      <w:lvlJc w:val="left"/>
+      <w:pPr>
+        <w:tabs>
+          <w:tab w:val="num" w:pos="5040"/>
+        </w:tabs>
+        <w:ind w:left="5040" w:hanging="360"/>
+      </w:pPr>
+      <w:rPr>
+        <w:rFonts w:ascii="Wingdings" w:hAnsi="Wingdings" w:hint="default"/>
+        <w:sz w:val="20"/>
+      </w:rPr>
+    </w:lvl>
+    <w:lvl w:ilvl="7" w:tentative="1">
+      <w:start w:val="1"/>
+      <w:numFmt w:val="bullet"/>
+      <w:lvlText w:val=""/>
+      <w:lvlJc w:val="left"/>
+      <w:pPr>
+        <w:tabs>
+          <w:tab w:val="num" w:pos="5760"/>
+        </w:tabs>
+        <w:ind w:left="5760" w:hanging="360"/>
+      </w:pPr>
+      <w:rPr>
+        <w:rFonts w:ascii="Wingdings" w:hAnsi="Wingdings" w:hint="default"/>
+        <w:sz w:val="20"/>
+      </w:rPr>
+    </w:lvl>
+    <w:lvl w:ilvl="8" w:tentative="1">
+      <w:start w:val="1"/>
+      <w:numFmt w:val="bullet"/>
+      <w:lvlText w:val=""/>
+      <w:lvlJc w:val="left"/>
+      <w:pPr>
+        <w:tabs>
+          <w:tab w:val="num" w:pos="6480"/>
+        </w:tabs>
+        <w:ind w:left="6480" w:hanging="360"/>
+      </w:pPr>
+      <w:rPr>
+        <w:rFonts w:ascii="Wingdings" w:hAnsi="Wingdings" w:hint="default"/>
+        <w:sz w:val="20"/>
+      </w:rPr>
+    </w:lvl>
+  </w:abstractNum>
+  <w:abstractNum w:abstractNumId="41" w15:restartNumberingAfterBreak="0">
     <w:nsid w:val="35CB71E9"/>
     <w:multiLevelType w:val="multilevel"/>
     <w:tmpl w:val="7312EBD8"/>
@@ -28566,7 +29641,7 @@
       </w:rPr>
     </w:lvl>
   </w:abstractNum>
-  <w:abstractNum w:abstractNumId="40" w15:restartNumberingAfterBreak="0">
+  <w:abstractNum w:abstractNumId="42" w15:restartNumberingAfterBreak="0">
     <w:nsid w:val="375D3367"/>
     <w:multiLevelType w:val="multilevel"/>
     <w:tmpl w:val="573AAE5E"/>
@@ -28715,7 +29790,7 @@
       </w:rPr>
     </w:lvl>
   </w:abstractNum>
-  <w:abstractNum w:abstractNumId="41" w15:restartNumberingAfterBreak="0">
+  <w:abstractNum w:abstractNumId="43" w15:restartNumberingAfterBreak="0">
     <w:nsid w:val="37C0756B"/>
     <w:multiLevelType w:val="multilevel"/>
     <w:tmpl w:val="DEACF4A6"/>
@@ -28864,7 +29939,7 @@
       </w:rPr>
     </w:lvl>
   </w:abstractNum>
-  <w:abstractNum w:abstractNumId="42" w15:restartNumberingAfterBreak="0">
+  <w:abstractNum w:abstractNumId="44" w15:restartNumberingAfterBreak="0">
     <w:nsid w:val="38B93EC2"/>
     <w:multiLevelType w:val="multilevel"/>
     <w:tmpl w:val="94202850"/>
@@ -29013,7 +30088,7 @@
       </w:rPr>
     </w:lvl>
   </w:abstractNum>
-  <w:abstractNum w:abstractNumId="43" w15:restartNumberingAfterBreak="0">
+  <w:abstractNum w:abstractNumId="45" w15:restartNumberingAfterBreak="0">
     <w:nsid w:val="39E840FC"/>
     <w:multiLevelType w:val="multilevel"/>
     <w:tmpl w:val="75943A8E"/>
@@ -29162,7 +30237,7 @@
       </w:rPr>
     </w:lvl>
   </w:abstractNum>
-  <w:abstractNum w:abstractNumId="44" w15:restartNumberingAfterBreak="0">
+  <w:abstractNum w:abstractNumId="46" w15:restartNumberingAfterBreak="0">
     <w:nsid w:val="3A824266"/>
     <w:multiLevelType w:val="multilevel"/>
     <w:tmpl w:val="E6280AA2"/>
@@ -29311,7 +30386,7 @@
       </w:rPr>
     </w:lvl>
   </w:abstractNum>
-  <w:abstractNum w:abstractNumId="45" w15:restartNumberingAfterBreak="0">
+  <w:abstractNum w:abstractNumId="47" w15:restartNumberingAfterBreak="0">
     <w:nsid w:val="3BC370FC"/>
     <w:multiLevelType w:val="multilevel"/>
     <w:tmpl w:val="DEACF4A6"/>
@@ -29460,7 +30535,7 @@
       </w:rPr>
     </w:lvl>
   </w:abstractNum>
-  <w:abstractNum w:abstractNumId="46" w15:restartNumberingAfterBreak="0">
+  <w:abstractNum w:abstractNumId="48" w15:restartNumberingAfterBreak="0">
     <w:nsid w:val="3C2B6D0A"/>
     <w:multiLevelType w:val="multilevel"/>
     <w:tmpl w:val="DEACF4A6"/>
@@ -29609,7 +30684,7 @@
       </w:rPr>
     </w:lvl>
   </w:abstractNum>
-  <w:abstractNum w:abstractNumId="47" w15:restartNumberingAfterBreak="0">
+  <w:abstractNum w:abstractNumId="49" w15:restartNumberingAfterBreak="0">
     <w:nsid w:val="3C2E5E3F"/>
     <w:multiLevelType w:val="multilevel"/>
     <w:tmpl w:val="DEACF4A6"/>
@@ -29758,7 +30833,7 @@
       </w:rPr>
     </w:lvl>
   </w:abstractNum>
-  <w:abstractNum w:abstractNumId="48" w15:restartNumberingAfterBreak="0">
+  <w:abstractNum w:abstractNumId="50" w15:restartNumberingAfterBreak="0">
     <w:nsid w:val="3DA409C1"/>
     <w:multiLevelType w:val="multilevel"/>
     <w:tmpl w:val="D9B0EB32"/>
@@ -29907,7 +30982,7 @@
       </w:rPr>
     </w:lvl>
   </w:abstractNum>
-  <w:abstractNum w:abstractNumId="49" w15:restartNumberingAfterBreak="0">
+  <w:abstractNum w:abstractNumId="51" w15:restartNumberingAfterBreak="0">
     <w:nsid w:val="3FB67063"/>
     <w:multiLevelType w:val="multilevel"/>
     <w:tmpl w:val="DEACF4A6"/>
@@ -30056,7 +31131,7 @@
       </w:rPr>
     </w:lvl>
   </w:abstractNum>
-  <w:abstractNum w:abstractNumId="50" w15:restartNumberingAfterBreak="0">
+  <w:abstractNum w:abstractNumId="52" w15:restartNumberingAfterBreak="0">
     <w:nsid w:val="40320410"/>
     <w:multiLevelType w:val="multilevel"/>
     <w:tmpl w:val="DEACF4A6"/>
@@ -30205,7 +31280,7 @@
       </w:rPr>
     </w:lvl>
   </w:abstractNum>
-  <w:abstractNum w:abstractNumId="51" w15:restartNumberingAfterBreak="0">
+  <w:abstractNum w:abstractNumId="53" w15:restartNumberingAfterBreak="0">
     <w:nsid w:val="40890F92"/>
     <w:multiLevelType w:val="multilevel"/>
     <w:tmpl w:val="19DEC10E"/>
@@ -30354,7 +31429,7 @@
       </w:rPr>
     </w:lvl>
   </w:abstractNum>
-  <w:abstractNum w:abstractNumId="52" w15:restartNumberingAfterBreak="0">
+  <w:abstractNum w:abstractNumId="54" w15:restartNumberingAfterBreak="0">
     <w:nsid w:val="415C2938"/>
     <w:multiLevelType w:val="multilevel"/>
     <w:tmpl w:val="23C2479E"/>
@@ -30503,7 +31578,7 @@
       </w:rPr>
     </w:lvl>
   </w:abstractNum>
-  <w:abstractNum w:abstractNumId="53" w15:restartNumberingAfterBreak="0">
+  <w:abstractNum w:abstractNumId="55" w15:restartNumberingAfterBreak="0">
     <w:nsid w:val="4181329B"/>
     <w:multiLevelType w:val="multilevel"/>
     <w:tmpl w:val="DEACF4A6"/>
@@ -30652,7 +31727,7 @@
       </w:rPr>
     </w:lvl>
   </w:abstractNum>
-  <w:abstractNum w:abstractNumId="54" w15:restartNumberingAfterBreak="0">
+  <w:abstractNum w:abstractNumId="56" w15:restartNumberingAfterBreak="0">
     <w:nsid w:val="418834FC"/>
     <w:multiLevelType w:val="multilevel"/>
     <w:tmpl w:val="BEE04852"/>
@@ -30801,7 +31876,7 @@
       </w:rPr>
     </w:lvl>
   </w:abstractNum>
-  <w:abstractNum w:abstractNumId="55" w15:restartNumberingAfterBreak="0">
+  <w:abstractNum w:abstractNumId="57" w15:restartNumberingAfterBreak="0">
     <w:nsid w:val="41F642CE"/>
     <w:multiLevelType w:val="multilevel"/>
     <w:tmpl w:val="55A291E0"/>
@@ -30950,7 +32025,7 @@
       </w:rPr>
     </w:lvl>
   </w:abstractNum>
-  <w:abstractNum w:abstractNumId="56" w15:restartNumberingAfterBreak="0">
+  <w:abstractNum w:abstractNumId="58" w15:restartNumberingAfterBreak="0">
     <w:nsid w:val="422D07EF"/>
     <w:multiLevelType w:val="multilevel"/>
     <w:tmpl w:val="DEACF4A6"/>
@@ -31099,7 +32174,7 @@
       </w:rPr>
     </w:lvl>
   </w:abstractNum>
-  <w:abstractNum w:abstractNumId="57" w15:restartNumberingAfterBreak="0">
+  <w:abstractNum w:abstractNumId="59" w15:restartNumberingAfterBreak="0">
     <w:nsid w:val="459941E7"/>
     <w:multiLevelType w:val="multilevel"/>
     <w:tmpl w:val="E870D406"/>
@@ -31248,7 +32323,7 @@
       </w:rPr>
     </w:lvl>
   </w:abstractNum>
-  <w:abstractNum w:abstractNumId="58" w15:restartNumberingAfterBreak="0">
+  <w:abstractNum w:abstractNumId="60" w15:restartNumberingAfterBreak="0">
     <w:nsid w:val="47FA068A"/>
     <w:multiLevelType w:val="multilevel"/>
     <w:tmpl w:val="1C4280A4"/>
@@ -31397,7 +32472,7 @@
       </w:rPr>
     </w:lvl>
   </w:abstractNum>
-  <w:abstractNum w:abstractNumId="59" w15:restartNumberingAfterBreak="0">
+  <w:abstractNum w:abstractNumId="61" w15:restartNumberingAfterBreak="0">
     <w:nsid w:val="499347E1"/>
     <w:multiLevelType w:val="multilevel"/>
     <w:tmpl w:val="A69AFF14"/>
@@ -31546,7 +32621,156 @@
       </w:rPr>
     </w:lvl>
   </w:abstractNum>
-  <w:abstractNum w:abstractNumId="60" w15:restartNumberingAfterBreak="0">
+  <w:abstractNum w:abstractNumId="62" w15:restartNumberingAfterBreak="0">
+    <w:nsid w:val="49AC00E4"/>
+    <w:multiLevelType w:val="multilevel"/>
+    <w:tmpl w:val="D3586A0C"/>
+    <w:lvl w:ilvl="0">
+      <w:start w:val="1"/>
+      <w:numFmt w:val="bullet"/>
+      <w:lvlText w:val=""/>
+      <w:lvlJc w:val="left"/>
+      <w:pPr>
+        <w:tabs>
+          <w:tab w:val="num" w:pos="720"/>
+        </w:tabs>
+        <w:ind w:left="720" w:hanging="360"/>
+      </w:pPr>
+      <w:rPr>
+        <w:rFonts w:ascii="Symbol" w:hAnsi="Symbol" w:hint="default"/>
+        <w:sz w:val="20"/>
+      </w:rPr>
+    </w:lvl>
+    <w:lvl w:ilvl="1" w:tentative="1">
+      <w:start w:val="1"/>
+      <w:numFmt w:val="bullet"/>
+      <w:lvlText w:val="o"/>
+      <w:lvlJc w:val="left"/>
+      <w:pPr>
+        <w:tabs>
+          <w:tab w:val="num" w:pos="1440"/>
+        </w:tabs>
+        <w:ind w:left="1440" w:hanging="360"/>
+      </w:pPr>
+      <w:rPr>
+        <w:rFonts w:ascii="Courier New" w:hAnsi="Courier New" w:hint="default"/>
+        <w:sz w:val="20"/>
+      </w:rPr>
+    </w:lvl>
+    <w:lvl w:ilvl="2" w:tentative="1">
+      <w:start w:val="1"/>
+      <w:numFmt w:val="bullet"/>
+      <w:lvlText w:val=""/>
+      <w:lvlJc w:val="left"/>
+      <w:pPr>
+        <w:tabs>
+          <w:tab w:val="num" w:pos="2160"/>
+        </w:tabs>
+        <w:ind w:left="2160" w:hanging="360"/>
+      </w:pPr>
+      <w:rPr>
+        <w:rFonts w:ascii="Wingdings" w:hAnsi="Wingdings" w:hint="default"/>
+        <w:sz w:val="20"/>
+      </w:rPr>
+    </w:lvl>
+    <w:lvl w:ilvl="3" w:tentative="1">
+      <w:start w:val="1"/>
+      <w:numFmt w:val="bullet"/>
+      <w:lvlText w:val=""/>
+      <w:lvlJc w:val="left"/>
+      <w:pPr>
+        <w:tabs>
+          <w:tab w:val="num" w:pos="2880"/>
+        </w:tabs>
+        <w:ind w:left="2880" w:hanging="360"/>
+      </w:pPr>
+      <w:rPr>
+        <w:rFonts w:ascii="Wingdings" w:hAnsi="Wingdings" w:hint="default"/>
+        <w:sz w:val="20"/>
+      </w:rPr>
+    </w:lvl>
+    <w:lvl w:ilvl="4" w:tentative="1">
+      <w:start w:val="1"/>
+      <w:numFmt w:val="bullet"/>
+      <w:lvlText w:val=""/>
+      <w:lvlJc w:val="left"/>
+      <w:pPr>
+        <w:tabs>
+          <w:tab w:val="num" w:pos="3600"/>
+        </w:tabs>
+        <w:ind w:left="3600" w:hanging="360"/>
+      </w:pPr>
+      <w:rPr>
+        <w:rFonts w:ascii="Wingdings" w:hAnsi="Wingdings" w:hint="default"/>
+        <w:sz w:val="20"/>
+      </w:rPr>
+    </w:lvl>
+    <w:lvl w:ilvl="5" w:tentative="1">
+      <w:start w:val="1"/>
+      <w:numFmt w:val="bullet"/>
+      <w:lvlText w:val=""/>
+      <w:lvlJc w:val="left"/>
+      <w:pPr>
+        <w:tabs>
+          <w:tab w:val="num" w:pos="4320"/>
+        </w:tabs>
+        <w:ind w:left="4320" w:hanging="360"/>
+      </w:pPr>
+      <w:rPr>
+        <w:rFonts w:ascii="Wingdings" w:hAnsi="Wingdings" w:hint="default"/>
+        <w:sz w:val="20"/>
+      </w:rPr>
+    </w:lvl>
+    <w:lvl w:ilvl="6" w:tentative="1">
+      <w:start w:val="1"/>
+      <w:numFmt w:val="bullet"/>
+      <w:lvlText w:val=""/>
+      <w:lvlJc w:val="left"/>
+      <w:pPr>
+        <w:tabs>
+          <w:tab w:val="num" w:pos="5040"/>
+        </w:tabs>
+        <w:ind w:left="5040" w:hanging="360"/>
+      </w:pPr>
+      <w:rPr>
+        <w:rFonts w:ascii="Wingdings" w:hAnsi="Wingdings" w:hint="default"/>
+        <w:sz w:val="20"/>
+      </w:rPr>
+    </w:lvl>
+    <w:lvl w:ilvl="7" w:tentative="1">
+      <w:start w:val="1"/>
+      <w:numFmt w:val="bullet"/>
+      <w:lvlText w:val=""/>
+      <w:lvlJc w:val="left"/>
+      <w:pPr>
+        <w:tabs>
+          <w:tab w:val="num" w:pos="5760"/>
+        </w:tabs>
+        <w:ind w:left="5760" w:hanging="360"/>
+      </w:pPr>
+      <w:rPr>
+        <w:rFonts w:ascii="Wingdings" w:hAnsi="Wingdings" w:hint="default"/>
+        <w:sz w:val="20"/>
+      </w:rPr>
+    </w:lvl>
+    <w:lvl w:ilvl="8" w:tentative="1">
+      <w:start w:val="1"/>
+      <w:numFmt w:val="bullet"/>
+      <w:lvlText w:val=""/>
+      <w:lvlJc w:val="left"/>
+      <w:pPr>
+        <w:tabs>
+          <w:tab w:val="num" w:pos="6480"/>
+        </w:tabs>
+        <w:ind w:left="6480" w:hanging="360"/>
+      </w:pPr>
+      <w:rPr>
+        <w:rFonts w:ascii="Wingdings" w:hAnsi="Wingdings" w:hint="default"/>
+        <w:sz w:val="20"/>
+      </w:rPr>
+    </w:lvl>
+  </w:abstractNum>
+  <w:abstractNum w:abstractNumId="63" w15:restartNumberingAfterBreak="0">
     <w:nsid w:val="4A37675A"/>
     <w:multiLevelType w:val="multilevel"/>
     <w:tmpl w:val="5CAA72DA"/>
@@ -31695,7 +32919,7 @@
       </w:rPr>
     </w:lvl>
   </w:abstractNum>
-  <w:abstractNum w:abstractNumId="61" w15:restartNumberingAfterBreak="0">
+  <w:abstractNum w:abstractNumId="64" w15:restartNumberingAfterBreak="0">
     <w:nsid w:val="4A7938A8"/>
     <w:multiLevelType w:val="multilevel"/>
     <w:tmpl w:val="6FC2FDEA"/>
@@ -31844,7 +33068,7 @@
       </w:rPr>
     </w:lvl>
   </w:abstractNum>
-  <w:abstractNum w:abstractNumId="62" w15:restartNumberingAfterBreak="0">
+  <w:abstractNum w:abstractNumId="65" w15:restartNumberingAfterBreak="0">
     <w:nsid w:val="4A916050"/>
     <w:multiLevelType w:val="multilevel"/>
     <w:tmpl w:val="DEACF4A6"/>
@@ -31993,7 +33217,7 @@
       </w:rPr>
     </w:lvl>
   </w:abstractNum>
-  <w:abstractNum w:abstractNumId="63" w15:restartNumberingAfterBreak="0">
+  <w:abstractNum w:abstractNumId="66" w15:restartNumberingAfterBreak="0">
     <w:nsid w:val="4D435794"/>
     <w:multiLevelType w:val="multilevel"/>
     <w:tmpl w:val="01C8C402"/>
@@ -32142,7 +33366,7 @@
       </w:rPr>
     </w:lvl>
   </w:abstractNum>
-  <w:abstractNum w:abstractNumId="64" w15:restartNumberingAfterBreak="0">
+  <w:abstractNum w:abstractNumId="67" w15:restartNumberingAfterBreak="0">
     <w:nsid w:val="4E2E7287"/>
     <w:multiLevelType w:val="multilevel"/>
     <w:tmpl w:val="DEACF4A6"/>
@@ -32291,7 +33515,7 @@
       </w:rPr>
     </w:lvl>
   </w:abstractNum>
-  <w:abstractNum w:abstractNumId="65" w15:restartNumberingAfterBreak="0">
+  <w:abstractNum w:abstractNumId="68" w15:restartNumberingAfterBreak="0">
     <w:nsid w:val="4EAE3361"/>
     <w:multiLevelType w:val="multilevel"/>
     <w:tmpl w:val="B866B10A"/>
@@ -32440,7 +33664,124 @@
       </w:rPr>
     </w:lvl>
   </w:abstractNum>
-  <w:abstractNum w:abstractNumId="66" w15:restartNumberingAfterBreak="0">
+  <w:abstractNum w:abstractNumId="69" w15:restartNumberingAfterBreak="0">
+    <w:nsid w:val="50C010A8"/>
+    <w:multiLevelType w:val="multilevel"/>
+    <w:tmpl w:val="7FF6A5C6"/>
+    <w:lvl w:ilvl="0">
+      <w:start w:val="1"/>
+      <w:numFmt w:val="decimal"/>
+      <w:lvlText w:val="%1."/>
+      <w:lvlJc w:val="left"/>
+      <w:pPr>
+        <w:tabs>
+          <w:tab w:val="num" w:pos="720"/>
+        </w:tabs>
+        <w:ind w:left="720" w:hanging="360"/>
+      </w:pPr>
+    </w:lvl>
+    <w:lvl w:ilvl="1">
+      <w:start w:val="1"/>
+      <w:numFmt w:val="bullet"/>
+      <w:lvlText w:val="o"/>
+      <w:lvlJc w:val="left"/>
+      <w:pPr>
+        <w:tabs>
+          <w:tab w:val="num" w:pos="1440"/>
+        </w:tabs>
+        <w:ind w:left="1440" w:hanging="360"/>
+      </w:pPr>
+      <w:rPr>
+        <w:rFonts w:ascii="Courier New" w:hAnsi="Courier New" w:hint="default"/>
+        <w:sz w:val="20"/>
+      </w:rPr>
+    </w:lvl>
+    <w:lvl w:ilvl="2" w:tentative="1">
+      <w:start w:val="1"/>
+      <w:numFmt w:val="decimal"/>
+      <w:lvlText w:val="%3."/>
+      <w:lvlJc w:val="left"/>
+      <w:pPr>
+        <w:tabs>
+          <w:tab w:val="num" w:pos="2160"/>
+        </w:tabs>
+        <w:ind w:left="2160" w:hanging="360"/>
+      </w:pPr>
+    </w:lvl>
+    <w:lvl w:ilvl="3" w:tentative="1">
+      <w:start w:val="1"/>
+      <w:numFmt w:val="decimal"/>
+      <w:lvlText w:val="%4."/>
+      <w:lvlJc w:val="left"/>
+      <w:pPr>
+        <w:tabs>
+          <w:tab w:val="num" w:pos="2880"/>
+        </w:tabs>
+        <w:ind w:left="2880" w:hanging="360"/>
+      </w:pPr>
+    </w:lvl>
+    <w:lvl w:ilvl="4" w:tentative="1">
+      <w:start w:val="1"/>
+      <w:numFmt w:val="decimal"/>
+      <w:lvlText w:val="%5."/>
+      <w:lvlJc w:val="left"/>
+      <w:pPr>
+        <w:tabs>
+          <w:tab w:val="num" w:pos="3600"/>
+        </w:tabs>
+        <w:ind w:left="3600" w:hanging="360"/>
+      </w:pPr>
+    </w:lvl>
+    <w:lvl w:ilvl="5" w:tentative="1">
+      <w:start w:val="1"/>
+      <w:numFmt w:val="decimal"/>
+      <w:lvlText w:val="%6."/>
+      <w:lvlJc w:val="left"/>
+      <w:pPr>
+        <w:tabs>
+          <w:tab w:val="num" w:pos="4320"/>
+        </w:tabs>
+        <w:ind w:left="4320" w:hanging="360"/>
+      </w:pPr>
+    </w:lvl>
+    <w:lvl w:ilvl="6" w:tentative="1">
+      <w:start w:val="1"/>
+      <w:numFmt w:val="decimal"/>
+      <w:lvlText w:val="%7."/>
+      <w:lvlJc w:val="left"/>
+      <w:pPr>
+        <w:tabs>
+          <w:tab w:val="num" w:pos="5040"/>
+        </w:tabs>
+        <w:ind w:left="5040" w:hanging="360"/>
+      </w:pPr>
+    </w:lvl>
+    <w:lvl w:ilvl="7" w:tentative="1">
+      <w:start w:val="1"/>
+      <w:numFmt w:val="decimal"/>
+      <w:lvlText w:val="%8."/>
+      <w:lvlJc w:val="left"/>
+      <w:pPr>
+        <w:tabs>
+          <w:tab w:val="num" w:pos="5760"/>
+        </w:tabs>
+        <w:ind w:left="5760" w:hanging="360"/>
+      </w:pPr>
+    </w:lvl>
+    <w:lvl w:ilvl="8" w:tentative="1">
+      <w:start w:val="1"/>
+      <w:numFmt w:val="decimal"/>
+      <w:lvlText w:val="%9."/>
+      <w:lvlJc w:val="left"/>
+      <w:pPr>
+        <w:tabs>
+          <w:tab w:val="num" w:pos="6480"/>
+        </w:tabs>
+        <w:ind w:left="6480" w:hanging="360"/>
+      </w:pPr>
+    </w:lvl>
+  </w:abstractNum>
+  <w:abstractNum w:abstractNumId="70" w15:restartNumberingAfterBreak="0">
     <w:nsid w:val="51491159"/>
     <w:multiLevelType w:val="multilevel"/>
     <w:tmpl w:val="856CF8B2"/>
@@ -32589,7 +33930,7 @@
       </w:rPr>
     </w:lvl>
   </w:abstractNum>
-  <w:abstractNum w:abstractNumId="67" w15:restartNumberingAfterBreak="0">
+  <w:abstractNum w:abstractNumId="71" w15:restartNumberingAfterBreak="0">
     <w:nsid w:val="523B5C17"/>
     <w:multiLevelType w:val="multilevel"/>
     <w:tmpl w:val="62E45FB0"/>
@@ -32738,7 +34079,7 @@
       </w:rPr>
     </w:lvl>
   </w:abstractNum>
-  <w:abstractNum w:abstractNumId="68" w15:restartNumberingAfterBreak="0">
+  <w:abstractNum w:abstractNumId="72" w15:restartNumberingAfterBreak="0">
     <w:nsid w:val="54E6346C"/>
     <w:multiLevelType w:val="multilevel"/>
     <w:tmpl w:val="C19AAF5E"/>
@@ -32887,7 +34228,7 @@
       </w:rPr>
     </w:lvl>
   </w:abstractNum>
-  <w:abstractNum w:abstractNumId="69" w15:restartNumberingAfterBreak="0">
+  <w:abstractNum w:abstractNumId="73" w15:restartNumberingAfterBreak="0">
     <w:nsid w:val="55376D85"/>
     <w:multiLevelType w:val="multilevel"/>
     <w:tmpl w:val="DEACF4A6"/>
@@ -33036,7 +34377,7 @@
       </w:rPr>
     </w:lvl>
   </w:abstractNum>
-  <w:abstractNum w:abstractNumId="70" w15:restartNumberingAfterBreak="0">
+  <w:abstractNum w:abstractNumId="74" w15:restartNumberingAfterBreak="0">
     <w:nsid w:val="560078D3"/>
     <w:multiLevelType w:val="hybridMultilevel"/>
     <w:tmpl w:val="F30A58D4"/>
@@ -33122,7 +34463,7 @@
       </w:pPr>
     </w:lvl>
   </w:abstractNum>
-  <w:abstractNum w:abstractNumId="71" w15:restartNumberingAfterBreak="0">
+  <w:abstractNum w:abstractNumId="75" w15:restartNumberingAfterBreak="0">
     <w:nsid w:val="56A96381"/>
     <w:multiLevelType w:val="multilevel"/>
     <w:tmpl w:val="1DB88E4A"/>
@@ -33271,7 +34612,7 @@
       </w:rPr>
     </w:lvl>
   </w:abstractNum>
-  <w:abstractNum w:abstractNumId="72" w15:restartNumberingAfterBreak="0">
+  <w:abstractNum w:abstractNumId="76" w15:restartNumberingAfterBreak="0">
     <w:nsid w:val="56DE45A4"/>
     <w:multiLevelType w:val="multilevel"/>
     <w:tmpl w:val="F1DE8CA8"/>
@@ -33420,7 +34761,7 @@
       </w:rPr>
     </w:lvl>
   </w:abstractNum>
-  <w:abstractNum w:abstractNumId="73" w15:restartNumberingAfterBreak="0">
+  <w:abstractNum w:abstractNumId="77" w15:restartNumberingAfterBreak="0">
     <w:nsid w:val="573729A6"/>
     <w:multiLevelType w:val="multilevel"/>
     <w:tmpl w:val="DEACF4A6"/>
@@ -33569,7 +34910,7 @@
       </w:rPr>
     </w:lvl>
   </w:abstractNum>
-  <w:abstractNum w:abstractNumId="74" w15:restartNumberingAfterBreak="0">
+  <w:abstractNum w:abstractNumId="78" w15:restartNumberingAfterBreak="0">
     <w:nsid w:val="57E235CD"/>
     <w:multiLevelType w:val="multilevel"/>
     <w:tmpl w:val="DEACF4A6"/>
@@ -33718,7 +35059,7 @@
       </w:rPr>
     </w:lvl>
   </w:abstractNum>
-  <w:abstractNum w:abstractNumId="75" w15:restartNumberingAfterBreak="0">
+  <w:abstractNum w:abstractNumId="79" w15:restartNumberingAfterBreak="0">
     <w:nsid w:val="587E1401"/>
     <w:multiLevelType w:val="multilevel"/>
     <w:tmpl w:val="32D0B74A"/>
@@ -33867,7 +35208,7 @@
       </w:rPr>
     </w:lvl>
   </w:abstractNum>
-  <w:abstractNum w:abstractNumId="76" w15:restartNumberingAfterBreak="0">
+  <w:abstractNum w:abstractNumId="80" w15:restartNumberingAfterBreak="0">
     <w:nsid w:val="58DA77D3"/>
     <w:multiLevelType w:val="multilevel"/>
     <w:tmpl w:val="496AECC8"/>
@@ -34016,7 +35357,7 @@
       </w:rPr>
     </w:lvl>
   </w:abstractNum>
-  <w:abstractNum w:abstractNumId="77" w15:restartNumberingAfterBreak="0">
+  <w:abstractNum w:abstractNumId="81" w15:restartNumberingAfterBreak="0">
     <w:nsid w:val="5AB5146E"/>
     <w:multiLevelType w:val="multilevel"/>
     <w:tmpl w:val="F79A82F0"/>
@@ -34165,7 +35506,7 @@
       </w:rPr>
     </w:lvl>
   </w:abstractNum>
-  <w:abstractNum w:abstractNumId="78" w15:restartNumberingAfterBreak="0">
+  <w:abstractNum w:abstractNumId="82" w15:restartNumberingAfterBreak="0">
     <w:nsid w:val="5B16276B"/>
     <w:multiLevelType w:val="multilevel"/>
     <w:tmpl w:val="B846DD08"/>
@@ -34314,7 +35655,7 @@
       </w:rPr>
     </w:lvl>
   </w:abstractNum>
-  <w:abstractNum w:abstractNumId="79" w15:restartNumberingAfterBreak="0">
+  <w:abstractNum w:abstractNumId="83" w15:restartNumberingAfterBreak="0">
     <w:nsid w:val="5B8B1F0F"/>
     <w:multiLevelType w:val="multilevel"/>
     <w:tmpl w:val="7276947C"/>
@@ -34463,7 +35804,7 @@
       </w:rPr>
     </w:lvl>
   </w:abstractNum>
-  <w:abstractNum w:abstractNumId="80" w15:restartNumberingAfterBreak="0">
+  <w:abstractNum w:abstractNumId="84" w15:restartNumberingAfterBreak="0">
     <w:nsid w:val="5C70747B"/>
     <w:multiLevelType w:val="multilevel"/>
     <w:tmpl w:val="D61EB76A"/>
@@ -34612,7 +35953,7 @@
       </w:rPr>
     </w:lvl>
   </w:abstractNum>
-  <w:abstractNum w:abstractNumId="81" w15:restartNumberingAfterBreak="0">
+  <w:abstractNum w:abstractNumId="85" w15:restartNumberingAfterBreak="0">
     <w:nsid w:val="5CB55C3E"/>
     <w:multiLevelType w:val="multilevel"/>
     <w:tmpl w:val="12BCF4F6"/>
@@ -34761,7 +36102,7 @@
       </w:rPr>
     </w:lvl>
   </w:abstractNum>
-  <w:abstractNum w:abstractNumId="82" w15:restartNumberingAfterBreak="0">
+  <w:abstractNum w:abstractNumId="86" w15:restartNumberingAfterBreak="0">
     <w:nsid w:val="5E330E1C"/>
     <w:multiLevelType w:val="multilevel"/>
     <w:tmpl w:val="F5B24378"/>
@@ -34882,7 +36223,7 @@
       </w:pPr>
     </w:lvl>
   </w:abstractNum>
-  <w:abstractNum w:abstractNumId="83" w15:restartNumberingAfterBreak="0">
+  <w:abstractNum w:abstractNumId="87" w15:restartNumberingAfterBreak="0">
     <w:nsid w:val="5E4013E7"/>
     <w:multiLevelType w:val="multilevel"/>
     <w:tmpl w:val="5406C0D6"/>
@@ -35031,7 +36372,7 @@
       </w:rPr>
     </w:lvl>
   </w:abstractNum>
-  <w:abstractNum w:abstractNumId="84" w15:restartNumberingAfterBreak="0">
+  <w:abstractNum w:abstractNumId="88" w15:restartNumberingAfterBreak="0">
     <w:nsid w:val="5E855BCE"/>
     <w:multiLevelType w:val="multilevel"/>
     <w:tmpl w:val="64E2A726"/>
@@ -35180,7 +36521,7 @@
       </w:rPr>
     </w:lvl>
   </w:abstractNum>
-  <w:abstractNum w:abstractNumId="85" w15:restartNumberingAfterBreak="0">
+  <w:abstractNum w:abstractNumId="89" w15:restartNumberingAfterBreak="0">
     <w:nsid w:val="5FF87B10"/>
     <w:multiLevelType w:val="multilevel"/>
     <w:tmpl w:val="DCBCD0F2"/>
@@ -35329,7 +36670,7 @@
       </w:rPr>
     </w:lvl>
   </w:abstractNum>
-  <w:abstractNum w:abstractNumId="86" w15:restartNumberingAfterBreak="0">
+  <w:abstractNum w:abstractNumId="90" w15:restartNumberingAfterBreak="0">
     <w:nsid w:val="60D47D6E"/>
     <w:multiLevelType w:val="multilevel"/>
     <w:tmpl w:val="7C100110"/>
@@ -35478,7 +36819,7 @@
       </w:rPr>
     </w:lvl>
   </w:abstractNum>
-  <w:abstractNum w:abstractNumId="87" w15:restartNumberingAfterBreak="0">
+  <w:abstractNum w:abstractNumId="91" w15:restartNumberingAfterBreak="0">
     <w:nsid w:val="64E90CE1"/>
     <w:multiLevelType w:val="multilevel"/>
     <w:tmpl w:val="9D2C4784"/>
@@ -35627,7 +36968,7 @@
       </w:rPr>
     </w:lvl>
   </w:abstractNum>
-  <w:abstractNum w:abstractNumId="88" w15:restartNumberingAfterBreak="0">
+  <w:abstractNum w:abstractNumId="92" w15:restartNumberingAfterBreak="0">
     <w:nsid w:val="65111CD7"/>
     <w:multiLevelType w:val="multilevel"/>
     <w:tmpl w:val="1756B308"/>
@@ -35776,7 +37117,7 @@
       </w:rPr>
     </w:lvl>
   </w:abstractNum>
-  <w:abstractNum w:abstractNumId="89" w15:restartNumberingAfterBreak="0">
+  <w:abstractNum w:abstractNumId="93" w15:restartNumberingAfterBreak="0">
     <w:nsid w:val="66F80A6D"/>
     <w:multiLevelType w:val="multilevel"/>
     <w:tmpl w:val="31862EF4"/>
@@ -35925,7 +37266,7 @@
       </w:rPr>
     </w:lvl>
   </w:abstractNum>
-  <w:abstractNum w:abstractNumId="90" w15:restartNumberingAfterBreak="0">
+  <w:abstractNum w:abstractNumId="94" w15:restartNumberingAfterBreak="0">
     <w:nsid w:val="678934E3"/>
     <w:multiLevelType w:val="multilevel"/>
     <w:tmpl w:val="5E38E4AC"/>
@@ -36074,7 +37415,7 @@
       </w:rPr>
     </w:lvl>
   </w:abstractNum>
-  <w:abstractNum w:abstractNumId="91" w15:restartNumberingAfterBreak="0">
+  <w:abstractNum w:abstractNumId="95" w15:restartNumberingAfterBreak="0">
     <w:nsid w:val="6B155A5B"/>
     <w:multiLevelType w:val="multilevel"/>
     <w:tmpl w:val="DEACF4A6"/>
@@ -36223,7 +37564,7 @@
       </w:rPr>
     </w:lvl>
   </w:abstractNum>
-  <w:abstractNum w:abstractNumId="92" w15:restartNumberingAfterBreak="0">
+  <w:abstractNum w:abstractNumId="96" w15:restartNumberingAfterBreak="0">
     <w:nsid w:val="6B660339"/>
     <w:multiLevelType w:val="multilevel"/>
     <w:tmpl w:val="8A4CFEBC"/>
@@ -36372,7 +37713,7 @@
       </w:rPr>
     </w:lvl>
   </w:abstractNum>
-  <w:abstractNum w:abstractNumId="93" w15:restartNumberingAfterBreak="0">
+  <w:abstractNum w:abstractNumId="97" w15:restartNumberingAfterBreak="0">
     <w:nsid w:val="6BC53BB3"/>
     <w:multiLevelType w:val="multilevel"/>
     <w:tmpl w:val="1AAA5DEA"/>
@@ -36521,7 +37862,7 @@
       </w:rPr>
     </w:lvl>
   </w:abstractNum>
-  <w:abstractNum w:abstractNumId="94" w15:restartNumberingAfterBreak="0">
+  <w:abstractNum w:abstractNumId="98" w15:restartNumberingAfterBreak="0">
     <w:nsid w:val="6BF2702D"/>
     <w:multiLevelType w:val="multilevel"/>
     <w:tmpl w:val="DEACF4A6"/>
@@ -36670,7 +38011,7 @@
       </w:rPr>
     </w:lvl>
   </w:abstractNum>
-  <w:abstractNum w:abstractNumId="95" w15:restartNumberingAfterBreak="0">
+  <w:abstractNum w:abstractNumId="99" w15:restartNumberingAfterBreak="0">
     <w:nsid w:val="6C95580B"/>
     <w:multiLevelType w:val="multilevel"/>
     <w:tmpl w:val="C8A61D28"/>
@@ -36819,7 +38160,7 @@
       </w:rPr>
     </w:lvl>
   </w:abstractNum>
-  <w:abstractNum w:abstractNumId="96" w15:restartNumberingAfterBreak="0">
+  <w:abstractNum w:abstractNumId="100" w15:restartNumberingAfterBreak="0">
     <w:nsid w:val="6EF74731"/>
     <w:multiLevelType w:val="multilevel"/>
     <w:tmpl w:val="DEACF4A6"/>
@@ -36968,7 +38309,7 @@
       </w:rPr>
     </w:lvl>
   </w:abstractNum>
-  <w:abstractNum w:abstractNumId="97" w15:restartNumberingAfterBreak="0">
+  <w:abstractNum w:abstractNumId="101" w15:restartNumberingAfterBreak="0">
     <w:nsid w:val="6F1676F9"/>
     <w:multiLevelType w:val="multilevel"/>
     <w:tmpl w:val="FF9EEDB0"/>
@@ -37117,7 +38458,7 @@
       </w:rPr>
     </w:lvl>
   </w:abstractNum>
-  <w:abstractNum w:abstractNumId="98" w15:restartNumberingAfterBreak="0">
+  <w:abstractNum w:abstractNumId="102" w15:restartNumberingAfterBreak="0">
     <w:nsid w:val="723767A4"/>
     <w:multiLevelType w:val="multilevel"/>
     <w:tmpl w:val="DEACF4A6"/>
@@ -37266,7 +38607,7 @@
       </w:rPr>
     </w:lvl>
   </w:abstractNum>
-  <w:abstractNum w:abstractNumId="99" w15:restartNumberingAfterBreak="0">
+  <w:abstractNum w:abstractNumId="103" w15:restartNumberingAfterBreak="0">
     <w:nsid w:val="74384A88"/>
     <w:multiLevelType w:val="multilevel"/>
     <w:tmpl w:val="0AF22E1E"/>
@@ -37383,7 +38724,7 @@
       </w:pPr>
     </w:lvl>
   </w:abstractNum>
-  <w:abstractNum w:abstractNumId="100" w15:restartNumberingAfterBreak="0">
+  <w:abstractNum w:abstractNumId="104" w15:restartNumberingAfterBreak="0">
     <w:nsid w:val="753718BF"/>
     <w:multiLevelType w:val="multilevel"/>
     <w:tmpl w:val="DEACF4A6"/>
@@ -37532,7 +38873,7 @@
       </w:rPr>
     </w:lvl>
   </w:abstractNum>
-  <w:abstractNum w:abstractNumId="101" w15:restartNumberingAfterBreak="0">
+  <w:abstractNum w:abstractNumId="105" w15:restartNumberingAfterBreak="0">
     <w:nsid w:val="78DE38B2"/>
     <w:multiLevelType w:val="multilevel"/>
     <w:tmpl w:val="A14C85F6"/>
@@ -37681,7 +39022,7 @@
       </w:rPr>
     </w:lvl>
   </w:abstractNum>
-  <w:abstractNum w:abstractNumId="102" w15:restartNumberingAfterBreak="0">
+  <w:abstractNum w:abstractNumId="106" w15:restartNumberingAfterBreak="0">
     <w:nsid w:val="78F113F9"/>
     <w:multiLevelType w:val="multilevel"/>
     <w:tmpl w:val="E6640F2E"/>
@@ -37830,7 +39171,7 @@
       </w:rPr>
     </w:lvl>
   </w:abstractNum>
-  <w:abstractNum w:abstractNumId="103" w15:restartNumberingAfterBreak="0">
+  <w:abstractNum w:abstractNumId="107" w15:restartNumberingAfterBreak="0">
     <w:nsid w:val="7A17119F"/>
     <w:multiLevelType w:val="multilevel"/>
     <w:tmpl w:val="7EDA17CA"/>
@@ -37979,7 +39320,7 @@
       </w:rPr>
     </w:lvl>
   </w:abstractNum>
-  <w:abstractNum w:abstractNumId="104" w15:restartNumberingAfterBreak="0">
+  <w:abstractNum w:abstractNumId="108" w15:restartNumberingAfterBreak="0">
     <w:nsid w:val="7B956861"/>
     <w:multiLevelType w:val="multilevel"/>
     <w:tmpl w:val="3A38D396"/>
@@ -38128,7 +39469,7 @@
       </w:rPr>
     </w:lvl>
   </w:abstractNum>
-  <w:abstractNum w:abstractNumId="105" w15:restartNumberingAfterBreak="0">
+  <w:abstractNum w:abstractNumId="109" w15:restartNumberingAfterBreak="0">
     <w:nsid w:val="7E0008E5"/>
     <w:multiLevelType w:val="multilevel"/>
     <w:tmpl w:val="D056215A"/>
@@ -38242,10 +39583,10 @@
     </w:lvl>
   </w:abstractNum>
   <w:num w:numId="1" w16cid:durableId="942803316">
-    <w:abstractNumId w:val="99"/>
+    <w:abstractNumId w:val="103"/>
   </w:num>
   <w:num w:numId="2" w16cid:durableId="270747766">
-    <w:abstractNumId w:val="86"/>
+    <w:abstractNumId w:val="90"/>
   </w:num>
   <w:num w:numId="3" w16cid:durableId="1032075383">
     <w:abstractNumId w:val="0"/>
@@ -38254,31 +39595,31 @@
     <w:abstractNumId w:val="15"/>
   </w:num>
   <w:num w:numId="5" w16cid:durableId="1179151838">
-    <w:abstractNumId w:val="85"/>
+    <w:abstractNumId w:val="89"/>
   </w:num>
   <w:num w:numId="6" w16cid:durableId="544101733">
-    <w:abstractNumId w:val="59"/>
+    <w:abstractNumId w:val="61"/>
   </w:num>
   <w:num w:numId="7" w16cid:durableId="4283976">
-    <w:abstractNumId w:val="104"/>
+    <w:abstractNumId w:val="108"/>
   </w:num>
   <w:num w:numId="8" w16cid:durableId="245917338">
-    <w:abstractNumId w:val="54"/>
+    <w:abstractNumId w:val="56"/>
   </w:num>
   <w:num w:numId="9" w16cid:durableId="609435230">
-    <w:abstractNumId w:val="60"/>
+    <w:abstractNumId w:val="63"/>
   </w:num>
   <w:num w:numId="10" w16cid:durableId="1472097361">
-    <w:abstractNumId w:val="65"/>
+    <w:abstractNumId w:val="68"/>
   </w:num>
   <w:num w:numId="11" w16cid:durableId="1364328853">
     <w:abstractNumId w:val="11"/>
   </w:num>
   <w:num w:numId="12" w16cid:durableId="316425971">
-    <w:abstractNumId w:val="77"/>
+    <w:abstractNumId w:val="81"/>
   </w:num>
   <w:num w:numId="13" w16cid:durableId="431825394">
-    <w:abstractNumId w:val="84"/>
+    <w:abstractNumId w:val="88"/>
   </w:num>
   <w:num w:numId="14" w16cid:durableId="834343080">
     <w:abstractNumId w:val="6"/>
@@ -38287,148 +39628,148 @@
     <w:abstractNumId w:val="2"/>
   </w:num>
   <w:num w:numId="16" w16cid:durableId="1432430141">
-    <w:abstractNumId w:val="24"/>
+    <w:abstractNumId w:val="25"/>
   </w:num>
   <w:num w:numId="17" w16cid:durableId="2146846462">
-    <w:abstractNumId w:val="20"/>
+    <w:abstractNumId w:val="21"/>
   </w:num>
   <w:num w:numId="18" w16cid:durableId="1871064906">
     <w:abstractNumId w:val="18"/>
   </w:num>
   <w:num w:numId="19" w16cid:durableId="2119134066">
-    <w:abstractNumId w:val="89"/>
+    <w:abstractNumId w:val="93"/>
   </w:num>
   <w:num w:numId="20" w16cid:durableId="579292118">
-    <w:abstractNumId w:val="80"/>
+    <w:abstractNumId w:val="84"/>
   </w:num>
   <w:num w:numId="21" w16cid:durableId="1781337550">
-    <w:abstractNumId w:val="33"/>
+    <w:abstractNumId w:val="34"/>
   </w:num>
   <w:num w:numId="22" w16cid:durableId="173957045">
     <w:abstractNumId w:val="14"/>
   </w:num>
   <w:num w:numId="23" w16cid:durableId="1053696051">
-    <w:abstractNumId w:val="78"/>
+    <w:abstractNumId w:val="82"/>
   </w:num>
   <w:num w:numId="24" w16cid:durableId="1229724906">
-    <w:abstractNumId w:val="40"/>
+    <w:abstractNumId w:val="42"/>
   </w:num>
   <w:num w:numId="25" w16cid:durableId="1105270786">
     <w:abstractNumId w:val="13"/>
   </w:num>
   <w:num w:numId="26" w16cid:durableId="181013303">
-    <w:abstractNumId w:val="36"/>
+    <w:abstractNumId w:val="37"/>
   </w:num>
   <w:num w:numId="27" w16cid:durableId="1005090841">
-    <w:abstractNumId w:val="72"/>
+    <w:abstractNumId w:val="76"/>
   </w:num>
   <w:num w:numId="28" w16cid:durableId="756709327">
-    <w:abstractNumId w:val="55"/>
+    <w:abstractNumId w:val="57"/>
   </w:num>
   <w:num w:numId="29" w16cid:durableId="1175075060">
     <w:abstractNumId w:val="17"/>
   </w:num>
   <w:num w:numId="30" w16cid:durableId="816338617">
-    <w:abstractNumId w:val="61"/>
+    <w:abstractNumId w:val="64"/>
   </w:num>
   <w:num w:numId="31" w16cid:durableId="811018014">
-    <w:abstractNumId w:val="63"/>
+    <w:abstractNumId w:val="66"/>
   </w:num>
   <w:num w:numId="32" w16cid:durableId="2007442846">
     <w:abstractNumId w:val="4"/>
   </w:num>
   <w:num w:numId="33" w16cid:durableId="557594128">
+    <w:abstractNumId w:val="28"/>
+  </w:num>
+  <w:num w:numId="34" w16cid:durableId="2058358458">
+    <w:abstractNumId w:val="85"/>
+  </w:num>
+  <w:num w:numId="35" w16cid:durableId="664430994">
+    <w:abstractNumId w:val="50"/>
+  </w:num>
+  <w:num w:numId="36" w16cid:durableId="1858736738">
+    <w:abstractNumId w:val="79"/>
+  </w:num>
+  <w:num w:numId="37" w16cid:durableId="1793285636">
+    <w:abstractNumId w:val="83"/>
+  </w:num>
+  <w:num w:numId="38" w16cid:durableId="49766020">
+    <w:abstractNumId w:val="94"/>
+  </w:num>
+  <w:num w:numId="39" w16cid:durableId="1444303552">
+    <w:abstractNumId w:val="22"/>
+  </w:num>
+  <w:num w:numId="40" w16cid:durableId="1190021365">
+    <w:abstractNumId w:val="99"/>
+  </w:num>
+  <w:num w:numId="41" w16cid:durableId="624238255">
+    <w:abstractNumId w:val="105"/>
+  </w:num>
+  <w:num w:numId="42" w16cid:durableId="1806924102">
+    <w:abstractNumId w:val="60"/>
+  </w:num>
+  <w:num w:numId="43" w16cid:durableId="1782604561">
+    <w:abstractNumId w:val="75"/>
+  </w:num>
+  <w:num w:numId="44" w16cid:durableId="1816292712">
+    <w:abstractNumId w:val="92"/>
+  </w:num>
+  <w:num w:numId="45" w16cid:durableId="873080635">
+    <w:abstractNumId w:val="70"/>
+  </w:num>
+  <w:num w:numId="46" w16cid:durableId="1561865549">
+    <w:abstractNumId w:val="72"/>
+  </w:num>
+  <w:num w:numId="47" w16cid:durableId="1555769635">
+    <w:abstractNumId w:val="31"/>
+  </w:num>
+  <w:num w:numId="48" w16cid:durableId="1605575889">
+    <w:abstractNumId w:val="106"/>
+  </w:num>
+  <w:num w:numId="49" w16cid:durableId="213855190">
+    <w:abstractNumId w:val="59"/>
+  </w:num>
+  <w:num w:numId="50" w16cid:durableId="69619266">
+    <w:abstractNumId w:val="23"/>
+  </w:num>
+  <w:num w:numId="51" w16cid:durableId="25254510">
     <w:abstractNumId w:val="27"/>
   </w:num>
-  <w:num w:numId="34" w16cid:durableId="2058358458">
-    <w:abstractNumId w:val="81"/>
+  <w:num w:numId="52" w16cid:durableId="813301875">
+    <w:abstractNumId w:val="107"/>
   </w:num>
-  <w:num w:numId="35" w16cid:durableId="664430994">
-    <w:abstractNumId w:val="48"/>
+  <w:num w:numId="53" w16cid:durableId="349066359">
+    <w:abstractNumId w:val="41"/>
   </w:num>
-  <w:num w:numId="36" w16cid:durableId="1858736738">
-    <w:abstractNumId w:val="75"/>
+  <w:num w:numId="54" w16cid:durableId="1827240326">
+    <w:abstractNumId w:val="46"/>
   </w:num>
-  <w:num w:numId="37" w16cid:durableId="1793285636">
-    <w:abstractNumId w:val="79"/>
+  <w:num w:numId="55" w16cid:durableId="1067726837">
+    <w:abstractNumId w:val="91"/>
   </w:num>
-  <w:num w:numId="38" w16cid:durableId="49766020">
-    <w:abstractNumId w:val="90"/>
+  <w:num w:numId="56" w16cid:durableId="1145976340">
+    <w:abstractNumId w:val="39"/>
   </w:num>
-  <w:num w:numId="39" w16cid:durableId="1444303552">
-    <w:abstractNumId w:val="21"/>
+  <w:num w:numId="57" w16cid:durableId="328758546">
+    <w:abstractNumId w:val="36"/>
   </w:num>
-  <w:num w:numId="40" w16cid:durableId="1190021365">
-    <w:abstractNumId w:val="95"/>
+  <w:num w:numId="58" w16cid:durableId="354310452">
+    <w:abstractNumId w:val="44"/>
   </w:num>
-  <w:num w:numId="41" w16cid:durableId="624238255">
-    <w:abstractNumId w:val="101"/>
-  </w:num>
-  <w:num w:numId="42" w16cid:durableId="1806924102">
-    <w:abstractNumId w:val="58"/>
-  </w:num>
-  <w:num w:numId="43" w16cid:durableId="1782604561">
+  <w:num w:numId="59" w16cid:durableId="1777402173">
     <w:abstractNumId w:val="71"/>
   </w:num>
-  <w:num w:numId="44" w16cid:durableId="1816292712">
-    <w:abstractNumId w:val="88"/>
-  </w:num>
-  <w:num w:numId="45" w16cid:durableId="873080635">
-    <w:abstractNumId w:val="66"/>
-  </w:num>
-  <w:num w:numId="46" w16cid:durableId="1561865549">
-    <w:abstractNumId w:val="68"/>
-  </w:num>
-  <w:num w:numId="47" w16cid:durableId="1555769635">
-    <w:abstractNumId w:val="30"/>
-  </w:num>
-  <w:num w:numId="48" w16cid:durableId="1605575889">
-    <w:abstractNumId w:val="102"/>
-  </w:num>
-  <w:num w:numId="49" w16cid:durableId="213855190">
-    <w:abstractNumId w:val="57"/>
-  </w:num>
-  <w:num w:numId="50" w16cid:durableId="69619266">
-    <w:abstractNumId w:val="22"/>
-  </w:num>
-  <w:num w:numId="51" w16cid:durableId="25254510">
-    <w:abstractNumId w:val="26"/>
-  </w:num>
-  <w:num w:numId="52" w16cid:durableId="813301875">
-    <w:abstractNumId w:val="103"/>
-  </w:num>
-  <w:num w:numId="53" w16cid:durableId="349066359">
-    <w:abstractNumId w:val="39"/>
-  </w:num>
-  <w:num w:numId="54" w16cid:durableId="1827240326">
-    <w:abstractNumId w:val="44"/>
-  </w:num>
-  <w:num w:numId="55" w16cid:durableId="1067726837">
-    <w:abstractNumId w:val="87"/>
-  </w:num>
-  <w:num w:numId="56" w16cid:durableId="1145976340">
-    <w:abstractNumId w:val="38"/>
-  </w:num>
-  <w:num w:numId="57" w16cid:durableId="328758546">
-    <w:abstractNumId w:val="35"/>
-  </w:num>
-  <w:num w:numId="58" w16cid:durableId="354310452">
-    <w:abstractNumId w:val="42"/>
-  </w:num>
-  <w:num w:numId="59" w16cid:durableId="1777402173">
-    <w:abstractNumId w:val="67"/>
-  </w:num>
   <w:num w:numId="60" w16cid:durableId="1878082184">
-    <w:abstractNumId w:val="97"/>
+    <w:abstractNumId w:val="101"/>
   </w:num>
   <w:num w:numId="61" w16cid:durableId="257717478">
     <w:abstractNumId w:val="12"/>
   </w:num>
   <w:num w:numId="62" w16cid:durableId="290208252">
-    <w:abstractNumId w:val="76"/>
+    <w:abstractNumId w:val="80"/>
   </w:num>
   <w:num w:numId="63" w16cid:durableId="921568839">
-    <w:abstractNumId w:val="29"/>
+    <w:abstractNumId w:val="30"/>
   </w:num>
   <w:num w:numId="64" w16cid:durableId="1601639283">
     <w:abstractNumId w:val="7"/>
@@ -38437,73 +39778,73 @@
     <w:abstractNumId w:val="5"/>
   </w:num>
   <w:num w:numId="66" w16cid:durableId="715392561">
-    <w:abstractNumId w:val="52"/>
+    <w:abstractNumId w:val="54"/>
   </w:num>
   <w:num w:numId="67" w16cid:durableId="2056079112">
-    <w:abstractNumId w:val="51"/>
+    <w:abstractNumId w:val="53"/>
   </w:num>
   <w:num w:numId="68" w16cid:durableId="2080126014">
-    <w:abstractNumId w:val="93"/>
+    <w:abstractNumId w:val="97"/>
   </w:num>
   <w:num w:numId="69" w16cid:durableId="1310135776">
-    <w:abstractNumId w:val="31"/>
+    <w:abstractNumId w:val="32"/>
   </w:num>
   <w:num w:numId="70" w16cid:durableId="1028986258">
-    <w:abstractNumId w:val="70"/>
+    <w:abstractNumId w:val="74"/>
   </w:num>
   <w:num w:numId="71" w16cid:durableId="1785491322">
-    <w:abstractNumId w:val="43"/>
+    <w:abstractNumId w:val="45"/>
   </w:num>
   <w:num w:numId="72" w16cid:durableId="230359834">
-    <w:abstractNumId w:val="92"/>
+    <w:abstractNumId w:val="96"/>
   </w:num>
   <w:num w:numId="73" w16cid:durableId="97215562">
     <w:abstractNumId w:val="10"/>
   </w:num>
   <w:num w:numId="74" w16cid:durableId="168567758">
-    <w:abstractNumId w:val="32"/>
+    <w:abstractNumId w:val="33"/>
   </w:num>
   <w:num w:numId="75" w16cid:durableId="130028596">
+    <w:abstractNumId w:val="102"/>
+  </w:num>
+  <w:num w:numId="76" w16cid:durableId="2045401898">
+    <w:abstractNumId w:val="48"/>
+  </w:num>
+  <w:num w:numId="77" w16cid:durableId="1810897170">
+    <w:abstractNumId w:val="52"/>
+  </w:num>
+  <w:num w:numId="78" w16cid:durableId="1994092115">
+    <w:abstractNumId w:val="43"/>
+  </w:num>
+  <w:num w:numId="79" w16cid:durableId="1675691065">
+    <w:abstractNumId w:val="65"/>
+  </w:num>
+  <w:num w:numId="80" w16cid:durableId="1682316995">
+    <w:abstractNumId w:val="35"/>
+  </w:num>
+  <w:num w:numId="81" w16cid:durableId="1522040136">
     <w:abstractNumId w:val="98"/>
   </w:num>
-  <w:num w:numId="76" w16cid:durableId="2045401898">
-    <w:abstractNumId w:val="46"/>
-  </w:num>
-  <w:num w:numId="77" w16cid:durableId="1810897170">
-    <w:abstractNumId w:val="50"/>
-  </w:num>
-  <w:num w:numId="78" w16cid:durableId="1994092115">
-    <w:abstractNumId w:val="41"/>
-  </w:num>
-  <w:num w:numId="79" w16cid:durableId="1675691065">
-    <w:abstractNumId w:val="62"/>
-  </w:num>
-  <w:num w:numId="80" w16cid:durableId="1682316995">
-    <w:abstractNumId w:val="34"/>
-  </w:num>
-  <w:num w:numId="81" w16cid:durableId="1522040136">
-    <w:abstractNumId w:val="94"/>
-  </w:num>
   <w:num w:numId="82" w16cid:durableId="592789119">
-    <w:abstractNumId w:val="37"/>
+    <w:abstractNumId w:val="38"/>
   </w:num>
   <w:num w:numId="83" w16cid:durableId="1100443382">
-    <w:abstractNumId w:val="96"/>
+    <w:abstractNumId w:val="100"/>
   </w:num>
   <w:num w:numId="84" w16cid:durableId="495994496">
-    <w:abstractNumId w:val="69"/>
+    <w:abstractNumId w:val="73"/>
   </w:num>
   <w:num w:numId="85" w16cid:durableId="1548757019">
     <w:abstractNumId w:val="1"/>
   </w:num>
   <w:num w:numId="86" w16cid:durableId="1047218572">
-    <w:abstractNumId w:val="45"/>
+    <w:abstractNumId w:val="47"/>
   </w:num>
   <w:num w:numId="87" w16cid:durableId="735973842">
-    <w:abstractNumId w:val="53"/>
+    <w:abstractNumId w:val="55"/>
   </w:num>
   <w:num w:numId="88" w16cid:durableId="627516981">
-    <w:abstractNumId w:val="25"/>
+    <w:abstractNumId w:val="26"/>
   </w:num>
   <w:num w:numId="89" w16cid:durableId="1932010567">
     <w:abstractNumId w:val="9"/>
@@ -38512,37 +39853,37 @@
     <w:abstractNumId w:val="3"/>
   </w:num>
   <w:num w:numId="91" w16cid:durableId="243686588">
-    <w:abstractNumId w:val="47"/>
+    <w:abstractNumId w:val="49"/>
   </w:num>
   <w:num w:numId="92" w16cid:durableId="1287276980">
-    <w:abstractNumId w:val="56"/>
+    <w:abstractNumId w:val="58"/>
   </w:num>
   <w:num w:numId="93" w16cid:durableId="2051223741">
-    <w:abstractNumId w:val="100"/>
+    <w:abstractNumId w:val="104"/>
   </w:num>
   <w:num w:numId="94" w16cid:durableId="1708751724">
-    <w:abstractNumId w:val="105"/>
+    <w:abstractNumId w:val="109"/>
   </w:num>
   <w:num w:numId="95" w16cid:durableId="2138178102">
-    <w:abstractNumId w:val="28"/>
+    <w:abstractNumId w:val="29"/>
   </w:num>
   <w:num w:numId="96" w16cid:durableId="299188647">
-    <w:abstractNumId w:val="23"/>
+    <w:abstractNumId w:val="24"/>
   </w:num>
   <w:num w:numId="97" w16cid:durableId="951012475">
-    <w:abstractNumId w:val="91"/>
+    <w:abstractNumId w:val="95"/>
   </w:num>
   <w:num w:numId="98" w16cid:durableId="1274361570">
-    <w:abstractNumId w:val="64"/>
+    <w:abstractNumId w:val="67"/>
   </w:num>
   <w:num w:numId="99" w16cid:durableId="1306357555">
-    <w:abstractNumId w:val="49"/>
+    <w:abstractNumId w:val="51"/>
   </w:num>
   <w:num w:numId="100" w16cid:durableId="327290992">
-    <w:abstractNumId w:val="74"/>
+    <w:abstractNumId w:val="78"/>
   </w:num>
   <w:num w:numId="101" w16cid:durableId="1990866381">
-    <w:abstractNumId w:val="73"/>
+    <w:abstractNumId w:val="77"/>
   </w:num>
   <w:num w:numId="102" w16cid:durableId="371266948">
     <w:abstractNumId w:val="8"/>
@@ -38551,13 +39892,25 @@
     <w:abstractNumId w:val="16"/>
   </w:num>
   <w:num w:numId="104" w16cid:durableId="1397819114">
-    <w:abstractNumId w:val="82"/>
+    <w:abstractNumId w:val="86"/>
   </w:num>
   <w:num w:numId="105" w16cid:durableId="1012728081">
-    <w:abstractNumId w:val="83"/>
+    <w:abstractNumId w:val="87"/>
   </w:num>
   <w:num w:numId="106" w16cid:durableId="1036468611">
     <w:abstractNumId w:val="19"/>
+  </w:num>
+  <w:num w:numId="107" w16cid:durableId="293871772">
+    <w:abstractNumId w:val="69"/>
+  </w:num>
+  <w:num w:numId="108" w16cid:durableId="1766875230">
+    <w:abstractNumId w:val="40"/>
+  </w:num>
+  <w:num w:numId="109" w16cid:durableId="695815868">
+    <w:abstractNumId w:val="20"/>
+  </w:num>
+  <w:num w:numId="110" w16cid:durableId="1980648420">
+    <w:abstractNumId w:val="62"/>
   </w:num>
   <w:numIdMacAtCleanup w:val="103"/>
 </w:numbering>
@@ -38962,6 +40315,10 @@
   <w:style w:type="paragraph" w:default="1" w:styleId="Normal">
     <w:name w:val="Normal"/>
     <w:qFormat/>
+    <w:rsid w:val="00BF39F9"/>
+    <w:rPr>
+      <w:noProof/>
+    </w:rPr>
   </w:style>
   <w:style w:type="paragraph" w:styleId="Heading1">
     <w:name w:val="heading 1"/>
@@ -39312,7 +40669,7 @@
     <w:basedOn w:val="Normal"/>
     <w:autoRedefine/>
     <w:qFormat/>
-    <w:rsid w:val="000D2298"/>
+    <w:rsid w:val="00644A46"/>
     <w:pPr>
       <w:tabs>
         <w:tab w:val="left" w:pos="916"/>
@@ -39337,7 +40694,6 @@
     </w:pPr>
     <w:rPr>
       <w:rFonts w:ascii="Courier New" w:eastAsiaTheme="majorEastAsia" w:hAnsi="Courier New" w:cs="Courier New"/>
-      <w:noProof/>
       <w:color w:val="00B050"/>
       <w:sz w:val="20"/>
       <w:szCs w:val="20"/>

</xml_diff>

<commit_message>
rolling mean or moving average
</commit_message>
<xml_diff>
--- a/Trading algorithm.docx
+++ b/Trading algorithm.docx
@@ -24670,7 +24670,7 @@
       </w:pPr>
       <w:r>
         <w:pict w14:anchorId="57FC5AA0">
-          <v:rect id="_x0000_i1138" style="width:0;height:1.5pt" o:hralign="center" o:hrstd="t" o:hr="t" fillcolor="#a0a0a0" stroked="f"/>
+          <v:rect id="_x0000_i1114" style="width:0;height:1.5pt" o:hralign="center" o:hrstd="t" o:hr="t" fillcolor="#a0a0a0" stroked="f"/>
         </w:pict>
       </w:r>
     </w:p>
@@ -24789,7 +24789,7 @@
       </w:pPr>
       <w:r>
         <w:pict w14:anchorId="072DA01E">
-          <v:rect id="_x0000_i1139" style="width:0;height:1.5pt" o:hralign="center" o:hrstd="t" o:hr="t" fillcolor="#a0a0a0" stroked="f"/>
+          <v:rect id="_x0000_i1115" style="width:0;height:1.5pt" o:hralign="center" o:hrstd="t" o:hr="t" fillcolor="#a0a0a0" stroked="f"/>
         </w:pict>
       </w:r>
     </w:p>
@@ -25103,7 +25103,7 @@
       </w:pPr>
       <w:r>
         <w:pict w14:anchorId="7C645944">
-          <v:rect id="_x0000_i1140" style="width:0;height:1.5pt" o:hralign="center" o:hrstd="t" o:hr="t" fillcolor="#a0a0a0" stroked="f"/>
+          <v:rect id="_x0000_i1116" style="width:0;height:1.5pt" o:hralign="center" o:hrstd="t" o:hr="t" fillcolor="#a0a0a0" stroked="f"/>
         </w:pict>
       </w:r>
     </w:p>
@@ -25331,7 +25331,7 @@
       </w:pPr>
       <w:r>
         <w:pict w14:anchorId="30C172A6">
-          <v:rect id="_x0000_i1141" style="width:0;height:1.5pt" o:hralign="center" o:hrstd="t" o:hr="t" fillcolor="#a0a0a0" stroked="f"/>
+          <v:rect id="_x0000_i1117" style="width:0;height:1.5pt" o:hralign="center" o:hrstd="t" o:hr="t" fillcolor="#a0a0a0" stroked="f"/>
         </w:pict>
       </w:r>
     </w:p>
@@ -25835,7 +25835,7 @@
       </w:pPr>
       <w:r>
         <w:pict w14:anchorId="3EFD7F4E">
-          <v:rect id="_x0000_i1164" style="width:0;height:1.5pt" o:hralign="center" o:hrstd="t" o:hr="t" fillcolor="#a0a0a0" stroked="f"/>
+          <v:rect id="_x0000_i1118" style="width:0;height:1.5pt" o:hralign="center" o:hrstd="t" o:hr="t" fillcolor="#a0a0a0" stroked="f"/>
         </w:pict>
       </w:r>
     </w:p>
@@ -25967,7 +25967,7 @@
       </w:pPr>
       <w:r>
         <w:pict w14:anchorId="1E09B81D">
-          <v:rect id="_x0000_i1165" style="width:0;height:1.5pt" o:hralign="center" o:hrstd="t" o:hr="t" fillcolor="#a0a0a0" stroked="f"/>
+          <v:rect id="_x0000_i1119" style="width:0;height:1.5pt" o:hralign="center" o:hrstd="t" o:hr="t" fillcolor="#a0a0a0" stroked="f"/>
         </w:pict>
       </w:r>
     </w:p>
@@ -26257,7 +26257,7 @@
       </w:pPr>
       <w:r>
         <w:pict w14:anchorId="75E8E821">
-          <v:rect id="_x0000_i1166" style="width:0;height:1.5pt" o:hralign="center" o:hrstd="t" o:hr="t" fillcolor="#a0a0a0" stroked="f"/>
+          <v:rect id="_x0000_i1120" style="width:0;height:1.5pt" o:hralign="center" o:hrstd="t" o:hr="t" fillcolor="#a0a0a0" stroked="f"/>
         </w:pict>
       </w:r>
     </w:p>
@@ -26764,7 +26764,7 @@
       </w:pPr>
       <w:r>
         <w:pict w14:anchorId="409DE650">
-          <v:rect id="_x0000_i1201" style="width:0;height:1.5pt" o:hralign="center" o:hrstd="t" o:hr="t" fillcolor="#a0a0a0" stroked="f"/>
+          <v:rect id="_x0000_i1121" style="width:0;height:1.5pt" o:hralign="center" o:hrstd="t" o:hr="t" fillcolor="#a0a0a0" stroked="f"/>
         </w:pict>
       </w:r>
     </w:p>
@@ -27078,7 +27078,7 @@
       </w:pPr>
       <w:r>
         <w:pict w14:anchorId="04996FB2">
-          <v:rect id="_x0000_i1202" style="width:0;height:1.5pt" o:hralign="center" o:hrstd="t" o:hr="t" fillcolor="#a0a0a0" stroked="f"/>
+          <v:rect id="_x0000_i1122" style="width:0;height:1.5pt" o:hralign="center" o:hrstd="t" o:hr="t" fillcolor="#a0a0a0" stroked="f"/>
         </w:pict>
       </w:r>
     </w:p>
@@ -27140,7 +27140,7 @@
       </w:pPr>
       <w:r>
         <w:pict w14:anchorId="0D5EB0F8">
-          <v:rect id="_x0000_i1203" style="width:0;height:1.5pt" o:hralign="center" o:hrstd="t" o:hr="t" fillcolor="#a0a0a0" stroked="f"/>
+          <v:rect id="_x0000_i1123" style="width:0;height:1.5pt" o:hralign="center" o:hrstd="t" o:hr="t" fillcolor="#a0a0a0" stroked="f"/>
         </w:pict>
       </w:r>
     </w:p>
@@ -27250,7 +27250,7 @@
       </w:pPr>
       <w:r>
         <w:pict w14:anchorId="04B7E181">
-          <v:rect id="_x0000_i1204" style="width:0;height:1.5pt" o:hralign="center" o:hrstd="t" o:hr="t" fillcolor="#a0a0a0" stroked="f"/>
+          <v:rect id="_x0000_i1124" style="width:0;height:1.5pt" o:hralign="center" o:hrstd="t" o:hr="t" fillcolor="#a0a0a0" stroked="f"/>
         </w:pict>
       </w:r>
     </w:p>
@@ -27319,6 +27319,896 @@
       <w:r>
         <w:t xml:space="preserve"> for statistical modeling, portfolio optimization, and ML models.</w:t>
       </w:r>
+    </w:p>
+    <w:p>
+      <w:pPr>
+        <w:ind w:firstLine="0"/>
+      </w:pPr>
+      <w:r>
+        <w:lastRenderedPageBreak/>
+        <w:drawing>
+          <wp:inline distT="0" distB="0" distL="0" distR="0" wp14:anchorId="26654F9E" wp14:editId="67795466">
+            <wp:extent cx="5943600" cy="2367915"/>
+            <wp:effectExtent l="0" t="0" r="0" b="0"/>
+            <wp:docPr id="1954469108" name="Picture 1" descr="A screenshot of a computer&#10;&#10;AI-generated content may be incorrect."/>
+            <wp:cNvGraphicFramePr>
+              <a:graphicFrameLocks xmlns:a="http://schemas.openxmlformats.org/drawingml/2006/main" noChangeAspect="1"/>
+            </wp:cNvGraphicFramePr>
+            <a:graphic xmlns:a="http://schemas.openxmlformats.org/drawingml/2006/main">
+              <a:graphicData uri="http://schemas.openxmlformats.org/drawingml/2006/picture">
+                <pic:pic xmlns:pic="http://schemas.openxmlformats.org/drawingml/2006/picture">
+                  <pic:nvPicPr>
+                    <pic:cNvPr id="1954469108" name="Picture 1" descr="A screenshot of a computer&#10;&#10;AI-generated content may be incorrect."/>
+                    <pic:cNvPicPr/>
+                  </pic:nvPicPr>
+                  <pic:blipFill>
+                    <a:blip r:embed="rId54"/>
+                    <a:stretch>
+                      <a:fillRect/>
+                    </a:stretch>
+                  </pic:blipFill>
+                  <pic:spPr>
+                    <a:xfrm>
+                      <a:off x="0" y="0"/>
+                      <a:ext cx="5943600" cy="2367915"/>
+                    </a:xfrm>
+                    <a:prstGeom prst="rect">
+                      <a:avLst/>
+                    </a:prstGeom>
+                  </pic:spPr>
+                </pic:pic>
+              </a:graphicData>
+            </a:graphic>
+          </wp:inline>
+        </w:drawing>
+      </w:r>
+    </w:p>
+    <w:p>
+      <w:pPr>
+        <w:ind w:firstLine="0"/>
+        <w:rPr>
+          <w:b/>
+          <w:bCs/>
+        </w:rPr>
+      </w:pPr>
+      <w:r>
+        <w:rPr>
+          <w:b/>
+          <w:bCs/>
+        </w:rPr>
+        <w:t>Error Explanation:</w:t>
+      </w:r>
+    </w:p>
+    <w:p>
+      <w:pPr>
+        <w:ind w:firstLine="0"/>
+      </w:pPr>
+      <w:r>
+        <w:t>The error you’re encountering is:</w:t>
+      </w:r>
+    </w:p>
+    <w:p>
+      <w:pPr>
+        <w:ind w:firstLine="0"/>
+      </w:pPr>
+      <w:r>
+        <w:t>AttributeError: 'DataFrame' object has no attribute 'to_frame'</w:t>
+      </w:r>
+    </w:p>
+    <w:p>
+      <w:pPr>
+        <w:ind w:firstLine="0"/>
+      </w:pPr>
+      <w:r>
+        <w:t>This error is caused by calling .to_frame() on a Series object incorrectly.</w:t>
+      </w:r>
+    </w:p>
+    <w:p>
+      <w:pPr>
+        <w:ind w:firstLine="0"/>
+        <w:rPr>
+          <w:b/>
+          <w:bCs/>
+        </w:rPr>
+      </w:pPr>
+      <w:r>
+        <w:rPr>
+          <w:b/>
+          <w:bCs/>
+        </w:rPr>
+        <w:t>Root Cause:</w:t>
+      </w:r>
+    </w:p>
+    <w:p>
+      <w:pPr>
+        <w:numPr>
+          <w:ilvl w:val="0"/>
+          <w:numId w:val="146"/>
+        </w:numPr>
+      </w:pPr>
+      <w:r>
+        <w:rPr>
+          <w:b/>
+          <w:bCs/>
+        </w:rPr>
+        <w:t>yf.download("SPY")</w:t>
+      </w:r>
+      <w:r>
+        <w:t xml:space="preserve"> returns a DataFrame with multiple columns (like Open, High, Low, Close, Volume).</w:t>
+      </w:r>
+    </w:p>
+    <w:p>
+      <w:pPr>
+        <w:numPr>
+          <w:ilvl w:val="0"/>
+          <w:numId w:val="146"/>
+        </w:numPr>
+      </w:pPr>
+      <w:r>
+        <w:t xml:space="preserve">When you extract the Close column, you should be working with a </w:t>
+      </w:r>
+      <w:r>
+        <w:rPr>
+          <w:b/>
+          <w:bCs/>
+        </w:rPr>
+        <w:t>Series</w:t>
+      </w:r>
+      <w:r>
+        <w:t xml:space="preserve"> object.</w:t>
+      </w:r>
+    </w:p>
+    <w:p>
+      <w:pPr>
+        <w:numPr>
+          <w:ilvl w:val="0"/>
+          <w:numId w:val="146"/>
+        </w:numPr>
+      </w:pPr>
+      <w:r>
+        <w:t xml:space="preserve">The correct method for a Series is </w:t>
+      </w:r>
+      <w:r>
+        <w:rPr>
+          <w:b/>
+          <w:bCs/>
+        </w:rPr>
+        <w:t>.to_frame()</w:t>
+      </w:r>
+      <w:r>
+        <w:t xml:space="preserve"> (note the correct capitalization of frame).</w:t>
+      </w:r>
+    </w:p>
+    <w:p>
+      <w:pPr>
+        <w:ind w:firstLine="0"/>
+        <w:rPr>
+          <w:b/>
+          <w:bCs/>
+        </w:rPr>
+      </w:pPr>
+      <w:r>
+        <w:rPr>
+          <w:b/>
+          <w:bCs/>
+        </w:rPr>
+        <w:t>Solution:</w:t>
+      </w:r>
+    </w:p>
+    <w:p>
+      <w:pPr>
+        <w:ind w:firstLine="0"/>
+      </w:pPr>
+      <w:r>
+        <w:t>To fix this error, modify the code like this:</w:t>
+      </w:r>
+    </w:p>
+    <w:p>
+      <w:pPr>
+        <w:ind w:firstLine="0"/>
+      </w:pPr>
+      <w:r>
+        <w:t># Download SPY data from Yahoo Finance</w:t>
+      </w:r>
+    </w:p>
+    <w:p>
+      <w:pPr>
+        <w:ind w:firstLine="0"/>
+      </w:pPr>
+      <w:r>
+        <w:t>SPY = yf.download("SPY")</w:t>
+      </w:r>
+    </w:p>
+    <w:p>
+      <w:pPr>
+        <w:ind w:firstLine="0"/>
+      </w:pPr>
+    </w:p>
+    <w:p>
+      <w:pPr>
+        <w:ind w:firstLine="0"/>
+      </w:pPr>
+      <w:r>
+        <w:t># Extract the 'Close' column and convert it to a DataFrame</w:t>
+      </w:r>
+    </w:p>
+    <w:p>
+      <w:pPr>
+        <w:ind w:firstLine="0"/>
+      </w:pPr>
+      <w:r>
+        <w:t>spy_close = SPY['Close'].to_frame()  # Correct usage of 'to_frame'</w:t>
+      </w:r>
+    </w:p>
+    <w:p>
+      <w:pPr>
+        <w:ind w:firstLine="0"/>
+        <w:rPr>
+          <w:b/>
+          <w:bCs/>
+        </w:rPr>
+      </w:pPr>
+      <w:r>
+        <w:rPr>
+          <w:b/>
+          <w:bCs/>
+        </w:rPr>
+        <w:lastRenderedPageBreak/>
+        <w:t>Explanation:</w:t>
+      </w:r>
+    </w:p>
+    <w:p>
+      <w:pPr>
+        <w:numPr>
+          <w:ilvl w:val="0"/>
+          <w:numId w:val="147"/>
+        </w:numPr>
+      </w:pPr>
+      <w:r>
+        <w:rPr>
+          <w:b/>
+          <w:bCs/>
+        </w:rPr>
+        <w:t>SPY['Close']</w:t>
+      </w:r>
+      <w:r>
+        <w:t xml:space="preserve">: Extracts the Close column from the DataFrame, which returns a </w:t>
+      </w:r>
+      <w:r>
+        <w:rPr>
+          <w:b/>
+          <w:bCs/>
+        </w:rPr>
+        <w:t>Series</w:t>
+      </w:r>
+      <w:r>
+        <w:t xml:space="preserve"> object.</w:t>
+      </w:r>
+    </w:p>
+    <w:p>
+      <w:pPr>
+        <w:numPr>
+          <w:ilvl w:val="0"/>
+          <w:numId w:val="147"/>
+        </w:numPr>
+      </w:pPr>
+      <w:r>
+        <w:rPr>
+          <w:b/>
+          <w:bCs/>
+        </w:rPr>
+        <w:t>.to_frame()</w:t>
+      </w:r>
+      <w:r>
+        <w:t>: Converts the Series to a DataFrame.</w:t>
+      </w:r>
+    </w:p>
+    <w:p>
+      <w:pPr>
+        <w:ind w:firstLine="0"/>
+      </w:pPr>
+      <w:r>
+        <w:pict w14:anchorId="165809A7">
+          <v:rect id="_x0000_i1131" style="width:0;height:1.5pt" o:hralign="center" o:hrstd="t" o:hr="t" fillcolor="#a0a0a0" stroked="f"/>
+        </w:pict>
+      </w:r>
+    </w:p>
+    <w:p>
+      <w:pPr>
+        <w:ind w:firstLine="0"/>
+        <w:rPr>
+          <w:b/>
+          <w:bCs/>
+        </w:rPr>
+      </w:pPr>
+      <w:r>
+        <w:rPr>
+          <w:b/>
+          <w:bCs/>
+        </w:rPr>
+        <w:t>Data Science Concept:</w:t>
+      </w:r>
+    </w:p>
+    <w:p>
+      <w:pPr>
+        <w:numPr>
+          <w:ilvl w:val="0"/>
+          <w:numId w:val="148"/>
+        </w:numPr>
+      </w:pPr>
+      <w:r>
+        <w:rPr>
+          <w:b/>
+          <w:bCs/>
+        </w:rPr>
+        <w:t>Series to DataFrame</w:t>
+      </w:r>
+      <w:r>
+        <w:t>:</w:t>
+      </w:r>
+    </w:p>
+    <w:p>
+      <w:pPr>
+        <w:numPr>
+          <w:ilvl w:val="1"/>
+          <w:numId w:val="148"/>
+        </w:numPr>
+      </w:pPr>
+      <w:r>
+        <w:t xml:space="preserve">When working with Pandas, a </w:t>
+      </w:r>
+      <w:r>
+        <w:rPr>
+          <w:b/>
+          <w:bCs/>
+        </w:rPr>
+        <w:t>Series</w:t>
+      </w:r>
+      <w:r>
+        <w:t xml:space="preserve"> is a single column from a DataFrame. To perform some operations that require a DataFrame (e.g., handling multiple columns), you may need to convert a Series back to a DataFrame.</w:t>
+      </w:r>
+    </w:p>
+    <w:p>
+      <w:pPr>
+        <w:ind w:firstLine="0"/>
+        <w:rPr>
+          <w:b/>
+          <w:bCs/>
+        </w:rPr>
+      </w:pPr>
+      <w:r>
+        <w:rPr>
+          <w:b/>
+          <w:bCs/>
+        </w:rPr>
+        <w:t>Notes on Code and Concepts:</w:t>
+      </w:r>
+    </w:p>
+    <w:p>
+      <w:pPr>
+        <w:ind w:firstLine="0"/>
+        <w:rPr>
+          <w:b/>
+          <w:bCs/>
+        </w:rPr>
+      </w:pPr>
+      <w:r>
+        <w:drawing>
+          <wp:inline distT="0" distB="0" distL="0" distR="0" wp14:anchorId="0307B4B3" wp14:editId="1AFEE937">
+            <wp:extent cx="5943600" cy="4032885"/>
+            <wp:effectExtent l="0" t="0" r="0" b="5715"/>
+            <wp:docPr id="622890334" name="Picture 1" descr="A screenshot of a computer&#10;&#10;AI-generated content may be incorrect."/>
+            <wp:cNvGraphicFramePr>
+              <a:graphicFrameLocks xmlns:a="http://schemas.openxmlformats.org/drawingml/2006/main" noChangeAspect="1"/>
+            </wp:cNvGraphicFramePr>
+            <a:graphic xmlns:a="http://schemas.openxmlformats.org/drawingml/2006/main">
+              <a:graphicData uri="http://schemas.openxmlformats.org/drawingml/2006/picture">
+                <pic:pic xmlns:pic="http://schemas.openxmlformats.org/drawingml/2006/picture">
+                  <pic:nvPicPr>
+                    <pic:cNvPr id="622890334" name="Picture 1" descr="A screenshot of a computer&#10;&#10;AI-generated content may be incorrect."/>
+                    <pic:cNvPicPr/>
+                  </pic:nvPicPr>
+                  <pic:blipFill>
+                    <a:blip r:embed="rId55"/>
+                    <a:stretch>
+                      <a:fillRect/>
+                    </a:stretch>
+                  </pic:blipFill>
+                  <pic:spPr>
+                    <a:xfrm>
+                      <a:off x="0" y="0"/>
+                      <a:ext cx="5943600" cy="4032885"/>
+                    </a:xfrm>
+                    <a:prstGeom prst="rect">
+                      <a:avLst/>
+                    </a:prstGeom>
+                  </pic:spPr>
+                </pic:pic>
+              </a:graphicData>
+            </a:graphic>
+          </wp:inline>
+        </w:drawing>
+      </w:r>
+    </w:p>
+    <w:p>
+      <w:pPr>
+        <w:ind w:firstLine="0"/>
+        <w:rPr>
+          <w:b/>
+          <w:bCs/>
+        </w:rPr>
+      </w:pPr>
+      <w:r>
+        <w:rPr>
+          <w:b/>
+          <w:bCs/>
+        </w:rPr>
+        <w:lastRenderedPageBreak/>
+        <w:t>Objective:</w:t>
+      </w:r>
+    </w:p>
+    <w:p>
+      <w:pPr>
+        <w:ind w:firstLine="0"/>
+      </w:pPr>
+      <w:r>
+        <w:t xml:space="preserve">The code applies </w:t>
+      </w:r>
+      <w:r>
+        <w:rPr>
+          <w:b/>
+          <w:bCs/>
+        </w:rPr>
+        <w:t>rolling window calculations</w:t>
+      </w:r>
+      <w:r>
+        <w:t xml:space="preserve"> to the SPY data, which is typically used in </w:t>
+      </w:r>
+      <w:r>
+        <w:rPr>
+          <w:b/>
+          <w:bCs/>
+        </w:rPr>
+        <w:t>time series analysis</w:t>
+      </w:r>
+      <w:r>
+        <w:t xml:space="preserve"> to smooth out fluctuations in data, providing a clearer picture of trends over time.</w:t>
+      </w:r>
+    </w:p>
+    <w:p>
+      <w:pPr>
+        <w:ind w:firstLine="0"/>
+        <w:rPr>
+          <w:b/>
+          <w:bCs/>
+        </w:rPr>
+      </w:pPr>
+      <w:r>
+        <w:rPr>
+          <w:b/>
+          <w:bCs/>
+        </w:rPr>
+        <w:t>Code Breakdown:</w:t>
+      </w:r>
+    </w:p>
+    <w:p>
+      <w:pPr>
+        <w:ind w:firstLine="0"/>
+      </w:pPr>
+      <w:r>
+        <w:t>spy_roll = spy.rolling(window=10)</w:t>
+      </w:r>
+    </w:p>
+    <w:p>
+      <w:pPr>
+        <w:numPr>
+          <w:ilvl w:val="0"/>
+          <w:numId w:val="149"/>
+        </w:numPr>
+      </w:pPr>
+      <w:r>
+        <w:rPr>
+          <w:b/>
+          <w:bCs/>
+        </w:rPr>
+        <w:t>rolling(window=10)</w:t>
+      </w:r>
+      <w:r>
+        <w:t>:</w:t>
+      </w:r>
+    </w:p>
+    <w:p>
+      <w:pPr>
+        <w:numPr>
+          <w:ilvl w:val="1"/>
+          <w:numId w:val="149"/>
+        </w:numPr>
+      </w:pPr>
+      <w:r>
+        <w:t xml:space="preserve">This is applying a rolling window calculation with a </w:t>
+      </w:r>
+      <w:r>
+        <w:rPr>
+          <w:b/>
+          <w:bCs/>
+        </w:rPr>
+        <w:t>window size of 10</w:t>
+      </w:r>
+      <w:r>
+        <w:t>.</w:t>
+      </w:r>
+    </w:p>
+    <w:p>
+      <w:pPr>
+        <w:numPr>
+          <w:ilvl w:val="1"/>
+          <w:numId w:val="149"/>
+        </w:numPr>
+      </w:pPr>
+      <w:r>
+        <w:t xml:space="preserve">A </w:t>
+      </w:r>
+      <w:r>
+        <w:rPr>
+          <w:b/>
+          <w:bCs/>
+        </w:rPr>
+        <w:t>rolling window</w:t>
+      </w:r>
+      <w:r>
+        <w:t xml:space="preserve"> is a method that uses a specified number of previous data points (here, 10) to compute a summary statistic for the current point.</w:t>
+      </w:r>
+    </w:p>
+    <w:p>
+      <w:pPr>
+        <w:numPr>
+          <w:ilvl w:val="1"/>
+          <w:numId w:val="149"/>
+        </w:numPr>
+      </w:pPr>
+      <w:r>
+        <w:t>For each data point in the series, the calculation uses the previous 10 values. For instance, for a rolling mean, it averages the previous 10 values.</w:t>
+      </w:r>
+    </w:p>
+    <w:p>
+      <w:pPr>
+        <w:ind w:firstLine="0"/>
+      </w:pPr>
+      <w:r>
+        <w:t>spy_roll = spy_roll.mean()</w:t>
+      </w:r>
+    </w:p>
+    <w:p>
+      <w:pPr>
+        <w:numPr>
+          <w:ilvl w:val="0"/>
+          <w:numId w:val="150"/>
+        </w:numPr>
+      </w:pPr>
+      <w:r>
+        <w:rPr>
+          <w:b/>
+          <w:bCs/>
+        </w:rPr>
+        <w:t>mean()</w:t>
+      </w:r>
+      <w:r>
+        <w:t>:</w:t>
+      </w:r>
+    </w:p>
+    <w:p>
+      <w:pPr>
+        <w:numPr>
+          <w:ilvl w:val="1"/>
+          <w:numId w:val="150"/>
+        </w:numPr>
+      </w:pPr>
+      <w:r>
+        <w:t xml:space="preserve">After applying the rolling window, this line calculates the </w:t>
+      </w:r>
+      <w:r>
+        <w:rPr>
+          <w:b/>
+          <w:bCs/>
+        </w:rPr>
+        <w:t>mean</w:t>
+      </w:r>
+      <w:r>
+        <w:t xml:space="preserve"> (average) of the values within each window.</w:t>
+      </w:r>
+    </w:p>
+    <w:p>
+      <w:pPr>
+        <w:numPr>
+          <w:ilvl w:val="1"/>
+          <w:numId w:val="150"/>
+        </w:numPr>
+      </w:pPr>
+      <w:r>
+        <w:t>It replaces each point in the series with the mean of the previous 10 points.</w:t>
+      </w:r>
+    </w:p>
+    <w:p>
+      <w:pPr>
+        <w:ind w:firstLine="0"/>
+        <w:rPr>
+          <w:b/>
+          <w:bCs/>
+        </w:rPr>
+      </w:pPr>
+      <w:r>
+        <w:rPr>
+          <w:b/>
+          <w:bCs/>
+        </w:rPr>
+        <w:t>Output Explanation:</w:t>
+      </w:r>
+    </w:p>
+    <w:p>
+      <w:pPr>
+        <w:numPr>
+          <w:ilvl w:val="0"/>
+          <w:numId w:val="151"/>
+        </w:numPr>
+      </w:pPr>
+      <w:r>
+        <w:rPr>
+          <w:b/>
+          <w:bCs/>
+        </w:rPr>
+        <w:t>NaN Values at the Start</w:t>
+      </w:r>
+      <w:r>
+        <w:t>:</w:t>
+      </w:r>
+    </w:p>
+    <w:p>
+      <w:pPr>
+        <w:numPr>
+          <w:ilvl w:val="1"/>
+          <w:numId w:val="151"/>
+        </w:numPr>
+      </w:pPr>
+      <w:r>
+        <w:t xml:space="preserve">The first </w:t>
+      </w:r>
+      <w:r>
+        <w:rPr>
+          <w:b/>
+          <w:bCs/>
+        </w:rPr>
+        <w:t>9</w:t>
+      </w:r>
+      <w:r>
+        <w:t xml:space="preserve"> rows have </w:t>
+      </w:r>
+      <w:r>
+        <w:rPr>
+          <w:b/>
+          <w:bCs/>
+        </w:rPr>
+        <w:t>NaN</w:t>
+      </w:r>
+      <w:r>
+        <w:t xml:space="preserve"> (Not a Number) values. This happens because the first 9 data points do not have a full 10 previous data points to calculate the rolling mean.</w:t>
+      </w:r>
+    </w:p>
+    <w:p>
+      <w:pPr>
+        <w:numPr>
+          <w:ilvl w:val="1"/>
+          <w:numId w:val="151"/>
+        </w:numPr>
+      </w:pPr>
+      <w:r>
+        <w:t>For a window of size 10, the first valid value for the rolling mean is calculated after the 10th data point.</w:t>
+      </w:r>
+    </w:p>
+    <w:p>
+      <w:pPr>
+        <w:numPr>
+          <w:ilvl w:val="0"/>
+          <w:numId w:val="151"/>
+        </w:numPr>
+      </w:pPr>
+      <w:r>
+        <w:rPr>
+          <w:b/>
+          <w:bCs/>
+        </w:rPr>
+        <w:lastRenderedPageBreak/>
+        <w:t>Valid Data from 2024</w:t>
+      </w:r>
+      <w:r>
+        <w:t>:</w:t>
+      </w:r>
+    </w:p>
+    <w:p>
+      <w:pPr>
+        <w:numPr>
+          <w:ilvl w:val="1"/>
+          <w:numId w:val="151"/>
+        </w:numPr>
+      </w:pPr>
+      <w:r>
+        <w:t xml:space="preserve">From the row starting with </w:t>
+      </w:r>
+      <w:r>
+        <w:rPr>
+          <w:b/>
+          <w:bCs/>
+        </w:rPr>
+        <w:t>2024-12-24</w:t>
+      </w:r>
+      <w:r>
+        <w:t>, the rolling mean calculation can finally be performed. The rolling mean is calculated using the last 10 data points, and you start seeing values for SPY.</w:t>
+      </w:r>
+    </w:p>
+    <w:p>
+      <w:pPr>
+        <w:ind w:firstLine="0"/>
+        <w:rPr>
+          <w:b/>
+          <w:bCs/>
+        </w:rPr>
+      </w:pPr>
+      <w:r>
+        <w:rPr>
+          <w:b/>
+          <w:bCs/>
+        </w:rPr>
+        <w:t>Concepts Explained:</w:t>
+      </w:r>
+    </w:p>
+    <w:p>
+      <w:pPr>
+        <w:numPr>
+          <w:ilvl w:val="0"/>
+          <w:numId w:val="152"/>
+        </w:numPr>
+      </w:pPr>
+      <w:r>
+        <w:rPr>
+          <w:b/>
+          <w:bCs/>
+        </w:rPr>
+        <w:t>Rolling Window</w:t>
+      </w:r>
+      <w:r>
+        <w:t>:</w:t>
+      </w:r>
+    </w:p>
+    <w:p>
+      <w:pPr>
+        <w:numPr>
+          <w:ilvl w:val="1"/>
+          <w:numId w:val="152"/>
+        </w:numPr>
+      </w:pPr>
+      <w:r>
+        <w:t>A rolling window allows you to apply a function (mean, sum, etc.) over a window of observations and move the window over time.</w:t>
+      </w:r>
+    </w:p>
+    <w:p>
+      <w:pPr>
+        <w:numPr>
+          <w:ilvl w:val="1"/>
+          <w:numId w:val="152"/>
+        </w:numPr>
+      </w:pPr>
+      <w:r>
+        <w:t>This is particularly useful for smoothing time series data and analyzing trends.</w:t>
+      </w:r>
+    </w:p>
+    <w:p>
+      <w:pPr>
+        <w:numPr>
+          <w:ilvl w:val="0"/>
+          <w:numId w:val="152"/>
+        </w:numPr>
+      </w:pPr>
+      <w:r>
+        <w:rPr>
+          <w:b/>
+          <w:bCs/>
+        </w:rPr>
+        <w:t>NaN Values</w:t>
+      </w:r>
+      <w:r>
+        <w:t>:</w:t>
+      </w:r>
+    </w:p>
+    <w:p>
+      <w:pPr>
+        <w:numPr>
+          <w:ilvl w:val="1"/>
+          <w:numId w:val="152"/>
+        </w:numPr>
+      </w:pPr>
+      <w:r>
+        <w:t>For a rolling mean with a window of size 10, the first 9 data points cannot have a rolling mean since there aren't enough data points to calculate the window (e.g., there are fewer than 10 data points before them).</w:t>
+      </w:r>
+    </w:p>
+    <w:p>
+      <w:pPr>
+        <w:numPr>
+          <w:ilvl w:val="1"/>
+          <w:numId w:val="152"/>
+        </w:numPr>
+      </w:pPr>
+      <w:r>
+        <w:t>As a result, they are filled with NaN values until the window is large enough to compute the first valid mean.</w:t>
+      </w:r>
+    </w:p>
+    <w:p>
+      <w:pPr>
+        <w:ind w:firstLine="0"/>
+      </w:pPr>
+      <w:r>
+        <w:pict w14:anchorId="397EF689">
+          <v:rect id="_x0000_i1139" style="width:0;height:1.5pt" o:hralign="center" o:hrstd="t" o:hr="t" fillcolor="#a0a0a0" stroked="f"/>
+        </w:pict>
+      </w:r>
+    </w:p>
+    <w:p>
+      <w:pPr>
+        <w:ind w:firstLine="0"/>
+        <w:rPr>
+          <w:b/>
+          <w:bCs/>
+        </w:rPr>
+      </w:pPr>
+      <w:r>
+        <w:rPr>
+          <w:b/>
+          <w:bCs/>
+        </w:rPr>
+        <w:t>Time Series Concept:</w:t>
+      </w:r>
+    </w:p>
+    <w:p>
+      <w:pPr>
+        <w:numPr>
+          <w:ilvl w:val="0"/>
+          <w:numId w:val="153"/>
+        </w:numPr>
+      </w:pPr>
+      <w:r>
+        <w:rPr>
+          <w:b/>
+          <w:bCs/>
+        </w:rPr>
+        <w:t>Rolling Mean</w:t>
+      </w:r>
+      <w:r>
+        <w:t>:</w:t>
+      </w:r>
+    </w:p>
+    <w:p>
+      <w:pPr>
+        <w:numPr>
+          <w:ilvl w:val="1"/>
+          <w:numId w:val="153"/>
+        </w:numPr>
+      </w:pPr>
+      <w:r>
+        <w:t xml:space="preserve">A </w:t>
+      </w:r>
+      <w:r>
+        <w:rPr>
+          <w:b/>
+          <w:bCs/>
+        </w:rPr>
+        <w:t>rolling mean</w:t>
+      </w:r>
+      <w:r>
+        <w:t xml:space="preserve"> (or moving average) is used in time series analysis to smooth fluctuations. It’s commonly used in financial analysis to understand price trends, such as for stock prices or indices like SPY.</w:t>
+      </w:r>
+    </w:p>
+    <w:p>
+      <w:pPr>
+        <w:ind w:firstLine="0"/>
+      </w:pPr>
     </w:p>
     <w:p>
       <w:pPr>
@@ -27636,6 +28526,155 @@
     </w:lvl>
   </w:abstractNum>
   <w:abstractNum w:abstractNumId="2" w15:restartNumberingAfterBreak="0">
+    <w:nsid w:val="030B67E6"/>
+    <w:multiLevelType w:val="multilevel"/>
+    <w:tmpl w:val="59EAEA3C"/>
+    <w:lvl w:ilvl="0">
+      <w:start w:val="1"/>
+      <w:numFmt w:val="bullet"/>
+      <w:lvlText w:val=""/>
+      <w:lvlJc w:val="left"/>
+      <w:pPr>
+        <w:tabs>
+          <w:tab w:val="num" w:pos="720"/>
+        </w:tabs>
+        <w:ind w:left="720" w:hanging="360"/>
+      </w:pPr>
+      <w:rPr>
+        <w:rFonts w:ascii="Symbol" w:hAnsi="Symbol" w:hint="default"/>
+        <w:sz w:val="20"/>
+      </w:rPr>
+    </w:lvl>
+    <w:lvl w:ilvl="1">
+      <w:start w:val="1"/>
+      <w:numFmt w:val="bullet"/>
+      <w:lvlText w:val="o"/>
+      <w:lvlJc w:val="left"/>
+      <w:pPr>
+        <w:tabs>
+          <w:tab w:val="num" w:pos="1440"/>
+        </w:tabs>
+        <w:ind w:left="1440" w:hanging="360"/>
+      </w:pPr>
+      <w:rPr>
+        <w:rFonts w:ascii="Courier New" w:hAnsi="Courier New" w:hint="default"/>
+        <w:sz w:val="20"/>
+      </w:rPr>
+    </w:lvl>
+    <w:lvl w:ilvl="2" w:tentative="1">
+      <w:start w:val="1"/>
+      <w:numFmt w:val="bullet"/>
+      <w:lvlText w:val=""/>
+      <w:lvlJc w:val="left"/>
+      <w:pPr>
+        <w:tabs>
+          <w:tab w:val="num" w:pos="2160"/>
+        </w:tabs>
+        <w:ind w:left="2160" w:hanging="360"/>
+      </w:pPr>
+      <w:rPr>
+        <w:rFonts w:ascii="Wingdings" w:hAnsi="Wingdings" w:hint="default"/>
+        <w:sz w:val="20"/>
+      </w:rPr>
+    </w:lvl>
+    <w:lvl w:ilvl="3" w:tentative="1">
+      <w:start w:val="1"/>
+      <w:numFmt w:val="bullet"/>
+      <w:lvlText w:val=""/>
+      <w:lvlJc w:val="left"/>
+      <w:pPr>
+        <w:tabs>
+          <w:tab w:val="num" w:pos="2880"/>
+        </w:tabs>
+        <w:ind w:left="2880" w:hanging="360"/>
+      </w:pPr>
+      <w:rPr>
+        <w:rFonts w:ascii="Wingdings" w:hAnsi="Wingdings" w:hint="default"/>
+        <w:sz w:val="20"/>
+      </w:rPr>
+    </w:lvl>
+    <w:lvl w:ilvl="4" w:tentative="1">
+      <w:start w:val="1"/>
+      <w:numFmt w:val="bullet"/>
+      <w:lvlText w:val=""/>
+      <w:lvlJc w:val="left"/>
+      <w:pPr>
+        <w:tabs>
+          <w:tab w:val="num" w:pos="3600"/>
+        </w:tabs>
+        <w:ind w:left="3600" w:hanging="360"/>
+      </w:pPr>
+      <w:rPr>
+        <w:rFonts w:ascii="Wingdings" w:hAnsi="Wingdings" w:hint="default"/>
+        <w:sz w:val="20"/>
+      </w:rPr>
+    </w:lvl>
+    <w:lvl w:ilvl="5" w:tentative="1">
+      <w:start w:val="1"/>
+      <w:numFmt w:val="bullet"/>
+      <w:lvlText w:val=""/>
+      <w:lvlJc w:val="left"/>
+      <w:pPr>
+        <w:tabs>
+          <w:tab w:val="num" w:pos="4320"/>
+        </w:tabs>
+        <w:ind w:left="4320" w:hanging="360"/>
+      </w:pPr>
+      <w:rPr>
+        <w:rFonts w:ascii="Wingdings" w:hAnsi="Wingdings" w:hint="default"/>
+        <w:sz w:val="20"/>
+      </w:rPr>
+    </w:lvl>
+    <w:lvl w:ilvl="6" w:tentative="1">
+      <w:start w:val="1"/>
+      <w:numFmt w:val="bullet"/>
+      <w:lvlText w:val=""/>
+      <w:lvlJc w:val="left"/>
+      <w:pPr>
+        <w:tabs>
+          <w:tab w:val="num" w:pos="5040"/>
+        </w:tabs>
+        <w:ind w:left="5040" w:hanging="360"/>
+      </w:pPr>
+      <w:rPr>
+        <w:rFonts w:ascii="Wingdings" w:hAnsi="Wingdings" w:hint="default"/>
+        <w:sz w:val="20"/>
+      </w:rPr>
+    </w:lvl>
+    <w:lvl w:ilvl="7" w:tentative="1">
+      <w:start w:val="1"/>
+      <w:numFmt w:val="bullet"/>
+      <w:lvlText w:val=""/>
+      <w:lvlJc w:val="left"/>
+      <w:pPr>
+        <w:tabs>
+          <w:tab w:val="num" w:pos="5760"/>
+        </w:tabs>
+        <w:ind w:left="5760" w:hanging="360"/>
+      </w:pPr>
+      <w:rPr>
+        <w:rFonts w:ascii="Wingdings" w:hAnsi="Wingdings" w:hint="default"/>
+        <w:sz w:val="20"/>
+      </w:rPr>
+    </w:lvl>
+    <w:lvl w:ilvl="8" w:tentative="1">
+      <w:start w:val="1"/>
+      <w:numFmt w:val="bullet"/>
+      <w:lvlText w:val=""/>
+      <w:lvlJc w:val="left"/>
+      <w:pPr>
+        <w:tabs>
+          <w:tab w:val="num" w:pos="6480"/>
+        </w:tabs>
+        <w:ind w:left="6480" w:hanging="360"/>
+      </w:pPr>
+      <w:rPr>
+        <w:rFonts w:ascii="Wingdings" w:hAnsi="Wingdings" w:hint="default"/>
+        <w:sz w:val="20"/>
+      </w:rPr>
+    </w:lvl>
+  </w:abstractNum>
+  <w:abstractNum w:abstractNumId="3" w15:restartNumberingAfterBreak="0">
     <w:nsid w:val="03700660"/>
     <w:multiLevelType w:val="multilevel"/>
     <w:tmpl w:val="88328872"/>
@@ -27784,7 +28823,7 @@
       </w:rPr>
     </w:lvl>
   </w:abstractNum>
-  <w:abstractNum w:abstractNumId="3" w15:restartNumberingAfterBreak="0">
+  <w:abstractNum w:abstractNumId="4" w15:restartNumberingAfterBreak="0">
     <w:nsid w:val="061A4A65"/>
     <w:multiLevelType w:val="multilevel"/>
     <w:tmpl w:val="DEACF4A6"/>
@@ -27933,7 +28972,7 @@
       </w:rPr>
     </w:lvl>
   </w:abstractNum>
-  <w:abstractNum w:abstractNumId="4" w15:restartNumberingAfterBreak="0">
+  <w:abstractNum w:abstractNumId="5" w15:restartNumberingAfterBreak="0">
     <w:nsid w:val="06B57BE9"/>
     <w:multiLevelType w:val="multilevel"/>
     <w:tmpl w:val="B8F406B0"/>
@@ -28082,7 +29121,7 @@
       </w:rPr>
     </w:lvl>
   </w:abstractNum>
-  <w:abstractNum w:abstractNumId="5" w15:restartNumberingAfterBreak="0">
+  <w:abstractNum w:abstractNumId="6" w15:restartNumberingAfterBreak="0">
     <w:nsid w:val="06BC1066"/>
     <w:multiLevelType w:val="multilevel"/>
     <w:tmpl w:val="DEACF4A6"/>
@@ -28231,7 +29270,7 @@
       </w:rPr>
     </w:lvl>
   </w:abstractNum>
-  <w:abstractNum w:abstractNumId="6" w15:restartNumberingAfterBreak="0">
+  <w:abstractNum w:abstractNumId="7" w15:restartNumberingAfterBreak="0">
     <w:nsid w:val="07C52EA1"/>
     <w:multiLevelType w:val="multilevel"/>
     <w:tmpl w:val="29F27434"/>
@@ -28380,7 +29419,7 @@
       </w:rPr>
     </w:lvl>
   </w:abstractNum>
-  <w:abstractNum w:abstractNumId="7" w15:restartNumberingAfterBreak="0">
+  <w:abstractNum w:abstractNumId="8" w15:restartNumberingAfterBreak="0">
     <w:nsid w:val="089D153A"/>
     <w:multiLevelType w:val="multilevel"/>
     <w:tmpl w:val="2666859E"/>
@@ -28529,7 +29568,7 @@
       </w:rPr>
     </w:lvl>
   </w:abstractNum>
-  <w:abstractNum w:abstractNumId="8" w15:restartNumberingAfterBreak="0">
+  <w:abstractNum w:abstractNumId="9" w15:restartNumberingAfterBreak="0">
     <w:nsid w:val="0AB44FD7"/>
     <w:multiLevelType w:val="multilevel"/>
     <w:tmpl w:val="5B566E6E"/>
@@ -28678,7 +29717,7 @@
       </w:rPr>
     </w:lvl>
   </w:abstractNum>
-  <w:abstractNum w:abstractNumId="9" w15:restartNumberingAfterBreak="0">
+  <w:abstractNum w:abstractNumId="10" w15:restartNumberingAfterBreak="0">
     <w:nsid w:val="0B8C2398"/>
     <w:multiLevelType w:val="multilevel"/>
     <w:tmpl w:val="60CABFAC"/>
@@ -28827,7 +29866,7 @@
       </w:rPr>
     </w:lvl>
   </w:abstractNum>
-  <w:abstractNum w:abstractNumId="10" w15:restartNumberingAfterBreak="0">
+  <w:abstractNum w:abstractNumId="11" w15:restartNumberingAfterBreak="0">
     <w:nsid w:val="0BA1407A"/>
     <w:multiLevelType w:val="multilevel"/>
     <w:tmpl w:val="70422D1E"/>
@@ -28976,7 +30015,7 @@
       </w:rPr>
     </w:lvl>
   </w:abstractNum>
-  <w:abstractNum w:abstractNumId="11" w15:restartNumberingAfterBreak="0">
+  <w:abstractNum w:abstractNumId="12" w15:restartNumberingAfterBreak="0">
     <w:nsid w:val="0BD92E68"/>
     <w:multiLevelType w:val="multilevel"/>
     <w:tmpl w:val="12D8678A"/>
@@ -29125,7 +30164,7 @@
       </w:rPr>
     </w:lvl>
   </w:abstractNum>
-  <w:abstractNum w:abstractNumId="12" w15:restartNumberingAfterBreak="0">
+  <w:abstractNum w:abstractNumId="13" w15:restartNumberingAfterBreak="0">
     <w:nsid w:val="0D180050"/>
     <w:multiLevelType w:val="multilevel"/>
     <w:tmpl w:val="3FECA542"/>
@@ -29274,7 +30313,7 @@
       </w:rPr>
     </w:lvl>
   </w:abstractNum>
-  <w:abstractNum w:abstractNumId="13" w15:restartNumberingAfterBreak="0">
+  <w:abstractNum w:abstractNumId="14" w15:restartNumberingAfterBreak="0">
     <w:nsid w:val="0D9F517B"/>
     <w:multiLevelType w:val="multilevel"/>
     <w:tmpl w:val="3B8A9964"/>
@@ -29423,7 +30462,7 @@
       </w:rPr>
     </w:lvl>
   </w:abstractNum>
-  <w:abstractNum w:abstractNumId="14" w15:restartNumberingAfterBreak="0">
+  <w:abstractNum w:abstractNumId="15" w15:restartNumberingAfterBreak="0">
     <w:nsid w:val="0ED41278"/>
     <w:multiLevelType w:val="multilevel"/>
     <w:tmpl w:val="72A8002C"/>
@@ -29572,7 +30611,7 @@
       </w:rPr>
     </w:lvl>
   </w:abstractNum>
-  <w:abstractNum w:abstractNumId="15" w15:restartNumberingAfterBreak="0">
+  <w:abstractNum w:abstractNumId="16" w15:restartNumberingAfterBreak="0">
     <w:nsid w:val="0F013ACB"/>
     <w:multiLevelType w:val="multilevel"/>
     <w:tmpl w:val="6EE6FE6E"/>
@@ -29693,7 +30732,7 @@
       </w:pPr>
     </w:lvl>
   </w:abstractNum>
-  <w:abstractNum w:abstractNumId="16" w15:restartNumberingAfterBreak="0">
+  <w:abstractNum w:abstractNumId="17" w15:restartNumberingAfterBreak="0">
     <w:nsid w:val="0F8E714B"/>
     <w:multiLevelType w:val="multilevel"/>
     <w:tmpl w:val="DEACF4A6"/>
@@ -29842,7 +30881,7 @@
       </w:rPr>
     </w:lvl>
   </w:abstractNum>
-  <w:abstractNum w:abstractNumId="17" w15:restartNumberingAfterBreak="0">
+  <w:abstractNum w:abstractNumId="18" w15:restartNumberingAfterBreak="0">
     <w:nsid w:val="12DD5029"/>
     <w:multiLevelType w:val="multilevel"/>
     <w:tmpl w:val="DEACF4A6"/>
@@ -29991,7 +31030,7 @@
       </w:rPr>
     </w:lvl>
   </w:abstractNum>
-  <w:abstractNum w:abstractNumId="18" w15:restartNumberingAfterBreak="0">
+  <w:abstractNum w:abstractNumId="19" w15:restartNumberingAfterBreak="0">
     <w:nsid w:val="1425161A"/>
     <w:multiLevelType w:val="multilevel"/>
     <w:tmpl w:val="2202F16A"/>
@@ -30140,7 +31179,7 @@
       </w:rPr>
     </w:lvl>
   </w:abstractNum>
-  <w:abstractNum w:abstractNumId="19" w15:restartNumberingAfterBreak="0">
+  <w:abstractNum w:abstractNumId="20" w15:restartNumberingAfterBreak="0">
     <w:nsid w:val="14441912"/>
     <w:multiLevelType w:val="multilevel"/>
     <w:tmpl w:val="DC4606AC"/>
@@ -30289,7 +31328,7 @@
       </w:rPr>
     </w:lvl>
   </w:abstractNum>
-  <w:abstractNum w:abstractNumId="20" w15:restartNumberingAfterBreak="0">
+  <w:abstractNum w:abstractNumId="21" w15:restartNumberingAfterBreak="0">
     <w:nsid w:val="15A520AC"/>
     <w:multiLevelType w:val="multilevel"/>
     <w:tmpl w:val="62F01294"/>
@@ -30438,7 +31477,7 @@
       </w:rPr>
     </w:lvl>
   </w:abstractNum>
-  <w:abstractNum w:abstractNumId="21" w15:restartNumberingAfterBreak="0">
+  <w:abstractNum w:abstractNumId="22" w15:restartNumberingAfterBreak="0">
     <w:nsid w:val="16502608"/>
     <w:multiLevelType w:val="multilevel"/>
     <w:tmpl w:val="8FD45416"/>
@@ -30587,7 +31626,7 @@
       </w:rPr>
     </w:lvl>
   </w:abstractNum>
-  <w:abstractNum w:abstractNumId="22" w15:restartNumberingAfterBreak="0">
+  <w:abstractNum w:abstractNumId="23" w15:restartNumberingAfterBreak="0">
     <w:nsid w:val="16904944"/>
     <w:multiLevelType w:val="multilevel"/>
     <w:tmpl w:val="FBEAFFC4"/>
@@ -30736,7 +31775,7 @@
       </w:rPr>
     </w:lvl>
   </w:abstractNum>
-  <w:abstractNum w:abstractNumId="23" w15:restartNumberingAfterBreak="0">
+  <w:abstractNum w:abstractNumId="24" w15:restartNumberingAfterBreak="0">
     <w:nsid w:val="188E3E7E"/>
     <w:multiLevelType w:val="multilevel"/>
     <w:tmpl w:val="3B1E40B2"/>
@@ -30885,7 +31924,7 @@
       </w:rPr>
     </w:lvl>
   </w:abstractNum>
-  <w:abstractNum w:abstractNumId="24" w15:restartNumberingAfterBreak="0">
+  <w:abstractNum w:abstractNumId="25" w15:restartNumberingAfterBreak="0">
     <w:nsid w:val="1B1E04D0"/>
     <w:multiLevelType w:val="multilevel"/>
     <w:tmpl w:val="A1888502"/>
@@ -31034,7 +32073,7 @@
       </w:rPr>
     </w:lvl>
   </w:abstractNum>
-  <w:abstractNum w:abstractNumId="25" w15:restartNumberingAfterBreak="0">
+  <w:abstractNum w:abstractNumId="26" w15:restartNumberingAfterBreak="0">
     <w:nsid w:val="1B3D26BA"/>
     <w:multiLevelType w:val="multilevel"/>
     <w:tmpl w:val="AD52D648"/>
@@ -31147,7 +32186,7 @@
       </w:pPr>
     </w:lvl>
   </w:abstractNum>
-  <w:abstractNum w:abstractNumId="26" w15:restartNumberingAfterBreak="0">
+  <w:abstractNum w:abstractNumId="27" w15:restartNumberingAfterBreak="0">
     <w:nsid w:val="1C906A84"/>
     <w:multiLevelType w:val="multilevel"/>
     <w:tmpl w:val="2D600E1C"/>
@@ -31296,7 +32335,7 @@
       </w:rPr>
     </w:lvl>
   </w:abstractNum>
-  <w:abstractNum w:abstractNumId="27" w15:restartNumberingAfterBreak="0">
+  <w:abstractNum w:abstractNumId="28" w15:restartNumberingAfterBreak="0">
     <w:nsid w:val="1CB61C70"/>
     <w:multiLevelType w:val="multilevel"/>
     <w:tmpl w:val="51301420"/>
@@ -31445,7 +32484,7 @@
       </w:rPr>
     </w:lvl>
   </w:abstractNum>
-  <w:abstractNum w:abstractNumId="28" w15:restartNumberingAfterBreak="0">
+  <w:abstractNum w:abstractNumId="29" w15:restartNumberingAfterBreak="0">
     <w:nsid w:val="1FFC4DDF"/>
     <w:multiLevelType w:val="multilevel"/>
     <w:tmpl w:val="5DD65FC4"/>
@@ -31594,7 +32633,7 @@
       </w:rPr>
     </w:lvl>
   </w:abstractNum>
-  <w:abstractNum w:abstractNumId="29" w15:restartNumberingAfterBreak="0">
+  <w:abstractNum w:abstractNumId="30" w15:restartNumberingAfterBreak="0">
     <w:nsid w:val="20A520F8"/>
     <w:multiLevelType w:val="multilevel"/>
     <w:tmpl w:val="E3AE063A"/>
@@ -31711,7 +32750,7 @@
       </w:pPr>
     </w:lvl>
   </w:abstractNum>
-  <w:abstractNum w:abstractNumId="30" w15:restartNumberingAfterBreak="0">
+  <w:abstractNum w:abstractNumId="31" w15:restartNumberingAfterBreak="0">
     <w:nsid w:val="21527DBF"/>
     <w:multiLevelType w:val="multilevel"/>
     <w:tmpl w:val="A8C065B4"/>
@@ -31860,7 +32899,7 @@
       </w:rPr>
     </w:lvl>
   </w:abstractNum>
-  <w:abstractNum w:abstractNumId="31" w15:restartNumberingAfterBreak="0">
+  <w:abstractNum w:abstractNumId="32" w15:restartNumberingAfterBreak="0">
     <w:nsid w:val="216838D8"/>
     <w:multiLevelType w:val="multilevel"/>
     <w:tmpl w:val="F87C41E2"/>
@@ -32009,7 +33048,7 @@
       </w:rPr>
     </w:lvl>
   </w:abstractNum>
-  <w:abstractNum w:abstractNumId="32" w15:restartNumberingAfterBreak="0">
+  <w:abstractNum w:abstractNumId="33" w15:restartNumberingAfterBreak="0">
     <w:nsid w:val="22D7528E"/>
     <w:multiLevelType w:val="multilevel"/>
     <w:tmpl w:val="B45E2DA2"/>
@@ -32158,7 +33197,7 @@
       </w:rPr>
     </w:lvl>
   </w:abstractNum>
-  <w:abstractNum w:abstractNumId="33" w15:restartNumberingAfterBreak="0">
+  <w:abstractNum w:abstractNumId="34" w15:restartNumberingAfterBreak="0">
     <w:nsid w:val="22F3033E"/>
     <w:multiLevelType w:val="multilevel"/>
     <w:tmpl w:val="1D14DB68"/>
@@ -32279,7 +33318,7 @@
       </w:pPr>
     </w:lvl>
   </w:abstractNum>
-  <w:abstractNum w:abstractNumId="34" w15:restartNumberingAfterBreak="0">
+  <w:abstractNum w:abstractNumId="35" w15:restartNumberingAfterBreak="0">
     <w:nsid w:val="262A5CD1"/>
     <w:multiLevelType w:val="multilevel"/>
     <w:tmpl w:val="0030AD14"/>
@@ -32428,7 +33467,7 @@
       </w:rPr>
     </w:lvl>
   </w:abstractNum>
-  <w:abstractNum w:abstractNumId="35" w15:restartNumberingAfterBreak="0">
+  <w:abstractNum w:abstractNumId="36" w15:restartNumberingAfterBreak="0">
     <w:nsid w:val="27C850EE"/>
     <w:multiLevelType w:val="multilevel"/>
     <w:tmpl w:val="DEACF4A6"/>
@@ -32577,7 +33616,7 @@
       </w:rPr>
     </w:lvl>
   </w:abstractNum>
-  <w:abstractNum w:abstractNumId="36" w15:restartNumberingAfterBreak="0">
+  <w:abstractNum w:abstractNumId="37" w15:restartNumberingAfterBreak="0">
     <w:nsid w:val="292B7E68"/>
     <w:multiLevelType w:val="multilevel"/>
     <w:tmpl w:val="7E16B122"/>
@@ -32726,7 +33765,7 @@
       </w:rPr>
     </w:lvl>
   </w:abstractNum>
-  <w:abstractNum w:abstractNumId="37" w15:restartNumberingAfterBreak="0">
+  <w:abstractNum w:abstractNumId="38" w15:restartNumberingAfterBreak="0">
     <w:nsid w:val="293C1D4A"/>
     <w:multiLevelType w:val="multilevel"/>
     <w:tmpl w:val="AE30152E"/>
@@ -32875,7 +33914,7 @@
       </w:rPr>
     </w:lvl>
   </w:abstractNum>
-  <w:abstractNum w:abstractNumId="38" w15:restartNumberingAfterBreak="0">
+  <w:abstractNum w:abstractNumId="39" w15:restartNumberingAfterBreak="0">
     <w:nsid w:val="297B1D2B"/>
     <w:multiLevelType w:val="multilevel"/>
     <w:tmpl w:val="DEACF4A6"/>
@@ -33024,7 +34063,7 @@
       </w:rPr>
     </w:lvl>
   </w:abstractNum>
-  <w:abstractNum w:abstractNumId="39" w15:restartNumberingAfterBreak="0">
+  <w:abstractNum w:abstractNumId="40" w15:restartNumberingAfterBreak="0">
     <w:nsid w:val="299E3D9A"/>
     <w:multiLevelType w:val="multilevel"/>
     <w:tmpl w:val="1C9E39F8"/>
@@ -33173,7 +34212,7 @@
       </w:rPr>
     </w:lvl>
   </w:abstractNum>
-  <w:abstractNum w:abstractNumId="40" w15:restartNumberingAfterBreak="0">
+  <w:abstractNum w:abstractNumId="41" w15:restartNumberingAfterBreak="0">
     <w:nsid w:val="2CB43EE0"/>
     <w:multiLevelType w:val="multilevel"/>
     <w:tmpl w:val="ABD6C58E"/>
@@ -33322,7 +34361,7 @@
       </w:rPr>
     </w:lvl>
   </w:abstractNum>
-  <w:abstractNum w:abstractNumId="41" w15:restartNumberingAfterBreak="0">
+  <w:abstractNum w:abstractNumId="42" w15:restartNumberingAfterBreak="0">
     <w:nsid w:val="2D037575"/>
     <w:multiLevelType w:val="multilevel"/>
     <w:tmpl w:val="B9CC6152"/>
@@ -33471,7 +34510,7 @@
       </w:rPr>
     </w:lvl>
   </w:abstractNum>
-  <w:abstractNum w:abstractNumId="42" w15:restartNumberingAfterBreak="0">
+  <w:abstractNum w:abstractNumId="43" w15:restartNumberingAfterBreak="0">
     <w:nsid w:val="2DFF50FE"/>
     <w:multiLevelType w:val="multilevel"/>
     <w:tmpl w:val="AB46487C"/>
@@ -33620,7 +34659,7 @@
       </w:rPr>
     </w:lvl>
   </w:abstractNum>
-  <w:abstractNum w:abstractNumId="43" w15:restartNumberingAfterBreak="0">
+  <w:abstractNum w:abstractNumId="44" w15:restartNumberingAfterBreak="0">
     <w:nsid w:val="2F7852F2"/>
     <w:multiLevelType w:val="multilevel"/>
     <w:tmpl w:val="A5542A08"/>
@@ -33769,7 +34808,7 @@
       </w:rPr>
     </w:lvl>
   </w:abstractNum>
-  <w:abstractNum w:abstractNumId="44" w15:restartNumberingAfterBreak="0">
+  <w:abstractNum w:abstractNumId="45" w15:restartNumberingAfterBreak="0">
     <w:nsid w:val="2F981726"/>
     <w:multiLevelType w:val="multilevel"/>
     <w:tmpl w:val="A844E6BA"/>
@@ -33918,7 +34957,7 @@
       </w:rPr>
     </w:lvl>
   </w:abstractNum>
-  <w:abstractNum w:abstractNumId="45" w15:restartNumberingAfterBreak="0">
+  <w:abstractNum w:abstractNumId="46" w15:restartNumberingAfterBreak="0">
     <w:nsid w:val="30031988"/>
     <w:multiLevelType w:val="multilevel"/>
     <w:tmpl w:val="69D456D8"/>
@@ -34067,7 +35106,7 @@
       </w:rPr>
     </w:lvl>
   </w:abstractNum>
-  <w:abstractNum w:abstractNumId="46" w15:restartNumberingAfterBreak="0">
+  <w:abstractNum w:abstractNumId="47" w15:restartNumberingAfterBreak="0">
     <w:nsid w:val="30806B48"/>
     <w:multiLevelType w:val="multilevel"/>
     <w:tmpl w:val="DEACF4A6"/>
@@ -34216,7 +35255,7 @@
       </w:rPr>
     </w:lvl>
   </w:abstractNum>
-  <w:abstractNum w:abstractNumId="47" w15:restartNumberingAfterBreak="0">
+  <w:abstractNum w:abstractNumId="48" w15:restartNumberingAfterBreak="0">
     <w:nsid w:val="30E86102"/>
     <w:multiLevelType w:val="multilevel"/>
     <w:tmpl w:val="97DC36DC"/>
@@ -34365,7 +35404,7 @@
       </w:rPr>
     </w:lvl>
   </w:abstractNum>
-  <w:abstractNum w:abstractNumId="48" w15:restartNumberingAfterBreak="0">
+  <w:abstractNum w:abstractNumId="49" w15:restartNumberingAfterBreak="0">
     <w:nsid w:val="320D68E2"/>
     <w:multiLevelType w:val="multilevel"/>
     <w:tmpl w:val="DEACF4A6"/>
@@ -34514,7 +35553,7 @@
       </w:rPr>
     </w:lvl>
   </w:abstractNum>
-  <w:abstractNum w:abstractNumId="49" w15:restartNumberingAfterBreak="0">
+  <w:abstractNum w:abstractNumId="50" w15:restartNumberingAfterBreak="0">
     <w:nsid w:val="32D025FC"/>
     <w:multiLevelType w:val="multilevel"/>
     <w:tmpl w:val="E0F6F884"/>
@@ -34663,7 +35702,7 @@
       </w:rPr>
     </w:lvl>
   </w:abstractNum>
-  <w:abstractNum w:abstractNumId="50" w15:restartNumberingAfterBreak="0">
+  <w:abstractNum w:abstractNumId="51" w15:restartNumberingAfterBreak="0">
     <w:nsid w:val="34460E44"/>
     <w:multiLevelType w:val="multilevel"/>
     <w:tmpl w:val="E056F696"/>
@@ -34812,7 +35851,156 @@
       </w:rPr>
     </w:lvl>
   </w:abstractNum>
-  <w:abstractNum w:abstractNumId="51" w15:restartNumberingAfterBreak="0">
+  <w:abstractNum w:abstractNumId="52" w15:restartNumberingAfterBreak="0">
+    <w:nsid w:val="34EC0AD8"/>
+    <w:multiLevelType w:val="multilevel"/>
+    <w:tmpl w:val="5240D3F2"/>
+    <w:lvl w:ilvl="0">
+      <w:start w:val="1"/>
+      <w:numFmt w:val="bullet"/>
+      <w:lvlText w:val=""/>
+      <w:lvlJc w:val="left"/>
+      <w:pPr>
+        <w:tabs>
+          <w:tab w:val="num" w:pos="720"/>
+        </w:tabs>
+        <w:ind w:left="720" w:hanging="360"/>
+      </w:pPr>
+      <w:rPr>
+        <w:rFonts w:ascii="Symbol" w:hAnsi="Symbol" w:hint="default"/>
+        <w:sz w:val="20"/>
+      </w:rPr>
+    </w:lvl>
+    <w:lvl w:ilvl="1">
+      <w:start w:val="1"/>
+      <w:numFmt w:val="bullet"/>
+      <w:lvlText w:val="o"/>
+      <w:lvlJc w:val="left"/>
+      <w:pPr>
+        <w:tabs>
+          <w:tab w:val="num" w:pos="1440"/>
+        </w:tabs>
+        <w:ind w:left="1440" w:hanging="360"/>
+      </w:pPr>
+      <w:rPr>
+        <w:rFonts w:ascii="Courier New" w:hAnsi="Courier New" w:hint="default"/>
+        <w:sz w:val="20"/>
+      </w:rPr>
+    </w:lvl>
+    <w:lvl w:ilvl="2" w:tentative="1">
+      <w:start w:val="1"/>
+      <w:numFmt w:val="bullet"/>
+      <w:lvlText w:val=""/>
+      <w:lvlJc w:val="left"/>
+      <w:pPr>
+        <w:tabs>
+          <w:tab w:val="num" w:pos="2160"/>
+        </w:tabs>
+        <w:ind w:left="2160" w:hanging="360"/>
+      </w:pPr>
+      <w:rPr>
+        <w:rFonts w:ascii="Wingdings" w:hAnsi="Wingdings" w:hint="default"/>
+        <w:sz w:val="20"/>
+      </w:rPr>
+    </w:lvl>
+    <w:lvl w:ilvl="3" w:tentative="1">
+      <w:start w:val="1"/>
+      <w:numFmt w:val="bullet"/>
+      <w:lvlText w:val=""/>
+      <w:lvlJc w:val="left"/>
+      <w:pPr>
+        <w:tabs>
+          <w:tab w:val="num" w:pos="2880"/>
+        </w:tabs>
+        <w:ind w:left="2880" w:hanging="360"/>
+      </w:pPr>
+      <w:rPr>
+        <w:rFonts w:ascii="Wingdings" w:hAnsi="Wingdings" w:hint="default"/>
+        <w:sz w:val="20"/>
+      </w:rPr>
+    </w:lvl>
+    <w:lvl w:ilvl="4" w:tentative="1">
+      <w:start w:val="1"/>
+      <w:numFmt w:val="bullet"/>
+      <w:lvlText w:val=""/>
+      <w:lvlJc w:val="left"/>
+      <w:pPr>
+        <w:tabs>
+          <w:tab w:val="num" w:pos="3600"/>
+        </w:tabs>
+        <w:ind w:left="3600" w:hanging="360"/>
+      </w:pPr>
+      <w:rPr>
+        <w:rFonts w:ascii="Wingdings" w:hAnsi="Wingdings" w:hint="default"/>
+        <w:sz w:val="20"/>
+      </w:rPr>
+    </w:lvl>
+    <w:lvl w:ilvl="5" w:tentative="1">
+      <w:start w:val="1"/>
+      <w:numFmt w:val="bullet"/>
+      <w:lvlText w:val=""/>
+      <w:lvlJc w:val="left"/>
+      <w:pPr>
+        <w:tabs>
+          <w:tab w:val="num" w:pos="4320"/>
+        </w:tabs>
+        <w:ind w:left="4320" w:hanging="360"/>
+      </w:pPr>
+      <w:rPr>
+        <w:rFonts w:ascii="Wingdings" w:hAnsi="Wingdings" w:hint="default"/>
+        <w:sz w:val="20"/>
+      </w:rPr>
+    </w:lvl>
+    <w:lvl w:ilvl="6" w:tentative="1">
+      <w:start w:val="1"/>
+      <w:numFmt w:val="bullet"/>
+      <w:lvlText w:val=""/>
+      <w:lvlJc w:val="left"/>
+      <w:pPr>
+        <w:tabs>
+          <w:tab w:val="num" w:pos="5040"/>
+        </w:tabs>
+        <w:ind w:left="5040" w:hanging="360"/>
+      </w:pPr>
+      <w:rPr>
+        <w:rFonts w:ascii="Wingdings" w:hAnsi="Wingdings" w:hint="default"/>
+        <w:sz w:val="20"/>
+      </w:rPr>
+    </w:lvl>
+    <w:lvl w:ilvl="7" w:tentative="1">
+      <w:start w:val="1"/>
+      <w:numFmt w:val="bullet"/>
+      <w:lvlText w:val=""/>
+      <w:lvlJc w:val="left"/>
+      <w:pPr>
+        <w:tabs>
+          <w:tab w:val="num" w:pos="5760"/>
+        </w:tabs>
+        <w:ind w:left="5760" w:hanging="360"/>
+      </w:pPr>
+      <w:rPr>
+        <w:rFonts w:ascii="Wingdings" w:hAnsi="Wingdings" w:hint="default"/>
+        <w:sz w:val="20"/>
+      </w:rPr>
+    </w:lvl>
+    <w:lvl w:ilvl="8" w:tentative="1">
+      <w:start w:val="1"/>
+      <w:numFmt w:val="bullet"/>
+      <w:lvlText w:val=""/>
+      <w:lvlJc w:val="left"/>
+      <w:pPr>
+        <w:tabs>
+          <w:tab w:val="num" w:pos="6480"/>
+        </w:tabs>
+        <w:ind w:left="6480" w:hanging="360"/>
+      </w:pPr>
+      <w:rPr>
+        <w:rFonts w:ascii="Wingdings" w:hAnsi="Wingdings" w:hint="default"/>
+        <w:sz w:val="20"/>
+      </w:rPr>
+    </w:lvl>
+  </w:abstractNum>
+  <w:abstractNum w:abstractNumId="53" w15:restartNumberingAfterBreak="0">
     <w:nsid w:val="351F35B9"/>
     <w:multiLevelType w:val="multilevel"/>
     <w:tmpl w:val="614279C4"/>
@@ -34925,7 +36113,7 @@
       </w:pPr>
     </w:lvl>
   </w:abstractNum>
-  <w:abstractNum w:abstractNumId="52" w15:restartNumberingAfterBreak="0">
+  <w:abstractNum w:abstractNumId="54" w15:restartNumberingAfterBreak="0">
     <w:nsid w:val="353D32ED"/>
     <w:multiLevelType w:val="multilevel"/>
     <w:tmpl w:val="DEACF4A6"/>
@@ -35074,7 +36262,7 @@
       </w:rPr>
     </w:lvl>
   </w:abstractNum>
-  <w:abstractNum w:abstractNumId="53" w15:restartNumberingAfterBreak="0">
+  <w:abstractNum w:abstractNumId="55" w15:restartNumberingAfterBreak="0">
     <w:nsid w:val="358567C2"/>
     <w:multiLevelType w:val="multilevel"/>
     <w:tmpl w:val="A3986F94"/>
@@ -35223,7 +36411,7 @@
       </w:rPr>
     </w:lvl>
   </w:abstractNum>
-  <w:abstractNum w:abstractNumId="54" w15:restartNumberingAfterBreak="0">
+  <w:abstractNum w:abstractNumId="56" w15:restartNumberingAfterBreak="0">
     <w:nsid w:val="359011B4"/>
     <w:multiLevelType w:val="multilevel"/>
     <w:tmpl w:val="A1DCF1AC"/>
@@ -35372,7 +36560,7 @@
       </w:rPr>
     </w:lvl>
   </w:abstractNum>
-  <w:abstractNum w:abstractNumId="55" w15:restartNumberingAfterBreak="0">
+  <w:abstractNum w:abstractNumId="57" w15:restartNumberingAfterBreak="0">
     <w:nsid w:val="35CB71E9"/>
     <w:multiLevelType w:val="multilevel"/>
     <w:tmpl w:val="7312EBD8"/>
@@ -35521,7 +36709,7 @@
       </w:rPr>
     </w:lvl>
   </w:abstractNum>
-  <w:abstractNum w:abstractNumId="56" w15:restartNumberingAfterBreak="0">
+  <w:abstractNum w:abstractNumId="58" w15:restartNumberingAfterBreak="0">
     <w:nsid w:val="375D3367"/>
     <w:multiLevelType w:val="multilevel"/>
     <w:tmpl w:val="573AAE5E"/>
@@ -35670,7 +36858,7 @@
       </w:rPr>
     </w:lvl>
   </w:abstractNum>
-  <w:abstractNum w:abstractNumId="57" w15:restartNumberingAfterBreak="0">
+  <w:abstractNum w:abstractNumId="59" w15:restartNumberingAfterBreak="0">
     <w:nsid w:val="37C0756B"/>
     <w:multiLevelType w:val="multilevel"/>
     <w:tmpl w:val="DEACF4A6"/>
@@ -35819,7 +37007,7 @@
       </w:rPr>
     </w:lvl>
   </w:abstractNum>
-  <w:abstractNum w:abstractNumId="58" w15:restartNumberingAfterBreak="0">
+  <w:abstractNum w:abstractNumId="60" w15:restartNumberingAfterBreak="0">
     <w:nsid w:val="38B93EC2"/>
     <w:multiLevelType w:val="multilevel"/>
     <w:tmpl w:val="94202850"/>
@@ -35968,7 +37156,7 @@
       </w:rPr>
     </w:lvl>
   </w:abstractNum>
-  <w:abstractNum w:abstractNumId="59" w15:restartNumberingAfterBreak="0">
+  <w:abstractNum w:abstractNumId="61" w15:restartNumberingAfterBreak="0">
     <w:nsid w:val="39E840FC"/>
     <w:multiLevelType w:val="multilevel"/>
     <w:tmpl w:val="75943A8E"/>
@@ -36117,7 +37305,7 @@
       </w:rPr>
     </w:lvl>
   </w:abstractNum>
-  <w:abstractNum w:abstractNumId="60" w15:restartNumberingAfterBreak="0">
+  <w:abstractNum w:abstractNumId="62" w15:restartNumberingAfterBreak="0">
     <w:nsid w:val="3A824266"/>
     <w:multiLevelType w:val="multilevel"/>
     <w:tmpl w:val="E6280AA2"/>
@@ -36266,7 +37454,7 @@
       </w:rPr>
     </w:lvl>
   </w:abstractNum>
-  <w:abstractNum w:abstractNumId="61" w15:restartNumberingAfterBreak="0">
+  <w:abstractNum w:abstractNumId="63" w15:restartNumberingAfterBreak="0">
     <w:nsid w:val="3BC370FC"/>
     <w:multiLevelType w:val="multilevel"/>
     <w:tmpl w:val="DEACF4A6"/>
@@ -36415,7 +37603,124 @@
       </w:rPr>
     </w:lvl>
   </w:abstractNum>
-  <w:abstractNum w:abstractNumId="62" w15:restartNumberingAfterBreak="0">
+  <w:abstractNum w:abstractNumId="64" w15:restartNumberingAfterBreak="0">
+    <w:nsid w:val="3BD810AC"/>
+    <w:multiLevelType w:val="multilevel"/>
+    <w:tmpl w:val="82740430"/>
+    <w:lvl w:ilvl="0">
+      <w:start w:val="1"/>
+      <w:numFmt w:val="decimal"/>
+      <w:lvlText w:val="%1."/>
+      <w:lvlJc w:val="left"/>
+      <w:pPr>
+        <w:tabs>
+          <w:tab w:val="num" w:pos="720"/>
+        </w:tabs>
+        <w:ind w:left="720" w:hanging="360"/>
+      </w:pPr>
+    </w:lvl>
+    <w:lvl w:ilvl="1">
+      <w:start w:val="1"/>
+      <w:numFmt w:val="bullet"/>
+      <w:lvlText w:val="o"/>
+      <w:lvlJc w:val="left"/>
+      <w:pPr>
+        <w:tabs>
+          <w:tab w:val="num" w:pos="1440"/>
+        </w:tabs>
+        <w:ind w:left="1440" w:hanging="360"/>
+      </w:pPr>
+      <w:rPr>
+        <w:rFonts w:ascii="Courier New" w:hAnsi="Courier New" w:hint="default"/>
+        <w:sz w:val="20"/>
+      </w:rPr>
+    </w:lvl>
+    <w:lvl w:ilvl="2" w:tentative="1">
+      <w:start w:val="1"/>
+      <w:numFmt w:val="decimal"/>
+      <w:lvlText w:val="%3."/>
+      <w:lvlJc w:val="left"/>
+      <w:pPr>
+        <w:tabs>
+          <w:tab w:val="num" w:pos="2160"/>
+        </w:tabs>
+        <w:ind w:left="2160" w:hanging="360"/>
+      </w:pPr>
+    </w:lvl>
+    <w:lvl w:ilvl="3" w:tentative="1">
+      <w:start w:val="1"/>
+      <w:numFmt w:val="decimal"/>
+      <w:lvlText w:val="%4."/>
+      <w:lvlJc w:val="left"/>
+      <w:pPr>
+        <w:tabs>
+          <w:tab w:val="num" w:pos="2880"/>
+        </w:tabs>
+        <w:ind w:left="2880" w:hanging="360"/>
+      </w:pPr>
+    </w:lvl>
+    <w:lvl w:ilvl="4" w:tentative="1">
+      <w:start w:val="1"/>
+      <w:numFmt w:val="decimal"/>
+      <w:lvlText w:val="%5."/>
+      <w:lvlJc w:val="left"/>
+      <w:pPr>
+        <w:tabs>
+          <w:tab w:val="num" w:pos="3600"/>
+        </w:tabs>
+        <w:ind w:left="3600" w:hanging="360"/>
+      </w:pPr>
+    </w:lvl>
+    <w:lvl w:ilvl="5" w:tentative="1">
+      <w:start w:val="1"/>
+      <w:numFmt w:val="decimal"/>
+      <w:lvlText w:val="%6."/>
+      <w:lvlJc w:val="left"/>
+      <w:pPr>
+        <w:tabs>
+          <w:tab w:val="num" w:pos="4320"/>
+        </w:tabs>
+        <w:ind w:left="4320" w:hanging="360"/>
+      </w:pPr>
+    </w:lvl>
+    <w:lvl w:ilvl="6" w:tentative="1">
+      <w:start w:val="1"/>
+      <w:numFmt w:val="decimal"/>
+      <w:lvlText w:val="%7."/>
+      <w:lvlJc w:val="left"/>
+      <w:pPr>
+        <w:tabs>
+          <w:tab w:val="num" w:pos="5040"/>
+        </w:tabs>
+        <w:ind w:left="5040" w:hanging="360"/>
+      </w:pPr>
+    </w:lvl>
+    <w:lvl w:ilvl="7" w:tentative="1">
+      <w:start w:val="1"/>
+      <w:numFmt w:val="decimal"/>
+      <w:lvlText w:val="%8."/>
+      <w:lvlJc w:val="left"/>
+      <w:pPr>
+        <w:tabs>
+          <w:tab w:val="num" w:pos="5760"/>
+        </w:tabs>
+        <w:ind w:left="5760" w:hanging="360"/>
+      </w:pPr>
+    </w:lvl>
+    <w:lvl w:ilvl="8" w:tentative="1">
+      <w:start w:val="1"/>
+      <w:numFmt w:val="decimal"/>
+      <w:lvlText w:val="%9."/>
+      <w:lvlJc w:val="left"/>
+      <w:pPr>
+        <w:tabs>
+          <w:tab w:val="num" w:pos="6480"/>
+        </w:tabs>
+        <w:ind w:left="6480" w:hanging="360"/>
+      </w:pPr>
+    </w:lvl>
+  </w:abstractNum>
+  <w:abstractNum w:abstractNumId="65" w15:restartNumberingAfterBreak="0">
     <w:nsid w:val="3C2B6D0A"/>
     <w:multiLevelType w:val="multilevel"/>
     <w:tmpl w:val="DEACF4A6"/>
@@ -36564,7 +37869,7 @@
       </w:rPr>
     </w:lvl>
   </w:abstractNum>
-  <w:abstractNum w:abstractNumId="63" w15:restartNumberingAfterBreak="0">
+  <w:abstractNum w:abstractNumId="66" w15:restartNumberingAfterBreak="0">
     <w:nsid w:val="3C2E5E3F"/>
     <w:multiLevelType w:val="multilevel"/>
     <w:tmpl w:val="DEACF4A6"/>
@@ -36713,7 +38018,7 @@
       </w:rPr>
     </w:lvl>
   </w:abstractNum>
-  <w:abstractNum w:abstractNumId="64" w15:restartNumberingAfterBreak="0">
+  <w:abstractNum w:abstractNumId="67" w15:restartNumberingAfterBreak="0">
     <w:nsid w:val="3C7D3893"/>
     <w:multiLevelType w:val="multilevel"/>
     <w:tmpl w:val="29B8FFAA"/>
@@ -36862,7 +38167,7 @@
       </w:rPr>
     </w:lvl>
   </w:abstractNum>
-  <w:abstractNum w:abstractNumId="65" w15:restartNumberingAfterBreak="0">
+  <w:abstractNum w:abstractNumId="68" w15:restartNumberingAfterBreak="0">
     <w:nsid w:val="3D7A37AC"/>
     <w:multiLevelType w:val="multilevel"/>
     <w:tmpl w:val="21204102"/>
@@ -37011,7 +38316,7 @@
       </w:rPr>
     </w:lvl>
   </w:abstractNum>
-  <w:abstractNum w:abstractNumId="66" w15:restartNumberingAfterBreak="0">
+  <w:abstractNum w:abstractNumId="69" w15:restartNumberingAfterBreak="0">
     <w:nsid w:val="3DA409C1"/>
     <w:multiLevelType w:val="multilevel"/>
     <w:tmpl w:val="D9B0EB32"/>
@@ -37160,7 +38465,156 @@
       </w:rPr>
     </w:lvl>
   </w:abstractNum>
-  <w:abstractNum w:abstractNumId="67" w15:restartNumberingAfterBreak="0">
+  <w:abstractNum w:abstractNumId="70" w15:restartNumberingAfterBreak="0">
+    <w:nsid w:val="3ECE2872"/>
+    <w:multiLevelType w:val="multilevel"/>
+    <w:tmpl w:val="D1C8890E"/>
+    <w:lvl w:ilvl="0">
+      <w:start w:val="1"/>
+      <w:numFmt w:val="bullet"/>
+      <w:lvlText w:val=""/>
+      <w:lvlJc w:val="left"/>
+      <w:pPr>
+        <w:tabs>
+          <w:tab w:val="num" w:pos="720"/>
+        </w:tabs>
+        <w:ind w:left="720" w:hanging="360"/>
+      </w:pPr>
+      <w:rPr>
+        <w:rFonts w:ascii="Symbol" w:hAnsi="Symbol" w:hint="default"/>
+        <w:sz w:val="20"/>
+      </w:rPr>
+    </w:lvl>
+    <w:lvl w:ilvl="1">
+      <w:start w:val="1"/>
+      <w:numFmt w:val="bullet"/>
+      <w:lvlText w:val="o"/>
+      <w:lvlJc w:val="left"/>
+      <w:pPr>
+        <w:tabs>
+          <w:tab w:val="num" w:pos="1440"/>
+        </w:tabs>
+        <w:ind w:left="1440" w:hanging="360"/>
+      </w:pPr>
+      <w:rPr>
+        <w:rFonts w:ascii="Courier New" w:hAnsi="Courier New" w:hint="default"/>
+        <w:sz w:val="20"/>
+      </w:rPr>
+    </w:lvl>
+    <w:lvl w:ilvl="2" w:tentative="1">
+      <w:start w:val="1"/>
+      <w:numFmt w:val="bullet"/>
+      <w:lvlText w:val=""/>
+      <w:lvlJc w:val="left"/>
+      <w:pPr>
+        <w:tabs>
+          <w:tab w:val="num" w:pos="2160"/>
+        </w:tabs>
+        <w:ind w:left="2160" w:hanging="360"/>
+      </w:pPr>
+      <w:rPr>
+        <w:rFonts w:ascii="Wingdings" w:hAnsi="Wingdings" w:hint="default"/>
+        <w:sz w:val="20"/>
+      </w:rPr>
+    </w:lvl>
+    <w:lvl w:ilvl="3" w:tentative="1">
+      <w:start w:val="1"/>
+      <w:numFmt w:val="bullet"/>
+      <w:lvlText w:val=""/>
+      <w:lvlJc w:val="left"/>
+      <w:pPr>
+        <w:tabs>
+          <w:tab w:val="num" w:pos="2880"/>
+        </w:tabs>
+        <w:ind w:left="2880" w:hanging="360"/>
+      </w:pPr>
+      <w:rPr>
+        <w:rFonts w:ascii="Wingdings" w:hAnsi="Wingdings" w:hint="default"/>
+        <w:sz w:val="20"/>
+      </w:rPr>
+    </w:lvl>
+    <w:lvl w:ilvl="4" w:tentative="1">
+      <w:start w:val="1"/>
+      <w:numFmt w:val="bullet"/>
+      <w:lvlText w:val=""/>
+      <w:lvlJc w:val="left"/>
+      <w:pPr>
+        <w:tabs>
+          <w:tab w:val="num" w:pos="3600"/>
+        </w:tabs>
+        <w:ind w:left="3600" w:hanging="360"/>
+      </w:pPr>
+      <w:rPr>
+        <w:rFonts w:ascii="Wingdings" w:hAnsi="Wingdings" w:hint="default"/>
+        <w:sz w:val="20"/>
+      </w:rPr>
+    </w:lvl>
+    <w:lvl w:ilvl="5" w:tentative="1">
+      <w:start w:val="1"/>
+      <w:numFmt w:val="bullet"/>
+      <w:lvlText w:val=""/>
+      <w:lvlJc w:val="left"/>
+      <w:pPr>
+        <w:tabs>
+          <w:tab w:val="num" w:pos="4320"/>
+        </w:tabs>
+        <w:ind w:left="4320" w:hanging="360"/>
+      </w:pPr>
+      <w:rPr>
+        <w:rFonts w:ascii="Wingdings" w:hAnsi="Wingdings" w:hint="default"/>
+        <w:sz w:val="20"/>
+      </w:rPr>
+    </w:lvl>
+    <w:lvl w:ilvl="6" w:tentative="1">
+      <w:start w:val="1"/>
+      <w:numFmt w:val="bullet"/>
+      <w:lvlText w:val=""/>
+      <w:lvlJc w:val="left"/>
+      <w:pPr>
+        <w:tabs>
+          <w:tab w:val="num" w:pos="5040"/>
+        </w:tabs>
+        <w:ind w:left="5040" w:hanging="360"/>
+      </w:pPr>
+      <w:rPr>
+        <w:rFonts w:ascii="Wingdings" w:hAnsi="Wingdings" w:hint="default"/>
+        <w:sz w:val="20"/>
+      </w:rPr>
+    </w:lvl>
+    <w:lvl w:ilvl="7" w:tentative="1">
+      <w:start w:val="1"/>
+      <w:numFmt w:val="bullet"/>
+      <w:lvlText w:val=""/>
+      <w:lvlJc w:val="left"/>
+      <w:pPr>
+        <w:tabs>
+          <w:tab w:val="num" w:pos="5760"/>
+        </w:tabs>
+        <w:ind w:left="5760" w:hanging="360"/>
+      </w:pPr>
+      <w:rPr>
+        <w:rFonts w:ascii="Wingdings" w:hAnsi="Wingdings" w:hint="default"/>
+        <w:sz w:val="20"/>
+      </w:rPr>
+    </w:lvl>
+    <w:lvl w:ilvl="8" w:tentative="1">
+      <w:start w:val="1"/>
+      <w:numFmt w:val="bullet"/>
+      <w:lvlText w:val=""/>
+      <w:lvlJc w:val="left"/>
+      <w:pPr>
+        <w:tabs>
+          <w:tab w:val="num" w:pos="6480"/>
+        </w:tabs>
+        <w:ind w:left="6480" w:hanging="360"/>
+      </w:pPr>
+      <w:rPr>
+        <w:rFonts w:ascii="Wingdings" w:hAnsi="Wingdings" w:hint="default"/>
+        <w:sz w:val="20"/>
+      </w:rPr>
+    </w:lvl>
+  </w:abstractNum>
+  <w:abstractNum w:abstractNumId="71" w15:restartNumberingAfterBreak="0">
     <w:nsid w:val="3FB67063"/>
     <w:multiLevelType w:val="multilevel"/>
     <w:tmpl w:val="DEACF4A6"/>
@@ -37309,7 +38763,7 @@
       </w:rPr>
     </w:lvl>
   </w:abstractNum>
-  <w:abstractNum w:abstractNumId="68" w15:restartNumberingAfterBreak="0">
+  <w:abstractNum w:abstractNumId="72" w15:restartNumberingAfterBreak="0">
     <w:nsid w:val="40320410"/>
     <w:multiLevelType w:val="multilevel"/>
     <w:tmpl w:val="DEACF4A6"/>
@@ -37458,7 +38912,7 @@
       </w:rPr>
     </w:lvl>
   </w:abstractNum>
-  <w:abstractNum w:abstractNumId="69" w15:restartNumberingAfterBreak="0">
+  <w:abstractNum w:abstractNumId="73" w15:restartNumberingAfterBreak="0">
     <w:nsid w:val="40890F92"/>
     <w:multiLevelType w:val="multilevel"/>
     <w:tmpl w:val="19DEC10E"/>
@@ -37607,7 +39061,7 @@
       </w:rPr>
     </w:lvl>
   </w:abstractNum>
-  <w:abstractNum w:abstractNumId="70" w15:restartNumberingAfterBreak="0">
+  <w:abstractNum w:abstractNumId="74" w15:restartNumberingAfterBreak="0">
     <w:nsid w:val="41436C5D"/>
     <w:multiLevelType w:val="multilevel"/>
     <w:tmpl w:val="EA4035CE"/>
@@ -37756,7 +39210,7 @@
       </w:rPr>
     </w:lvl>
   </w:abstractNum>
-  <w:abstractNum w:abstractNumId="71" w15:restartNumberingAfterBreak="0">
+  <w:abstractNum w:abstractNumId="75" w15:restartNumberingAfterBreak="0">
     <w:nsid w:val="415C2938"/>
     <w:multiLevelType w:val="multilevel"/>
     <w:tmpl w:val="23C2479E"/>
@@ -37905,7 +39359,7 @@
       </w:rPr>
     </w:lvl>
   </w:abstractNum>
-  <w:abstractNum w:abstractNumId="72" w15:restartNumberingAfterBreak="0">
+  <w:abstractNum w:abstractNumId="76" w15:restartNumberingAfterBreak="0">
     <w:nsid w:val="416631EF"/>
     <w:multiLevelType w:val="multilevel"/>
     <w:tmpl w:val="A5DA0BC8"/>
@@ -38054,7 +39508,7 @@
       </w:rPr>
     </w:lvl>
   </w:abstractNum>
-  <w:abstractNum w:abstractNumId="73" w15:restartNumberingAfterBreak="0">
+  <w:abstractNum w:abstractNumId="77" w15:restartNumberingAfterBreak="0">
     <w:nsid w:val="4181329B"/>
     <w:multiLevelType w:val="multilevel"/>
     <w:tmpl w:val="DEACF4A6"/>
@@ -38203,7 +39657,7 @@
       </w:rPr>
     </w:lvl>
   </w:abstractNum>
-  <w:abstractNum w:abstractNumId="74" w15:restartNumberingAfterBreak="0">
+  <w:abstractNum w:abstractNumId="78" w15:restartNumberingAfterBreak="0">
     <w:nsid w:val="418834FC"/>
     <w:multiLevelType w:val="multilevel"/>
     <w:tmpl w:val="BEE04852"/>
@@ -38352,7 +39806,7 @@
       </w:rPr>
     </w:lvl>
   </w:abstractNum>
-  <w:abstractNum w:abstractNumId="75" w15:restartNumberingAfterBreak="0">
+  <w:abstractNum w:abstractNumId="79" w15:restartNumberingAfterBreak="0">
     <w:nsid w:val="418A05A0"/>
     <w:multiLevelType w:val="multilevel"/>
     <w:tmpl w:val="0674F7AE"/>
@@ -38501,7 +39955,7 @@
       </w:rPr>
     </w:lvl>
   </w:abstractNum>
-  <w:abstractNum w:abstractNumId="76" w15:restartNumberingAfterBreak="0">
+  <w:abstractNum w:abstractNumId="80" w15:restartNumberingAfterBreak="0">
     <w:nsid w:val="41F642CE"/>
     <w:multiLevelType w:val="multilevel"/>
     <w:tmpl w:val="55A291E0"/>
@@ -38650,7 +40104,7 @@
       </w:rPr>
     </w:lvl>
   </w:abstractNum>
-  <w:abstractNum w:abstractNumId="77" w15:restartNumberingAfterBreak="0">
+  <w:abstractNum w:abstractNumId="81" w15:restartNumberingAfterBreak="0">
     <w:nsid w:val="422D07EF"/>
     <w:multiLevelType w:val="multilevel"/>
     <w:tmpl w:val="DEACF4A6"/>
@@ -38799,7 +40253,7 @@
       </w:rPr>
     </w:lvl>
   </w:abstractNum>
-  <w:abstractNum w:abstractNumId="78" w15:restartNumberingAfterBreak="0">
+  <w:abstractNum w:abstractNumId="82" w15:restartNumberingAfterBreak="0">
     <w:nsid w:val="43B402E8"/>
     <w:multiLevelType w:val="multilevel"/>
     <w:tmpl w:val="734CA24C"/>
@@ -38948,7 +40402,7 @@
       </w:rPr>
     </w:lvl>
   </w:abstractNum>
-  <w:abstractNum w:abstractNumId="79" w15:restartNumberingAfterBreak="0">
+  <w:abstractNum w:abstractNumId="83" w15:restartNumberingAfterBreak="0">
     <w:nsid w:val="459941E7"/>
     <w:multiLevelType w:val="multilevel"/>
     <w:tmpl w:val="E870D406"/>
@@ -39097,7 +40551,156 @@
       </w:rPr>
     </w:lvl>
   </w:abstractNum>
-  <w:abstractNum w:abstractNumId="80" w15:restartNumberingAfterBreak="0">
+  <w:abstractNum w:abstractNumId="84" w15:restartNumberingAfterBreak="0">
+    <w:nsid w:val="45C96F3B"/>
+    <w:multiLevelType w:val="multilevel"/>
+    <w:tmpl w:val="DD107304"/>
+    <w:lvl w:ilvl="0">
+      <w:start w:val="1"/>
+      <w:numFmt w:val="bullet"/>
+      <w:lvlText w:val=""/>
+      <w:lvlJc w:val="left"/>
+      <w:pPr>
+        <w:tabs>
+          <w:tab w:val="num" w:pos="720"/>
+        </w:tabs>
+        <w:ind w:left="720" w:hanging="360"/>
+      </w:pPr>
+      <w:rPr>
+        <w:rFonts w:ascii="Symbol" w:hAnsi="Symbol" w:hint="default"/>
+        <w:sz w:val="20"/>
+      </w:rPr>
+    </w:lvl>
+    <w:lvl w:ilvl="1" w:tentative="1">
+      <w:start w:val="1"/>
+      <w:numFmt w:val="bullet"/>
+      <w:lvlText w:val="o"/>
+      <w:lvlJc w:val="left"/>
+      <w:pPr>
+        <w:tabs>
+          <w:tab w:val="num" w:pos="1440"/>
+        </w:tabs>
+        <w:ind w:left="1440" w:hanging="360"/>
+      </w:pPr>
+      <w:rPr>
+        <w:rFonts w:ascii="Courier New" w:hAnsi="Courier New" w:hint="default"/>
+        <w:sz w:val="20"/>
+      </w:rPr>
+    </w:lvl>
+    <w:lvl w:ilvl="2" w:tentative="1">
+      <w:start w:val="1"/>
+      <w:numFmt w:val="bullet"/>
+      <w:lvlText w:val=""/>
+      <w:lvlJc w:val="left"/>
+      <w:pPr>
+        <w:tabs>
+          <w:tab w:val="num" w:pos="2160"/>
+        </w:tabs>
+        <w:ind w:left="2160" w:hanging="360"/>
+      </w:pPr>
+      <w:rPr>
+        <w:rFonts w:ascii="Wingdings" w:hAnsi="Wingdings" w:hint="default"/>
+        <w:sz w:val="20"/>
+      </w:rPr>
+    </w:lvl>
+    <w:lvl w:ilvl="3" w:tentative="1">
+      <w:start w:val="1"/>
+      <w:numFmt w:val="bullet"/>
+      <w:lvlText w:val=""/>
+      <w:lvlJc w:val="left"/>
+      <w:pPr>
+        <w:tabs>
+          <w:tab w:val="num" w:pos="2880"/>
+        </w:tabs>
+        <w:ind w:left="2880" w:hanging="360"/>
+      </w:pPr>
+      <w:rPr>
+        <w:rFonts w:ascii="Wingdings" w:hAnsi="Wingdings" w:hint="default"/>
+        <w:sz w:val="20"/>
+      </w:rPr>
+    </w:lvl>
+    <w:lvl w:ilvl="4" w:tentative="1">
+      <w:start w:val="1"/>
+      <w:numFmt w:val="bullet"/>
+      <w:lvlText w:val=""/>
+      <w:lvlJc w:val="left"/>
+      <w:pPr>
+        <w:tabs>
+          <w:tab w:val="num" w:pos="3600"/>
+        </w:tabs>
+        <w:ind w:left="3600" w:hanging="360"/>
+      </w:pPr>
+      <w:rPr>
+        <w:rFonts w:ascii="Wingdings" w:hAnsi="Wingdings" w:hint="default"/>
+        <w:sz w:val="20"/>
+      </w:rPr>
+    </w:lvl>
+    <w:lvl w:ilvl="5" w:tentative="1">
+      <w:start w:val="1"/>
+      <w:numFmt w:val="bullet"/>
+      <w:lvlText w:val=""/>
+      <w:lvlJc w:val="left"/>
+      <w:pPr>
+        <w:tabs>
+          <w:tab w:val="num" w:pos="4320"/>
+        </w:tabs>
+        <w:ind w:left="4320" w:hanging="360"/>
+      </w:pPr>
+      <w:rPr>
+        <w:rFonts w:ascii="Wingdings" w:hAnsi="Wingdings" w:hint="default"/>
+        <w:sz w:val="20"/>
+      </w:rPr>
+    </w:lvl>
+    <w:lvl w:ilvl="6" w:tentative="1">
+      <w:start w:val="1"/>
+      <w:numFmt w:val="bullet"/>
+      <w:lvlText w:val=""/>
+      <w:lvlJc w:val="left"/>
+      <w:pPr>
+        <w:tabs>
+          <w:tab w:val="num" w:pos="5040"/>
+        </w:tabs>
+        <w:ind w:left="5040" w:hanging="360"/>
+      </w:pPr>
+      <w:rPr>
+        <w:rFonts w:ascii="Wingdings" w:hAnsi="Wingdings" w:hint="default"/>
+        <w:sz w:val="20"/>
+      </w:rPr>
+    </w:lvl>
+    <w:lvl w:ilvl="7" w:tentative="1">
+      <w:start w:val="1"/>
+      <w:numFmt w:val="bullet"/>
+      <w:lvlText w:val=""/>
+      <w:lvlJc w:val="left"/>
+      <w:pPr>
+        <w:tabs>
+          <w:tab w:val="num" w:pos="5760"/>
+        </w:tabs>
+        <w:ind w:left="5760" w:hanging="360"/>
+      </w:pPr>
+      <w:rPr>
+        <w:rFonts w:ascii="Wingdings" w:hAnsi="Wingdings" w:hint="default"/>
+        <w:sz w:val="20"/>
+      </w:rPr>
+    </w:lvl>
+    <w:lvl w:ilvl="8" w:tentative="1">
+      <w:start w:val="1"/>
+      <w:numFmt w:val="bullet"/>
+      <w:lvlText w:val=""/>
+      <w:lvlJc w:val="left"/>
+      <w:pPr>
+        <w:tabs>
+          <w:tab w:val="num" w:pos="6480"/>
+        </w:tabs>
+        <w:ind w:left="6480" w:hanging="360"/>
+      </w:pPr>
+      <w:rPr>
+        <w:rFonts w:ascii="Wingdings" w:hAnsi="Wingdings" w:hint="default"/>
+        <w:sz w:val="20"/>
+      </w:rPr>
+    </w:lvl>
+  </w:abstractNum>
+  <w:abstractNum w:abstractNumId="85" w15:restartNumberingAfterBreak="0">
     <w:nsid w:val="47A41862"/>
     <w:multiLevelType w:val="multilevel"/>
     <w:tmpl w:val="2EE45D36"/>
@@ -39246,7 +40849,7 @@
       </w:rPr>
     </w:lvl>
   </w:abstractNum>
-  <w:abstractNum w:abstractNumId="81" w15:restartNumberingAfterBreak="0">
+  <w:abstractNum w:abstractNumId="86" w15:restartNumberingAfterBreak="0">
     <w:nsid w:val="47FA068A"/>
     <w:multiLevelType w:val="multilevel"/>
     <w:tmpl w:val="1C4280A4"/>
@@ -39395,7 +40998,7 @@
       </w:rPr>
     </w:lvl>
   </w:abstractNum>
-  <w:abstractNum w:abstractNumId="82" w15:restartNumberingAfterBreak="0">
+  <w:abstractNum w:abstractNumId="87" w15:restartNumberingAfterBreak="0">
     <w:nsid w:val="4959219F"/>
     <w:multiLevelType w:val="multilevel"/>
     <w:tmpl w:val="EEA4B6CE"/>
@@ -39544,7 +41147,7 @@
       </w:rPr>
     </w:lvl>
   </w:abstractNum>
-  <w:abstractNum w:abstractNumId="83" w15:restartNumberingAfterBreak="0">
+  <w:abstractNum w:abstractNumId="88" w15:restartNumberingAfterBreak="0">
     <w:nsid w:val="49592460"/>
     <w:multiLevelType w:val="multilevel"/>
     <w:tmpl w:val="74B23A92"/>
@@ -39693,7 +41296,7 @@
       </w:rPr>
     </w:lvl>
   </w:abstractNum>
-  <w:abstractNum w:abstractNumId="84" w15:restartNumberingAfterBreak="0">
+  <w:abstractNum w:abstractNumId="89" w15:restartNumberingAfterBreak="0">
     <w:nsid w:val="499347E1"/>
     <w:multiLevelType w:val="multilevel"/>
     <w:tmpl w:val="A69AFF14"/>
@@ -39842,7 +41445,7 @@
       </w:rPr>
     </w:lvl>
   </w:abstractNum>
-  <w:abstractNum w:abstractNumId="85" w15:restartNumberingAfterBreak="0">
+  <w:abstractNum w:abstractNumId="90" w15:restartNumberingAfterBreak="0">
     <w:nsid w:val="49AC00E4"/>
     <w:multiLevelType w:val="multilevel"/>
     <w:tmpl w:val="D3586A0C"/>
@@ -39991,7 +41594,7 @@
       </w:rPr>
     </w:lvl>
   </w:abstractNum>
-  <w:abstractNum w:abstractNumId="86" w15:restartNumberingAfterBreak="0">
+  <w:abstractNum w:abstractNumId="91" w15:restartNumberingAfterBreak="0">
     <w:nsid w:val="4A37675A"/>
     <w:multiLevelType w:val="multilevel"/>
     <w:tmpl w:val="5CAA72DA"/>
@@ -40140,7 +41743,7 @@
       </w:rPr>
     </w:lvl>
   </w:abstractNum>
-  <w:abstractNum w:abstractNumId="87" w15:restartNumberingAfterBreak="0">
+  <w:abstractNum w:abstractNumId="92" w15:restartNumberingAfterBreak="0">
     <w:nsid w:val="4A7938A8"/>
     <w:multiLevelType w:val="multilevel"/>
     <w:tmpl w:val="6FC2FDEA"/>
@@ -40289,7 +41892,7 @@
       </w:rPr>
     </w:lvl>
   </w:abstractNum>
-  <w:abstractNum w:abstractNumId="88" w15:restartNumberingAfterBreak="0">
+  <w:abstractNum w:abstractNumId="93" w15:restartNumberingAfterBreak="0">
     <w:nsid w:val="4A916050"/>
     <w:multiLevelType w:val="multilevel"/>
     <w:tmpl w:val="DEACF4A6"/>
@@ -40438,7 +42041,7 @@
       </w:rPr>
     </w:lvl>
   </w:abstractNum>
-  <w:abstractNum w:abstractNumId="89" w15:restartNumberingAfterBreak="0">
+  <w:abstractNum w:abstractNumId="94" w15:restartNumberingAfterBreak="0">
     <w:nsid w:val="4B5C4E86"/>
     <w:multiLevelType w:val="multilevel"/>
     <w:tmpl w:val="49CCAE56"/>
@@ -40587,7 +42190,7 @@
       </w:rPr>
     </w:lvl>
   </w:abstractNum>
-  <w:abstractNum w:abstractNumId="90" w15:restartNumberingAfterBreak="0">
+  <w:abstractNum w:abstractNumId="95" w15:restartNumberingAfterBreak="0">
     <w:nsid w:val="4BA535A7"/>
     <w:multiLevelType w:val="multilevel"/>
     <w:tmpl w:val="1F9CFAF6"/>
@@ -40708,7 +42311,7 @@
       </w:pPr>
     </w:lvl>
   </w:abstractNum>
-  <w:abstractNum w:abstractNumId="91" w15:restartNumberingAfterBreak="0">
+  <w:abstractNum w:abstractNumId="96" w15:restartNumberingAfterBreak="0">
     <w:nsid w:val="4D435794"/>
     <w:multiLevelType w:val="multilevel"/>
     <w:tmpl w:val="01C8C402"/>
@@ -40857,7 +42460,7 @@
       </w:rPr>
     </w:lvl>
   </w:abstractNum>
-  <w:abstractNum w:abstractNumId="92" w15:restartNumberingAfterBreak="0">
+  <w:abstractNum w:abstractNumId="97" w15:restartNumberingAfterBreak="0">
     <w:nsid w:val="4E2E7287"/>
     <w:multiLevelType w:val="multilevel"/>
     <w:tmpl w:val="DEACF4A6"/>
@@ -41006,7 +42609,7 @@
       </w:rPr>
     </w:lvl>
   </w:abstractNum>
-  <w:abstractNum w:abstractNumId="93" w15:restartNumberingAfterBreak="0">
+  <w:abstractNum w:abstractNumId="98" w15:restartNumberingAfterBreak="0">
     <w:nsid w:val="4EAE3361"/>
     <w:multiLevelType w:val="multilevel"/>
     <w:tmpl w:val="B866B10A"/>
@@ -41155,7 +42758,7 @@
       </w:rPr>
     </w:lvl>
   </w:abstractNum>
-  <w:abstractNum w:abstractNumId="94" w15:restartNumberingAfterBreak="0">
+  <w:abstractNum w:abstractNumId="99" w15:restartNumberingAfterBreak="0">
     <w:nsid w:val="4F3279A5"/>
     <w:multiLevelType w:val="multilevel"/>
     <w:tmpl w:val="F3D6E59C"/>
@@ -41304,7 +42907,7 @@
       </w:rPr>
     </w:lvl>
   </w:abstractNum>
-  <w:abstractNum w:abstractNumId="95" w15:restartNumberingAfterBreak="0">
+  <w:abstractNum w:abstractNumId="100" w15:restartNumberingAfterBreak="0">
     <w:nsid w:val="50C010A8"/>
     <w:multiLevelType w:val="multilevel"/>
     <w:tmpl w:val="7FF6A5C6"/>
@@ -41421,7 +43024,7 @@
       </w:pPr>
     </w:lvl>
   </w:abstractNum>
-  <w:abstractNum w:abstractNumId="96" w15:restartNumberingAfterBreak="0">
+  <w:abstractNum w:abstractNumId="101" w15:restartNumberingAfterBreak="0">
     <w:nsid w:val="51491159"/>
     <w:multiLevelType w:val="multilevel"/>
     <w:tmpl w:val="856CF8B2"/>
@@ -41570,7 +43173,7 @@
       </w:rPr>
     </w:lvl>
   </w:abstractNum>
-  <w:abstractNum w:abstractNumId="97" w15:restartNumberingAfterBreak="0">
+  <w:abstractNum w:abstractNumId="102" w15:restartNumberingAfterBreak="0">
     <w:nsid w:val="523740B1"/>
     <w:multiLevelType w:val="multilevel"/>
     <w:tmpl w:val="1FB84864"/>
@@ -41719,7 +43322,7 @@
       </w:rPr>
     </w:lvl>
   </w:abstractNum>
-  <w:abstractNum w:abstractNumId="98" w15:restartNumberingAfterBreak="0">
+  <w:abstractNum w:abstractNumId="103" w15:restartNumberingAfterBreak="0">
     <w:nsid w:val="523B5C17"/>
     <w:multiLevelType w:val="multilevel"/>
     <w:tmpl w:val="62E45FB0"/>
@@ -41868,7 +43471,7 @@
       </w:rPr>
     </w:lvl>
   </w:abstractNum>
-  <w:abstractNum w:abstractNumId="99" w15:restartNumberingAfterBreak="0">
+  <w:abstractNum w:abstractNumId="104" w15:restartNumberingAfterBreak="0">
     <w:nsid w:val="54E6346C"/>
     <w:multiLevelType w:val="multilevel"/>
     <w:tmpl w:val="C19AAF5E"/>
@@ -42017,7 +43620,7 @@
       </w:rPr>
     </w:lvl>
   </w:abstractNum>
-  <w:abstractNum w:abstractNumId="100" w15:restartNumberingAfterBreak="0">
+  <w:abstractNum w:abstractNumId="105" w15:restartNumberingAfterBreak="0">
     <w:nsid w:val="55376D85"/>
     <w:multiLevelType w:val="multilevel"/>
     <w:tmpl w:val="DEACF4A6"/>
@@ -42166,7 +43769,7 @@
       </w:rPr>
     </w:lvl>
   </w:abstractNum>
-  <w:abstractNum w:abstractNumId="101" w15:restartNumberingAfterBreak="0">
+  <w:abstractNum w:abstractNumId="106" w15:restartNumberingAfterBreak="0">
     <w:nsid w:val="560078D3"/>
     <w:multiLevelType w:val="hybridMultilevel"/>
     <w:tmpl w:val="F30A58D4"/>
@@ -42252,7 +43855,7 @@
       </w:pPr>
     </w:lvl>
   </w:abstractNum>
-  <w:abstractNum w:abstractNumId="102" w15:restartNumberingAfterBreak="0">
+  <w:abstractNum w:abstractNumId="107" w15:restartNumberingAfterBreak="0">
     <w:nsid w:val="561B0462"/>
     <w:multiLevelType w:val="multilevel"/>
     <w:tmpl w:val="BF2808BA"/>
@@ -42401,7 +44004,7 @@
       </w:rPr>
     </w:lvl>
   </w:abstractNum>
-  <w:abstractNum w:abstractNumId="103" w15:restartNumberingAfterBreak="0">
+  <w:abstractNum w:abstractNumId="108" w15:restartNumberingAfterBreak="0">
     <w:nsid w:val="56A96381"/>
     <w:multiLevelType w:val="multilevel"/>
     <w:tmpl w:val="1DB88E4A"/>
@@ -42550,7 +44153,7 @@
       </w:rPr>
     </w:lvl>
   </w:abstractNum>
-  <w:abstractNum w:abstractNumId="104" w15:restartNumberingAfterBreak="0">
+  <w:abstractNum w:abstractNumId="109" w15:restartNumberingAfterBreak="0">
     <w:nsid w:val="56DE45A4"/>
     <w:multiLevelType w:val="multilevel"/>
     <w:tmpl w:val="F1DE8CA8"/>
@@ -42699,7 +44302,7 @@
       </w:rPr>
     </w:lvl>
   </w:abstractNum>
-  <w:abstractNum w:abstractNumId="105" w15:restartNumberingAfterBreak="0">
+  <w:abstractNum w:abstractNumId="110" w15:restartNumberingAfterBreak="0">
     <w:nsid w:val="573729A6"/>
     <w:multiLevelType w:val="multilevel"/>
     <w:tmpl w:val="DEACF4A6"/>
@@ -42848,7 +44451,7 @@
       </w:rPr>
     </w:lvl>
   </w:abstractNum>
-  <w:abstractNum w:abstractNumId="106" w15:restartNumberingAfterBreak="0">
+  <w:abstractNum w:abstractNumId="111" w15:restartNumberingAfterBreak="0">
     <w:nsid w:val="57E235CD"/>
     <w:multiLevelType w:val="multilevel"/>
     <w:tmpl w:val="DEACF4A6"/>
@@ -42997,7 +44600,7 @@
       </w:rPr>
     </w:lvl>
   </w:abstractNum>
-  <w:abstractNum w:abstractNumId="107" w15:restartNumberingAfterBreak="0">
+  <w:abstractNum w:abstractNumId="112" w15:restartNumberingAfterBreak="0">
     <w:nsid w:val="587E1401"/>
     <w:multiLevelType w:val="multilevel"/>
     <w:tmpl w:val="32D0B74A"/>
@@ -43146,7 +44749,7 @@
       </w:rPr>
     </w:lvl>
   </w:abstractNum>
-  <w:abstractNum w:abstractNumId="108" w15:restartNumberingAfterBreak="0">
+  <w:abstractNum w:abstractNumId="113" w15:restartNumberingAfterBreak="0">
     <w:nsid w:val="58DA77D3"/>
     <w:multiLevelType w:val="multilevel"/>
     <w:tmpl w:val="496AECC8"/>
@@ -43295,7 +44898,7 @@
       </w:rPr>
     </w:lvl>
   </w:abstractNum>
-  <w:abstractNum w:abstractNumId="109" w15:restartNumberingAfterBreak="0">
+  <w:abstractNum w:abstractNumId="114" w15:restartNumberingAfterBreak="0">
     <w:nsid w:val="59962779"/>
     <w:multiLevelType w:val="multilevel"/>
     <w:tmpl w:val="2F541102"/>
@@ -43444,7 +45047,7 @@
       </w:rPr>
     </w:lvl>
   </w:abstractNum>
-  <w:abstractNum w:abstractNumId="110" w15:restartNumberingAfterBreak="0">
+  <w:abstractNum w:abstractNumId="115" w15:restartNumberingAfterBreak="0">
     <w:nsid w:val="5AB5146E"/>
     <w:multiLevelType w:val="multilevel"/>
     <w:tmpl w:val="F79A82F0"/>
@@ -43593,7 +45196,7 @@
       </w:rPr>
     </w:lvl>
   </w:abstractNum>
-  <w:abstractNum w:abstractNumId="111" w15:restartNumberingAfterBreak="0">
+  <w:abstractNum w:abstractNumId="116" w15:restartNumberingAfterBreak="0">
     <w:nsid w:val="5B16276B"/>
     <w:multiLevelType w:val="multilevel"/>
     <w:tmpl w:val="B846DD08"/>
@@ -43742,7 +45345,7 @@
       </w:rPr>
     </w:lvl>
   </w:abstractNum>
-  <w:abstractNum w:abstractNumId="112" w15:restartNumberingAfterBreak="0">
+  <w:abstractNum w:abstractNumId="117" w15:restartNumberingAfterBreak="0">
     <w:nsid w:val="5B371E84"/>
     <w:multiLevelType w:val="multilevel"/>
     <w:tmpl w:val="E864D950"/>
@@ -43891,7 +45494,7 @@
       </w:rPr>
     </w:lvl>
   </w:abstractNum>
-  <w:abstractNum w:abstractNumId="113" w15:restartNumberingAfterBreak="0">
+  <w:abstractNum w:abstractNumId="118" w15:restartNumberingAfterBreak="0">
     <w:nsid w:val="5B8B1F0F"/>
     <w:multiLevelType w:val="multilevel"/>
     <w:tmpl w:val="7276947C"/>
@@ -44040,7 +45643,7 @@
       </w:rPr>
     </w:lvl>
   </w:abstractNum>
-  <w:abstractNum w:abstractNumId="114" w15:restartNumberingAfterBreak="0">
+  <w:abstractNum w:abstractNumId="119" w15:restartNumberingAfterBreak="0">
     <w:nsid w:val="5C70747B"/>
     <w:multiLevelType w:val="multilevel"/>
     <w:tmpl w:val="D61EB76A"/>
@@ -44189,7 +45792,7 @@
       </w:rPr>
     </w:lvl>
   </w:abstractNum>
-  <w:abstractNum w:abstractNumId="115" w15:restartNumberingAfterBreak="0">
+  <w:abstractNum w:abstractNumId="120" w15:restartNumberingAfterBreak="0">
     <w:nsid w:val="5CB55C3E"/>
     <w:multiLevelType w:val="multilevel"/>
     <w:tmpl w:val="12BCF4F6"/>
@@ -44338,7 +45941,7 @@
       </w:rPr>
     </w:lvl>
   </w:abstractNum>
-  <w:abstractNum w:abstractNumId="116" w15:restartNumberingAfterBreak="0">
+  <w:abstractNum w:abstractNumId="121" w15:restartNumberingAfterBreak="0">
     <w:nsid w:val="5D1C3627"/>
     <w:multiLevelType w:val="multilevel"/>
     <w:tmpl w:val="665417FA"/>
@@ -44451,7 +46054,7 @@
       </w:pPr>
     </w:lvl>
   </w:abstractNum>
-  <w:abstractNum w:abstractNumId="117" w15:restartNumberingAfterBreak="0">
+  <w:abstractNum w:abstractNumId="122" w15:restartNumberingAfterBreak="0">
     <w:nsid w:val="5D334310"/>
     <w:multiLevelType w:val="multilevel"/>
     <w:tmpl w:val="2390A07E"/>
@@ -44600,7 +46203,7 @@
       </w:rPr>
     </w:lvl>
   </w:abstractNum>
-  <w:abstractNum w:abstractNumId="118" w15:restartNumberingAfterBreak="0">
+  <w:abstractNum w:abstractNumId="123" w15:restartNumberingAfterBreak="0">
     <w:nsid w:val="5E330E1C"/>
     <w:multiLevelType w:val="multilevel"/>
     <w:tmpl w:val="F5B24378"/>
@@ -44721,7 +46324,7 @@
       </w:pPr>
     </w:lvl>
   </w:abstractNum>
-  <w:abstractNum w:abstractNumId="119" w15:restartNumberingAfterBreak="0">
+  <w:abstractNum w:abstractNumId="124" w15:restartNumberingAfterBreak="0">
     <w:nsid w:val="5E4013E7"/>
     <w:multiLevelType w:val="multilevel"/>
     <w:tmpl w:val="5406C0D6"/>
@@ -44870,7 +46473,7 @@
       </w:rPr>
     </w:lvl>
   </w:abstractNum>
-  <w:abstractNum w:abstractNumId="120" w15:restartNumberingAfterBreak="0">
+  <w:abstractNum w:abstractNumId="125" w15:restartNumberingAfterBreak="0">
     <w:nsid w:val="5E855BCE"/>
     <w:multiLevelType w:val="multilevel"/>
     <w:tmpl w:val="64E2A726"/>
@@ -45019,7 +46622,7 @@
       </w:rPr>
     </w:lvl>
   </w:abstractNum>
-  <w:abstractNum w:abstractNumId="121" w15:restartNumberingAfterBreak="0">
+  <w:abstractNum w:abstractNumId="126" w15:restartNumberingAfterBreak="0">
     <w:nsid w:val="5FF87B10"/>
     <w:multiLevelType w:val="multilevel"/>
     <w:tmpl w:val="DCBCD0F2"/>
@@ -45168,7 +46771,7 @@
       </w:rPr>
     </w:lvl>
   </w:abstractNum>
-  <w:abstractNum w:abstractNumId="122" w15:restartNumberingAfterBreak="0">
+  <w:abstractNum w:abstractNumId="127" w15:restartNumberingAfterBreak="0">
     <w:nsid w:val="60D47D6E"/>
     <w:multiLevelType w:val="multilevel"/>
     <w:tmpl w:val="7C100110"/>
@@ -45317,7 +46920,7 @@
       </w:rPr>
     </w:lvl>
   </w:abstractNum>
-  <w:abstractNum w:abstractNumId="123" w15:restartNumberingAfterBreak="0">
+  <w:abstractNum w:abstractNumId="128" w15:restartNumberingAfterBreak="0">
     <w:nsid w:val="64E90CE1"/>
     <w:multiLevelType w:val="multilevel"/>
     <w:tmpl w:val="9D2C4784"/>
@@ -45466,7 +47069,7 @@
       </w:rPr>
     </w:lvl>
   </w:abstractNum>
-  <w:abstractNum w:abstractNumId="124" w15:restartNumberingAfterBreak="0">
+  <w:abstractNum w:abstractNumId="129" w15:restartNumberingAfterBreak="0">
     <w:nsid w:val="65111CD7"/>
     <w:multiLevelType w:val="multilevel"/>
     <w:tmpl w:val="1756B308"/>
@@ -45615,7 +47218,7 @@
       </w:rPr>
     </w:lvl>
   </w:abstractNum>
-  <w:abstractNum w:abstractNumId="125" w15:restartNumberingAfterBreak="0">
+  <w:abstractNum w:abstractNumId="130" w15:restartNumberingAfterBreak="0">
     <w:nsid w:val="66F80A6D"/>
     <w:multiLevelType w:val="multilevel"/>
     <w:tmpl w:val="31862EF4"/>
@@ -45764,7 +47367,7 @@
       </w:rPr>
     </w:lvl>
   </w:abstractNum>
-  <w:abstractNum w:abstractNumId="126" w15:restartNumberingAfterBreak="0">
+  <w:abstractNum w:abstractNumId="131" w15:restartNumberingAfterBreak="0">
     <w:nsid w:val="678934E3"/>
     <w:multiLevelType w:val="multilevel"/>
     <w:tmpl w:val="5E38E4AC"/>
@@ -45913,7 +47516,7 @@
       </w:rPr>
     </w:lvl>
   </w:abstractNum>
-  <w:abstractNum w:abstractNumId="127" w15:restartNumberingAfterBreak="0">
+  <w:abstractNum w:abstractNumId="132" w15:restartNumberingAfterBreak="0">
     <w:nsid w:val="6B155A5B"/>
     <w:multiLevelType w:val="multilevel"/>
     <w:tmpl w:val="DEACF4A6"/>
@@ -46062,7 +47665,7 @@
       </w:rPr>
     </w:lvl>
   </w:abstractNum>
-  <w:abstractNum w:abstractNumId="128" w15:restartNumberingAfterBreak="0">
+  <w:abstractNum w:abstractNumId="133" w15:restartNumberingAfterBreak="0">
     <w:nsid w:val="6B660339"/>
     <w:multiLevelType w:val="multilevel"/>
     <w:tmpl w:val="8A4CFEBC"/>
@@ -46211,7 +47814,7 @@
       </w:rPr>
     </w:lvl>
   </w:abstractNum>
-  <w:abstractNum w:abstractNumId="129" w15:restartNumberingAfterBreak="0">
+  <w:abstractNum w:abstractNumId="134" w15:restartNumberingAfterBreak="0">
     <w:nsid w:val="6BC53BB3"/>
     <w:multiLevelType w:val="multilevel"/>
     <w:tmpl w:val="1AAA5DEA"/>
@@ -46360,7 +47963,7 @@
       </w:rPr>
     </w:lvl>
   </w:abstractNum>
-  <w:abstractNum w:abstractNumId="130" w15:restartNumberingAfterBreak="0">
+  <w:abstractNum w:abstractNumId="135" w15:restartNumberingAfterBreak="0">
     <w:nsid w:val="6BF2702D"/>
     <w:multiLevelType w:val="multilevel"/>
     <w:tmpl w:val="DEACF4A6"/>
@@ -46509,7 +48112,156 @@
       </w:rPr>
     </w:lvl>
   </w:abstractNum>
-  <w:abstractNum w:abstractNumId="131" w15:restartNumberingAfterBreak="0">
+  <w:abstractNum w:abstractNumId="136" w15:restartNumberingAfterBreak="0">
+    <w:nsid w:val="6C3A2C06"/>
+    <w:multiLevelType w:val="multilevel"/>
+    <w:tmpl w:val="60424A78"/>
+    <w:lvl w:ilvl="0">
+      <w:start w:val="1"/>
+      <w:numFmt w:val="bullet"/>
+      <w:lvlText w:val=""/>
+      <w:lvlJc w:val="left"/>
+      <w:pPr>
+        <w:tabs>
+          <w:tab w:val="num" w:pos="720"/>
+        </w:tabs>
+        <w:ind w:left="720" w:hanging="360"/>
+      </w:pPr>
+      <w:rPr>
+        <w:rFonts w:ascii="Symbol" w:hAnsi="Symbol" w:hint="default"/>
+        <w:sz w:val="20"/>
+      </w:rPr>
+    </w:lvl>
+    <w:lvl w:ilvl="1">
+      <w:start w:val="1"/>
+      <w:numFmt w:val="bullet"/>
+      <w:lvlText w:val="o"/>
+      <w:lvlJc w:val="left"/>
+      <w:pPr>
+        <w:tabs>
+          <w:tab w:val="num" w:pos="1440"/>
+        </w:tabs>
+        <w:ind w:left="1440" w:hanging="360"/>
+      </w:pPr>
+      <w:rPr>
+        <w:rFonts w:ascii="Courier New" w:hAnsi="Courier New" w:hint="default"/>
+        <w:sz w:val="20"/>
+      </w:rPr>
+    </w:lvl>
+    <w:lvl w:ilvl="2" w:tentative="1">
+      <w:start w:val="1"/>
+      <w:numFmt w:val="bullet"/>
+      <w:lvlText w:val=""/>
+      <w:lvlJc w:val="left"/>
+      <w:pPr>
+        <w:tabs>
+          <w:tab w:val="num" w:pos="2160"/>
+        </w:tabs>
+        <w:ind w:left="2160" w:hanging="360"/>
+      </w:pPr>
+      <w:rPr>
+        <w:rFonts w:ascii="Wingdings" w:hAnsi="Wingdings" w:hint="default"/>
+        <w:sz w:val="20"/>
+      </w:rPr>
+    </w:lvl>
+    <w:lvl w:ilvl="3" w:tentative="1">
+      <w:start w:val="1"/>
+      <w:numFmt w:val="bullet"/>
+      <w:lvlText w:val=""/>
+      <w:lvlJc w:val="left"/>
+      <w:pPr>
+        <w:tabs>
+          <w:tab w:val="num" w:pos="2880"/>
+        </w:tabs>
+        <w:ind w:left="2880" w:hanging="360"/>
+      </w:pPr>
+      <w:rPr>
+        <w:rFonts w:ascii="Wingdings" w:hAnsi="Wingdings" w:hint="default"/>
+        <w:sz w:val="20"/>
+      </w:rPr>
+    </w:lvl>
+    <w:lvl w:ilvl="4" w:tentative="1">
+      <w:start w:val="1"/>
+      <w:numFmt w:val="bullet"/>
+      <w:lvlText w:val=""/>
+      <w:lvlJc w:val="left"/>
+      <w:pPr>
+        <w:tabs>
+          <w:tab w:val="num" w:pos="3600"/>
+        </w:tabs>
+        <w:ind w:left="3600" w:hanging="360"/>
+      </w:pPr>
+      <w:rPr>
+        <w:rFonts w:ascii="Wingdings" w:hAnsi="Wingdings" w:hint="default"/>
+        <w:sz w:val="20"/>
+      </w:rPr>
+    </w:lvl>
+    <w:lvl w:ilvl="5" w:tentative="1">
+      <w:start w:val="1"/>
+      <w:numFmt w:val="bullet"/>
+      <w:lvlText w:val=""/>
+      <w:lvlJc w:val="left"/>
+      <w:pPr>
+        <w:tabs>
+          <w:tab w:val="num" w:pos="4320"/>
+        </w:tabs>
+        <w:ind w:left="4320" w:hanging="360"/>
+      </w:pPr>
+      <w:rPr>
+        <w:rFonts w:ascii="Wingdings" w:hAnsi="Wingdings" w:hint="default"/>
+        <w:sz w:val="20"/>
+      </w:rPr>
+    </w:lvl>
+    <w:lvl w:ilvl="6" w:tentative="1">
+      <w:start w:val="1"/>
+      <w:numFmt w:val="bullet"/>
+      <w:lvlText w:val=""/>
+      <w:lvlJc w:val="left"/>
+      <w:pPr>
+        <w:tabs>
+          <w:tab w:val="num" w:pos="5040"/>
+        </w:tabs>
+        <w:ind w:left="5040" w:hanging="360"/>
+      </w:pPr>
+      <w:rPr>
+        <w:rFonts w:ascii="Wingdings" w:hAnsi="Wingdings" w:hint="default"/>
+        <w:sz w:val="20"/>
+      </w:rPr>
+    </w:lvl>
+    <w:lvl w:ilvl="7" w:tentative="1">
+      <w:start w:val="1"/>
+      <w:numFmt w:val="bullet"/>
+      <w:lvlText w:val=""/>
+      <w:lvlJc w:val="left"/>
+      <w:pPr>
+        <w:tabs>
+          <w:tab w:val="num" w:pos="5760"/>
+        </w:tabs>
+        <w:ind w:left="5760" w:hanging="360"/>
+      </w:pPr>
+      <w:rPr>
+        <w:rFonts w:ascii="Wingdings" w:hAnsi="Wingdings" w:hint="default"/>
+        <w:sz w:val="20"/>
+      </w:rPr>
+    </w:lvl>
+    <w:lvl w:ilvl="8" w:tentative="1">
+      <w:start w:val="1"/>
+      <w:numFmt w:val="bullet"/>
+      <w:lvlText w:val=""/>
+      <w:lvlJc w:val="left"/>
+      <w:pPr>
+        <w:tabs>
+          <w:tab w:val="num" w:pos="6480"/>
+        </w:tabs>
+        <w:ind w:left="6480" w:hanging="360"/>
+      </w:pPr>
+      <w:rPr>
+        <w:rFonts w:ascii="Wingdings" w:hAnsi="Wingdings" w:hint="default"/>
+        <w:sz w:val="20"/>
+      </w:rPr>
+    </w:lvl>
+  </w:abstractNum>
+  <w:abstractNum w:abstractNumId="137" w15:restartNumberingAfterBreak="0">
     <w:nsid w:val="6C95580B"/>
     <w:multiLevelType w:val="multilevel"/>
     <w:tmpl w:val="C8A61D28"/>
@@ -46658,7 +48410,7 @@
       </w:rPr>
     </w:lvl>
   </w:abstractNum>
-  <w:abstractNum w:abstractNumId="132" w15:restartNumberingAfterBreak="0">
+  <w:abstractNum w:abstractNumId="138" w15:restartNumberingAfterBreak="0">
     <w:nsid w:val="6EF74731"/>
     <w:multiLevelType w:val="multilevel"/>
     <w:tmpl w:val="DEACF4A6"/>
@@ -46807,7 +48559,7 @@
       </w:rPr>
     </w:lvl>
   </w:abstractNum>
-  <w:abstractNum w:abstractNumId="133" w15:restartNumberingAfterBreak="0">
+  <w:abstractNum w:abstractNumId="139" w15:restartNumberingAfterBreak="0">
     <w:nsid w:val="6F1676F9"/>
     <w:multiLevelType w:val="multilevel"/>
     <w:tmpl w:val="FF9EEDB0"/>
@@ -46956,7 +48708,7 @@
       </w:rPr>
     </w:lvl>
   </w:abstractNum>
-  <w:abstractNum w:abstractNumId="134" w15:restartNumberingAfterBreak="0">
+  <w:abstractNum w:abstractNumId="140" w15:restartNumberingAfterBreak="0">
     <w:nsid w:val="706A6F20"/>
     <w:multiLevelType w:val="multilevel"/>
     <w:tmpl w:val="C4F21CF6"/>
@@ -47105,7 +48857,7 @@
       </w:rPr>
     </w:lvl>
   </w:abstractNum>
-  <w:abstractNum w:abstractNumId="135" w15:restartNumberingAfterBreak="0">
+  <w:abstractNum w:abstractNumId="141" w15:restartNumberingAfterBreak="0">
     <w:nsid w:val="713A1BFE"/>
     <w:multiLevelType w:val="multilevel"/>
     <w:tmpl w:val="190E8908"/>
@@ -47254,7 +49006,7 @@
       </w:rPr>
     </w:lvl>
   </w:abstractNum>
-  <w:abstractNum w:abstractNumId="136" w15:restartNumberingAfterBreak="0">
+  <w:abstractNum w:abstractNumId="142" w15:restartNumberingAfterBreak="0">
     <w:nsid w:val="723767A4"/>
     <w:multiLevelType w:val="multilevel"/>
     <w:tmpl w:val="DEACF4A6"/>
@@ -47403,7 +49155,156 @@
       </w:rPr>
     </w:lvl>
   </w:abstractNum>
-  <w:abstractNum w:abstractNumId="137" w15:restartNumberingAfterBreak="0">
+  <w:abstractNum w:abstractNumId="143" w15:restartNumberingAfterBreak="0">
+    <w:nsid w:val="7343291E"/>
+    <w:multiLevelType w:val="multilevel"/>
+    <w:tmpl w:val="627810EA"/>
+    <w:lvl w:ilvl="0">
+      <w:start w:val="1"/>
+      <w:numFmt w:val="bullet"/>
+      <w:lvlText w:val=""/>
+      <w:lvlJc w:val="left"/>
+      <w:pPr>
+        <w:tabs>
+          <w:tab w:val="num" w:pos="720"/>
+        </w:tabs>
+        <w:ind w:left="720" w:hanging="360"/>
+      </w:pPr>
+      <w:rPr>
+        <w:rFonts w:ascii="Symbol" w:hAnsi="Symbol" w:hint="default"/>
+        <w:sz w:val="20"/>
+      </w:rPr>
+    </w:lvl>
+    <w:lvl w:ilvl="1">
+      <w:start w:val="1"/>
+      <w:numFmt w:val="bullet"/>
+      <w:lvlText w:val="o"/>
+      <w:lvlJc w:val="left"/>
+      <w:pPr>
+        <w:tabs>
+          <w:tab w:val="num" w:pos="1440"/>
+        </w:tabs>
+        <w:ind w:left="1440" w:hanging="360"/>
+      </w:pPr>
+      <w:rPr>
+        <w:rFonts w:ascii="Courier New" w:hAnsi="Courier New" w:hint="default"/>
+        <w:sz w:val="20"/>
+      </w:rPr>
+    </w:lvl>
+    <w:lvl w:ilvl="2" w:tentative="1">
+      <w:start w:val="1"/>
+      <w:numFmt w:val="bullet"/>
+      <w:lvlText w:val=""/>
+      <w:lvlJc w:val="left"/>
+      <w:pPr>
+        <w:tabs>
+          <w:tab w:val="num" w:pos="2160"/>
+        </w:tabs>
+        <w:ind w:left="2160" w:hanging="360"/>
+      </w:pPr>
+      <w:rPr>
+        <w:rFonts w:ascii="Wingdings" w:hAnsi="Wingdings" w:hint="default"/>
+        <w:sz w:val="20"/>
+      </w:rPr>
+    </w:lvl>
+    <w:lvl w:ilvl="3" w:tentative="1">
+      <w:start w:val="1"/>
+      <w:numFmt w:val="bullet"/>
+      <w:lvlText w:val=""/>
+      <w:lvlJc w:val="left"/>
+      <w:pPr>
+        <w:tabs>
+          <w:tab w:val="num" w:pos="2880"/>
+        </w:tabs>
+        <w:ind w:left="2880" w:hanging="360"/>
+      </w:pPr>
+      <w:rPr>
+        <w:rFonts w:ascii="Wingdings" w:hAnsi="Wingdings" w:hint="default"/>
+        <w:sz w:val="20"/>
+      </w:rPr>
+    </w:lvl>
+    <w:lvl w:ilvl="4" w:tentative="1">
+      <w:start w:val="1"/>
+      <w:numFmt w:val="bullet"/>
+      <w:lvlText w:val=""/>
+      <w:lvlJc w:val="left"/>
+      <w:pPr>
+        <w:tabs>
+          <w:tab w:val="num" w:pos="3600"/>
+        </w:tabs>
+        <w:ind w:left="3600" w:hanging="360"/>
+      </w:pPr>
+      <w:rPr>
+        <w:rFonts w:ascii="Wingdings" w:hAnsi="Wingdings" w:hint="default"/>
+        <w:sz w:val="20"/>
+      </w:rPr>
+    </w:lvl>
+    <w:lvl w:ilvl="5" w:tentative="1">
+      <w:start w:val="1"/>
+      <w:numFmt w:val="bullet"/>
+      <w:lvlText w:val=""/>
+      <w:lvlJc w:val="left"/>
+      <w:pPr>
+        <w:tabs>
+          <w:tab w:val="num" w:pos="4320"/>
+        </w:tabs>
+        <w:ind w:left="4320" w:hanging="360"/>
+      </w:pPr>
+      <w:rPr>
+        <w:rFonts w:ascii="Wingdings" w:hAnsi="Wingdings" w:hint="default"/>
+        <w:sz w:val="20"/>
+      </w:rPr>
+    </w:lvl>
+    <w:lvl w:ilvl="6" w:tentative="1">
+      <w:start w:val="1"/>
+      <w:numFmt w:val="bullet"/>
+      <w:lvlText w:val=""/>
+      <w:lvlJc w:val="left"/>
+      <w:pPr>
+        <w:tabs>
+          <w:tab w:val="num" w:pos="5040"/>
+        </w:tabs>
+        <w:ind w:left="5040" w:hanging="360"/>
+      </w:pPr>
+      <w:rPr>
+        <w:rFonts w:ascii="Wingdings" w:hAnsi="Wingdings" w:hint="default"/>
+        <w:sz w:val="20"/>
+      </w:rPr>
+    </w:lvl>
+    <w:lvl w:ilvl="7" w:tentative="1">
+      <w:start w:val="1"/>
+      <w:numFmt w:val="bullet"/>
+      <w:lvlText w:val=""/>
+      <w:lvlJc w:val="left"/>
+      <w:pPr>
+        <w:tabs>
+          <w:tab w:val="num" w:pos="5760"/>
+        </w:tabs>
+        <w:ind w:left="5760" w:hanging="360"/>
+      </w:pPr>
+      <w:rPr>
+        <w:rFonts w:ascii="Wingdings" w:hAnsi="Wingdings" w:hint="default"/>
+        <w:sz w:val="20"/>
+      </w:rPr>
+    </w:lvl>
+    <w:lvl w:ilvl="8" w:tentative="1">
+      <w:start w:val="1"/>
+      <w:numFmt w:val="bullet"/>
+      <w:lvlText w:val=""/>
+      <w:lvlJc w:val="left"/>
+      <w:pPr>
+        <w:tabs>
+          <w:tab w:val="num" w:pos="6480"/>
+        </w:tabs>
+        <w:ind w:left="6480" w:hanging="360"/>
+      </w:pPr>
+      <w:rPr>
+        <w:rFonts w:ascii="Wingdings" w:hAnsi="Wingdings" w:hint="default"/>
+        <w:sz w:val="20"/>
+      </w:rPr>
+    </w:lvl>
+  </w:abstractNum>
+  <w:abstractNum w:abstractNumId="144" w15:restartNumberingAfterBreak="0">
     <w:nsid w:val="74384A88"/>
     <w:multiLevelType w:val="multilevel"/>
     <w:tmpl w:val="0AF22E1E"/>
@@ -47520,7 +49421,7 @@
       </w:pPr>
     </w:lvl>
   </w:abstractNum>
-  <w:abstractNum w:abstractNumId="138" w15:restartNumberingAfterBreak="0">
+  <w:abstractNum w:abstractNumId="145" w15:restartNumberingAfterBreak="0">
     <w:nsid w:val="753718BF"/>
     <w:multiLevelType w:val="multilevel"/>
     <w:tmpl w:val="DEACF4A6"/>
@@ -47669,7 +49570,7 @@
       </w:rPr>
     </w:lvl>
   </w:abstractNum>
-  <w:abstractNum w:abstractNumId="139" w15:restartNumberingAfterBreak="0">
+  <w:abstractNum w:abstractNumId="146" w15:restartNumberingAfterBreak="0">
     <w:nsid w:val="78DE38B2"/>
     <w:multiLevelType w:val="multilevel"/>
     <w:tmpl w:val="A14C85F6"/>
@@ -47818,7 +49719,7 @@
       </w:rPr>
     </w:lvl>
   </w:abstractNum>
-  <w:abstractNum w:abstractNumId="140" w15:restartNumberingAfterBreak="0">
+  <w:abstractNum w:abstractNumId="147" w15:restartNumberingAfterBreak="0">
     <w:nsid w:val="78F113F9"/>
     <w:multiLevelType w:val="multilevel"/>
     <w:tmpl w:val="E6640F2E"/>
@@ -47967,7 +49868,7 @@
       </w:rPr>
     </w:lvl>
   </w:abstractNum>
-  <w:abstractNum w:abstractNumId="141" w15:restartNumberingAfterBreak="0">
+  <w:abstractNum w:abstractNumId="148" w15:restartNumberingAfterBreak="0">
     <w:nsid w:val="7A17119F"/>
     <w:multiLevelType w:val="multilevel"/>
     <w:tmpl w:val="7EDA17CA"/>
@@ -48116,7 +50017,7 @@
       </w:rPr>
     </w:lvl>
   </w:abstractNum>
-  <w:abstractNum w:abstractNumId="142" w15:restartNumberingAfterBreak="0">
+  <w:abstractNum w:abstractNumId="149" w15:restartNumberingAfterBreak="0">
     <w:nsid w:val="7B956861"/>
     <w:multiLevelType w:val="multilevel"/>
     <w:tmpl w:val="3A38D396"/>
@@ -48265,7 +50166,7 @@
       </w:rPr>
     </w:lvl>
   </w:abstractNum>
-  <w:abstractNum w:abstractNumId="143" w15:restartNumberingAfterBreak="0">
+  <w:abstractNum w:abstractNumId="150" w15:restartNumberingAfterBreak="0">
     <w:nsid w:val="7D1F670C"/>
     <w:multiLevelType w:val="multilevel"/>
     <w:tmpl w:val="E65CDAE8"/>
@@ -48414,7 +50315,7 @@
       </w:rPr>
     </w:lvl>
   </w:abstractNum>
-  <w:abstractNum w:abstractNumId="144" w15:restartNumberingAfterBreak="0">
+  <w:abstractNum w:abstractNumId="151" w15:restartNumberingAfterBreak="0">
     <w:nsid w:val="7E0008E5"/>
     <w:multiLevelType w:val="multilevel"/>
     <w:tmpl w:val="D056215A"/>
@@ -48527,440 +50428,613 @@
       </w:pPr>
     </w:lvl>
   </w:abstractNum>
+  <w:abstractNum w:abstractNumId="152" w15:restartNumberingAfterBreak="0">
+    <w:nsid w:val="7ED807A1"/>
+    <w:multiLevelType w:val="multilevel"/>
+    <w:tmpl w:val="C788330E"/>
+    <w:lvl w:ilvl="0">
+      <w:start w:val="1"/>
+      <w:numFmt w:val="bullet"/>
+      <w:lvlText w:val=""/>
+      <w:lvlJc w:val="left"/>
+      <w:pPr>
+        <w:tabs>
+          <w:tab w:val="num" w:pos="720"/>
+        </w:tabs>
+        <w:ind w:left="720" w:hanging="360"/>
+      </w:pPr>
+      <w:rPr>
+        <w:rFonts w:ascii="Symbol" w:hAnsi="Symbol" w:hint="default"/>
+        <w:sz w:val="20"/>
+      </w:rPr>
+    </w:lvl>
+    <w:lvl w:ilvl="1" w:tentative="1">
+      <w:start w:val="1"/>
+      <w:numFmt w:val="bullet"/>
+      <w:lvlText w:val="o"/>
+      <w:lvlJc w:val="left"/>
+      <w:pPr>
+        <w:tabs>
+          <w:tab w:val="num" w:pos="1440"/>
+        </w:tabs>
+        <w:ind w:left="1440" w:hanging="360"/>
+      </w:pPr>
+      <w:rPr>
+        <w:rFonts w:ascii="Courier New" w:hAnsi="Courier New" w:hint="default"/>
+        <w:sz w:val="20"/>
+      </w:rPr>
+    </w:lvl>
+    <w:lvl w:ilvl="2" w:tentative="1">
+      <w:start w:val="1"/>
+      <w:numFmt w:val="bullet"/>
+      <w:lvlText w:val=""/>
+      <w:lvlJc w:val="left"/>
+      <w:pPr>
+        <w:tabs>
+          <w:tab w:val="num" w:pos="2160"/>
+        </w:tabs>
+        <w:ind w:left="2160" w:hanging="360"/>
+      </w:pPr>
+      <w:rPr>
+        <w:rFonts w:ascii="Wingdings" w:hAnsi="Wingdings" w:hint="default"/>
+        <w:sz w:val="20"/>
+      </w:rPr>
+    </w:lvl>
+    <w:lvl w:ilvl="3" w:tentative="1">
+      <w:start w:val="1"/>
+      <w:numFmt w:val="bullet"/>
+      <w:lvlText w:val=""/>
+      <w:lvlJc w:val="left"/>
+      <w:pPr>
+        <w:tabs>
+          <w:tab w:val="num" w:pos="2880"/>
+        </w:tabs>
+        <w:ind w:left="2880" w:hanging="360"/>
+      </w:pPr>
+      <w:rPr>
+        <w:rFonts w:ascii="Wingdings" w:hAnsi="Wingdings" w:hint="default"/>
+        <w:sz w:val="20"/>
+      </w:rPr>
+    </w:lvl>
+    <w:lvl w:ilvl="4" w:tentative="1">
+      <w:start w:val="1"/>
+      <w:numFmt w:val="bullet"/>
+      <w:lvlText w:val=""/>
+      <w:lvlJc w:val="left"/>
+      <w:pPr>
+        <w:tabs>
+          <w:tab w:val="num" w:pos="3600"/>
+        </w:tabs>
+        <w:ind w:left="3600" w:hanging="360"/>
+      </w:pPr>
+      <w:rPr>
+        <w:rFonts w:ascii="Wingdings" w:hAnsi="Wingdings" w:hint="default"/>
+        <w:sz w:val="20"/>
+      </w:rPr>
+    </w:lvl>
+    <w:lvl w:ilvl="5" w:tentative="1">
+      <w:start w:val="1"/>
+      <w:numFmt w:val="bullet"/>
+      <w:lvlText w:val=""/>
+      <w:lvlJc w:val="left"/>
+      <w:pPr>
+        <w:tabs>
+          <w:tab w:val="num" w:pos="4320"/>
+        </w:tabs>
+        <w:ind w:left="4320" w:hanging="360"/>
+      </w:pPr>
+      <w:rPr>
+        <w:rFonts w:ascii="Wingdings" w:hAnsi="Wingdings" w:hint="default"/>
+        <w:sz w:val="20"/>
+      </w:rPr>
+    </w:lvl>
+    <w:lvl w:ilvl="6" w:tentative="1">
+      <w:start w:val="1"/>
+      <w:numFmt w:val="bullet"/>
+      <w:lvlText w:val=""/>
+      <w:lvlJc w:val="left"/>
+      <w:pPr>
+        <w:tabs>
+          <w:tab w:val="num" w:pos="5040"/>
+        </w:tabs>
+        <w:ind w:left="5040" w:hanging="360"/>
+      </w:pPr>
+      <w:rPr>
+        <w:rFonts w:ascii="Wingdings" w:hAnsi="Wingdings" w:hint="default"/>
+        <w:sz w:val="20"/>
+      </w:rPr>
+    </w:lvl>
+    <w:lvl w:ilvl="7" w:tentative="1">
+      <w:start w:val="1"/>
+      <w:numFmt w:val="bullet"/>
+      <w:lvlText w:val=""/>
+      <w:lvlJc w:val="left"/>
+      <w:pPr>
+        <w:tabs>
+          <w:tab w:val="num" w:pos="5760"/>
+        </w:tabs>
+        <w:ind w:left="5760" w:hanging="360"/>
+      </w:pPr>
+      <w:rPr>
+        <w:rFonts w:ascii="Wingdings" w:hAnsi="Wingdings" w:hint="default"/>
+        <w:sz w:val="20"/>
+      </w:rPr>
+    </w:lvl>
+    <w:lvl w:ilvl="8" w:tentative="1">
+      <w:start w:val="1"/>
+      <w:numFmt w:val="bullet"/>
+      <w:lvlText w:val=""/>
+      <w:lvlJc w:val="left"/>
+      <w:pPr>
+        <w:tabs>
+          <w:tab w:val="num" w:pos="6480"/>
+        </w:tabs>
+        <w:ind w:left="6480" w:hanging="360"/>
+      </w:pPr>
+      <w:rPr>
+        <w:rFonts w:ascii="Wingdings" w:hAnsi="Wingdings" w:hint="default"/>
+        <w:sz w:val="20"/>
+      </w:rPr>
+    </w:lvl>
+  </w:abstractNum>
   <w:num w:numId="1" w16cid:durableId="942803316">
-    <w:abstractNumId w:val="137"/>
+    <w:abstractNumId w:val="144"/>
   </w:num>
   <w:num w:numId="2" w16cid:durableId="270747766">
-    <w:abstractNumId w:val="122"/>
+    <w:abstractNumId w:val="127"/>
   </w:num>
   <w:num w:numId="3" w16cid:durableId="1032075383">
     <w:abstractNumId w:val="1"/>
   </w:num>
   <w:num w:numId="4" w16cid:durableId="974914791">
+    <w:abstractNumId w:val="25"/>
+  </w:num>
+  <w:num w:numId="5" w16cid:durableId="1179151838">
+    <w:abstractNumId w:val="126"/>
+  </w:num>
+  <w:num w:numId="6" w16cid:durableId="544101733">
+    <w:abstractNumId w:val="89"/>
+  </w:num>
+  <w:num w:numId="7" w16cid:durableId="4283976">
+    <w:abstractNumId w:val="149"/>
+  </w:num>
+  <w:num w:numId="8" w16cid:durableId="245917338">
+    <w:abstractNumId w:val="78"/>
+  </w:num>
+  <w:num w:numId="9" w16cid:durableId="609435230">
+    <w:abstractNumId w:val="91"/>
+  </w:num>
+  <w:num w:numId="10" w16cid:durableId="1472097361">
+    <w:abstractNumId w:val="98"/>
+  </w:num>
+  <w:num w:numId="11" w16cid:durableId="1364328853">
+    <w:abstractNumId w:val="20"/>
+  </w:num>
+  <w:num w:numId="12" w16cid:durableId="316425971">
+    <w:abstractNumId w:val="115"/>
+  </w:num>
+  <w:num w:numId="13" w16cid:durableId="431825394">
+    <w:abstractNumId w:val="125"/>
+  </w:num>
+  <w:num w:numId="14" w16cid:durableId="834343080">
+    <w:abstractNumId w:val="12"/>
+  </w:num>
+  <w:num w:numId="15" w16cid:durableId="59600544">
+    <w:abstractNumId w:val="5"/>
+  </w:num>
+  <w:num w:numId="16" w16cid:durableId="1432430141">
+    <w:abstractNumId w:val="35"/>
+  </w:num>
+  <w:num w:numId="17" w16cid:durableId="2146846462">
+    <w:abstractNumId w:val="31"/>
+  </w:num>
+  <w:num w:numId="18" w16cid:durableId="1871064906">
+    <w:abstractNumId w:val="28"/>
+  </w:num>
+  <w:num w:numId="19" w16cid:durableId="2119134066">
+    <w:abstractNumId w:val="130"/>
+  </w:num>
+  <w:num w:numId="20" w16cid:durableId="579292118">
+    <w:abstractNumId w:val="119"/>
+  </w:num>
+  <w:num w:numId="21" w16cid:durableId="1781337550">
+    <w:abstractNumId w:val="48"/>
+  </w:num>
+  <w:num w:numId="22" w16cid:durableId="173957045">
     <w:abstractNumId w:val="24"/>
   </w:num>
-  <w:num w:numId="5" w16cid:durableId="1179151838">
+  <w:num w:numId="23" w16cid:durableId="1053696051">
+    <w:abstractNumId w:val="116"/>
+  </w:num>
+  <w:num w:numId="24" w16cid:durableId="1229724906">
+    <w:abstractNumId w:val="58"/>
+  </w:num>
+  <w:num w:numId="25" w16cid:durableId="1105270786">
+    <w:abstractNumId w:val="22"/>
+  </w:num>
+  <w:num w:numId="26" w16cid:durableId="181013303">
+    <w:abstractNumId w:val="51"/>
+  </w:num>
+  <w:num w:numId="27" w16cid:durableId="1005090841">
+    <w:abstractNumId w:val="109"/>
+  </w:num>
+  <w:num w:numId="28" w16cid:durableId="756709327">
+    <w:abstractNumId w:val="80"/>
+  </w:num>
+  <w:num w:numId="29" w16cid:durableId="1175075060">
+    <w:abstractNumId w:val="27"/>
+  </w:num>
+  <w:num w:numId="30" w16cid:durableId="816338617">
+    <w:abstractNumId w:val="92"/>
+  </w:num>
+  <w:num w:numId="31" w16cid:durableId="811018014">
+    <w:abstractNumId w:val="96"/>
+  </w:num>
+  <w:num w:numId="32" w16cid:durableId="2007442846">
+    <w:abstractNumId w:val="7"/>
+  </w:num>
+  <w:num w:numId="33" w16cid:durableId="557594128">
+    <w:abstractNumId w:val="38"/>
+  </w:num>
+  <w:num w:numId="34" w16cid:durableId="2058358458">
+    <w:abstractNumId w:val="120"/>
+  </w:num>
+  <w:num w:numId="35" w16cid:durableId="664430994">
+    <w:abstractNumId w:val="69"/>
+  </w:num>
+  <w:num w:numId="36" w16cid:durableId="1858736738">
+    <w:abstractNumId w:val="112"/>
+  </w:num>
+  <w:num w:numId="37" w16cid:durableId="1793285636">
+    <w:abstractNumId w:val="118"/>
+  </w:num>
+  <w:num w:numId="38" w16cid:durableId="49766020">
+    <w:abstractNumId w:val="131"/>
+  </w:num>
+  <w:num w:numId="39" w16cid:durableId="1444303552">
+    <w:abstractNumId w:val="32"/>
+  </w:num>
+  <w:num w:numId="40" w16cid:durableId="1190021365">
+    <w:abstractNumId w:val="137"/>
+  </w:num>
+  <w:num w:numId="41" w16cid:durableId="624238255">
+    <w:abstractNumId w:val="146"/>
+  </w:num>
+  <w:num w:numId="42" w16cid:durableId="1806924102">
+    <w:abstractNumId w:val="86"/>
+  </w:num>
+  <w:num w:numId="43" w16cid:durableId="1782604561">
+    <w:abstractNumId w:val="108"/>
+  </w:num>
+  <w:num w:numId="44" w16cid:durableId="1816292712">
+    <w:abstractNumId w:val="129"/>
+  </w:num>
+  <w:num w:numId="45" w16cid:durableId="873080635">
+    <w:abstractNumId w:val="101"/>
+  </w:num>
+  <w:num w:numId="46" w16cid:durableId="1561865549">
+    <w:abstractNumId w:val="104"/>
+  </w:num>
+  <w:num w:numId="47" w16cid:durableId="1555769635">
+    <w:abstractNumId w:val="44"/>
+  </w:num>
+  <w:num w:numId="48" w16cid:durableId="1605575889">
+    <w:abstractNumId w:val="147"/>
+  </w:num>
+  <w:num w:numId="49" w16cid:durableId="213855190">
+    <w:abstractNumId w:val="83"/>
+  </w:num>
+  <w:num w:numId="50" w16cid:durableId="69619266">
+    <w:abstractNumId w:val="33"/>
+  </w:num>
+  <w:num w:numId="51" w16cid:durableId="25254510">
+    <w:abstractNumId w:val="37"/>
+  </w:num>
+  <w:num w:numId="52" w16cid:durableId="813301875">
+    <w:abstractNumId w:val="148"/>
+  </w:num>
+  <w:num w:numId="53" w16cid:durableId="349066359">
+    <w:abstractNumId w:val="57"/>
+  </w:num>
+  <w:num w:numId="54" w16cid:durableId="1827240326">
+    <w:abstractNumId w:val="62"/>
+  </w:num>
+  <w:num w:numId="55" w16cid:durableId="1067726837">
+    <w:abstractNumId w:val="128"/>
+  </w:num>
+  <w:num w:numId="56" w16cid:durableId="1145976340">
+    <w:abstractNumId w:val="55"/>
+  </w:num>
+  <w:num w:numId="57" w16cid:durableId="328758546">
+    <w:abstractNumId w:val="50"/>
+  </w:num>
+  <w:num w:numId="58" w16cid:durableId="354310452">
+    <w:abstractNumId w:val="60"/>
+  </w:num>
+  <w:num w:numId="59" w16cid:durableId="1777402173">
+    <w:abstractNumId w:val="103"/>
+  </w:num>
+  <w:num w:numId="60" w16cid:durableId="1878082184">
+    <w:abstractNumId w:val="139"/>
+  </w:num>
+  <w:num w:numId="61" w16cid:durableId="257717478">
+    <w:abstractNumId w:val="21"/>
+  </w:num>
+  <w:num w:numId="62" w16cid:durableId="290208252">
+    <w:abstractNumId w:val="113"/>
+  </w:num>
+  <w:num w:numId="63" w16cid:durableId="921568839">
+    <w:abstractNumId w:val="42"/>
+  </w:num>
+  <w:num w:numId="64" w16cid:durableId="1601639283">
+    <w:abstractNumId w:val="14"/>
+  </w:num>
+  <w:num w:numId="65" w16cid:durableId="1897087019">
+    <w:abstractNumId w:val="10"/>
+  </w:num>
+  <w:num w:numId="66" w16cid:durableId="715392561">
+    <w:abstractNumId w:val="75"/>
+  </w:num>
+  <w:num w:numId="67" w16cid:durableId="2056079112">
+    <w:abstractNumId w:val="73"/>
+  </w:num>
+  <w:num w:numId="68" w16cid:durableId="2080126014">
+    <w:abstractNumId w:val="134"/>
+  </w:num>
+  <w:num w:numId="69" w16cid:durableId="1310135776">
+    <w:abstractNumId w:val="46"/>
+  </w:num>
+  <w:num w:numId="70" w16cid:durableId="1028986258">
+    <w:abstractNumId w:val="106"/>
+  </w:num>
+  <w:num w:numId="71" w16cid:durableId="1785491322">
+    <w:abstractNumId w:val="61"/>
+  </w:num>
+  <w:num w:numId="72" w16cid:durableId="230359834">
+    <w:abstractNumId w:val="133"/>
+  </w:num>
+  <w:num w:numId="73" w16cid:durableId="97215562">
+    <w:abstractNumId w:val="19"/>
+  </w:num>
+  <w:num w:numId="74" w16cid:durableId="168567758">
+    <w:abstractNumId w:val="47"/>
+  </w:num>
+  <w:num w:numId="75" w16cid:durableId="130028596">
+    <w:abstractNumId w:val="142"/>
+  </w:num>
+  <w:num w:numId="76" w16cid:durableId="2045401898">
+    <w:abstractNumId w:val="65"/>
+  </w:num>
+  <w:num w:numId="77" w16cid:durableId="1810897170">
+    <w:abstractNumId w:val="72"/>
+  </w:num>
+  <w:num w:numId="78" w16cid:durableId="1994092115">
+    <w:abstractNumId w:val="59"/>
+  </w:num>
+  <w:num w:numId="79" w16cid:durableId="1675691065">
+    <w:abstractNumId w:val="93"/>
+  </w:num>
+  <w:num w:numId="80" w16cid:durableId="1682316995">
+    <w:abstractNumId w:val="49"/>
+  </w:num>
+  <w:num w:numId="81" w16cid:durableId="1522040136">
+    <w:abstractNumId w:val="135"/>
+  </w:num>
+  <w:num w:numId="82" w16cid:durableId="592789119">
+    <w:abstractNumId w:val="54"/>
+  </w:num>
+  <w:num w:numId="83" w16cid:durableId="1100443382">
+    <w:abstractNumId w:val="138"/>
+  </w:num>
+  <w:num w:numId="84" w16cid:durableId="495994496">
+    <w:abstractNumId w:val="105"/>
+  </w:num>
+  <w:num w:numId="85" w16cid:durableId="1548757019">
+    <w:abstractNumId w:val="4"/>
+  </w:num>
+  <w:num w:numId="86" w16cid:durableId="1047218572">
+    <w:abstractNumId w:val="63"/>
+  </w:num>
+  <w:num w:numId="87" w16cid:durableId="735973842">
+    <w:abstractNumId w:val="77"/>
+  </w:num>
+  <w:num w:numId="88" w16cid:durableId="627516981">
+    <w:abstractNumId w:val="36"/>
+  </w:num>
+  <w:num w:numId="89" w16cid:durableId="1932010567">
+    <w:abstractNumId w:val="18"/>
+  </w:num>
+  <w:num w:numId="90" w16cid:durableId="1582324752">
+    <w:abstractNumId w:val="6"/>
+  </w:num>
+  <w:num w:numId="91" w16cid:durableId="243686588">
+    <w:abstractNumId w:val="66"/>
+  </w:num>
+  <w:num w:numId="92" w16cid:durableId="1287276980">
+    <w:abstractNumId w:val="81"/>
+  </w:num>
+  <w:num w:numId="93" w16cid:durableId="2051223741">
+    <w:abstractNumId w:val="145"/>
+  </w:num>
+  <w:num w:numId="94" w16cid:durableId="1708751724">
+    <w:abstractNumId w:val="151"/>
+  </w:num>
+  <w:num w:numId="95" w16cid:durableId="2138178102">
+    <w:abstractNumId w:val="39"/>
+  </w:num>
+  <w:num w:numId="96" w16cid:durableId="299188647">
+    <w:abstractNumId w:val="34"/>
+  </w:num>
+  <w:num w:numId="97" w16cid:durableId="951012475">
+    <w:abstractNumId w:val="132"/>
+  </w:num>
+  <w:num w:numId="98" w16cid:durableId="1274361570">
+    <w:abstractNumId w:val="97"/>
+  </w:num>
+  <w:num w:numId="99" w16cid:durableId="1306357555">
+    <w:abstractNumId w:val="71"/>
+  </w:num>
+  <w:num w:numId="100" w16cid:durableId="327290992">
+    <w:abstractNumId w:val="111"/>
+  </w:num>
+  <w:num w:numId="101" w16cid:durableId="1990866381">
+    <w:abstractNumId w:val="110"/>
+  </w:num>
+  <w:num w:numId="102" w16cid:durableId="371266948">
+    <w:abstractNumId w:val="17"/>
+  </w:num>
+  <w:num w:numId="103" w16cid:durableId="281613913">
+    <w:abstractNumId w:val="26"/>
+  </w:num>
+  <w:num w:numId="104" w16cid:durableId="1397819114">
+    <w:abstractNumId w:val="123"/>
+  </w:num>
+  <w:num w:numId="105" w16cid:durableId="1012728081">
+    <w:abstractNumId w:val="124"/>
+  </w:num>
+  <w:num w:numId="106" w16cid:durableId="1036468611">
+    <w:abstractNumId w:val="29"/>
+  </w:num>
+  <w:num w:numId="107" w16cid:durableId="293871772">
+    <w:abstractNumId w:val="100"/>
+  </w:num>
+  <w:num w:numId="108" w16cid:durableId="1766875230">
+    <w:abstractNumId w:val="56"/>
+  </w:num>
+  <w:num w:numId="109" w16cid:durableId="695815868">
+    <w:abstractNumId w:val="30"/>
+  </w:num>
+  <w:num w:numId="110" w16cid:durableId="1980648420">
+    <w:abstractNumId w:val="90"/>
+  </w:num>
+  <w:num w:numId="111" w16cid:durableId="204099977">
+    <w:abstractNumId w:val="99"/>
+  </w:num>
+  <w:num w:numId="112" w16cid:durableId="566377572">
+    <w:abstractNumId w:val="68"/>
+  </w:num>
+  <w:num w:numId="113" w16cid:durableId="845172666">
+    <w:abstractNumId w:val="13"/>
+  </w:num>
+  <w:num w:numId="114" w16cid:durableId="1132092914">
+    <w:abstractNumId w:val="88"/>
+  </w:num>
+  <w:num w:numId="115" w16cid:durableId="683092990">
     <w:abstractNumId w:val="121"/>
   </w:num>
-  <w:num w:numId="6" w16cid:durableId="544101733">
-    <w:abstractNumId w:val="84"/>
+  <w:num w:numId="116" w16cid:durableId="1244877407">
+    <w:abstractNumId w:val="122"/>
   </w:num>
-  <w:num w:numId="7" w16cid:durableId="4283976">
-    <w:abstractNumId w:val="142"/>
+  <w:num w:numId="117" w16cid:durableId="726148022">
+    <w:abstractNumId w:val="76"/>
   </w:num>
-  <w:num w:numId="8" w16cid:durableId="245917338">
+  <w:num w:numId="118" w16cid:durableId="1448769905">
+    <w:abstractNumId w:val="67"/>
+  </w:num>
+  <w:num w:numId="119" w16cid:durableId="1248341273">
+    <w:abstractNumId w:val="87"/>
+  </w:num>
+  <w:num w:numId="120" w16cid:durableId="562370162">
+    <w:abstractNumId w:val="107"/>
+  </w:num>
+  <w:num w:numId="121" w16cid:durableId="160629884">
+    <w:abstractNumId w:val="15"/>
+  </w:num>
+  <w:num w:numId="122" w16cid:durableId="474568737">
+    <w:abstractNumId w:val="43"/>
+  </w:num>
+  <w:num w:numId="123" w16cid:durableId="768964622">
+    <w:abstractNumId w:val="40"/>
+  </w:num>
+  <w:num w:numId="124" w16cid:durableId="1335910887">
+    <w:abstractNumId w:val="150"/>
+  </w:num>
+  <w:num w:numId="125" w16cid:durableId="1905530579">
+    <w:abstractNumId w:val="53"/>
+  </w:num>
+  <w:num w:numId="126" w16cid:durableId="565188705">
+    <w:abstractNumId w:val="11"/>
+  </w:num>
+  <w:num w:numId="127" w16cid:durableId="981227013">
+    <w:abstractNumId w:val="8"/>
+  </w:num>
+  <w:num w:numId="128" w16cid:durableId="1373310907">
     <w:abstractNumId w:val="74"/>
   </w:num>
-  <w:num w:numId="9" w16cid:durableId="609435230">
-    <w:abstractNumId w:val="86"/>
+  <w:num w:numId="129" w16cid:durableId="984776096">
+    <w:abstractNumId w:val="41"/>
   </w:num>
-  <w:num w:numId="10" w16cid:durableId="1472097361">
-    <w:abstractNumId w:val="93"/>
+  <w:num w:numId="130" w16cid:durableId="1123306180">
+    <w:abstractNumId w:val="141"/>
   </w:num>
-  <w:num w:numId="11" w16cid:durableId="1364328853">
-    <w:abstractNumId w:val="19"/>
+  <w:num w:numId="131" w16cid:durableId="304550907">
+    <w:abstractNumId w:val="3"/>
   </w:num>
-  <w:num w:numId="12" w16cid:durableId="316425971">
-    <w:abstractNumId w:val="110"/>
+  <w:num w:numId="132" w16cid:durableId="855731337">
+    <w:abstractNumId w:val="79"/>
   </w:num>
-  <w:num w:numId="13" w16cid:durableId="431825394">
-    <w:abstractNumId w:val="120"/>
+  <w:num w:numId="133" w16cid:durableId="1098528262">
+    <w:abstractNumId w:val="16"/>
   </w:num>
-  <w:num w:numId="14" w16cid:durableId="834343080">
-    <w:abstractNumId w:val="11"/>
+  <w:num w:numId="134" w16cid:durableId="1355619462">
+    <w:abstractNumId w:val="102"/>
   </w:num>
-  <w:num w:numId="15" w16cid:durableId="59600544">
-    <w:abstractNumId w:val="4"/>
+  <w:num w:numId="135" w16cid:durableId="937908552">
+    <w:abstractNumId w:val="95"/>
   </w:num>
-  <w:num w:numId="16" w16cid:durableId="1432430141">
-    <w:abstractNumId w:val="34"/>
+  <w:num w:numId="136" w16cid:durableId="1048651440">
+    <w:abstractNumId w:val="117"/>
   </w:num>
-  <w:num w:numId="17" w16cid:durableId="2146846462">
-    <w:abstractNumId w:val="30"/>
-  </w:num>
-  <w:num w:numId="18" w16cid:durableId="1871064906">
-    <w:abstractNumId w:val="27"/>
-  </w:num>
-  <w:num w:numId="19" w16cid:durableId="2119134066">
-    <w:abstractNumId w:val="125"/>
-  </w:num>
-  <w:num w:numId="20" w16cid:durableId="579292118">
+  <w:num w:numId="137" w16cid:durableId="1625428331">
     <w:abstractNumId w:val="114"/>
   </w:num>
-  <w:num w:numId="21" w16cid:durableId="1781337550">
-    <w:abstractNumId w:val="47"/>
+  <w:num w:numId="138" w16cid:durableId="1061559164">
+    <w:abstractNumId w:val="140"/>
   </w:num>
-  <w:num w:numId="22" w16cid:durableId="173957045">
+  <w:num w:numId="139" w16cid:durableId="1710061249">
     <w:abstractNumId w:val="23"/>
   </w:num>
-  <w:num w:numId="23" w16cid:durableId="1053696051">
-    <w:abstractNumId w:val="111"/>
-  </w:num>
-  <w:num w:numId="24" w16cid:durableId="1229724906">
-    <w:abstractNumId w:val="56"/>
-  </w:num>
-  <w:num w:numId="25" w16cid:durableId="1105270786">
-    <w:abstractNumId w:val="21"/>
-  </w:num>
-  <w:num w:numId="26" w16cid:durableId="181013303">
-    <w:abstractNumId w:val="50"/>
-  </w:num>
-  <w:num w:numId="27" w16cid:durableId="1005090841">
-    <w:abstractNumId w:val="104"/>
-  </w:num>
-  <w:num w:numId="28" w16cid:durableId="756709327">
-    <w:abstractNumId w:val="76"/>
-  </w:num>
-  <w:num w:numId="29" w16cid:durableId="1175075060">
-    <w:abstractNumId w:val="26"/>
-  </w:num>
-  <w:num w:numId="30" w16cid:durableId="816338617">
-    <w:abstractNumId w:val="87"/>
-  </w:num>
-  <w:num w:numId="31" w16cid:durableId="811018014">
-    <w:abstractNumId w:val="91"/>
-  </w:num>
-  <w:num w:numId="32" w16cid:durableId="2007442846">
-    <w:abstractNumId w:val="6"/>
-  </w:num>
-  <w:num w:numId="33" w16cid:durableId="557594128">
-    <w:abstractNumId w:val="37"/>
-  </w:num>
-  <w:num w:numId="34" w16cid:durableId="2058358458">
-    <w:abstractNumId w:val="115"/>
-  </w:num>
-  <w:num w:numId="35" w16cid:durableId="664430994">
-    <w:abstractNumId w:val="66"/>
-  </w:num>
-  <w:num w:numId="36" w16cid:durableId="1858736738">
-    <w:abstractNumId w:val="107"/>
-  </w:num>
-  <w:num w:numId="37" w16cid:durableId="1793285636">
-    <w:abstractNumId w:val="113"/>
-  </w:num>
-  <w:num w:numId="38" w16cid:durableId="49766020">
-    <w:abstractNumId w:val="126"/>
-  </w:num>
-  <w:num w:numId="39" w16cid:durableId="1444303552">
-    <w:abstractNumId w:val="31"/>
-  </w:num>
-  <w:num w:numId="40" w16cid:durableId="1190021365">
-    <w:abstractNumId w:val="131"/>
-  </w:num>
-  <w:num w:numId="41" w16cid:durableId="624238255">
-    <w:abstractNumId w:val="139"/>
-  </w:num>
-  <w:num w:numId="42" w16cid:durableId="1806924102">
-    <w:abstractNumId w:val="81"/>
-  </w:num>
-  <w:num w:numId="43" w16cid:durableId="1782604561">
-    <w:abstractNumId w:val="103"/>
-  </w:num>
-  <w:num w:numId="44" w16cid:durableId="1816292712">
-    <w:abstractNumId w:val="124"/>
-  </w:num>
-  <w:num w:numId="45" w16cid:durableId="873080635">
-    <w:abstractNumId w:val="96"/>
-  </w:num>
-  <w:num w:numId="46" w16cid:durableId="1561865549">
-    <w:abstractNumId w:val="99"/>
-  </w:num>
-  <w:num w:numId="47" w16cid:durableId="1555769635">
-    <w:abstractNumId w:val="43"/>
-  </w:num>
-  <w:num w:numId="48" w16cid:durableId="1605575889">
-    <w:abstractNumId w:val="140"/>
-  </w:num>
-  <w:num w:numId="49" w16cid:durableId="213855190">
-    <w:abstractNumId w:val="79"/>
-  </w:num>
-  <w:num w:numId="50" w16cid:durableId="69619266">
-    <w:abstractNumId w:val="32"/>
-  </w:num>
-  <w:num w:numId="51" w16cid:durableId="25254510">
-    <w:abstractNumId w:val="36"/>
-  </w:num>
-  <w:num w:numId="52" w16cid:durableId="813301875">
-    <w:abstractNumId w:val="141"/>
-  </w:num>
-  <w:num w:numId="53" w16cid:durableId="349066359">
-    <w:abstractNumId w:val="55"/>
-  </w:num>
-  <w:num w:numId="54" w16cid:durableId="1827240326">
-    <w:abstractNumId w:val="60"/>
-  </w:num>
-  <w:num w:numId="55" w16cid:durableId="1067726837">
-    <w:abstractNumId w:val="123"/>
-  </w:num>
-  <w:num w:numId="56" w16cid:durableId="1145976340">
-    <w:abstractNumId w:val="53"/>
-  </w:num>
-  <w:num w:numId="57" w16cid:durableId="328758546">
-    <w:abstractNumId w:val="49"/>
-  </w:num>
-  <w:num w:numId="58" w16cid:durableId="354310452">
-    <w:abstractNumId w:val="58"/>
-  </w:num>
-  <w:num w:numId="59" w16cid:durableId="1777402173">
-    <w:abstractNumId w:val="98"/>
-  </w:num>
-  <w:num w:numId="60" w16cid:durableId="1878082184">
-    <w:abstractNumId w:val="133"/>
-  </w:num>
-  <w:num w:numId="61" w16cid:durableId="257717478">
-    <w:abstractNumId w:val="20"/>
-  </w:num>
-  <w:num w:numId="62" w16cid:durableId="290208252">
-    <w:abstractNumId w:val="108"/>
-  </w:num>
-  <w:num w:numId="63" w16cid:durableId="921568839">
-    <w:abstractNumId w:val="41"/>
-  </w:num>
-  <w:num w:numId="64" w16cid:durableId="1601639283">
-    <w:abstractNumId w:val="13"/>
-  </w:num>
-  <w:num w:numId="65" w16cid:durableId="1897087019">
+  <w:num w:numId="140" w16cid:durableId="1872187606">
     <w:abstractNumId w:val="9"/>
-  </w:num>
-  <w:num w:numId="66" w16cid:durableId="715392561">
-    <w:abstractNumId w:val="71"/>
-  </w:num>
-  <w:num w:numId="67" w16cid:durableId="2056079112">
-    <w:abstractNumId w:val="69"/>
-  </w:num>
-  <w:num w:numId="68" w16cid:durableId="2080126014">
-    <w:abstractNumId w:val="129"/>
-  </w:num>
-  <w:num w:numId="69" w16cid:durableId="1310135776">
-    <w:abstractNumId w:val="45"/>
-  </w:num>
-  <w:num w:numId="70" w16cid:durableId="1028986258">
-    <w:abstractNumId w:val="101"/>
-  </w:num>
-  <w:num w:numId="71" w16cid:durableId="1785491322">
-    <w:abstractNumId w:val="59"/>
-  </w:num>
-  <w:num w:numId="72" w16cid:durableId="230359834">
-    <w:abstractNumId w:val="128"/>
-  </w:num>
-  <w:num w:numId="73" w16cid:durableId="97215562">
-    <w:abstractNumId w:val="18"/>
-  </w:num>
-  <w:num w:numId="74" w16cid:durableId="168567758">
-    <w:abstractNumId w:val="46"/>
-  </w:num>
-  <w:num w:numId="75" w16cid:durableId="130028596">
-    <w:abstractNumId w:val="136"/>
-  </w:num>
-  <w:num w:numId="76" w16cid:durableId="2045401898">
-    <w:abstractNumId w:val="62"/>
-  </w:num>
-  <w:num w:numId="77" w16cid:durableId="1810897170">
-    <w:abstractNumId w:val="68"/>
-  </w:num>
-  <w:num w:numId="78" w16cid:durableId="1994092115">
-    <w:abstractNumId w:val="57"/>
-  </w:num>
-  <w:num w:numId="79" w16cid:durableId="1675691065">
-    <w:abstractNumId w:val="88"/>
-  </w:num>
-  <w:num w:numId="80" w16cid:durableId="1682316995">
-    <w:abstractNumId w:val="48"/>
-  </w:num>
-  <w:num w:numId="81" w16cid:durableId="1522040136">
-    <w:abstractNumId w:val="130"/>
-  </w:num>
-  <w:num w:numId="82" w16cid:durableId="592789119">
-    <w:abstractNumId w:val="52"/>
-  </w:num>
-  <w:num w:numId="83" w16cid:durableId="1100443382">
-    <w:abstractNumId w:val="132"/>
-  </w:num>
-  <w:num w:numId="84" w16cid:durableId="495994496">
-    <w:abstractNumId w:val="100"/>
-  </w:num>
-  <w:num w:numId="85" w16cid:durableId="1548757019">
-    <w:abstractNumId w:val="3"/>
-  </w:num>
-  <w:num w:numId="86" w16cid:durableId="1047218572">
-    <w:abstractNumId w:val="61"/>
-  </w:num>
-  <w:num w:numId="87" w16cid:durableId="735973842">
-    <w:abstractNumId w:val="73"/>
-  </w:num>
-  <w:num w:numId="88" w16cid:durableId="627516981">
-    <w:abstractNumId w:val="35"/>
-  </w:num>
-  <w:num w:numId="89" w16cid:durableId="1932010567">
-    <w:abstractNumId w:val="17"/>
-  </w:num>
-  <w:num w:numId="90" w16cid:durableId="1582324752">
-    <w:abstractNumId w:val="5"/>
-  </w:num>
-  <w:num w:numId="91" w16cid:durableId="243686588">
-    <w:abstractNumId w:val="63"/>
-  </w:num>
-  <w:num w:numId="92" w16cid:durableId="1287276980">
-    <w:abstractNumId w:val="77"/>
-  </w:num>
-  <w:num w:numId="93" w16cid:durableId="2051223741">
-    <w:abstractNumId w:val="138"/>
-  </w:num>
-  <w:num w:numId="94" w16cid:durableId="1708751724">
-    <w:abstractNumId w:val="144"/>
-  </w:num>
-  <w:num w:numId="95" w16cid:durableId="2138178102">
-    <w:abstractNumId w:val="38"/>
-  </w:num>
-  <w:num w:numId="96" w16cid:durableId="299188647">
-    <w:abstractNumId w:val="33"/>
-  </w:num>
-  <w:num w:numId="97" w16cid:durableId="951012475">
-    <w:abstractNumId w:val="127"/>
-  </w:num>
-  <w:num w:numId="98" w16cid:durableId="1274361570">
-    <w:abstractNumId w:val="92"/>
-  </w:num>
-  <w:num w:numId="99" w16cid:durableId="1306357555">
-    <w:abstractNumId w:val="67"/>
-  </w:num>
-  <w:num w:numId="100" w16cid:durableId="327290992">
-    <w:abstractNumId w:val="106"/>
-  </w:num>
-  <w:num w:numId="101" w16cid:durableId="1990866381">
-    <w:abstractNumId w:val="105"/>
-  </w:num>
-  <w:num w:numId="102" w16cid:durableId="371266948">
-    <w:abstractNumId w:val="16"/>
-  </w:num>
-  <w:num w:numId="103" w16cid:durableId="281613913">
-    <w:abstractNumId w:val="25"/>
-  </w:num>
-  <w:num w:numId="104" w16cid:durableId="1397819114">
-    <w:abstractNumId w:val="118"/>
-  </w:num>
-  <w:num w:numId="105" w16cid:durableId="1012728081">
-    <w:abstractNumId w:val="119"/>
-  </w:num>
-  <w:num w:numId="106" w16cid:durableId="1036468611">
-    <w:abstractNumId w:val="28"/>
-  </w:num>
-  <w:num w:numId="107" w16cid:durableId="293871772">
-    <w:abstractNumId w:val="95"/>
-  </w:num>
-  <w:num w:numId="108" w16cid:durableId="1766875230">
-    <w:abstractNumId w:val="54"/>
-  </w:num>
-  <w:num w:numId="109" w16cid:durableId="695815868">
-    <w:abstractNumId w:val="29"/>
-  </w:num>
-  <w:num w:numId="110" w16cid:durableId="1980648420">
-    <w:abstractNumId w:val="85"/>
-  </w:num>
-  <w:num w:numId="111" w16cid:durableId="204099977">
-    <w:abstractNumId w:val="94"/>
-  </w:num>
-  <w:num w:numId="112" w16cid:durableId="566377572">
-    <w:abstractNumId w:val="65"/>
-  </w:num>
-  <w:num w:numId="113" w16cid:durableId="845172666">
-    <w:abstractNumId w:val="12"/>
-  </w:num>
-  <w:num w:numId="114" w16cid:durableId="1132092914">
-    <w:abstractNumId w:val="83"/>
-  </w:num>
-  <w:num w:numId="115" w16cid:durableId="683092990">
-    <w:abstractNumId w:val="116"/>
-  </w:num>
-  <w:num w:numId="116" w16cid:durableId="1244877407">
-    <w:abstractNumId w:val="117"/>
-  </w:num>
-  <w:num w:numId="117" w16cid:durableId="726148022">
-    <w:abstractNumId w:val="72"/>
-  </w:num>
-  <w:num w:numId="118" w16cid:durableId="1448769905">
-    <w:abstractNumId w:val="64"/>
-  </w:num>
-  <w:num w:numId="119" w16cid:durableId="1248341273">
-    <w:abstractNumId w:val="82"/>
-  </w:num>
-  <w:num w:numId="120" w16cid:durableId="562370162">
-    <w:abstractNumId w:val="102"/>
-  </w:num>
-  <w:num w:numId="121" w16cid:durableId="160629884">
-    <w:abstractNumId w:val="14"/>
-  </w:num>
-  <w:num w:numId="122" w16cid:durableId="474568737">
-    <w:abstractNumId w:val="42"/>
-  </w:num>
-  <w:num w:numId="123" w16cid:durableId="768964622">
-    <w:abstractNumId w:val="39"/>
-  </w:num>
-  <w:num w:numId="124" w16cid:durableId="1335910887">
-    <w:abstractNumId w:val="143"/>
-  </w:num>
-  <w:num w:numId="125" w16cid:durableId="1905530579">
-    <w:abstractNumId w:val="51"/>
-  </w:num>
-  <w:num w:numId="126" w16cid:durableId="565188705">
-    <w:abstractNumId w:val="10"/>
-  </w:num>
-  <w:num w:numId="127" w16cid:durableId="981227013">
-    <w:abstractNumId w:val="7"/>
-  </w:num>
-  <w:num w:numId="128" w16cid:durableId="1373310907">
-    <w:abstractNumId w:val="70"/>
-  </w:num>
-  <w:num w:numId="129" w16cid:durableId="984776096">
-    <w:abstractNumId w:val="40"/>
-  </w:num>
-  <w:num w:numId="130" w16cid:durableId="1123306180">
-    <w:abstractNumId w:val="135"/>
-  </w:num>
-  <w:num w:numId="131" w16cid:durableId="304550907">
-    <w:abstractNumId w:val="2"/>
-  </w:num>
-  <w:num w:numId="132" w16cid:durableId="855731337">
-    <w:abstractNumId w:val="75"/>
-  </w:num>
-  <w:num w:numId="133" w16cid:durableId="1098528262">
-    <w:abstractNumId w:val="15"/>
-  </w:num>
-  <w:num w:numId="134" w16cid:durableId="1355619462">
-    <w:abstractNumId w:val="97"/>
-  </w:num>
-  <w:num w:numId="135" w16cid:durableId="937908552">
-    <w:abstractNumId w:val="90"/>
-  </w:num>
-  <w:num w:numId="136" w16cid:durableId="1048651440">
-    <w:abstractNumId w:val="112"/>
-  </w:num>
-  <w:num w:numId="137" w16cid:durableId="1625428331">
-    <w:abstractNumId w:val="109"/>
-  </w:num>
-  <w:num w:numId="138" w16cid:durableId="1061559164">
-    <w:abstractNumId w:val="134"/>
-  </w:num>
-  <w:num w:numId="139" w16cid:durableId="1710061249">
-    <w:abstractNumId w:val="22"/>
-  </w:num>
-  <w:num w:numId="140" w16cid:durableId="1872187606">
-    <w:abstractNumId w:val="8"/>
   </w:num>
   <w:num w:numId="141" w16cid:durableId="157576470">
     <w:abstractNumId w:val="0"/>
   </w:num>
   <w:num w:numId="142" w16cid:durableId="1841459746">
-    <w:abstractNumId w:val="78"/>
+    <w:abstractNumId w:val="82"/>
   </w:num>
   <w:num w:numId="143" w16cid:durableId="952327285">
-    <w:abstractNumId w:val="80"/>
+    <w:abstractNumId w:val="85"/>
   </w:num>
   <w:num w:numId="144" w16cid:durableId="1686399214">
-    <w:abstractNumId w:val="89"/>
+    <w:abstractNumId w:val="94"/>
   </w:num>
   <w:num w:numId="145" w16cid:durableId="437409285">
-    <w:abstractNumId w:val="44"/>
+    <w:abstractNumId w:val="45"/>
+  </w:num>
+  <w:num w:numId="146" w16cid:durableId="2056654596">
+    <w:abstractNumId w:val="152"/>
+  </w:num>
+  <w:num w:numId="147" w16cid:durableId="21365038">
+    <w:abstractNumId w:val="84"/>
+  </w:num>
+  <w:num w:numId="148" w16cid:durableId="863711799">
+    <w:abstractNumId w:val="136"/>
+  </w:num>
+  <w:num w:numId="149" w16cid:durableId="398553183">
+    <w:abstractNumId w:val="143"/>
+  </w:num>
+  <w:num w:numId="150" w16cid:durableId="565261923">
+    <w:abstractNumId w:val="70"/>
+  </w:num>
+  <w:num w:numId="151" w16cid:durableId="1868058141">
+    <w:abstractNumId w:val="64"/>
+  </w:num>
+  <w:num w:numId="152" w16cid:durableId="1211527827">
+    <w:abstractNumId w:val="2"/>
+  </w:num>
+  <w:num w:numId="153" w16cid:durableId="1070427344">
+    <w:abstractNumId w:val="52"/>
   </w:num>
   <w:numIdMacAtCleanup w:val="103"/>
 </w:numbering>

</xml_diff>

<commit_message>
trading algorithm and football predictions
</commit_message>
<xml_diff>
--- a/Trading algorithm.docx
+++ b/Trading algorithm.docx
@@ -7082,7 +7082,6 @@
           <w:rFonts w:eastAsia="Times New Roman" w:cs="Times New Roman"/>
           <w:szCs w:val="24"/>
         </w:rPr>
-        <w:lastRenderedPageBreak/>
         <w:t xml:space="preserve">Index is a proper </w:t>
       </w:r>
       <w:r>
@@ -7180,6 +7179,7 @@
           <w:rFonts w:eastAsia="Times New Roman" w:cs="Times New Roman"/>
           <w:szCs w:val="24"/>
         </w:rPr>
+        <w:lastRenderedPageBreak/>
         <w:pict w14:anchorId="210FB5C7">
           <v:rect id="_x0000_i1045" style="width:0;height:1.5pt" o:hralign="center" o:hrstd="t" o:hr="t" fillcolor="#a0a0a0" stroked="f"/>
         </w:pict>
@@ -8217,35 +8217,35 @@
         <w:rPr>
           <w:rFonts w:eastAsia="Times New Roman"/>
         </w:rPr>
+        <w:t>Now you can select data like:</w:t>
+      </w:r>
+    </w:p>
+    <w:p>
+      <w:pPr>
+        <w:pStyle w:val="code"/>
+        <w:rPr>
+          <w:rFonts w:eastAsia="Times New Roman"/>
+        </w:rPr>
+      </w:pPr>
+      <w:r>
+        <w:rPr>
+          <w:rFonts w:eastAsia="Times New Roman"/>
+        </w:rPr>
+        <w:t>stocks['Close_AAPL']</w:t>
+      </w:r>
+    </w:p>
+    <w:p>
+      <w:pPr>
+        <w:pStyle w:val="code"/>
+        <w:rPr>
+          <w:rFonts w:eastAsia="Times New Roman"/>
+        </w:rPr>
+      </w:pPr>
+      <w:r>
+        <w:rPr>
+          <w:rFonts w:eastAsia="Times New Roman"/>
+        </w:rPr>
         <w:lastRenderedPageBreak/>
-        <w:t>Now you can select data like:</w:t>
-      </w:r>
-    </w:p>
-    <w:p>
-      <w:pPr>
-        <w:pStyle w:val="code"/>
-        <w:rPr>
-          <w:rFonts w:eastAsia="Times New Roman"/>
-        </w:rPr>
-      </w:pPr>
-      <w:r>
-        <w:rPr>
-          <w:rFonts w:eastAsia="Times New Roman"/>
-        </w:rPr>
-        <w:t>stocks['Close_AAPL']</w:t>
-      </w:r>
-    </w:p>
-    <w:p>
-      <w:pPr>
-        <w:pStyle w:val="code"/>
-        <w:rPr>
-          <w:rFonts w:eastAsia="Times New Roman"/>
-        </w:rPr>
-      </w:pPr>
-      <w:r>
-        <w:rPr>
-          <w:rFonts w:eastAsia="Times New Roman"/>
-        </w:rPr>
         <w:t>stocks[['Close_AAPL', 'Close_SPY']]</w:t>
       </w:r>
     </w:p>
@@ -8696,12 +8696,38 @@
       <w:pPr>
         <w:ind w:firstLine="0"/>
       </w:pPr>
+    </w:p>
+    <w:p>
+      <w:pPr>
+        <w:pStyle w:val="Heading1"/>
+      </w:pPr>
+      <w:r>
+        <w:rPr>
+          <w:rFonts w:ascii="Segoe UI Emoji" w:hAnsi="Segoe UI Emoji" w:cs="Segoe UI Emoji"/>
+        </w:rPr>
+        <w:t>📝</w:t>
+      </w:r>
+      <w:r>
+        <w:t xml:space="preserve"> Notes on </w:t>
+      </w:r>
+      <w:r>
+        <w:rPr>
+          <w:rStyle w:val="HTMLCode"/>
+          <w:rFonts w:eastAsiaTheme="majorEastAsia"/>
+        </w:rPr>
+        <w:t>.describe()</w:t>
+      </w:r>
+      <w:r>
+        <w:t xml:space="preserve"> for Stock Data</w:t>
+      </w:r>
+    </w:p>
+    <w:p>
       <w:r>
         <w:drawing>
-          <wp:inline distT="0" distB="0" distL="0" distR="0" wp14:anchorId="5AB93B34" wp14:editId="0F21281D">
+          <wp:inline distT="0" distB="0" distL="0" distR="0" wp14:anchorId="0CF070A3" wp14:editId="17AE62B4">
             <wp:extent cx="5943600" cy="2123440"/>
             <wp:effectExtent l="0" t="0" r="0" b="0"/>
-            <wp:docPr id="15" name="Picture 15"/>
+            <wp:docPr id="15" name="Picture 15" descr="A screenshot of a computer&#10;&#10;AI-generated content may be incorrect."/>
             <wp:cNvGraphicFramePr>
               <a:graphicFrameLocks xmlns:a="http://schemas.openxmlformats.org/drawingml/2006/main" noChangeAspect="1"/>
             </wp:cNvGraphicFramePr>
@@ -8709,7 +8735,7 @@
               <a:graphicData uri="http://schemas.openxmlformats.org/drawingml/2006/picture">
                 <pic:pic xmlns:pic="http://schemas.openxmlformats.org/drawingml/2006/picture">
                   <pic:nvPicPr>
-                    <pic:cNvPr id="1" name=""/>
+                    <pic:cNvPr id="15" name="Picture 15" descr="A screenshot of a computer&#10;&#10;AI-generated content may be incorrect."/>
                     <pic:cNvPicPr/>
                   </pic:nvPicPr>
                   <pic:blipFill>
@@ -8736,17 +8762,18 @@
     </w:p>
     <w:p>
       <w:pPr>
-        <w:pStyle w:val="Heading1"/>
-      </w:pPr>
-      <w:r>
-        <w:rPr>
-          <w:rFonts w:ascii="Segoe UI Emoji" w:hAnsi="Segoe UI Emoji" w:cs="Segoe UI Emoji"/>
-        </w:rPr>
-        <w:lastRenderedPageBreak/>
-        <w:t>📝</w:t>
-      </w:r>
-      <w:r>
-        <w:t xml:space="preserve"> Notes on </w:t>
+        <w:pStyle w:val="Heading3"/>
+      </w:pPr>
+      <w:r>
+        <w:t xml:space="preserve">1. </w:t>
+      </w:r>
+      <w:r>
+        <w:rPr>
+          <w:rStyle w:val="Strong"/>
+          <w:b/>
+          <w:bCs w:val="0"/>
+        </w:rPr>
+        <w:t xml:space="preserve">What </w:t>
       </w:r>
       <w:r>
         <w:rPr>
@@ -8756,32 +8783,6 @@
         <w:t>.describe()</w:t>
       </w:r>
       <w:r>
-        <w:t xml:space="preserve"> for Stock Data</w:t>
-      </w:r>
-    </w:p>
-    <w:p>
-      <w:pPr>
-        <w:pStyle w:val="Heading3"/>
-      </w:pPr>
-      <w:r>
-        <w:t xml:space="preserve">1. </w:t>
-      </w:r>
-      <w:r>
-        <w:rPr>
-          <w:rStyle w:val="Strong"/>
-          <w:b/>
-          <w:bCs w:val="0"/>
-        </w:rPr>
-        <w:t xml:space="preserve">What </w:t>
-      </w:r>
-      <w:r>
-        <w:rPr>
-          <w:rStyle w:val="HTMLCode"/>
-          <w:rFonts w:eastAsiaTheme="majorEastAsia"/>
-        </w:rPr>
-        <w:t>.describe()</w:t>
-      </w:r>
-      <w:r>
         <w:rPr>
           <w:rStyle w:val="Strong"/>
           <w:b/>
@@ -8821,6 +8822,7 @@
         </w:numPr>
       </w:pPr>
       <w:r>
+        <w:lastRenderedPageBreak/>
         <w:t xml:space="preserve">Default stats: </w:t>
       </w:r>
       <w:r>
@@ -9343,7 +9345,6 @@
         <w:pStyle w:val="Heading3"/>
       </w:pPr>
       <w:r>
-        <w:lastRenderedPageBreak/>
         <w:t xml:space="preserve">4. </w:t>
       </w:r>
       <w:r>
@@ -9414,6 +9415,7 @@
     </w:p>
     <w:p>
       <w:r>
+        <w:lastRenderedPageBreak/>
         <w:pict w14:anchorId="310A7BBC">
           <v:rect id="_x0000_i1054" style="width:0;height:1.5pt" o:hralign="center" o:hrstd="t" o:hr="t" fillcolor="#a0a0a0" stroked="f"/>
         </w:pict>
@@ -19511,7 +19513,6 @@
         </w:numPr>
       </w:pPr>
       <w:r>
-        <w:lastRenderedPageBreak/>
         <w:t>dropna() removes any NaN (Not a Number) values, ensuring that any missing data is excluded from the analysis.</w:t>
       </w:r>
     </w:p>
@@ -19523,6 +19524,7 @@
         </w:numPr>
       </w:pPr>
       <w:r>
+        <w:lastRenderedPageBreak/>
         <w:t>This creates a new ret DataFrame, showing the percentage change (AAPL) and the calculated change (change), where:</w:t>
       </w:r>
     </w:p>
@@ -19738,7 +19740,6 @@
           <w:b/>
           <w:bCs/>
         </w:rPr>
-        <w:lastRenderedPageBreak/>
         <w:t>2024-12-31</w:t>
       </w:r>
       <w:r>
@@ -19753,6 +19754,7 @@
         </w:numPr>
       </w:pPr>
       <w:r>
+        <w:lastRenderedPageBreak/>
         <w:t>AAPL: -0.007058 (negative change indicating a decrease in the stock price).</w:t>
       </w:r>
     </w:p>
@@ -20033,7 +20035,6 @@
         <w:pStyle w:val="code"/>
       </w:pPr>
       <w:r>
-        <w:lastRenderedPageBreak/>
         <w:t>ret.plot(kind="hist", figsize=(12,8), bins=50)  # Decreasing the bins count</w:t>
       </w:r>
     </w:p>
@@ -20164,21 +20165,21 @@
         <w:pStyle w:val="code"/>
       </w:pPr>
       <w:r>
+        <w:t>plt.legend(["AAPL", "change"])</w:t>
+      </w:r>
+    </w:p>
+    <w:p>
+      <w:pPr>
+        <w:pStyle w:val="code"/>
+      </w:pPr>
+      <w:r>
+        <w:t>plt.show()</w:t>
+      </w:r>
+    </w:p>
+    <w:p/>
+    <w:p>
+      <w:r>
         <w:lastRenderedPageBreak/>
-        <w:t>plt.legend(["AAPL", "change"])</w:t>
-      </w:r>
-    </w:p>
-    <w:p>
-      <w:pPr>
-        <w:pStyle w:val="code"/>
-      </w:pPr>
-      <w:r>
-        <w:t>plt.show()</w:t>
-      </w:r>
-    </w:p>
-    <w:p/>
-    <w:p>
-      <w:r>
         <w:drawing>
           <wp:inline distT="0" distB="0" distL="0" distR="0" wp14:anchorId="50157024" wp14:editId="00712FAC">
             <wp:extent cx="5943600" cy="2599690"/>
@@ -20384,15 +20385,15 @@
           <w:b/>
           <w:bCs/>
         </w:rPr>
+        <w:t>Change standard deviation</w:t>
+      </w:r>
+      <w:r>
+        <w:t>: 0.339604 (measures the daily return volatility for change)</w:t>
+      </w:r>
+    </w:p>
+    <w:p>
+      <w:r>
         <w:lastRenderedPageBreak/>
-        <w:t>Change standard deviation</w:t>
-      </w:r>
-      <w:r>
-        <w:t>: 0.339604 (measures the daily return volatility for change)</w:t>
-      </w:r>
-    </w:p>
-    <w:p>
-      <w:r>
         <w:t>The standard deviation is the square root of the variance and gives a more interpretable measure of volatility.</w:t>
       </w:r>
     </w:p>
@@ -20470,7 +20471,6 @@
     </w:p>
     <w:p>
       <w:r>
-        <w:lastRenderedPageBreak/>
         <w:drawing>
           <wp:inline distT="0" distB="0" distL="0" distR="0" wp14:anchorId="7405F19E" wp14:editId="4DE07BFA">
             <wp:extent cx="5943600" cy="4768850"/>
@@ -20536,6 +20536,7 @@
           <w:b/>
           <w:bCs/>
         </w:rPr>
+        <w:lastRenderedPageBreak/>
         <w:t>Annualized Mean Return:</w:t>
       </w:r>
     </w:p>
@@ -20663,7 +20664,6 @@
         </w:tabs>
       </w:pPr>
       <w:r>
-        <w:lastRenderedPageBreak/>
         <w:t>169.083454</w:t>
       </w:r>
     </w:p>
@@ -20872,6 +20872,7 @@
         </w:numPr>
       </w:pPr>
       <w:r>
+        <w:lastRenderedPageBreak/>
         <w:t xml:space="preserve">The </w:t>
       </w:r>
       <w:r>
@@ -20997,7 +20998,6 @@
           <w:b/>
           <w:bCs/>
         </w:rPr>
-        <w:lastRenderedPageBreak/>
         <w:t>Annualized Mean Return</w:t>
       </w:r>
       <w:r>
@@ -21196,7 +21196,6 @@
           <w:b/>
           <w:bCs/>
         </w:rPr>
-        <w:lastRenderedPageBreak/>
         <w:t>KO</w:t>
       </w:r>
       <w:r>
@@ -21215,6 +21214,7 @@
           <w:b/>
           <w:bCs/>
         </w:rPr>
+        <w:lastRenderedPageBreak/>
         <w:t>IBM</w:t>
       </w:r>
       <w:r>
@@ -21433,7 +21433,6 @@
         <w:ind w:firstLine="0"/>
       </w:pPr>
       <w:r>
-        <w:lastRenderedPageBreak/>
         <w:pict w14:anchorId="40EB4E30">
           <v:rect id="_x0000_i1101" style="width:0;height:1.5pt" o:hralign="center" o:hrstd="t" o:hr="t" fillcolor="#a0a0a0" stroked="f"/>
         </w:pict>
@@ -21460,6 +21459,7 @@
         <w:pStyle w:val="code"/>
       </w:pPr>
       <w:r>
+        <w:lastRenderedPageBreak/>
         <w:t>normclose.plot(figsize=(15,8), fontsize=12)</w:t>
       </w:r>
     </w:p>
@@ -21785,7 +21785,6 @@
           <w:b/>
           <w:bCs/>
         </w:rPr>
-        <w:lastRenderedPageBreak/>
         <w:t>Key Concepts:</w:t>
       </w:r>
     </w:p>
@@ -21819,6 +21818,7 @@
           <w:b/>
           <w:bCs/>
         </w:rPr>
+        <w:lastRenderedPageBreak/>
         <w:t>Stock Performance Visualization</w:t>
       </w:r>
       <w:r>
@@ -23701,7 +23701,6 @@
         <w:pStyle w:val="code"/>
       </w:pPr>
       <w:r>
-        <w:lastRenderedPageBreak/>
         <w:t>plt.show()</w:t>
       </w:r>
     </w:p>
@@ -23735,6 +23734,7 @@
           <w:b/>
           <w:bCs/>
         </w:rPr>
+        <w:lastRenderedPageBreak/>
         <w:t>x="std"</w:t>
       </w:r>
       <w:r>
@@ -24133,7 +24133,6 @@
           <w:b/>
           <w:bCs/>
         </w:rPr>
-        <w:lastRenderedPageBreak/>
         <w:t>SPY</w:t>
       </w:r>
       <w:r>
@@ -24220,6 +24219,7 @@
           <w:b/>
           <w:bCs/>
         </w:rPr>
+        <w:lastRenderedPageBreak/>
         <w:t>KO</w:t>
       </w:r>
       <w:r>
@@ -27793,7 +27793,7 @@
     </w:p>
     <w:p>
       <w:pPr>
-        <w:ind w:firstLine="0"/>
+        <w:pStyle w:val="code"/>
       </w:pPr>
       <w:r>
         <w:t>spy_roll = spy.rolling(window=10)</w:t>
@@ -27872,7 +27872,7 @@
     </w:p>
     <w:p>
       <w:pPr>
-        <w:ind w:firstLine="0"/>
+        <w:pStyle w:val="code"/>
       </w:pPr>
       <w:r>
         <w:t>spy_roll = spy_roll.mean()</w:t>
@@ -28016,7 +28016,6 @@
           <w:b/>
           <w:bCs/>
         </w:rPr>
-        <w:lastRenderedPageBreak/>
         <w:t>Valid Data from 2024</w:t>
       </w:r>
       <w:r>
@@ -28031,6 +28030,7 @@
         </w:numPr>
       </w:pPr>
       <w:r>
+        <w:lastRenderedPageBreak/>
         <w:t xml:space="preserve">From the row starting with </w:t>
       </w:r>
       <w:r>
@@ -28363,7 +28363,7 @@
       </w:pPr>
       <w:r>
         <w:pict w14:anchorId="6FB8BED4">
-          <v:rect id="_x0000_i1145" style="width:0;height:1.5pt" o:hralign="center" o:hrstd="t" o:hr="t" fillcolor="#a0a0a0" stroked="f"/>
+          <v:rect id="_x0000_i1127" style="width:0;height:1.5pt" o:hralign="center" o:hrstd="t" o:hr="t" fillcolor="#a0a0a0" stroked="f"/>
         </w:pict>
       </w:r>
     </w:p>
@@ -28473,7 +28473,7 @@
       </w:pPr>
       <w:r>
         <w:pict w14:anchorId="1D7DC18E">
-          <v:rect id="_x0000_i1146" style="width:0;height:1.5pt" o:hralign="center" o:hrstd="t" o:hr="t" fillcolor="#a0a0a0" stroked="f"/>
+          <v:rect id="_x0000_i1128" style="width:0;height:1.5pt" o:hralign="center" o:hrstd="t" o:hr="t" fillcolor="#a0a0a0" stroked="f"/>
         </w:pict>
       </w:r>
     </w:p>
@@ -28542,7 +28542,7 @@
       </w:pPr>
       <w:r>
         <w:pict w14:anchorId="7C7725D8">
-          <v:rect id="_x0000_i1147" style="width:0;height:1.5pt" o:hralign="center" o:hrstd="t" o:hr="t" fillcolor="#a0a0a0" stroked="f"/>
+          <v:rect id="_x0000_i1129" style="width:0;height:1.5pt" o:hralign="center" o:hrstd="t" o:hr="t" fillcolor="#a0a0a0" stroked="f"/>
         </w:pict>
       </w:r>
     </w:p>
@@ -28822,10 +28822,7 @@
     </w:p>
     <w:p>
       <w:pPr>
-        <w:tabs>
-          <w:tab w:val="left" w:pos="2670"/>
-        </w:tabs>
-        <w:ind w:firstLine="0"/>
+        <w:pStyle w:val="code"/>
       </w:pPr>
       <w:r>
         <w:t>SPY["SMA200"] = spy_close.rolling(window=200, min_periods=200).mean()</w:t>
@@ -28868,7 +28865,7 @@
       </w:pPr>
       <w:r>
         <w:pict w14:anchorId="412EDA1A">
-          <v:rect id="_x0000_i1181" style="width:0;height:1.5pt" o:hralign="center" o:hrstd="t" o:hr="t" fillcolor="#a0a0a0" stroked="f"/>
+          <v:rect id="_x0000_i1130" style="width:0;height:1.5pt" o:hralign="center" o:hrstd="t" o:hr="t" fillcolor="#a0a0a0" stroked="f"/>
         </w:pict>
       </w:r>
     </w:p>
@@ -29052,7 +29049,7 @@
       </w:pPr>
       <w:r>
         <w:pict w14:anchorId="3D71F10F">
-          <v:rect id="_x0000_i1182" style="width:0;height:1.5pt" o:hralign="center" o:hrstd="t" o:hr="t" fillcolor="#a0a0a0" stroked="f"/>
+          <v:rect id="_x0000_i1131" style="width:0;height:1.5pt" o:hralign="center" o:hrstd="t" o:hr="t" fillcolor="#a0a0a0" stroked="f"/>
         </w:pict>
       </w:r>
     </w:p>
@@ -29198,7 +29195,7 @@
       </w:pPr>
       <w:r>
         <w:pict w14:anchorId="5739AF94">
-          <v:rect id="_x0000_i1183" style="width:0;height:1.5pt" o:hralign="center" o:hrstd="t" o:hr="t" fillcolor="#a0a0a0" stroked="f"/>
+          <v:rect id="_x0000_i1132" style="width:0;height:1.5pt" o:hralign="center" o:hrstd="t" o:hr="t" fillcolor="#a0a0a0" stroked="f"/>
         </w:pict>
       </w:r>
     </w:p>
@@ -29307,7 +29304,7 @@
       </w:pPr>
       <w:r>
         <w:pict w14:anchorId="5B11A684">
-          <v:rect id="_x0000_i1184" style="width:0;height:1.5pt" o:hralign="center" o:hrstd="t" o:hr="t" fillcolor="#a0a0a0" stroked="f"/>
+          <v:rect id="_x0000_i1133" style="width:0;height:1.5pt" o:hralign="center" o:hrstd="t" o:hr="t" fillcolor="#a0a0a0" stroked="f"/>
         </w:pict>
       </w:r>
     </w:p>
@@ -29421,7 +29418,7 @@
       </w:pPr>
       <w:r>
         <w:pict w14:anchorId="4F2E096B">
-          <v:rect id="_x0000_i1185" style="width:0;height:1.5pt" o:hralign="center" o:hrstd="t" o:hr="t" fillcolor="#a0a0a0" stroked="f"/>
+          <v:rect id="_x0000_i1134" style="width:0;height:1.5pt" o:hralign="center" o:hrstd="t" o:hr="t" fillcolor="#a0a0a0" stroked="f"/>
         </w:pict>
       </w:r>
     </w:p>
@@ -29481,6 +29478,1304 @@
       </w:r>
       <w:r>
         <w:t xml:space="preserve"> (Golden Cross / Death Cross) in real historical data.</w:t>
+      </w:r>
+    </w:p>
+    <w:p>
+      <w:pPr>
+        <w:tabs>
+          <w:tab w:val="left" w:pos="2670"/>
+        </w:tabs>
+        <w:ind w:firstLine="0"/>
+      </w:pPr>
+    </w:p>
+    <w:p>
+      <w:pPr>
+        <w:tabs>
+          <w:tab w:val="left" w:pos="2670"/>
+        </w:tabs>
+        <w:ind w:firstLine="0"/>
+      </w:pPr>
+    </w:p>
+    <w:p>
+      <w:pPr>
+        <w:tabs>
+          <w:tab w:val="left" w:pos="2670"/>
+        </w:tabs>
+        <w:ind w:firstLine="0"/>
+      </w:pPr>
+    </w:p>
+    <w:p>
+      <w:pPr>
+        <w:pStyle w:val="Heading1"/>
+      </w:pPr>
+      <w:r>
+        <w:lastRenderedPageBreak/>
+        <w:t xml:space="preserve">Notes on the </w:t>
+      </w:r>
+      <w:r>
+        <w:t>EMA and SMA</w:t>
+      </w:r>
+    </w:p>
+    <w:p>
+      <w:pPr>
+        <w:tabs>
+          <w:tab w:val="left" w:pos="2670"/>
+        </w:tabs>
+        <w:ind w:firstLine="0"/>
+        <w:rPr>
+          <w:b/>
+          <w:bCs/>
+        </w:rPr>
+      </w:pPr>
+      <w:r>
+        <w:drawing>
+          <wp:inline distT="0" distB="0" distL="0" distR="0" wp14:anchorId="52E44922" wp14:editId="0F346C57">
+            <wp:extent cx="5943600" cy="3012440"/>
+            <wp:effectExtent l="0" t="0" r="0" b="0"/>
+            <wp:docPr id="1994779891" name="Picture 1" descr="A screenshot of a computer&#10;&#10;AI-generated content may be incorrect."/>
+            <wp:cNvGraphicFramePr>
+              <a:graphicFrameLocks xmlns:a="http://schemas.openxmlformats.org/drawingml/2006/main" noChangeAspect="1"/>
+            </wp:cNvGraphicFramePr>
+            <a:graphic xmlns:a="http://schemas.openxmlformats.org/drawingml/2006/main">
+              <a:graphicData uri="http://schemas.openxmlformats.org/drawingml/2006/picture">
+                <pic:pic xmlns:pic="http://schemas.openxmlformats.org/drawingml/2006/picture">
+                  <pic:nvPicPr>
+                    <pic:cNvPr id="1994779891" name="Picture 1" descr="A screenshot of a computer&#10;&#10;AI-generated content may be incorrect."/>
+                    <pic:cNvPicPr/>
+                  </pic:nvPicPr>
+                  <pic:blipFill>
+                    <a:blip r:embed="rId58"/>
+                    <a:stretch>
+                      <a:fillRect/>
+                    </a:stretch>
+                  </pic:blipFill>
+                  <pic:spPr>
+                    <a:xfrm>
+                      <a:off x="0" y="0"/>
+                      <a:ext cx="5943600" cy="3012440"/>
+                    </a:xfrm>
+                    <a:prstGeom prst="rect">
+                      <a:avLst/>
+                    </a:prstGeom>
+                  </pic:spPr>
+                </pic:pic>
+              </a:graphicData>
+            </a:graphic>
+          </wp:inline>
+        </w:drawing>
+      </w:r>
+    </w:p>
+    <w:p>
+      <w:pPr>
+        <w:tabs>
+          <w:tab w:val="left" w:pos="2670"/>
+        </w:tabs>
+        <w:ind w:firstLine="0"/>
+        <w:rPr>
+          <w:b/>
+          <w:bCs/>
+        </w:rPr>
+      </w:pPr>
+      <w:r>
+        <w:rPr>
+          <w:b/>
+          <w:bCs/>
+        </w:rPr>
+        <w:t>1. Creating Moving Averages</w:t>
+      </w:r>
+    </w:p>
+    <w:p>
+      <w:pPr>
+        <w:pStyle w:val="code"/>
+      </w:pPr>
+      <w:r>
+        <w:t>SPY["EMA100"] = spy.SPY.ewm(span=100, min_periods=100).mean()</w:t>
+      </w:r>
+    </w:p>
+    <w:p>
+      <w:pPr>
+        <w:numPr>
+          <w:ilvl w:val="0"/>
+          <w:numId w:val="166"/>
+        </w:numPr>
+        <w:tabs>
+          <w:tab w:val="left" w:pos="2670"/>
+        </w:tabs>
+      </w:pPr>
+      <w:r>
+        <w:t xml:space="preserve">This line calculates the </w:t>
+      </w:r>
+      <w:r>
+        <w:rPr>
+          <w:b/>
+          <w:bCs/>
+        </w:rPr>
+        <w:t>Exponential Moving Average (EMA)</w:t>
+      </w:r>
+      <w:r>
+        <w:t xml:space="preserve"> for SPY using a </w:t>
+      </w:r>
+      <w:r>
+        <w:rPr>
+          <w:b/>
+          <w:bCs/>
+        </w:rPr>
+        <w:t>100-day span</w:t>
+      </w:r>
+      <w:r>
+        <w:t>.</w:t>
+      </w:r>
+    </w:p>
+    <w:p>
+      <w:pPr>
+        <w:numPr>
+          <w:ilvl w:val="0"/>
+          <w:numId w:val="166"/>
+        </w:numPr>
+        <w:tabs>
+          <w:tab w:val="left" w:pos="2670"/>
+        </w:tabs>
+      </w:pPr>
+      <w:r>
+        <w:t xml:space="preserve">.ewm(span=100) → applies exponential weighting with a smoothing factor, giving </w:t>
+      </w:r>
+      <w:r>
+        <w:rPr>
+          <w:b/>
+          <w:bCs/>
+        </w:rPr>
+        <w:t>more importance to recent prices</w:t>
+      </w:r>
+      <w:r>
+        <w:t>.</w:t>
+      </w:r>
+    </w:p>
+    <w:p>
+      <w:pPr>
+        <w:numPr>
+          <w:ilvl w:val="0"/>
+          <w:numId w:val="166"/>
+        </w:numPr>
+        <w:tabs>
+          <w:tab w:val="left" w:pos="2670"/>
+        </w:tabs>
+      </w:pPr>
+      <w:r>
+        <w:t>min_periods=100 → ensures that at least 100 data points are available before calculating the EMA.</w:t>
+      </w:r>
+    </w:p>
+    <w:p>
+      <w:pPr>
+        <w:numPr>
+          <w:ilvl w:val="0"/>
+          <w:numId w:val="166"/>
+        </w:numPr>
+        <w:tabs>
+          <w:tab w:val="left" w:pos="2670"/>
+        </w:tabs>
+      </w:pPr>
+      <w:r>
+        <w:t>.mean() → finalizes the calculation and produces the smoothed values.</w:t>
+      </w:r>
+    </w:p>
+    <w:p>
+      <w:pPr>
+        <w:numPr>
+          <w:ilvl w:val="0"/>
+          <w:numId w:val="166"/>
+        </w:numPr>
+        <w:tabs>
+          <w:tab w:val="left" w:pos="2670"/>
+        </w:tabs>
+      </w:pPr>
+      <w:r>
+        <w:t xml:space="preserve">The result is stored in a new column called </w:t>
+      </w:r>
+      <w:r>
+        <w:rPr>
+          <w:b/>
+          <w:bCs/>
+        </w:rPr>
+        <w:t>EMA100</w:t>
+      </w:r>
+      <w:r>
+        <w:t xml:space="preserve"> in the SPY DataFrame.</w:t>
+      </w:r>
+    </w:p>
+    <w:p>
+      <w:pPr>
+        <w:tabs>
+          <w:tab w:val="left" w:pos="2670"/>
+        </w:tabs>
+        <w:ind w:firstLine="0"/>
+        <w:rPr>
+          <w:b/>
+          <w:bCs/>
+        </w:rPr>
+      </w:pPr>
+      <w:r>
+        <w:rPr>
+          <w:b/>
+          <w:bCs/>
+        </w:rPr>
+        <w:t>2. Other Moving Averages</w:t>
+      </w:r>
+    </w:p>
+    <w:p>
+      <w:pPr>
+        <w:numPr>
+          <w:ilvl w:val="0"/>
+          <w:numId w:val="167"/>
+        </w:numPr>
+        <w:tabs>
+          <w:tab w:val="left" w:pos="2670"/>
+        </w:tabs>
+      </w:pPr>
+      <w:r>
+        <w:rPr>
+          <w:b/>
+          <w:bCs/>
+        </w:rPr>
+        <w:t>SMA50</w:t>
+      </w:r>
+      <w:r>
+        <w:t>: Simple Moving Average with a 50-day window (short-term trend).</w:t>
+      </w:r>
+    </w:p>
+    <w:p>
+      <w:pPr>
+        <w:numPr>
+          <w:ilvl w:val="0"/>
+          <w:numId w:val="167"/>
+        </w:numPr>
+        <w:tabs>
+          <w:tab w:val="left" w:pos="2670"/>
+        </w:tabs>
+      </w:pPr>
+      <w:r>
+        <w:rPr>
+          <w:b/>
+          <w:bCs/>
+        </w:rPr>
+        <w:t>SMA200</w:t>
+      </w:r>
+      <w:r>
+        <w:t>: Simple Moving Average with a 200-day window (long-term trend).</w:t>
+      </w:r>
+    </w:p>
+    <w:p>
+      <w:pPr>
+        <w:numPr>
+          <w:ilvl w:val="0"/>
+          <w:numId w:val="167"/>
+        </w:numPr>
+        <w:tabs>
+          <w:tab w:val="left" w:pos="2670"/>
+        </w:tabs>
+      </w:pPr>
+      <w:r>
+        <w:rPr>
+          <w:b/>
+          <w:bCs/>
+        </w:rPr>
+        <w:lastRenderedPageBreak/>
+        <w:t>EMA100</w:t>
+      </w:r>
+      <w:r>
+        <w:t>: Exponential Moving Average with 100 days (medium-term, more sensitive than SMA).</w:t>
+      </w:r>
+    </w:p>
+    <w:p>
+      <w:pPr>
+        <w:pStyle w:val="ListParagraph"/>
+        <w:numPr>
+          <w:ilvl w:val="0"/>
+          <w:numId w:val="151"/>
+        </w:numPr>
+        <w:tabs>
+          <w:tab w:val="left" w:pos="2670"/>
+        </w:tabs>
+        <w:rPr>
+          <w:b/>
+          <w:bCs/>
+        </w:rPr>
+      </w:pPr>
+      <w:r>
+        <w:rPr>
+          <w:b/>
+          <w:bCs/>
+        </w:rPr>
+        <w:t>Plotting the Data</w:t>
+      </w:r>
+    </w:p>
+    <w:p>
+      <w:pPr>
+        <w:pStyle w:val="ListParagraph"/>
+        <w:tabs>
+          <w:tab w:val="left" w:pos="2670"/>
+        </w:tabs>
+        <w:ind w:firstLine="0"/>
+        <w:rPr>
+          <w:b/>
+          <w:bCs/>
+        </w:rPr>
+      </w:pPr>
+      <w:r>
+        <w:drawing>
+          <wp:inline distT="0" distB="0" distL="0" distR="0" wp14:anchorId="4C3A9010" wp14:editId="25565750">
+            <wp:extent cx="5943600" cy="3585210"/>
+            <wp:effectExtent l="0" t="0" r="0" b="0"/>
+            <wp:docPr id="1044026715" name="Picture 1" descr="A graph on a screen&#10;&#10;AI-generated content may be incorrect."/>
+            <wp:cNvGraphicFramePr>
+              <a:graphicFrameLocks xmlns:a="http://schemas.openxmlformats.org/drawingml/2006/main" noChangeAspect="1"/>
+            </wp:cNvGraphicFramePr>
+            <a:graphic xmlns:a="http://schemas.openxmlformats.org/drawingml/2006/main">
+              <a:graphicData uri="http://schemas.openxmlformats.org/drawingml/2006/picture">
+                <pic:pic xmlns:pic="http://schemas.openxmlformats.org/drawingml/2006/picture">
+                  <pic:nvPicPr>
+                    <pic:cNvPr id="1044026715" name="Picture 1" descr="A graph on a screen&#10;&#10;AI-generated content may be incorrect."/>
+                    <pic:cNvPicPr/>
+                  </pic:nvPicPr>
+                  <pic:blipFill>
+                    <a:blip r:embed="rId59"/>
+                    <a:stretch>
+                      <a:fillRect/>
+                    </a:stretch>
+                  </pic:blipFill>
+                  <pic:spPr>
+                    <a:xfrm>
+                      <a:off x="0" y="0"/>
+                      <a:ext cx="5943600" cy="3585210"/>
+                    </a:xfrm>
+                    <a:prstGeom prst="rect">
+                      <a:avLst/>
+                    </a:prstGeom>
+                  </pic:spPr>
+                </pic:pic>
+              </a:graphicData>
+            </a:graphic>
+          </wp:inline>
+        </w:drawing>
+      </w:r>
+    </w:p>
+    <w:p>
+      <w:pPr>
+        <w:pStyle w:val="code"/>
+      </w:pPr>
+      <w:r>
+        <w:t>spy.plot(figsize=(15,8), fontsize=12)</w:t>
+      </w:r>
+    </w:p>
+    <w:p>
+      <w:pPr>
+        <w:pStyle w:val="code"/>
+      </w:pPr>
+      <w:r>
+        <w:t>plt.legend(loc="upper left", fontsize=12)</w:t>
+      </w:r>
+    </w:p>
+    <w:p>
+      <w:pPr>
+        <w:pStyle w:val="code"/>
+      </w:pPr>
+      <w:r>
+        <w:t>plt.show()</w:t>
+      </w:r>
+    </w:p>
+    <w:p>
+      <w:pPr>
+        <w:numPr>
+          <w:ilvl w:val="0"/>
+          <w:numId w:val="168"/>
+        </w:numPr>
+        <w:tabs>
+          <w:tab w:val="left" w:pos="2670"/>
+        </w:tabs>
+      </w:pPr>
+      <w:r>
+        <w:t>spy.plot() → plots all columns in the DataFrame (SPY, SMA50, SMA200, EMA100) on one chart.</w:t>
+      </w:r>
+    </w:p>
+    <w:p>
+      <w:pPr>
+        <w:numPr>
+          <w:ilvl w:val="0"/>
+          <w:numId w:val="168"/>
+        </w:numPr>
+        <w:tabs>
+          <w:tab w:val="left" w:pos="2670"/>
+        </w:tabs>
+      </w:pPr>
+      <w:r>
+        <w:t>figsize=(15,8) → sets the chart size for better readability.</w:t>
+      </w:r>
+    </w:p>
+    <w:p>
+      <w:pPr>
+        <w:numPr>
+          <w:ilvl w:val="0"/>
+          <w:numId w:val="168"/>
+        </w:numPr>
+        <w:tabs>
+          <w:tab w:val="left" w:pos="2670"/>
+        </w:tabs>
+      </w:pPr>
+      <w:r>
+        <w:t>fontsize=12 → adjusts text size for axis labels.</w:t>
+      </w:r>
+    </w:p>
+    <w:p>
+      <w:pPr>
+        <w:numPr>
+          <w:ilvl w:val="0"/>
+          <w:numId w:val="168"/>
+        </w:numPr>
+        <w:tabs>
+          <w:tab w:val="left" w:pos="2670"/>
+        </w:tabs>
+      </w:pPr>
+      <w:r>
+        <w:t>plt.legend() → adds a legend so you can distinguish SPY, SMA50, SMA200, and EMA100.</w:t>
+      </w:r>
+    </w:p>
+    <w:p>
+      <w:pPr>
+        <w:numPr>
+          <w:ilvl w:val="0"/>
+          <w:numId w:val="168"/>
+        </w:numPr>
+        <w:tabs>
+          <w:tab w:val="left" w:pos="2670"/>
+        </w:tabs>
+      </w:pPr>
+      <w:r>
+        <w:t>plt.show() → displays the chart.</w:t>
+      </w:r>
+    </w:p>
+    <w:p>
+      <w:pPr>
+        <w:tabs>
+          <w:tab w:val="left" w:pos="2670"/>
+        </w:tabs>
+        <w:ind w:firstLine="0"/>
+      </w:pPr>
+      <w:r>
+        <w:pict w14:anchorId="3537F0C1">
+          <v:rect id="_x0000_i1135" style="width:0;height:1.5pt" o:hralign="center" o:hrstd="t" o:hr="t" fillcolor="#a0a0a0" stroked="f"/>
+        </w:pict>
+      </w:r>
+    </w:p>
+    <w:p>
+      <w:pPr>
+        <w:tabs>
+          <w:tab w:val="left" w:pos="2670"/>
+        </w:tabs>
+        <w:ind w:firstLine="0"/>
+        <w:rPr>
+          <w:b/>
+          <w:bCs/>
+        </w:rPr>
+      </w:pPr>
+      <w:r>
+        <w:rPr>
+          <w:rFonts w:ascii="Segoe UI Emoji" w:hAnsi="Segoe UI Emoji" w:cs="Segoe UI Emoji"/>
+          <w:b/>
+          <w:bCs/>
+        </w:rPr>
+        <w:lastRenderedPageBreak/>
+        <w:t>📊</w:t>
+      </w:r>
+      <w:r>
+        <w:rPr>
+          <w:b/>
+          <w:bCs/>
+        </w:rPr>
+        <w:t xml:space="preserve"> Insights from the Chart</w:t>
+      </w:r>
+    </w:p>
+    <w:p>
+      <w:pPr>
+        <w:numPr>
+          <w:ilvl w:val="0"/>
+          <w:numId w:val="169"/>
+        </w:numPr>
+        <w:tabs>
+          <w:tab w:val="left" w:pos="2670"/>
+        </w:tabs>
+      </w:pPr>
+      <w:r>
+        <w:rPr>
+          <w:b/>
+          <w:bCs/>
+        </w:rPr>
+        <w:t>SPY (Blue Line)</w:t>
+      </w:r>
+    </w:p>
+    <w:p>
+      <w:pPr>
+        <w:numPr>
+          <w:ilvl w:val="1"/>
+          <w:numId w:val="169"/>
+        </w:numPr>
+        <w:tabs>
+          <w:tab w:val="left" w:pos="2670"/>
+        </w:tabs>
+      </w:pPr>
+      <w:r>
+        <w:t xml:space="preserve">Represents the daily </w:t>
+      </w:r>
+      <w:r>
+        <w:rPr>
+          <w:b/>
+          <w:bCs/>
+        </w:rPr>
+        <w:t>closing prices</w:t>
+      </w:r>
+      <w:r>
+        <w:t xml:space="preserve"> of the SPY ETF.</w:t>
+      </w:r>
+    </w:p>
+    <w:p>
+      <w:pPr>
+        <w:numPr>
+          <w:ilvl w:val="1"/>
+          <w:numId w:val="169"/>
+        </w:numPr>
+        <w:tabs>
+          <w:tab w:val="left" w:pos="2670"/>
+        </w:tabs>
+      </w:pPr>
+      <w:r>
+        <w:t>Shows the actual volatility and raw market movements.</w:t>
+      </w:r>
+    </w:p>
+    <w:p>
+      <w:pPr>
+        <w:numPr>
+          <w:ilvl w:val="0"/>
+          <w:numId w:val="169"/>
+        </w:numPr>
+        <w:tabs>
+          <w:tab w:val="left" w:pos="2670"/>
+        </w:tabs>
+      </w:pPr>
+      <w:r>
+        <w:rPr>
+          <w:b/>
+          <w:bCs/>
+        </w:rPr>
+        <w:t>SMA50 (Short-Term Trend)</w:t>
+      </w:r>
+    </w:p>
+    <w:p>
+      <w:pPr>
+        <w:numPr>
+          <w:ilvl w:val="1"/>
+          <w:numId w:val="169"/>
+        </w:numPr>
+        <w:tabs>
+          <w:tab w:val="left" w:pos="2670"/>
+        </w:tabs>
+      </w:pPr>
+      <w:r>
+        <w:t>Reacts faster to recent price movements.</w:t>
+      </w:r>
+    </w:p>
+    <w:p>
+      <w:pPr>
+        <w:numPr>
+          <w:ilvl w:val="1"/>
+          <w:numId w:val="169"/>
+        </w:numPr>
+        <w:tabs>
+          <w:tab w:val="left" w:pos="2670"/>
+        </w:tabs>
+      </w:pPr>
+      <w:r>
+        <w:t xml:space="preserve">Useful for identifying </w:t>
+      </w:r>
+      <w:r>
+        <w:rPr>
+          <w:b/>
+          <w:bCs/>
+        </w:rPr>
+        <w:t>short-term momentum</w:t>
+      </w:r>
+      <w:r>
+        <w:t>.</w:t>
+      </w:r>
+    </w:p>
+    <w:p>
+      <w:pPr>
+        <w:numPr>
+          <w:ilvl w:val="1"/>
+          <w:numId w:val="169"/>
+        </w:numPr>
+        <w:tabs>
+          <w:tab w:val="left" w:pos="2670"/>
+        </w:tabs>
+      </w:pPr>
+      <w:r>
+        <w:t>Crossovers with SMA200 are often used as trading signals.</w:t>
+      </w:r>
+    </w:p>
+    <w:p>
+      <w:pPr>
+        <w:numPr>
+          <w:ilvl w:val="0"/>
+          <w:numId w:val="169"/>
+        </w:numPr>
+        <w:tabs>
+          <w:tab w:val="left" w:pos="2670"/>
+        </w:tabs>
+      </w:pPr>
+      <w:r>
+        <w:rPr>
+          <w:b/>
+          <w:bCs/>
+        </w:rPr>
+        <w:t>SMA200 (Long-Term Trend)</w:t>
+      </w:r>
+    </w:p>
+    <w:p>
+      <w:pPr>
+        <w:numPr>
+          <w:ilvl w:val="1"/>
+          <w:numId w:val="169"/>
+        </w:numPr>
+        <w:tabs>
+          <w:tab w:val="left" w:pos="2670"/>
+        </w:tabs>
+      </w:pPr>
+      <w:r>
+        <w:t xml:space="preserve">Very smooth line that captures the </w:t>
+      </w:r>
+      <w:r>
+        <w:rPr>
+          <w:b/>
+          <w:bCs/>
+        </w:rPr>
+        <w:t>long-term direction</w:t>
+      </w:r>
+      <w:r>
+        <w:t>.</w:t>
+      </w:r>
+    </w:p>
+    <w:p>
+      <w:pPr>
+        <w:numPr>
+          <w:ilvl w:val="1"/>
+          <w:numId w:val="169"/>
+        </w:numPr>
+        <w:tabs>
+          <w:tab w:val="left" w:pos="2670"/>
+        </w:tabs>
+      </w:pPr>
+      <w:r>
+        <w:t xml:space="preserve">Often used to filter long-term </w:t>
+      </w:r>
+      <w:r>
+        <w:rPr>
+          <w:b/>
+          <w:bCs/>
+        </w:rPr>
+        <w:t>bullish or bearish markets</w:t>
+      </w:r>
+      <w:r>
+        <w:t>.</w:t>
+      </w:r>
+    </w:p>
+    <w:p>
+      <w:pPr>
+        <w:numPr>
+          <w:ilvl w:val="1"/>
+          <w:numId w:val="169"/>
+        </w:numPr>
+        <w:tabs>
+          <w:tab w:val="left" w:pos="2670"/>
+        </w:tabs>
+      </w:pPr>
+      <w:r>
+        <w:t>Example: If SPY price &gt; SMA200, trend is bullish.</w:t>
+      </w:r>
+    </w:p>
+    <w:p>
+      <w:pPr>
+        <w:numPr>
+          <w:ilvl w:val="0"/>
+          <w:numId w:val="169"/>
+        </w:numPr>
+        <w:tabs>
+          <w:tab w:val="left" w:pos="2670"/>
+        </w:tabs>
+      </w:pPr>
+      <w:r>
+        <w:rPr>
+          <w:b/>
+          <w:bCs/>
+        </w:rPr>
+        <w:t>EMA100 (Medium-Term, Red Line)</w:t>
+      </w:r>
+    </w:p>
+    <w:p>
+      <w:pPr>
+        <w:numPr>
+          <w:ilvl w:val="1"/>
+          <w:numId w:val="169"/>
+        </w:numPr>
+        <w:tabs>
+          <w:tab w:val="left" w:pos="2670"/>
+        </w:tabs>
+      </w:pPr>
+      <w:r>
+        <w:t>More sensitive than SMA200 but less noisy than SMA50.</w:t>
+      </w:r>
+    </w:p>
+    <w:p>
+      <w:pPr>
+        <w:numPr>
+          <w:ilvl w:val="1"/>
+          <w:numId w:val="169"/>
+        </w:numPr>
+        <w:tabs>
+          <w:tab w:val="left" w:pos="2670"/>
+        </w:tabs>
+      </w:pPr>
+      <w:r>
+        <w:t xml:space="preserve">Responds quickly to market changes, which helps in </w:t>
+      </w:r>
+      <w:r>
+        <w:rPr>
+          <w:b/>
+          <w:bCs/>
+        </w:rPr>
+        <w:t>early detection of trend reversals</w:t>
+      </w:r>
+      <w:r>
+        <w:t>.</w:t>
+      </w:r>
+    </w:p>
+    <w:p>
+      <w:pPr>
+        <w:numPr>
+          <w:ilvl w:val="1"/>
+          <w:numId w:val="169"/>
+        </w:numPr>
+        <w:tabs>
+          <w:tab w:val="left" w:pos="2670"/>
+        </w:tabs>
+      </w:pPr>
+      <w:r>
+        <w:t>Can act as a balance between short-term and long-term indicators.</w:t>
+      </w:r>
+    </w:p>
+    <w:p>
+      <w:pPr>
+        <w:tabs>
+          <w:tab w:val="left" w:pos="2670"/>
+        </w:tabs>
+        <w:ind w:firstLine="0"/>
+      </w:pPr>
+      <w:r>
+        <w:pict w14:anchorId="3E1BE552">
+          <v:rect id="_x0000_i1136" style="width:0;height:1.5pt" o:hralign="center" o:hrstd="t" o:hr="t" fillcolor="#a0a0a0" stroked="f"/>
+        </w:pict>
+      </w:r>
+    </w:p>
+    <w:p>
+      <w:pPr>
+        <w:tabs>
+          <w:tab w:val="left" w:pos="2670"/>
+        </w:tabs>
+        <w:ind w:firstLine="0"/>
+        <w:rPr>
+          <w:b/>
+          <w:bCs/>
+        </w:rPr>
+      </w:pPr>
+      <w:r>
+        <w:rPr>
+          <w:rFonts w:ascii="Segoe UI Emoji" w:hAnsi="Segoe UI Emoji" w:cs="Segoe UI Emoji"/>
+          <w:b/>
+          <w:bCs/>
+        </w:rPr>
+        <w:t>✅</w:t>
+      </w:r>
+      <w:r>
+        <w:rPr>
+          <w:b/>
+          <w:bCs/>
+        </w:rPr>
+        <w:t xml:space="preserve"> Key Takeaways</w:t>
+      </w:r>
+    </w:p>
+    <w:p>
+      <w:pPr>
+        <w:numPr>
+          <w:ilvl w:val="0"/>
+          <w:numId w:val="170"/>
+        </w:numPr>
+        <w:tabs>
+          <w:tab w:val="left" w:pos="2670"/>
+        </w:tabs>
+      </w:pPr>
+      <w:r>
+        <w:rPr>
+          <w:b/>
+          <w:bCs/>
+        </w:rPr>
+        <w:t>SMA50 vs. SMA200 Crossovers</w:t>
+      </w:r>
+      <w:r>
+        <w:t xml:space="preserve"> → These are used for Golden Cross (bullish) and Death Cross (bearish) signals.</w:t>
+      </w:r>
+    </w:p>
+    <w:p>
+      <w:pPr>
+        <w:numPr>
+          <w:ilvl w:val="0"/>
+          <w:numId w:val="170"/>
+        </w:numPr>
+        <w:tabs>
+          <w:tab w:val="left" w:pos="2670"/>
+        </w:tabs>
+      </w:pPr>
+      <w:r>
+        <w:rPr>
+          <w:b/>
+          <w:bCs/>
+        </w:rPr>
+        <w:t>EMA100</w:t>
+      </w:r>
+      <w:r>
+        <w:t xml:space="preserve"> → Smoother than SMA50, reacts quicker than SMA200, making it a great </w:t>
+      </w:r>
+      <w:r>
+        <w:rPr>
+          <w:b/>
+          <w:bCs/>
+        </w:rPr>
+        <w:t>medium-term indicator</w:t>
+      </w:r>
+      <w:r>
+        <w:t>.</w:t>
+      </w:r>
+    </w:p>
+    <w:p>
+      <w:pPr>
+        <w:numPr>
+          <w:ilvl w:val="0"/>
+          <w:numId w:val="170"/>
+        </w:numPr>
+        <w:tabs>
+          <w:tab w:val="left" w:pos="2670"/>
+        </w:tabs>
+      </w:pPr>
+      <w:r>
+        <w:lastRenderedPageBreak/>
+        <w:t xml:space="preserve">Combining all three gives traders a </w:t>
+      </w:r>
+      <w:r>
+        <w:rPr>
+          <w:b/>
+          <w:bCs/>
+        </w:rPr>
+        <w:t>multi-timeframe view</w:t>
+      </w:r>
+      <w:r>
+        <w:t>:</w:t>
+      </w:r>
+    </w:p>
+    <w:p>
+      <w:pPr>
+        <w:numPr>
+          <w:ilvl w:val="1"/>
+          <w:numId w:val="170"/>
+        </w:numPr>
+        <w:tabs>
+          <w:tab w:val="left" w:pos="2670"/>
+        </w:tabs>
+      </w:pPr>
+      <w:r>
+        <w:t>Short-term momentum (SMA50).</w:t>
+      </w:r>
+    </w:p>
+    <w:p>
+      <w:pPr>
+        <w:numPr>
+          <w:ilvl w:val="1"/>
+          <w:numId w:val="170"/>
+        </w:numPr>
+        <w:tabs>
+          <w:tab w:val="left" w:pos="2670"/>
+        </w:tabs>
+      </w:pPr>
+      <w:r>
+        <w:t>Medium-term confirmation (EMA100).</w:t>
+      </w:r>
+    </w:p>
+    <w:p>
+      <w:pPr>
+        <w:numPr>
+          <w:ilvl w:val="1"/>
+          <w:numId w:val="170"/>
+        </w:numPr>
+        <w:tabs>
+          <w:tab w:val="left" w:pos="2670"/>
+        </w:tabs>
+      </w:pPr>
+      <w:r>
+        <w:t>Long-term direction (SMA200).</w:t>
+      </w:r>
+    </w:p>
+    <w:p>
+      <w:pPr>
+        <w:tabs>
+          <w:tab w:val="left" w:pos="2670"/>
+        </w:tabs>
+        <w:ind w:firstLine="0"/>
+      </w:pPr>
+    </w:p>
+    <w:p>
+      <w:pPr>
+        <w:tabs>
+          <w:tab w:val="left" w:pos="2670"/>
+        </w:tabs>
+        <w:ind w:firstLine="0"/>
+        <w:rPr>
+          <w:b/>
+          <w:bCs/>
+        </w:rPr>
+      </w:pPr>
+      <w:r>
+        <w:rPr>
+          <w:rFonts w:ascii="Segoe UI Emoji" w:hAnsi="Segoe UI Emoji" w:cs="Segoe UI Emoji"/>
+          <w:b/>
+          <w:bCs/>
+        </w:rPr>
+        <w:t>📌</w:t>
+      </w:r>
+      <w:r>
+        <w:rPr>
+          <w:b/>
+          <w:bCs/>
+        </w:rPr>
+        <w:t xml:space="preserve"> Code Explanation</w:t>
+      </w:r>
+    </w:p>
+    <w:p>
+      <w:pPr>
+        <w:tabs>
+          <w:tab w:val="left" w:pos="2670"/>
+        </w:tabs>
+        <w:ind w:firstLine="0"/>
+        <w:rPr>
+          <w:b/>
+          <w:bCs/>
+        </w:rPr>
+      </w:pPr>
+      <w:r>
+        <w:drawing>
+          <wp:inline distT="0" distB="0" distL="0" distR="0" wp14:anchorId="3231E6D0" wp14:editId="19834770">
+            <wp:extent cx="5943600" cy="3648075"/>
+            <wp:effectExtent l="0" t="0" r="0" b="9525"/>
+            <wp:docPr id="137140194" name="Picture 1"/>
+            <wp:cNvGraphicFramePr>
+              <a:graphicFrameLocks xmlns:a="http://schemas.openxmlformats.org/drawingml/2006/main" noChangeAspect="1"/>
+            </wp:cNvGraphicFramePr>
+            <a:graphic xmlns:a="http://schemas.openxmlformats.org/drawingml/2006/main">
+              <a:graphicData uri="http://schemas.openxmlformats.org/drawingml/2006/picture">
+                <pic:pic xmlns:pic="http://schemas.openxmlformats.org/drawingml/2006/picture">
+                  <pic:nvPicPr>
+                    <pic:cNvPr id="137140194" name=""/>
+                    <pic:cNvPicPr/>
+                  </pic:nvPicPr>
+                  <pic:blipFill>
+                    <a:blip r:embed="rId60"/>
+                    <a:stretch>
+                      <a:fillRect/>
+                    </a:stretch>
+                  </pic:blipFill>
+                  <pic:spPr>
+                    <a:xfrm>
+                      <a:off x="0" y="0"/>
+                      <a:ext cx="5943600" cy="3648075"/>
+                    </a:xfrm>
+                    <a:prstGeom prst="rect">
+                      <a:avLst/>
+                    </a:prstGeom>
+                  </pic:spPr>
+                </pic:pic>
+              </a:graphicData>
+            </a:graphic>
+          </wp:inline>
+        </w:drawing>
+      </w:r>
+    </w:p>
+    <w:p>
+      <w:pPr>
+        <w:tabs>
+          <w:tab w:val="left" w:pos="2670"/>
+        </w:tabs>
+        <w:ind w:firstLine="0"/>
+        <w:rPr>
+          <w:b/>
+          <w:bCs/>
+        </w:rPr>
+      </w:pPr>
+      <w:r>
+        <w:rPr>
+          <w:b/>
+          <w:bCs/>
+        </w:rPr>
+        <w:t>1. Creating a Complete Date Range</w:t>
+      </w:r>
+    </w:p>
+    <w:p>
+      <w:pPr>
+        <w:tabs>
+          <w:tab w:val="left" w:pos="2670"/>
+        </w:tabs>
+        <w:ind w:firstLine="0"/>
+      </w:pPr>
+      <w:r>
+        <w:t>all_days = pd.date_range(start="2010-01-01", end="2020-01-01", freq="D")</w:t>
+      </w:r>
+    </w:p>
+    <w:p>
+      <w:pPr>
+        <w:numPr>
+          <w:ilvl w:val="0"/>
+          <w:numId w:val="171"/>
+        </w:numPr>
+        <w:tabs>
+          <w:tab w:val="left" w:pos="2670"/>
+        </w:tabs>
+      </w:pPr>
+      <w:r>
+        <w:t xml:space="preserve">pd.date_range() generates a </w:t>
+      </w:r>
+      <w:r>
+        <w:rPr>
+          <w:b/>
+          <w:bCs/>
+        </w:rPr>
+        <w:t>continuous sequence of dates</w:t>
+      </w:r>
+      <w:r>
+        <w:t xml:space="preserve"> from </w:t>
+      </w:r>
+      <w:r>
+        <w:rPr>
+          <w:b/>
+          <w:bCs/>
+        </w:rPr>
+        <w:t>2010-01-01 to 2020-01-01</w:t>
+      </w:r>
+      <w:r>
+        <w:t>.</w:t>
+      </w:r>
+    </w:p>
+    <w:p>
+      <w:pPr>
+        <w:numPr>
+          <w:ilvl w:val="0"/>
+          <w:numId w:val="171"/>
+        </w:numPr>
+        <w:tabs>
+          <w:tab w:val="left" w:pos="2670"/>
+        </w:tabs>
+      </w:pPr>
+      <w:r>
+        <w:t xml:space="preserve">freq="D" specifies </w:t>
+      </w:r>
+      <w:r>
+        <w:rPr>
+          <w:b/>
+          <w:bCs/>
+        </w:rPr>
+        <w:t>daily frequency</w:t>
+      </w:r>
+      <w:r>
+        <w:t>, so it includes weekends and holidays.</w:t>
+      </w:r>
+    </w:p>
+    <w:p>
+      <w:pPr>
+        <w:numPr>
+          <w:ilvl w:val="0"/>
+          <w:numId w:val="171"/>
+        </w:numPr>
+        <w:tabs>
+          <w:tab w:val="left" w:pos="2670"/>
+        </w:tabs>
+      </w:pPr>
+      <w:r>
+        <w:t xml:space="preserve">The result is a DatetimeIndex with </w:t>
+      </w:r>
+      <w:r>
+        <w:rPr>
+          <w:b/>
+          <w:bCs/>
+        </w:rPr>
+        <w:t>3653 days</w:t>
+      </w:r>
+      <w:r>
+        <w:t>.</w:t>
+      </w:r>
+    </w:p>
+    <w:p>
+      <w:pPr>
+        <w:tabs>
+          <w:tab w:val="left" w:pos="2670"/>
+        </w:tabs>
+        <w:ind w:firstLine="0"/>
+      </w:pPr>
+      <w:r>
+        <w:rPr>
+          <w:rFonts w:ascii="Segoe UI Emoji" w:hAnsi="Segoe UI Emoji" w:cs="Segoe UI Emoji"/>
+        </w:rPr>
+        <w:lastRenderedPageBreak/>
+        <w:t>👉</w:t>
+      </w:r>
+      <w:r>
+        <w:t xml:space="preserve"> This ensures you have a </w:t>
+      </w:r>
+      <w:r>
+        <w:rPr>
+          <w:b/>
+          <w:bCs/>
+        </w:rPr>
+        <w:t>complete timeline</w:t>
+      </w:r>
+      <w:r>
+        <w:t xml:space="preserve"> (every single day), not just trading days.</w:t>
+      </w:r>
+    </w:p>
+    <w:p>
+      <w:pPr>
+        <w:tabs>
+          <w:tab w:val="left" w:pos="2670"/>
+        </w:tabs>
+        <w:ind w:firstLine="0"/>
+      </w:pPr>
+      <w:r>
+        <w:pict w14:anchorId="59E14DBF">
+          <v:rect id="_x0000_i1143" style="width:0;height:1.5pt" o:hralign="center" o:hrstd="t" o:hr="t" fillcolor="#a0a0a0" stroked="f"/>
+        </w:pict>
+      </w:r>
+    </w:p>
+    <w:p>
+      <w:pPr>
+        <w:tabs>
+          <w:tab w:val="left" w:pos="2670"/>
+        </w:tabs>
+        <w:ind w:firstLine="0"/>
+        <w:rPr>
+          <w:b/>
+          <w:bCs/>
+        </w:rPr>
+      </w:pPr>
+      <w:r>
+        <w:rPr>
+          <w:b/>
+          <w:bCs/>
+        </w:rPr>
+        <w:t>2. Reindexing the Stock Data</w:t>
+      </w:r>
+    </w:p>
+    <w:p>
+      <w:pPr>
+        <w:tabs>
+          <w:tab w:val="left" w:pos="2670"/>
+        </w:tabs>
+        <w:ind w:firstLine="0"/>
+      </w:pPr>
+      <w:r>
+        <w:t>spy = spy.reindex(all_days)</w:t>
+      </w:r>
+    </w:p>
+    <w:p>
+      <w:pPr>
+        <w:numPr>
+          <w:ilvl w:val="0"/>
+          <w:numId w:val="172"/>
+        </w:numPr>
+        <w:tabs>
+          <w:tab w:val="left" w:pos="2670"/>
+        </w:tabs>
+      </w:pPr>
+      <w:r>
+        <w:t xml:space="preserve">Your original spy DataFrame contains only </w:t>
+      </w:r>
+      <w:r>
+        <w:rPr>
+          <w:b/>
+          <w:bCs/>
+        </w:rPr>
+        <w:t>trading days</w:t>
+      </w:r>
+      <w:r>
+        <w:t xml:space="preserve"> (business days when markets were open).</w:t>
+      </w:r>
+    </w:p>
+    <w:p>
+      <w:pPr>
+        <w:numPr>
+          <w:ilvl w:val="0"/>
+          <w:numId w:val="172"/>
+        </w:numPr>
+        <w:tabs>
+          <w:tab w:val="left" w:pos="2670"/>
+        </w:tabs>
+      </w:pPr>
+      <w:r>
+        <w:t>By reindexing with all_days, pandas aligns the original data with the full daily range.</w:t>
+      </w:r>
+    </w:p>
+    <w:p>
+      <w:pPr>
+        <w:numPr>
+          <w:ilvl w:val="0"/>
+          <w:numId w:val="172"/>
+        </w:numPr>
+        <w:tabs>
+          <w:tab w:val="left" w:pos="2670"/>
+        </w:tabs>
+      </w:pPr>
+      <w:r>
+        <w:rPr>
+          <w:b/>
+          <w:bCs/>
+        </w:rPr>
+        <w:t>Missing days (non-trading days)</w:t>
+      </w:r>
+      <w:r>
+        <w:t xml:space="preserve"> are filled with </w:t>
+      </w:r>
+      <w:r>
+        <w:rPr>
+          <w:b/>
+          <w:bCs/>
+        </w:rPr>
+        <w:t>NaN</w:t>
+      </w:r>
+      <w:r>
+        <w:t xml:space="preserve"> values.</w:t>
+      </w:r>
+    </w:p>
+    <w:p>
+      <w:pPr>
+        <w:numPr>
+          <w:ilvl w:val="0"/>
+          <w:numId w:val="172"/>
+        </w:numPr>
+        <w:tabs>
+          <w:tab w:val="left" w:pos="2670"/>
+        </w:tabs>
+      </w:pPr>
+      <w:r>
+        <w:t>This way, weekends and holidays now appear in the dataset as NaN.</w:t>
       </w:r>
     </w:p>
     <w:p>
@@ -35042,6 +36337,123 @@
     </w:lvl>
   </w:abstractNum>
   <w:abstractNum w:abstractNumId="38" w15:restartNumberingAfterBreak="0">
+    <w:nsid w:val="25F449AA"/>
+    <w:multiLevelType w:val="multilevel"/>
+    <w:tmpl w:val="A2B4417A"/>
+    <w:lvl w:ilvl="0">
+      <w:start w:val="1"/>
+      <w:numFmt w:val="decimal"/>
+      <w:lvlText w:val="%1."/>
+      <w:lvlJc w:val="left"/>
+      <w:pPr>
+        <w:tabs>
+          <w:tab w:val="num" w:pos="720"/>
+        </w:tabs>
+        <w:ind w:left="720" w:hanging="360"/>
+      </w:pPr>
+    </w:lvl>
+    <w:lvl w:ilvl="1">
+      <w:start w:val="1"/>
+      <w:numFmt w:val="bullet"/>
+      <w:lvlText w:val="o"/>
+      <w:lvlJc w:val="left"/>
+      <w:pPr>
+        <w:tabs>
+          <w:tab w:val="num" w:pos="1440"/>
+        </w:tabs>
+        <w:ind w:left="1440" w:hanging="360"/>
+      </w:pPr>
+      <w:rPr>
+        <w:rFonts w:ascii="Courier New" w:hAnsi="Courier New" w:hint="default"/>
+        <w:sz w:val="20"/>
+      </w:rPr>
+    </w:lvl>
+    <w:lvl w:ilvl="2" w:tentative="1">
+      <w:start w:val="1"/>
+      <w:numFmt w:val="decimal"/>
+      <w:lvlText w:val="%3."/>
+      <w:lvlJc w:val="left"/>
+      <w:pPr>
+        <w:tabs>
+          <w:tab w:val="num" w:pos="2160"/>
+        </w:tabs>
+        <w:ind w:left="2160" w:hanging="360"/>
+      </w:pPr>
+    </w:lvl>
+    <w:lvl w:ilvl="3" w:tentative="1">
+      <w:start w:val="1"/>
+      <w:numFmt w:val="decimal"/>
+      <w:lvlText w:val="%4."/>
+      <w:lvlJc w:val="left"/>
+      <w:pPr>
+        <w:tabs>
+          <w:tab w:val="num" w:pos="2880"/>
+        </w:tabs>
+        <w:ind w:left="2880" w:hanging="360"/>
+      </w:pPr>
+    </w:lvl>
+    <w:lvl w:ilvl="4" w:tentative="1">
+      <w:start w:val="1"/>
+      <w:numFmt w:val="decimal"/>
+      <w:lvlText w:val="%5."/>
+      <w:lvlJc w:val="left"/>
+      <w:pPr>
+        <w:tabs>
+          <w:tab w:val="num" w:pos="3600"/>
+        </w:tabs>
+        <w:ind w:left="3600" w:hanging="360"/>
+      </w:pPr>
+    </w:lvl>
+    <w:lvl w:ilvl="5" w:tentative="1">
+      <w:start w:val="1"/>
+      <w:numFmt w:val="decimal"/>
+      <w:lvlText w:val="%6."/>
+      <w:lvlJc w:val="left"/>
+      <w:pPr>
+        <w:tabs>
+          <w:tab w:val="num" w:pos="4320"/>
+        </w:tabs>
+        <w:ind w:left="4320" w:hanging="360"/>
+      </w:pPr>
+    </w:lvl>
+    <w:lvl w:ilvl="6" w:tentative="1">
+      <w:start w:val="1"/>
+      <w:numFmt w:val="decimal"/>
+      <w:lvlText w:val="%7."/>
+      <w:lvlJc w:val="left"/>
+      <w:pPr>
+        <w:tabs>
+          <w:tab w:val="num" w:pos="5040"/>
+        </w:tabs>
+        <w:ind w:left="5040" w:hanging="360"/>
+      </w:pPr>
+    </w:lvl>
+    <w:lvl w:ilvl="7" w:tentative="1">
+      <w:start w:val="1"/>
+      <w:numFmt w:val="decimal"/>
+      <w:lvlText w:val="%8."/>
+      <w:lvlJc w:val="left"/>
+      <w:pPr>
+        <w:tabs>
+          <w:tab w:val="num" w:pos="5760"/>
+        </w:tabs>
+        <w:ind w:left="5760" w:hanging="360"/>
+      </w:pPr>
+    </w:lvl>
+    <w:lvl w:ilvl="8" w:tentative="1">
+      <w:start w:val="1"/>
+      <w:numFmt w:val="decimal"/>
+      <w:lvlText w:val="%9."/>
+      <w:lvlJc w:val="left"/>
+      <w:pPr>
+        <w:tabs>
+          <w:tab w:val="num" w:pos="6480"/>
+        </w:tabs>
+        <w:ind w:left="6480" w:hanging="360"/>
+      </w:pPr>
+    </w:lvl>
+  </w:abstractNum>
+  <w:abstractNum w:abstractNumId="39" w15:restartNumberingAfterBreak="0">
     <w:nsid w:val="26007A01"/>
     <w:multiLevelType w:val="multilevel"/>
     <w:tmpl w:val="A0CAD8D2"/>
@@ -35190,7 +36602,7 @@
       </w:rPr>
     </w:lvl>
   </w:abstractNum>
-  <w:abstractNum w:abstractNumId="39" w15:restartNumberingAfterBreak="0">
+  <w:abstractNum w:abstractNumId="40" w15:restartNumberingAfterBreak="0">
     <w:nsid w:val="262A5CD1"/>
     <w:multiLevelType w:val="multilevel"/>
     <w:tmpl w:val="0030AD14"/>
@@ -35339,7 +36751,7 @@
       </w:rPr>
     </w:lvl>
   </w:abstractNum>
-  <w:abstractNum w:abstractNumId="40" w15:restartNumberingAfterBreak="0">
+  <w:abstractNum w:abstractNumId="41" w15:restartNumberingAfterBreak="0">
     <w:nsid w:val="27C850EE"/>
     <w:multiLevelType w:val="multilevel"/>
     <w:tmpl w:val="DEACF4A6"/>
@@ -35488,7 +36900,7 @@
       </w:rPr>
     </w:lvl>
   </w:abstractNum>
-  <w:abstractNum w:abstractNumId="41" w15:restartNumberingAfterBreak="0">
+  <w:abstractNum w:abstractNumId="42" w15:restartNumberingAfterBreak="0">
     <w:nsid w:val="292B7E68"/>
     <w:multiLevelType w:val="multilevel"/>
     <w:tmpl w:val="7E16B122"/>
@@ -35637,7 +37049,7 @@
       </w:rPr>
     </w:lvl>
   </w:abstractNum>
-  <w:abstractNum w:abstractNumId="42" w15:restartNumberingAfterBreak="0">
+  <w:abstractNum w:abstractNumId="43" w15:restartNumberingAfterBreak="0">
     <w:nsid w:val="293C1D4A"/>
     <w:multiLevelType w:val="multilevel"/>
     <w:tmpl w:val="AE30152E"/>
@@ -35786,7 +37198,7 @@
       </w:rPr>
     </w:lvl>
   </w:abstractNum>
-  <w:abstractNum w:abstractNumId="43" w15:restartNumberingAfterBreak="0">
+  <w:abstractNum w:abstractNumId="44" w15:restartNumberingAfterBreak="0">
     <w:nsid w:val="297B1D2B"/>
     <w:multiLevelType w:val="multilevel"/>
     <w:tmpl w:val="DEACF4A6"/>
@@ -35935,7 +37347,7 @@
       </w:rPr>
     </w:lvl>
   </w:abstractNum>
-  <w:abstractNum w:abstractNumId="44" w15:restartNumberingAfterBreak="0">
+  <w:abstractNum w:abstractNumId="45" w15:restartNumberingAfterBreak="0">
     <w:nsid w:val="299E3D9A"/>
     <w:multiLevelType w:val="multilevel"/>
     <w:tmpl w:val="1C9E39F8"/>
@@ -36084,7 +37496,7 @@
       </w:rPr>
     </w:lvl>
   </w:abstractNum>
-  <w:abstractNum w:abstractNumId="45" w15:restartNumberingAfterBreak="0">
+  <w:abstractNum w:abstractNumId="46" w15:restartNumberingAfterBreak="0">
     <w:nsid w:val="2A2C0AAD"/>
     <w:multiLevelType w:val="multilevel"/>
     <w:tmpl w:val="A206403C"/>
@@ -36233,7 +37645,7 @@
       </w:rPr>
     </w:lvl>
   </w:abstractNum>
-  <w:abstractNum w:abstractNumId="46" w15:restartNumberingAfterBreak="0">
+  <w:abstractNum w:abstractNumId="47" w15:restartNumberingAfterBreak="0">
     <w:nsid w:val="2CB43EE0"/>
     <w:multiLevelType w:val="multilevel"/>
     <w:tmpl w:val="ABD6C58E"/>
@@ -36382,7 +37794,7 @@
       </w:rPr>
     </w:lvl>
   </w:abstractNum>
-  <w:abstractNum w:abstractNumId="47" w15:restartNumberingAfterBreak="0">
+  <w:abstractNum w:abstractNumId="48" w15:restartNumberingAfterBreak="0">
     <w:nsid w:val="2D037575"/>
     <w:multiLevelType w:val="multilevel"/>
     <w:tmpl w:val="B9CC6152"/>
@@ -36531,7 +37943,7 @@
       </w:rPr>
     </w:lvl>
   </w:abstractNum>
-  <w:abstractNum w:abstractNumId="48" w15:restartNumberingAfterBreak="0">
+  <w:abstractNum w:abstractNumId="49" w15:restartNumberingAfterBreak="0">
     <w:nsid w:val="2DFF50FE"/>
     <w:multiLevelType w:val="multilevel"/>
     <w:tmpl w:val="AB46487C"/>
@@ -36680,7 +38092,7 @@
       </w:rPr>
     </w:lvl>
   </w:abstractNum>
-  <w:abstractNum w:abstractNumId="49" w15:restartNumberingAfterBreak="0">
+  <w:abstractNum w:abstractNumId="50" w15:restartNumberingAfterBreak="0">
     <w:nsid w:val="2F7852F2"/>
     <w:multiLevelType w:val="multilevel"/>
     <w:tmpl w:val="A5542A08"/>
@@ -36829,7 +38241,7 @@
       </w:rPr>
     </w:lvl>
   </w:abstractNum>
-  <w:abstractNum w:abstractNumId="50" w15:restartNumberingAfterBreak="0">
+  <w:abstractNum w:abstractNumId="51" w15:restartNumberingAfterBreak="0">
     <w:nsid w:val="2F981726"/>
     <w:multiLevelType w:val="multilevel"/>
     <w:tmpl w:val="A844E6BA"/>
@@ -36978,7 +38390,7 @@
       </w:rPr>
     </w:lvl>
   </w:abstractNum>
-  <w:abstractNum w:abstractNumId="51" w15:restartNumberingAfterBreak="0">
+  <w:abstractNum w:abstractNumId="52" w15:restartNumberingAfterBreak="0">
     <w:nsid w:val="30031988"/>
     <w:multiLevelType w:val="multilevel"/>
     <w:tmpl w:val="69D456D8"/>
@@ -37127,7 +38539,7 @@
       </w:rPr>
     </w:lvl>
   </w:abstractNum>
-  <w:abstractNum w:abstractNumId="52" w15:restartNumberingAfterBreak="0">
+  <w:abstractNum w:abstractNumId="53" w15:restartNumberingAfterBreak="0">
     <w:nsid w:val="30806B48"/>
     <w:multiLevelType w:val="multilevel"/>
     <w:tmpl w:val="DEACF4A6"/>
@@ -37276,7 +38688,7 @@
       </w:rPr>
     </w:lvl>
   </w:abstractNum>
-  <w:abstractNum w:abstractNumId="53" w15:restartNumberingAfterBreak="0">
+  <w:abstractNum w:abstractNumId="54" w15:restartNumberingAfterBreak="0">
     <w:nsid w:val="30E86102"/>
     <w:multiLevelType w:val="multilevel"/>
     <w:tmpl w:val="97DC36DC"/>
@@ -37425,7 +38837,7 @@
       </w:rPr>
     </w:lvl>
   </w:abstractNum>
-  <w:abstractNum w:abstractNumId="54" w15:restartNumberingAfterBreak="0">
+  <w:abstractNum w:abstractNumId="55" w15:restartNumberingAfterBreak="0">
     <w:nsid w:val="31BE793F"/>
     <w:multiLevelType w:val="multilevel"/>
     <w:tmpl w:val="811A4878"/>
@@ -37574,7 +38986,7 @@
       </w:rPr>
     </w:lvl>
   </w:abstractNum>
-  <w:abstractNum w:abstractNumId="55" w15:restartNumberingAfterBreak="0">
+  <w:abstractNum w:abstractNumId="56" w15:restartNumberingAfterBreak="0">
     <w:nsid w:val="320D68E2"/>
     <w:multiLevelType w:val="multilevel"/>
     <w:tmpl w:val="DEACF4A6"/>
@@ -37723,7 +39135,7 @@
       </w:rPr>
     </w:lvl>
   </w:abstractNum>
-  <w:abstractNum w:abstractNumId="56" w15:restartNumberingAfterBreak="0">
+  <w:abstractNum w:abstractNumId="57" w15:restartNumberingAfterBreak="0">
     <w:nsid w:val="32D025FC"/>
     <w:multiLevelType w:val="multilevel"/>
     <w:tmpl w:val="E0F6F884"/>
@@ -37872,7 +39284,7 @@
       </w:rPr>
     </w:lvl>
   </w:abstractNum>
-  <w:abstractNum w:abstractNumId="57" w15:restartNumberingAfterBreak="0">
+  <w:abstractNum w:abstractNumId="58" w15:restartNumberingAfterBreak="0">
     <w:nsid w:val="34460E44"/>
     <w:multiLevelType w:val="multilevel"/>
     <w:tmpl w:val="E056F696"/>
@@ -38021,7 +39433,7 @@
       </w:rPr>
     </w:lvl>
   </w:abstractNum>
-  <w:abstractNum w:abstractNumId="58" w15:restartNumberingAfterBreak="0">
+  <w:abstractNum w:abstractNumId="59" w15:restartNumberingAfterBreak="0">
     <w:nsid w:val="34EC0AD8"/>
     <w:multiLevelType w:val="multilevel"/>
     <w:tmpl w:val="5240D3F2"/>
@@ -38170,7 +39582,7 @@
       </w:rPr>
     </w:lvl>
   </w:abstractNum>
-  <w:abstractNum w:abstractNumId="59" w15:restartNumberingAfterBreak="0">
+  <w:abstractNum w:abstractNumId="60" w15:restartNumberingAfterBreak="0">
     <w:nsid w:val="351F35B9"/>
     <w:multiLevelType w:val="multilevel"/>
     <w:tmpl w:val="614279C4"/>
@@ -38283,7 +39695,7 @@
       </w:pPr>
     </w:lvl>
   </w:abstractNum>
-  <w:abstractNum w:abstractNumId="60" w15:restartNumberingAfterBreak="0">
+  <w:abstractNum w:abstractNumId="61" w15:restartNumberingAfterBreak="0">
     <w:nsid w:val="353D32ED"/>
     <w:multiLevelType w:val="multilevel"/>
     <w:tmpl w:val="DEACF4A6"/>
@@ -38432,7 +39844,7 @@
       </w:rPr>
     </w:lvl>
   </w:abstractNum>
-  <w:abstractNum w:abstractNumId="61" w15:restartNumberingAfterBreak="0">
+  <w:abstractNum w:abstractNumId="62" w15:restartNumberingAfterBreak="0">
     <w:nsid w:val="358567C2"/>
     <w:multiLevelType w:val="multilevel"/>
     <w:tmpl w:val="A3986F94"/>
@@ -38581,7 +39993,7 @@
       </w:rPr>
     </w:lvl>
   </w:abstractNum>
-  <w:abstractNum w:abstractNumId="62" w15:restartNumberingAfterBreak="0">
+  <w:abstractNum w:abstractNumId="63" w15:restartNumberingAfterBreak="0">
     <w:nsid w:val="359011B4"/>
     <w:multiLevelType w:val="multilevel"/>
     <w:tmpl w:val="A1DCF1AC"/>
@@ -38730,7 +40142,7 @@
       </w:rPr>
     </w:lvl>
   </w:abstractNum>
-  <w:abstractNum w:abstractNumId="63" w15:restartNumberingAfterBreak="0">
+  <w:abstractNum w:abstractNumId="64" w15:restartNumberingAfterBreak="0">
     <w:nsid w:val="35CB71E9"/>
     <w:multiLevelType w:val="multilevel"/>
     <w:tmpl w:val="7312EBD8"/>
@@ -38879,7 +40291,7 @@
       </w:rPr>
     </w:lvl>
   </w:abstractNum>
-  <w:abstractNum w:abstractNumId="64" w15:restartNumberingAfterBreak="0">
+  <w:abstractNum w:abstractNumId="65" w15:restartNumberingAfterBreak="0">
     <w:nsid w:val="36CF5EBA"/>
     <w:multiLevelType w:val="multilevel"/>
     <w:tmpl w:val="B55E5FC0"/>
@@ -39028,7 +40440,7 @@
       </w:rPr>
     </w:lvl>
   </w:abstractNum>
-  <w:abstractNum w:abstractNumId="65" w15:restartNumberingAfterBreak="0">
+  <w:abstractNum w:abstractNumId="66" w15:restartNumberingAfterBreak="0">
     <w:nsid w:val="375D3367"/>
     <w:multiLevelType w:val="multilevel"/>
     <w:tmpl w:val="573AAE5E"/>
@@ -39177,7 +40589,156 @@
       </w:rPr>
     </w:lvl>
   </w:abstractNum>
-  <w:abstractNum w:abstractNumId="66" w15:restartNumberingAfterBreak="0">
+  <w:abstractNum w:abstractNumId="67" w15:restartNumberingAfterBreak="0">
+    <w:nsid w:val="378945EB"/>
+    <w:multiLevelType w:val="multilevel"/>
+    <w:tmpl w:val="0442DBE4"/>
+    <w:lvl w:ilvl="0">
+      <w:start w:val="1"/>
+      <w:numFmt w:val="bullet"/>
+      <w:lvlText w:val=""/>
+      <w:lvlJc w:val="left"/>
+      <w:pPr>
+        <w:tabs>
+          <w:tab w:val="num" w:pos="720"/>
+        </w:tabs>
+        <w:ind w:left="720" w:hanging="360"/>
+      </w:pPr>
+      <w:rPr>
+        <w:rFonts w:ascii="Symbol" w:hAnsi="Symbol" w:hint="default"/>
+        <w:sz w:val="20"/>
+      </w:rPr>
+    </w:lvl>
+    <w:lvl w:ilvl="1" w:tentative="1">
+      <w:start w:val="1"/>
+      <w:numFmt w:val="bullet"/>
+      <w:lvlText w:val="o"/>
+      <w:lvlJc w:val="left"/>
+      <w:pPr>
+        <w:tabs>
+          <w:tab w:val="num" w:pos="1440"/>
+        </w:tabs>
+        <w:ind w:left="1440" w:hanging="360"/>
+      </w:pPr>
+      <w:rPr>
+        <w:rFonts w:ascii="Courier New" w:hAnsi="Courier New" w:hint="default"/>
+        <w:sz w:val="20"/>
+      </w:rPr>
+    </w:lvl>
+    <w:lvl w:ilvl="2" w:tentative="1">
+      <w:start w:val="1"/>
+      <w:numFmt w:val="bullet"/>
+      <w:lvlText w:val=""/>
+      <w:lvlJc w:val="left"/>
+      <w:pPr>
+        <w:tabs>
+          <w:tab w:val="num" w:pos="2160"/>
+        </w:tabs>
+        <w:ind w:left="2160" w:hanging="360"/>
+      </w:pPr>
+      <w:rPr>
+        <w:rFonts w:ascii="Wingdings" w:hAnsi="Wingdings" w:hint="default"/>
+        <w:sz w:val="20"/>
+      </w:rPr>
+    </w:lvl>
+    <w:lvl w:ilvl="3" w:tentative="1">
+      <w:start w:val="1"/>
+      <w:numFmt w:val="bullet"/>
+      <w:lvlText w:val=""/>
+      <w:lvlJc w:val="left"/>
+      <w:pPr>
+        <w:tabs>
+          <w:tab w:val="num" w:pos="2880"/>
+        </w:tabs>
+        <w:ind w:left="2880" w:hanging="360"/>
+      </w:pPr>
+      <w:rPr>
+        <w:rFonts w:ascii="Wingdings" w:hAnsi="Wingdings" w:hint="default"/>
+        <w:sz w:val="20"/>
+      </w:rPr>
+    </w:lvl>
+    <w:lvl w:ilvl="4" w:tentative="1">
+      <w:start w:val="1"/>
+      <w:numFmt w:val="bullet"/>
+      <w:lvlText w:val=""/>
+      <w:lvlJc w:val="left"/>
+      <w:pPr>
+        <w:tabs>
+          <w:tab w:val="num" w:pos="3600"/>
+        </w:tabs>
+        <w:ind w:left="3600" w:hanging="360"/>
+      </w:pPr>
+      <w:rPr>
+        <w:rFonts w:ascii="Wingdings" w:hAnsi="Wingdings" w:hint="default"/>
+        <w:sz w:val="20"/>
+      </w:rPr>
+    </w:lvl>
+    <w:lvl w:ilvl="5" w:tentative="1">
+      <w:start w:val="1"/>
+      <w:numFmt w:val="bullet"/>
+      <w:lvlText w:val=""/>
+      <w:lvlJc w:val="left"/>
+      <w:pPr>
+        <w:tabs>
+          <w:tab w:val="num" w:pos="4320"/>
+        </w:tabs>
+        <w:ind w:left="4320" w:hanging="360"/>
+      </w:pPr>
+      <w:rPr>
+        <w:rFonts w:ascii="Wingdings" w:hAnsi="Wingdings" w:hint="default"/>
+        <w:sz w:val="20"/>
+      </w:rPr>
+    </w:lvl>
+    <w:lvl w:ilvl="6" w:tentative="1">
+      <w:start w:val="1"/>
+      <w:numFmt w:val="bullet"/>
+      <w:lvlText w:val=""/>
+      <w:lvlJc w:val="left"/>
+      <w:pPr>
+        <w:tabs>
+          <w:tab w:val="num" w:pos="5040"/>
+        </w:tabs>
+        <w:ind w:left="5040" w:hanging="360"/>
+      </w:pPr>
+      <w:rPr>
+        <w:rFonts w:ascii="Wingdings" w:hAnsi="Wingdings" w:hint="default"/>
+        <w:sz w:val="20"/>
+      </w:rPr>
+    </w:lvl>
+    <w:lvl w:ilvl="7" w:tentative="1">
+      <w:start w:val="1"/>
+      <w:numFmt w:val="bullet"/>
+      <w:lvlText w:val=""/>
+      <w:lvlJc w:val="left"/>
+      <w:pPr>
+        <w:tabs>
+          <w:tab w:val="num" w:pos="5760"/>
+        </w:tabs>
+        <w:ind w:left="5760" w:hanging="360"/>
+      </w:pPr>
+      <w:rPr>
+        <w:rFonts w:ascii="Wingdings" w:hAnsi="Wingdings" w:hint="default"/>
+        <w:sz w:val="20"/>
+      </w:rPr>
+    </w:lvl>
+    <w:lvl w:ilvl="8" w:tentative="1">
+      <w:start w:val="1"/>
+      <w:numFmt w:val="bullet"/>
+      <w:lvlText w:val=""/>
+      <w:lvlJc w:val="left"/>
+      <w:pPr>
+        <w:tabs>
+          <w:tab w:val="num" w:pos="6480"/>
+        </w:tabs>
+        <w:ind w:left="6480" w:hanging="360"/>
+      </w:pPr>
+      <w:rPr>
+        <w:rFonts w:ascii="Wingdings" w:hAnsi="Wingdings" w:hint="default"/>
+        <w:sz w:val="20"/>
+      </w:rPr>
+    </w:lvl>
+  </w:abstractNum>
+  <w:abstractNum w:abstractNumId="68" w15:restartNumberingAfterBreak="0">
     <w:nsid w:val="37C0756B"/>
     <w:multiLevelType w:val="multilevel"/>
     <w:tmpl w:val="DEACF4A6"/>
@@ -39326,7 +40887,7 @@
       </w:rPr>
     </w:lvl>
   </w:abstractNum>
-  <w:abstractNum w:abstractNumId="67" w15:restartNumberingAfterBreak="0">
+  <w:abstractNum w:abstractNumId="69" w15:restartNumberingAfterBreak="0">
     <w:nsid w:val="38B93EC2"/>
     <w:multiLevelType w:val="multilevel"/>
     <w:tmpl w:val="94202850"/>
@@ -39475,7 +41036,7 @@
       </w:rPr>
     </w:lvl>
   </w:abstractNum>
-  <w:abstractNum w:abstractNumId="68" w15:restartNumberingAfterBreak="0">
+  <w:abstractNum w:abstractNumId="70" w15:restartNumberingAfterBreak="0">
     <w:nsid w:val="39E840FC"/>
     <w:multiLevelType w:val="multilevel"/>
     <w:tmpl w:val="75943A8E"/>
@@ -39624,7 +41185,7 @@
       </w:rPr>
     </w:lvl>
   </w:abstractNum>
-  <w:abstractNum w:abstractNumId="69" w15:restartNumberingAfterBreak="0">
+  <w:abstractNum w:abstractNumId="71" w15:restartNumberingAfterBreak="0">
     <w:nsid w:val="3A824266"/>
     <w:multiLevelType w:val="multilevel"/>
     <w:tmpl w:val="E6280AA2"/>
@@ -39773,7 +41334,156 @@
       </w:rPr>
     </w:lvl>
   </w:abstractNum>
-  <w:abstractNum w:abstractNumId="70" w15:restartNumberingAfterBreak="0">
+  <w:abstractNum w:abstractNumId="72" w15:restartNumberingAfterBreak="0">
+    <w:nsid w:val="3B1B4DED"/>
+    <w:multiLevelType w:val="multilevel"/>
+    <w:tmpl w:val="8394535C"/>
+    <w:lvl w:ilvl="0">
+      <w:start w:val="1"/>
+      <w:numFmt w:val="bullet"/>
+      <w:lvlText w:val=""/>
+      <w:lvlJc w:val="left"/>
+      <w:pPr>
+        <w:tabs>
+          <w:tab w:val="num" w:pos="720"/>
+        </w:tabs>
+        <w:ind w:left="720" w:hanging="360"/>
+      </w:pPr>
+      <w:rPr>
+        <w:rFonts w:ascii="Symbol" w:hAnsi="Symbol" w:hint="default"/>
+        <w:sz w:val="20"/>
+      </w:rPr>
+    </w:lvl>
+    <w:lvl w:ilvl="1" w:tentative="1">
+      <w:start w:val="1"/>
+      <w:numFmt w:val="bullet"/>
+      <w:lvlText w:val="o"/>
+      <w:lvlJc w:val="left"/>
+      <w:pPr>
+        <w:tabs>
+          <w:tab w:val="num" w:pos="1440"/>
+        </w:tabs>
+        <w:ind w:left="1440" w:hanging="360"/>
+      </w:pPr>
+      <w:rPr>
+        <w:rFonts w:ascii="Courier New" w:hAnsi="Courier New" w:hint="default"/>
+        <w:sz w:val="20"/>
+      </w:rPr>
+    </w:lvl>
+    <w:lvl w:ilvl="2" w:tentative="1">
+      <w:start w:val="1"/>
+      <w:numFmt w:val="bullet"/>
+      <w:lvlText w:val=""/>
+      <w:lvlJc w:val="left"/>
+      <w:pPr>
+        <w:tabs>
+          <w:tab w:val="num" w:pos="2160"/>
+        </w:tabs>
+        <w:ind w:left="2160" w:hanging="360"/>
+      </w:pPr>
+      <w:rPr>
+        <w:rFonts w:ascii="Wingdings" w:hAnsi="Wingdings" w:hint="default"/>
+        <w:sz w:val="20"/>
+      </w:rPr>
+    </w:lvl>
+    <w:lvl w:ilvl="3" w:tentative="1">
+      <w:start w:val="1"/>
+      <w:numFmt w:val="bullet"/>
+      <w:lvlText w:val=""/>
+      <w:lvlJc w:val="left"/>
+      <w:pPr>
+        <w:tabs>
+          <w:tab w:val="num" w:pos="2880"/>
+        </w:tabs>
+        <w:ind w:left="2880" w:hanging="360"/>
+      </w:pPr>
+      <w:rPr>
+        <w:rFonts w:ascii="Wingdings" w:hAnsi="Wingdings" w:hint="default"/>
+        <w:sz w:val="20"/>
+      </w:rPr>
+    </w:lvl>
+    <w:lvl w:ilvl="4" w:tentative="1">
+      <w:start w:val="1"/>
+      <w:numFmt w:val="bullet"/>
+      <w:lvlText w:val=""/>
+      <w:lvlJc w:val="left"/>
+      <w:pPr>
+        <w:tabs>
+          <w:tab w:val="num" w:pos="3600"/>
+        </w:tabs>
+        <w:ind w:left="3600" w:hanging="360"/>
+      </w:pPr>
+      <w:rPr>
+        <w:rFonts w:ascii="Wingdings" w:hAnsi="Wingdings" w:hint="default"/>
+        <w:sz w:val="20"/>
+      </w:rPr>
+    </w:lvl>
+    <w:lvl w:ilvl="5" w:tentative="1">
+      <w:start w:val="1"/>
+      <w:numFmt w:val="bullet"/>
+      <w:lvlText w:val=""/>
+      <w:lvlJc w:val="left"/>
+      <w:pPr>
+        <w:tabs>
+          <w:tab w:val="num" w:pos="4320"/>
+        </w:tabs>
+        <w:ind w:left="4320" w:hanging="360"/>
+      </w:pPr>
+      <w:rPr>
+        <w:rFonts w:ascii="Wingdings" w:hAnsi="Wingdings" w:hint="default"/>
+        <w:sz w:val="20"/>
+      </w:rPr>
+    </w:lvl>
+    <w:lvl w:ilvl="6" w:tentative="1">
+      <w:start w:val="1"/>
+      <w:numFmt w:val="bullet"/>
+      <w:lvlText w:val=""/>
+      <w:lvlJc w:val="left"/>
+      <w:pPr>
+        <w:tabs>
+          <w:tab w:val="num" w:pos="5040"/>
+        </w:tabs>
+        <w:ind w:left="5040" w:hanging="360"/>
+      </w:pPr>
+      <w:rPr>
+        <w:rFonts w:ascii="Wingdings" w:hAnsi="Wingdings" w:hint="default"/>
+        <w:sz w:val="20"/>
+      </w:rPr>
+    </w:lvl>
+    <w:lvl w:ilvl="7" w:tentative="1">
+      <w:start w:val="1"/>
+      <w:numFmt w:val="bullet"/>
+      <w:lvlText w:val=""/>
+      <w:lvlJc w:val="left"/>
+      <w:pPr>
+        <w:tabs>
+          <w:tab w:val="num" w:pos="5760"/>
+        </w:tabs>
+        <w:ind w:left="5760" w:hanging="360"/>
+      </w:pPr>
+      <w:rPr>
+        <w:rFonts w:ascii="Wingdings" w:hAnsi="Wingdings" w:hint="default"/>
+        <w:sz w:val="20"/>
+      </w:rPr>
+    </w:lvl>
+    <w:lvl w:ilvl="8" w:tentative="1">
+      <w:start w:val="1"/>
+      <w:numFmt w:val="bullet"/>
+      <w:lvlText w:val=""/>
+      <w:lvlJc w:val="left"/>
+      <w:pPr>
+        <w:tabs>
+          <w:tab w:val="num" w:pos="6480"/>
+        </w:tabs>
+        <w:ind w:left="6480" w:hanging="360"/>
+      </w:pPr>
+      <w:rPr>
+        <w:rFonts w:ascii="Wingdings" w:hAnsi="Wingdings" w:hint="default"/>
+        <w:sz w:val="20"/>
+      </w:rPr>
+    </w:lvl>
+  </w:abstractNum>
+  <w:abstractNum w:abstractNumId="73" w15:restartNumberingAfterBreak="0">
     <w:nsid w:val="3BC370FC"/>
     <w:multiLevelType w:val="multilevel"/>
     <w:tmpl w:val="DEACF4A6"/>
@@ -39922,7 +41632,7 @@
       </w:rPr>
     </w:lvl>
   </w:abstractNum>
-  <w:abstractNum w:abstractNumId="71" w15:restartNumberingAfterBreak="0">
+  <w:abstractNum w:abstractNumId="74" w15:restartNumberingAfterBreak="0">
     <w:nsid w:val="3BD810AC"/>
     <w:multiLevelType w:val="multilevel"/>
     <w:tmpl w:val="82740430"/>
@@ -40039,7 +41749,7 @@
       </w:pPr>
     </w:lvl>
   </w:abstractNum>
-  <w:abstractNum w:abstractNumId="72" w15:restartNumberingAfterBreak="0">
+  <w:abstractNum w:abstractNumId="75" w15:restartNumberingAfterBreak="0">
     <w:nsid w:val="3C2B6D0A"/>
     <w:multiLevelType w:val="multilevel"/>
     <w:tmpl w:val="DEACF4A6"/>
@@ -40188,7 +41898,7 @@
       </w:rPr>
     </w:lvl>
   </w:abstractNum>
-  <w:abstractNum w:abstractNumId="73" w15:restartNumberingAfterBreak="0">
+  <w:abstractNum w:abstractNumId="76" w15:restartNumberingAfterBreak="0">
     <w:nsid w:val="3C2E5E3F"/>
     <w:multiLevelType w:val="multilevel"/>
     <w:tmpl w:val="DEACF4A6"/>
@@ -40337,7 +42047,7 @@
       </w:rPr>
     </w:lvl>
   </w:abstractNum>
-  <w:abstractNum w:abstractNumId="74" w15:restartNumberingAfterBreak="0">
+  <w:abstractNum w:abstractNumId="77" w15:restartNumberingAfterBreak="0">
     <w:nsid w:val="3C7D3893"/>
     <w:multiLevelType w:val="multilevel"/>
     <w:tmpl w:val="29B8FFAA"/>
@@ -40486,7 +42196,156 @@
       </w:rPr>
     </w:lvl>
   </w:abstractNum>
-  <w:abstractNum w:abstractNumId="75" w15:restartNumberingAfterBreak="0">
+  <w:abstractNum w:abstractNumId="78" w15:restartNumberingAfterBreak="0">
+    <w:nsid w:val="3D3C5FEA"/>
+    <w:multiLevelType w:val="multilevel"/>
+    <w:tmpl w:val="AE92823A"/>
+    <w:lvl w:ilvl="0">
+      <w:start w:val="1"/>
+      <w:numFmt w:val="bullet"/>
+      <w:lvlText w:val=""/>
+      <w:lvlJc w:val="left"/>
+      <w:pPr>
+        <w:tabs>
+          <w:tab w:val="num" w:pos="720"/>
+        </w:tabs>
+        <w:ind w:left="720" w:hanging="360"/>
+      </w:pPr>
+      <w:rPr>
+        <w:rFonts w:ascii="Symbol" w:hAnsi="Symbol" w:hint="default"/>
+        <w:sz w:val="20"/>
+      </w:rPr>
+    </w:lvl>
+    <w:lvl w:ilvl="1" w:tentative="1">
+      <w:start w:val="1"/>
+      <w:numFmt w:val="bullet"/>
+      <w:lvlText w:val="o"/>
+      <w:lvlJc w:val="left"/>
+      <w:pPr>
+        <w:tabs>
+          <w:tab w:val="num" w:pos="1440"/>
+        </w:tabs>
+        <w:ind w:left="1440" w:hanging="360"/>
+      </w:pPr>
+      <w:rPr>
+        <w:rFonts w:ascii="Courier New" w:hAnsi="Courier New" w:hint="default"/>
+        <w:sz w:val="20"/>
+      </w:rPr>
+    </w:lvl>
+    <w:lvl w:ilvl="2" w:tentative="1">
+      <w:start w:val="1"/>
+      <w:numFmt w:val="bullet"/>
+      <w:lvlText w:val=""/>
+      <w:lvlJc w:val="left"/>
+      <w:pPr>
+        <w:tabs>
+          <w:tab w:val="num" w:pos="2160"/>
+        </w:tabs>
+        <w:ind w:left="2160" w:hanging="360"/>
+      </w:pPr>
+      <w:rPr>
+        <w:rFonts w:ascii="Wingdings" w:hAnsi="Wingdings" w:hint="default"/>
+        <w:sz w:val="20"/>
+      </w:rPr>
+    </w:lvl>
+    <w:lvl w:ilvl="3" w:tentative="1">
+      <w:start w:val="1"/>
+      <w:numFmt w:val="bullet"/>
+      <w:lvlText w:val=""/>
+      <w:lvlJc w:val="left"/>
+      <w:pPr>
+        <w:tabs>
+          <w:tab w:val="num" w:pos="2880"/>
+        </w:tabs>
+        <w:ind w:left="2880" w:hanging="360"/>
+      </w:pPr>
+      <w:rPr>
+        <w:rFonts w:ascii="Wingdings" w:hAnsi="Wingdings" w:hint="default"/>
+        <w:sz w:val="20"/>
+      </w:rPr>
+    </w:lvl>
+    <w:lvl w:ilvl="4" w:tentative="1">
+      <w:start w:val="1"/>
+      <w:numFmt w:val="bullet"/>
+      <w:lvlText w:val=""/>
+      <w:lvlJc w:val="left"/>
+      <w:pPr>
+        <w:tabs>
+          <w:tab w:val="num" w:pos="3600"/>
+        </w:tabs>
+        <w:ind w:left="3600" w:hanging="360"/>
+      </w:pPr>
+      <w:rPr>
+        <w:rFonts w:ascii="Wingdings" w:hAnsi="Wingdings" w:hint="default"/>
+        <w:sz w:val="20"/>
+      </w:rPr>
+    </w:lvl>
+    <w:lvl w:ilvl="5" w:tentative="1">
+      <w:start w:val="1"/>
+      <w:numFmt w:val="bullet"/>
+      <w:lvlText w:val=""/>
+      <w:lvlJc w:val="left"/>
+      <w:pPr>
+        <w:tabs>
+          <w:tab w:val="num" w:pos="4320"/>
+        </w:tabs>
+        <w:ind w:left="4320" w:hanging="360"/>
+      </w:pPr>
+      <w:rPr>
+        <w:rFonts w:ascii="Wingdings" w:hAnsi="Wingdings" w:hint="default"/>
+        <w:sz w:val="20"/>
+      </w:rPr>
+    </w:lvl>
+    <w:lvl w:ilvl="6" w:tentative="1">
+      <w:start w:val="1"/>
+      <w:numFmt w:val="bullet"/>
+      <w:lvlText w:val=""/>
+      <w:lvlJc w:val="left"/>
+      <w:pPr>
+        <w:tabs>
+          <w:tab w:val="num" w:pos="5040"/>
+        </w:tabs>
+        <w:ind w:left="5040" w:hanging="360"/>
+      </w:pPr>
+      <w:rPr>
+        <w:rFonts w:ascii="Wingdings" w:hAnsi="Wingdings" w:hint="default"/>
+        <w:sz w:val="20"/>
+      </w:rPr>
+    </w:lvl>
+    <w:lvl w:ilvl="7" w:tentative="1">
+      <w:start w:val="1"/>
+      <w:numFmt w:val="bullet"/>
+      <w:lvlText w:val=""/>
+      <w:lvlJc w:val="left"/>
+      <w:pPr>
+        <w:tabs>
+          <w:tab w:val="num" w:pos="5760"/>
+        </w:tabs>
+        <w:ind w:left="5760" w:hanging="360"/>
+      </w:pPr>
+      <w:rPr>
+        <w:rFonts w:ascii="Wingdings" w:hAnsi="Wingdings" w:hint="default"/>
+        <w:sz w:val="20"/>
+      </w:rPr>
+    </w:lvl>
+    <w:lvl w:ilvl="8" w:tentative="1">
+      <w:start w:val="1"/>
+      <w:numFmt w:val="bullet"/>
+      <w:lvlText w:val=""/>
+      <w:lvlJc w:val="left"/>
+      <w:pPr>
+        <w:tabs>
+          <w:tab w:val="num" w:pos="6480"/>
+        </w:tabs>
+        <w:ind w:left="6480" w:hanging="360"/>
+      </w:pPr>
+      <w:rPr>
+        <w:rFonts w:ascii="Wingdings" w:hAnsi="Wingdings" w:hint="default"/>
+        <w:sz w:val="20"/>
+      </w:rPr>
+    </w:lvl>
+  </w:abstractNum>
+  <w:abstractNum w:abstractNumId="79" w15:restartNumberingAfterBreak="0">
     <w:nsid w:val="3D7A37AC"/>
     <w:multiLevelType w:val="multilevel"/>
     <w:tmpl w:val="21204102"/>
@@ -40635,7 +42494,7 @@
       </w:rPr>
     </w:lvl>
   </w:abstractNum>
-  <w:abstractNum w:abstractNumId="76" w15:restartNumberingAfterBreak="0">
+  <w:abstractNum w:abstractNumId="80" w15:restartNumberingAfterBreak="0">
     <w:nsid w:val="3DA409C1"/>
     <w:multiLevelType w:val="multilevel"/>
     <w:tmpl w:val="D9B0EB32"/>
@@ -40784,7 +42643,7 @@
       </w:rPr>
     </w:lvl>
   </w:abstractNum>
-  <w:abstractNum w:abstractNumId="77" w15:restartNumberingAfterBreak="0">
+  <w:abstractNum w:abstractNumId="81" w15:restartNumberingAfterBreak="0">
     <w:nsid w:val="3ECE2872"/>
     <w:multiLevelType w:val="multilevel"/>
     <w:tmpl w:val="D1C8890E"/>
@@ -40933,7 +42792,7 @@
       </w:rPr>
     </w:lvl>
   </w:abstractNum>
-  <w:abstractNum w:abstractNumId="78" w15:restartNumberingAfterBreak="0">
+  <w:abstractNum w:abstractNumId="82" w15:restartNumberingAfterBreak="0">
     <w:nsid w:val="3FB67063"/>
     <w:multiLevelType w:val="multilevel"/>
     <w:tmpl w:val="DEACF4A6"/>
@@ -41082,7 +42941,7 @@
       </w:rPr>
     </w:lvl>
   </w:abstractNum>
-  <w:abstractNum w:abstractNumId="79" w15:restartNumberingAfterBreak="0">
+  <w:abstractNum w:abstractNumId="83" w15:restartNumberingAfterBreak="0">
     <w:nsid w:val="40320410"/>
     <w:multiLevelType w:val="multilevel"/>
     <w:tmpl w:val="DEACF4A6"/>
@@ -41231,7 +43090,7 @@
       </w:rPr>
     </w:lvl>
   </w:abstractNum>
-  <w:abstractNum w:abstractNumId="80" w15:restartNumberingAfterBreak="0">
+  <w:abstractNum w:abstractNumId="84" w15:restartNumberingAfterBreak="0">
     <w:nsid w:val="40890F92"/>
     <w:multiLevelType w:val="multilevel"/>
     <w:tmpl w:val="19DEC10E"/>
@@ -41380,7 +43239,7 @@
       </w:rPr>
     </w:lvl>
   </w:abstractNum>
-  <w:abstractNum w:abstractNumId="81" w15:restartNumberingAfterBreak="0">
+  <w:abstractNum w:abstractNumId="85" w15:restartNumberingAfterBreak="0">
     <w:nsid w:val="41436C5D"/>
     <w:multiLevelType w:val="multilevel"/>
     <w:tmpl w:val="EA4035CE"/>
@@ -41529,7 +43388,7 @@
       </w:rPr>
     </w:lvl>
   </w:abstractNum>
-  <w:abstractNum w:abstractNumId="82" w15:restartNumberingAfterBreak="0">
+  <w:abstractNum w:abstractNumId="86" w15:restartNumberingAfterBreak="0">
     <w:nsid w:val="415C2938"/>
     <w:multiLevelType w:val="multilevel"/>
     <w:tmpl w:val="23C2479E"/>
@@ -41678,7 +43537,7 @@
       </w:rPr>
     </w:lvl>
   </w:abstractNum>
-  <w:abstractNum w:abstractNumId="83" w15:restartNumberingAfterBreak="0">
+  <w:abstractNum w:abstractNumId="87" w15:restartNumberingAfterBreak="0">
     <w:nsid w:val="416631EF"/>
     <w:multiLevelType w:val="multilevel"/>
     <w:tmpl w:val="A5DA0BC8"/>
@@ -41827,7 +43686,7 @@
       </w:rPr>
     </w:lvl>
   </w:abstractNum>
-  <w:abstractNum w:abstractNumId="84" w15:restartNumberingAfterBreak="0">
+  <w:abstractNum w:abstractNumId="88" w15:restartNumberingAfterBreak="0">
     <w:nsid w:val="416A4194"/>
     <w:multiLevelType w:val="multilevel"/>
     <w:tmpl w:val="16342C7E"/>
@@ -41976,7 +43835,7 @@
       </w:rPr>
     </w:lvl>
   </w:abstractNum>
-  <w:abstractNum w:abstractNumId="85" w15:restartNumberingAfterBreak="0">
+  <w:abstractNum w:abstractNumId="89" w15:restartNumberingAfterBreak="0">
     <w:nsid w:val="4181329B"/>
     <w:multiLevelType w:val="multilevel"/>
     <w:tmpl w:val="DEACF4A6"/>
@@ -42125,7 +43984,7 @@
       </w:rPr>
     </w:lvl>
   </w:abstractNum>
-  <w:abstractNum w:abstractNumId="86" w15:restartNumberingAfterBreak="0">
+  <w:abstractNum w:abstractNumId="90" w15:restartNumberingAfterBreak="0">
     <w:nsid w:val="418834FC"/>
     <w:multiLevelType w:val="multilevel"/>
     <w:tmpl w:val="BEE04852"/>
@@ -42274,7 +44133,7 @@
       </w:rPr>
     </w:lvl>
   </w:abstractNum>
-  <w:abstractNum w:abstractNumId="87" w15:restartNumberingAfterBreak="0">
+  <w:abstractNum w:abstractNumId="91" w15:restartNumberingAfterBreak="0">
     <w:nsid w:val="418A05A0"/>
     <w:multiLevelType w:val="multilevel"/>
     <w:tmpl w:val="0674F7AE"/>
@@ -42423,7 +44282,7 @@
       </w:rPr>
     </w:lvl>
   </w:abstractNum>
-  <w:abstractNum w:abstractNumId="88" w15:restartNumberingAfterBreak="0">
+  <w:abstractNum w:abstractNumId="92" w15:restartNumberingAfterBreak="0">
     <w:nsid w:val="41F642CE"/>
     <w:multiLevelType w:val="multilevel"/>
     <w:tmpl w:val="55A291E0"/>
@@ -42572,7 +44431,7 @@
       </w:rPr>
     </w:lvl>
   </w:abstractNum>
-  <w:abstractNum w:abstractNumId="89" w15:restartNumberingAfterBreak="0">
+  <w:abstractNum w:abstractNumId="93" w15:restartNumberingAfterBreak="0">
     <w:nsid w:val="422D07EF"/>
     <w:multiLevelType w:val="multilevel"/>
     <w:tmpl w:val="DEACF4A6"/>
@@ -42721,7 +44580,7 @@
       </w:rPr>
     </w:lvl>
   </w:abstractNum>
-  <w:abstractNum w:abstractNumId="90" w15:restartNumberingAfterBreak="0">
+  <w:abstractNum w:abstractNumId="94" w15:restartNumberingAfterBreak="0">
     <w:nsid w:val="43B402E8"/>
     <w:multiLevelType w:val="multilevel"/>
     <w:tmpl w:val="734CA24C"/>
@@ -42870,7 +44729,7 @@
       </w:rPr>
     </w:lvl>
   </w:abstractNum>
-  <w:abstractNum w:abstractNumId="91" w15:restartNumberingAfterBreak="0">
+  <w:abstractNum w:abstractNumId="95" w15:restartNumberingAfterBreak="0">
     <w:nsid w:val="459941E7"/>
     <w:multiLevelType w:val="multilevel"/>
     <w:tmpl w:val="E870D406"/>
@@ -43019,7 +44878,7 @@
       </w:rPr>
     </w:lvl>
   </w:abstractNum>
-  <w:abstractNum w:abstractNumId="92" w15:restartNumberingAfterBreak="0">
+  <w:abstractNum w:abstractNumId="96" w15:restartNumberingAfterBreak="0">
     <w:nsid w:val="45C96F3B"/>
     <w:multiLevelType w:val="multilevel"/>
     <w:tmpl w:val="DD107304"/>
@@ -43168,7 +45027,7 @@
       </w:rPr>
     </w:lvl>
   </w:abstractNum>
-  <w:abstractNum w:abstractNumId="93" w15:restartNumberingAfterBreak="0">
+  <w:abstractNum w:abstractNumId="97" w15:restartNumberingAfterBreak="0">
     <w:nsid w:val="47A41862"/>
     <w:multiLevelType w:val="multilevel"/>
     <w:tmpl w:val="2EE45D36"/>
@@ -43317,7 +45176,7 @@
       </w:rPr>
     </w:lvl>
   </w:abstractNum>
-  <w:abstractNum w:abstractNumId="94" w15:restartNumberingAfterBreak="0">
+  <w:abstractNum w:abstractNumId="98" w15:restartNumberingAfterBreak="0">
     <w:nsid w:val="47FA068A"/>
     <w:multiLevelType w:val="multilevel"/>
     <w:tmpl w:val="1C4280A4"/>
@@ -43466,7 +45325,7 @@
       </w:rPr>
     </w:lvl>
   </w:abstractNum>
-  <w:abstractNum w:abstractNumId="95" w15:restartNumberingAfterBreak="0">
+  <w:abstractNum w:abstractNumId="99" w15:restartNumberingAfterBreak="0">
     <w:nsid w:val="4959219F"/>
     <w:multiLevelType w:val="multilevel"/>
     <w:tmpl w:val="EEA4B6CE"/>
@@ -43615,7 +45474,7 @@
       </w:rPr>
     </w:lvl>
   </w:abstractNum>
-  <w:abstractNum w:abstractNumId="96" w15:restartNumberingAfterBreak="0">
+  <w:abstractNum w:abstractNumId="100" w15:restartNumberingAfterBreak="0">
     <w:nsid w:val="49592460"/>
     <w:multiLevelType w:val="multilevel"/>
     <w:tmpl w:val="74B23A92"/>
@@ -43764,7 +45623,7 @@
       </w:rPr>
     </w:lvl>
   </w:abstractNum>
-  <w:abstractNum w:abstractNumId="97" w15:restartNumberingAfterBreak="0">
+  <w:abstractNum w:abstractNumId="101" w15:restartNumberingAfterBreak="0">
     <w:nsid w:val="499347E1"/>
     <w:multiLevelType w:val="multilevel"/>
     <w:tmpl w:val="A69AFF14"/>
@@ -43913,7 +45772,7 @@
       </w:rPr>
     </w:lvl>
   </w:abstractNum>
-  <w:abstractNum w:abstractNumId="98" w15:restartNumberingAfterBreak="0">
+  <w:abstractNum w:abstractNumId="102" w15:restartNumberingAfterBreak="0">
     <w:nsid w:val="49AC00E4"/>
     <w:multiLevelType w:val="multilevel"/>
     <w:tmpl w:val="D3586A0C"/>
@@ -44062,7 +45921,7 @@
       </w:rPr>
     </w:lvl>
   </w:abstractNum>
-  <w:abstractNum w:abstractNumId="99" w15:restartNumberingAfterBreak="0">
+  <w:abstractNum w:abstractNumId="103" w15:restartNumberingAfterBreak="0">
     <w:nsid w:val="4A37675A"/>
     <w:multiLevelType w:val="multilevel"/>
     <w:tmpl w:val="5CAA72DA"/>
@@ -44211,7 +46070,7 @@
       </w:rPr>
     </w:lvl>
   </w:abstractNum>
-  <w:abstractNum w:abstractNumId="100" w15:restartNumberingAfterBreak="0">
+  <w:abstractNum w:abstractNumId="104" w15:restartNumberingAfterBreak="0">
     <w:nsid w:val="4A7938A8"/>
     <w:multiLevelType w:val="multilevel"/>
     <w:tmpl w:val="6FC2FDEA"/>
@@ -44360,7 +46219,7 @@
       </w:rPr>
     </w:lvl>
   </w:abstractNum>
-  <w:abstractNum w:abstractNumId="101" w15:restartNumberingAfterBreak="0">
+  <w:abstractNum w:abstractNumId="105" w15:restartNumberingAfterBreak="0">
     <w:nsid w:val="4A916050"/>
     <w:multiLevelType w:val="multilevel"/>
     <w:tmpl w:val="DEACF4A6"/>
@@ -44509,7 +46368,7 @@
       </w:rPr>
     </w:lvl>
   </w:abstractNum>
-  <w:abstractNum w:abstractNumId="102" w15:restartNumberingAfterBreak="0">
+  <w:abstractNum w:abstractNumId="106" w15:restartNumberingAfterBreak="0">
     <w:nsid w:val="4B5C4E86"/>
     <w:multiLevelType w:val="multilevel"/>
     <w:tmpl w:val="49CCAE56"/>
@@ -44658,7 +46517,7 @@
       </w:rPr>
     </w:lvl>
   </w:abstractNum>
-  <w:abstractNum w:abstractNumId="103" w15:restartNumberingAfterBreak="0">
+  <w:abstractNum w:abstractNumId="107" w15:restartNumberingAfterBreak="0">
     <w:nsid w:val="4BA535A7"/>
     <w:multiLevelType w:val="multilevel"/>
     <w:tmpl w:val="1F9CFAF6"/>
@@ -44779,7 +46638,7 @@
       </w:pPr>
     </w:lvl>
   </w:abstractNum>
-  <w:abstractNum w:abstractNumId="104" w15:restartNumberingAfterBreak="0">
+  <w:abstractNum w:abstractNumId="108" w15:restartNumberingAfterBreak="0">
     <w:nsid w:val="4D435794"/>
     <w:multiLevelType w:val="multilevel"/>
     <w:tmpl w:val="01C8C402"/>
@@ -44928,7 +46787,7 @@
       </w:rPr>
     </w:lvl>
   </w:abstractNum>
-  <w:abstractNum w:abstractNumId="105" w15:restartNumberingAfterBreak="0">
+  <w:abstractNum w:abstractNumId="109" w15:restartNumberingAfterBreak="0">
     <w:nsid w:val="4E2E7287"/>
     <w:multiLevelType w:val="multilevel"/>
     <w:tmpl w:val="DEACF4A6"/>
@@ -45077,7 +46936,7 @@
       </w:rPr>
     </w:lvl>
   </w:abstractNum>
-  <w:abstractNum w:abstractNumId="106" w15:restartNumberingAfterBreak="0">
+  <w:abstractNum w:abstractNumId="110" w15:restartNumberingAfterBreak="0">
     <w:nsid w:val="4EAE3361"/>
     <w:multiLevelType w:val="multilevel"/>
     <w:tmpl w:val="B866B10A"/>
@@ -45226,7 +47085,7 @@
       </w:rPr>
     </w:lvl>
   </w:abstractNum>
-  <w:abstractNum w:abstractNumId="107" w15:restartNumberingAfterBreak="0">
+  <w:abstractNum w:abstractNumId="111" w15:restartNumberingAfterBreak="0">
     <w:nsid w:val="4F3279A5"/>
     <w:multiLevelType w:val="multilevel"/>
     <w:tmpl w:val="F3D6E59C"/>
@@ -45375,7 +47234,7 @@
       </w:rPr>
     </w:lvl>
   </w:abstractNum>
-  <w:abstractNum w:abstractNumId="108" w15:restartNumberingAfterBreak="0">
+  <w:abstractNum w:abstractNumId="112" w15:restartNumberingAfterBreak="0">
     <w:nsid w:val="50C010A8"/>
     <w:multiLevelType w:val="multilevel"/>
     <w:tmpl w:val="7FF6A5C6"/>
@@ -45492,7 +47351,7 @@
       </w:pPr>
     </w:lvl>
   </w:abstractNum>
-  <w:abstractNum w:abstractNumId="109" w15:restartNumberingAfterBreak="0">
+  <w:abstractNum w:abstractNumId="113" w15:restartNumberingAfterBreak="0">
     <w:nsid w:val="51491159"/>
     <w:multiLevelType w:val="multilevel"/>
     <w:tmpl w:val="856CF8B2"/>
@@ -45641,7 +47500,7 @@
       </w:rPr>
     </w:lvl>
   </w:abstractNum>
-  <w:abstractNum w:abstractNumId="110" w15:restartNumberingAfterBreak="0">
+  <w:abstractNum w:abstractNumId="114" w15:restartNumberingAfterBreak="0">
     <w:nsid w:val="523740B1"/>
     <w:multiLevelType w:val="multilevel"/>
     <w:tmpl w:val="1FB84864"/>
@@ -45790,7 +47649,7 @@
       </w:rPr>
     </w:lvl>
   </w:abstractNum>
-  <w:abstractNum w:abstractNumId="111" w15:restartNumberingAfterBreak="0">
+  <w:abstractNum w:abstractNumId="115" w15:restartNumberingAfterBreak="0">
     <w:nsid w:val="523B5C17"/>
     <w:multiLevelType w:val="multilevel"/>
     <w:tmpl w:val="62E45FB0"/>
@@ -45939,7 +47798,7 @@
       </w:rPr>
     </w:lvl>
   </w:abstractNum>
-  <w:abstractNum w:abstractNumId="112" w15:restartNumberingAfterBreak="0">
+  <w:abstractNum w:abstractNumId="116" w15:restartNumberingAfterBreak="0">
     <w:nsid w:val="54E6346C"/>
     <w:multiLevelType w:val="multilevel"/>
     <w:tmpl w:val="C19AAF5E"/>
@@ -46088,7 +47947,7 @@
       </w:rPr>
     </w:lvl>
   </w:abstractNum>
-  <w:abstractNum w:abstractNumId="113" w15:restartNumberingAfterBreak="0">
+  <w:abstractNum w:abstractNumId="117" w15:restartNumberingAfterBreak="0">
     <w:nsid w:val="55376D85"/>
     <w:multiLevelType w:val="multilevel"/>
     <w:tmpl w:val="DEACF4A6"/>
@@ -46237,7 +48096,7 @@
       </w:rPr>
     </w:lvl>
   </w:abstractNum>
-  <w:abstractNum w:abstractNumId="114" w15:restartNumberingAfterBreak="0">
+  <w:abstractNum w:abstractNumId="118" w15:restartNumberingAfterBreak="0">
     <w:nsid w:val="55795B7A"/>
     <w:multiLevelType w:val="multilevel"/>
     <w:tmpl w:val="4A9EE6C6"/>
@@ -46386,7 +48245,7 @@
       </w:rPr>
     </w:lvl>
   </w:abstractNum>
-  <w:abstractNum w:abstractNumId="115" w15:restartNumberingAfterBreak="0">
+  <w:abstractNum w:abstractNumId="119" w15:restartNumberingAfterBreak="0">
     <w:nsid w:val="560078D3"/>
     <w:multiLevelType w:val="hybridMultilevel"/>
     <w:tmpl w:val="F30A58D4"/>
@@ -46472,7 +48331,7 @@
       </w:pPr>
     </w:lvl>
   </w:abstractNum>
-  <w:abstractNum w:abstractNumId="116" w15:restartNumberingAfterBreak="0">
+  <w:abstractNum w:abstractNumId="120" w15:restartNumberingAfterBreak="0">
     <w:nsid w:val="561B0462"/>
     <w:multiLevelType w:val="multilevel"/>
     <w:tmpl w:val="BF2808BA"/>
@@ -46621,7 +48480,7 @@
       </w:rPr>
     </w:lvl>
   </w:abstractNum>
-  <w:abstractNum w:abstractNumId="117" w15:restartNumberingAfterBreak="0">
+  <w:abstractNum w:abstractNumId="121" w15:restartNumberingAfterBreak="0">
     <w:nsid w:val="56A96381"/>
     <w:multiLevelType w:val="multilevel"/>
     <w:tmpl w:val="1DB88E4A"/>
@@ -46770,7 +48629,7 @@
       </w:rPr>
     </w:lvl>
   </w:abstractNum>
-  <w:abstractNum w:abstractNumId="118" w15:restartNumberingAfterBreak="0">
+  <w:abstractNum w:abstractNumId="122" w15:restartNumberingAfterBreak="0">
     <w:nsid w:val="56DE45A4"/>
     <w:multiLevelType w:val="multilevel"/>
     <w:tmpl w:val="F1DE8CA8"/>
@@ -46919,7 +48778,7 @@
       </w:rPr>
     </w:lvl>
   </w:abstractNum>
-  <w:abstractNum w:abstractNumId="119" w15:restartNumberingAfterBreak="0">
+  <w:abstractNum w:abstractNumId="123" w15:restartNumberingAfterBreak="0">
     <w:nsid w:val="573729A6"/>
     <w:multiLevelType w:val="multilevel"/>
     <w:tmpl w:val="DEACF4A6"/>
@@ -47068,7 +48927,7 @@
       </w:rPr>
     </w:lvl>
   </w:abstractNum>
-  <w:abstractNum w:abstractNumId="120" w15:restartNumberingAfterBreak="0">
+  <w:abstractNum w:abstractNumId="124" w15:restartNumberingAfterBreak="0">
     <w:nsid w:val="57E235CD"/>
     <w:multiLevelType w:val="multilevel"/>
     <w:tmpl w:val="DEACF4A6"/>
@@ -47217,7 +49076,7 @@
       </w:rPr>
     </w:lvl>
   </w:abstractNum>
-  <w:abstractNum w:abstractNumId="121" w15:restartNumberingAfterBreak="0">
+  <w:abstractNum w:abstractNumId="125" w15:restartNumberingAfterBreak="0">
     <w:nsid w:val="587E1401"/>
     <w:multiLevelType w:val="multilevel"/>
     <w:tmpl w:val="32D0B74A"/>
@@ -47366,7 +49225,7 @@
       </w:rPr>
     </w:lvl>
   </w:abstractNum>
-  <w:abstractNum w:abstractNumId="122" w15:restartNumberingAfterBreak="0">
+  <w:abstractNum w:abstractNumId="126" w15:restartNumberingAfterBreak="0">
     <w:nsid w:val="58DA77D3"/>
     <w:multiLevelType w:val="multilevel"/>
     <w:tmpl w:val="496AECC8"/>
@@ -47515,7 +49374,156 @@
       </w:rPr>
     </w:lvl>
   </w:abstractNum>
-  <w:abstractNum w:abstractNumId="123" w15:restartNumberingAfterBreak="0">
+  <w:abstractNum w:abstractNumId="127" w15:restartNumberingAfterBreak="0">
+    <w:nsid w:val="5947379B"/>
+    <w:multiLevelType w:val="multilevel"/>
+    <w:tmpl w:val="F06CDECE"/>
+    <w:lvl w:ilvl="0">
+      <w:start w:val="1"/>
+      <w:numFmt w:val="bullet"/>
+      <w:lvlText w:val=""/>
+      <w:lvlJc w:val="left"/>
+      <w:pPr>
+        <w:tabs>
+          <w:tab w:val="num" w:pos="720"/>
+        </w:tabs>
+        <w:ind w:left="720" w:hanging="360"/>
+      </w:pPr>
+      <w:rPr>
+        <w:rFonts w:ascii="Symbol" w:hAnsi="Symbol" w:hint="default"/>
+        <w:sz w:val="20"/>
+      </w:rPr>
+    </w:lvl>
+    <w:lvl w:ilvl="1" w:tentative="1">
+      <w:start w:val="1"/>
+      <w:numFmt w:val="bullet"/>
+      <w:lvlText w:val="o"/>
+      <w:lvlJc w:val="left"/>
+      <w:pPr>
+        <w:tabs>
+          <w:tab w:val="num" w:pos="1440"/>
+        </w:tabs>
+        <w:ind w:left="1440" w:hanging="360"/>
+      </w:pPr>
+      <w:rPr>
+        <w:rFonts w:ascii="Courier New" w:hAnsi="Courier New" w:hint="default"/>
+        <w:sz w:val="20"/>
+      </w:rPr>
+    </w:lvl>
+    <w:lvl w:ilvl="2" w:tentative="1">
+      <w:start w:val="1"/>
+      <w:numFmt w:val="bullet"/>
+      <w:lvlText w:val=""/>
+      <w:lvlJc w:val="left"/>
+      <w:pPr>
+        <w:tabs>
+          <w:tab w:val="num" w:pos="2160"/>
+        </w:tabs>
+        <w:ind w:left="2160" w:hanging="360"/>
+      </w:pPr>
+      <w:rPr>
+        <w:rFonts w:ascii="Wingdings" w:hAnsi="Wingdings" w:hint="default"/>
+        <w:sz w:val="20"/>
+      </w:rPr>
+    </w:lvl>
+    <w:lvl w:ilvl="3" w:tentative="1">
+      <w:start w:val="1"/>
+      <w:numFmt w:val="bullet"/>
+      <w:lvlText w:val=""/>
+      <w:lvlJc w:val="left"/>
+      <w:pPr>
+        <w:tabs>
+          <w:tab w:val="num" w:pos="2880"/>
+        </w:tabs>
+        <w:ind w:left="2880" w:hanging="360"/>
+      </w:pPr>
+      <w:rPr>
+        <w:rFonts w:ascii="Wingdings" w:hAnsi="Wingdings" w:hint="default"/>
+        <w:sz w:val="20"/>
+      </w:rPr>
+    </w:lvl>
+    <w:lvl w:ilvl="4" w:tentative="1">
+      <w:start w:val="1"/>
+      <w:numFmt w:val="bullet"/>
+      <w:lvlText w:val=""/>
+      <w:lvlJc w:val="left"/>
+      <w:pPr>
+        <w:tabs>
+          <w:tab w:val="num" w:pos="3600"/>
+        </w:tabs>
+        <w:ind w:left="3600" w:hanging="360"/>
+      </w:pPr>
+      <w:rPr>
+        <w:rFonts w:ascii="Wingdings" w:hAnsi="Wingdings" w:hint="default"/>
+        <w:sz w:val="20"/>
+      </w:rPr>
+    </w:lvl>
+    <w:lvl w:ilvl="5" w:tentative="1">
+      <w:start w:val="1"/>
+      <w:numFmt w:val="bullet"/>
+      <w:lvlText w:val=""/>
+      <w:lvlJc w:val="left"/>
+      <w:pPr>
+        <w:tabs>
+          <w:tab w:val="num" w:pos="4320"/>
+        </w:tabs>
+        <w:ind w:left="4320" w:hanging="360"/>
+      </w:pPr>
+      <w:rPr>
+        <w:rFonts w:ascii="Wingdings" w:hAnsi="Wingdings" w:hint="default"/>
+        <w:sz w:val="20"/>
+      </w:rPr>
+    </w:lvl>
+    <w:lvl w:ilvl="6" w:tentative="1">
+      <w:start w:val="1"/>
+      <w:numFmt w:val="bullet"/>
+      <w:lvlText w:val=""/>
+      <w:lvlJc w:val="left"/>
+      <w:pPr>
+        <w:tabs>
+          <w:tab w:val="num" w:pos="5040"/>
+        </w:tabs>
+        <w:ind w:left="5040" w:hanging="360"/>
+      </w:pPr>
+      <w:rPr>
+        <w:rFonts w:ascii="Wingdings" w:hAnsi="Wingdings" w:hint="default"/>
+        <w:sz w:val="20"/>
+      </w:rPr>
+    </w:lvl>
+    <w:lvl w:ilvl="7" w:tentative="1">
+      <w:start w:val="1"/>
+      <w:numFmt w:val="bullet"/>
+      <w:lvlText w:val=""/>
+      <w:lvlJc w:val="left"/>
+      <w:pPr>
+        <w:tabs>
+          <w:tab w:val="num" w:pos="5760"/>
+        </w:tabs>
+        <w:ind w:left="5760" w:hanging="360"/>
+      </w:pPr>
+      <w:rPr>
+        <w:rFonts w:ascii="Wingdings" w:hAnsi="Wingdings" w:hint="default"/>
+        <w:sz w:val="20"/>
+      </w:rPr>
+    </w:lvl>
+    <w:lvl w:ilvl="8" w:tentative="1">
+      <w:start w:val="1"/>
+      <w:numFmt w:val="bullet"/>
+      <w:lvlText w:val=""/>
+      <w:lvlJc w:val="left"/>
+      <w:pPr>
+        <w:tabs>
+          <w:tab w:val="num" w:pos="6480"/>
+        </w:tabs>
+        <w:ind w:left="6480" w:hanging="360"/>
+      </w:pPr>
+      <w:rPr>
+        <w:rFonts w:ascii="Wingdings" w:hAnsi="Wingdings" w:hint="default"/>
+        <w:sz w:val="20"/>
+      </w:rPr>
+    </w:lvl>
+  </w:abstractNum>
+  <w:abstractNum w:abstractNumId="128" w15:restartNumberingAfterBreak="0">
     <w:nsid w:val="59962779"/>
     <w:multiLevelType w:val="multilevel"/>
     <w:tmpl w:val="2F541102"/>
@@ -47664,7 +49672,7 @@
       </w:rPr>
     </w:lvl>
   </w:abstractNum>
-  <w:abstractNum w:abstractNumId="124" w15:restartNumberingAfterBreak="0">
+  <w:abstractNum w:abstractNumId="129" w15:restartNumberingAfterBreak="0">
     <w:nsid w:val="5AB5146E"/>
     <w:multiLevelType w:val="multilevel"/>
     <w:tmpl w:val="F79A82F0"/>
@@ -47813,7 +49821,7 @@
       </w:rPr>
     </w:lvl>
   </w:abstractNum>
-  <w:abstractNum w:abstractNumId="125" w15:restartNumberingAfterBreak="0">
+  <w:abstractNum w:abstractNumId="130" w15:restartNumberingAfterBreak="0">
     <w:nsid w:val="5B16276B"/>
     <w:multiLevelType w:val="multilevel"/>
     <w:tmpl w:val="B846DD08"/>
@@ -47962,7 +49970,7 @@
       </w:rPr>
     </w:lvl>
   </w:abstractNum>
-  <w:abstractNum w:abstractNumId="126" w15:restartNumberingAfterBreak="0">
+  <w:abstractNum w:abstractNumId="131" w15:restartNumberingAfterBreak="0">
     <w:nsid w:val="5B371E84"/>
     <w:multiLevelType w:val="multilevel"/>
     <w:tmpl w:val="E864D950"/>
@@ -48111,7 +50119,7 @@
       </w:rPr>
     </w:lvl>
   </w:abstractNum>
-  <w:abstractNum w:abstractNumId="127" w15:restartNumberingAfterBreak="0">
+  <w:abstractNum w:abstractNumId="132" w15:restartNumberingAfterBreak="0">
     <w:nsid w:val="5B8B1F0F"/>
     <w:multiLevelType w:val="multilevel"/>
     <w:tmpl w:val="7276947C"/>
@@ -48260,7 +50268,7 @@
       </w:rPr>
     </w:lvl>
   </w:abstractNum>
-  <w:abstractNum w:abstractNumId="128" w15:restartNumberingAfterBreak="0">
+  <w:abstractNum w:abstractNumId="133" w15:restartNumberingAfterBreak="0">
     <w:nsid w:val="5C70747B"/>
     <w:multiLevelType w:val="multilevel"/>
     <w:tmpl w:val="D61EB76A"/>
@@ -48409,7 +50417,7 @@
       </w:rPr>
     </w:lvl>
   </w:abstractNum>
-  <w:abstractNum w:abstractNumId="129" w15:restartNumberingAfterBreak="0">
+  <w:abstractNum w:abstractNumId="134" w15:restartNumberingAfterBreak="0">
     <w:nsid w:val="5CB42909"/>
     <w:multiLevelType w:val="multilevel"/>
     <w:tmpl w:val="D4845CC4"/>
@@ -48558,7 +50566,7 @@
       </w:rPr>
     </w:lvl>
   </w:abstractNum>
-  <w:abstractNum w:abstractNumId="130" w15:restartNumberingAfterBreak="0">
+  <w:abstractNum w:abstractNumId="135" w15:restartNumberingAfterBreak="0">
     <w:nsid w:val="5CB55C3E"/>
     <w:multiLevelType w:val="multilevel"/>
     <w:tmpl w:val="12BCF4F6"/>
@@ -48707,7 +50715,7 @@
       </w:rPr>
     </w:lvl>
   </w:abstractNum>
-  <w:abstractNum w:abstractNumId="131" w15:restartNumberingAfterBreak="0">
+  <w:abstractNum w:abstractNumId="136" w15:restartNumberingAfterBreak="0">
     <w:nsid w:val="5D1C3627"/>
     <w:multiLevelType w:val="multilevel"/>
     <w:tmpl w:val="665417FA"/>
@@ -48820,7 +50828,7 @@
       </w:pPr>
     </w:lvl>
   </w:abstractNum>
-  <w:abstractNum w:abstractNumId="132" w15:restartNumberingAfterBreak="0">
+  <w:abstractNum w:abstractNumId="137" w15:restartNumberingAfterBreak="0">
     <w:nsid w:val="5D334310"/>
     <w:multiLevelType w:val="multilevel"/>
     <w:tmpl w:val="2390A07E"/>
@@ -48969,7 +50977,7 @@
       </w:rPr>
     </w:lvl>
   </w:abstractNum>
-  <w:abstractNum w:abstractNumId="133" w15:restartNumberingAfterBreak="0">
+  <w:abstractNum w:abstractNumId="138" w15:restartNumberingAfterBreak="0">
     <w:nsid w:val="5E330E1C"/>
     <w:multiLevelType w:val="multilevel"/>
     <w:tmpl w:val="F5B24378"/>
@@ -49090,7 +51098,7 @@
       </w:pPr>
     </w:lvl>
   </w:abstractNum>
-  <w:abstractNum w:abstractNumId="134" w15:restartNumberingAfterBreak="0">
+  <w:abstractNum w:abstractNumId="139" w15:restartNumberingAfterBreak="0">
     <w:nsid w:val="5E4013E7"/>
     <w:multiLevelType w:val="multilevel"/>
     <w:tmpl w:val="5406C0D6"/>
@@ -49239,7 +51247,7 @@
       </w:rPr>
     </w:lvl>
   </w:abstractNum>
-  <w:abstractNum w:abstractNumId="135" w15:restartNumberingAfterBreak="0">
+  <w:abstractNum w:abstractNumId="140" w15:restartNumberingAfterBreak="0">
     <w:nsid w:val="5E855BCE"/>
     <w:multiLevelType w:val="multilevel"/>
     <w:tmpl w:val="64E2A726"/>
@@ -49388,7 +51396,7 @@
       </w:rPr>
     </w:lvl>
   </w:abstractNum>
-  <w:abstractNum w:abstractNumId="136" w15:restartNumberingAfterBreak="0">
+  <w:abstractNum w:abstractNumId="141" w15:restartNumberingAfterBreak="0">
     <w:nsid w:val="5FF87B10"/>
     <w:multiLevelType w:val="multilevel"/>
     <w:tmpl w:val="DCBCD0F2"/>
@@ -49537,7 +51545,7 @@
       </w:rPr>
     </w:lvl>
   </w:abstractNum>
-  <w:abstractNum w:abstractNumId="137" w15:restartNumberingAfterBreak="0">
+  <w:abstractNum w:abstractNumId="142" w15:restartNumberingAfterBreak="0">
     <w:nsid w:val="60D47D6E"/>
     <w:multiLevelType w:val="multilevel"/>
     <w:tmpl w:val="7C100110"/>
@@ -49686,7 +51694,7 @@
       </w:rPr>
     </w:lvl>
   </w:abstractNum>
-  <w:abstractNum w:abstractNumId="138" w15:restartNumberingAfterBreak="0">
+  <w:abstractNum w:abstractNumId="143" w15:restartNumberingAfterBreak="0">
     <w:nsid w:val="64E90CE1"/>
     <w:multiLevelType w:val="multilevel"/>
     <w:tmpl w:val="9D2C4784"/>
@@ -49835,7 +51843,7 @@
       </w:rPr>
     </w:lvl>
   </w:abstractNum>
-  <w:abstractNum w:abstractNumId="139" w15:restartNumberingAfterBreak="0">
+  <w:abstractNum w:abstractNumId="144" w15:restartNumberingAfterBreak="0">
     <w:nsid w:val="65111CD7"/>
     <w:multiLevelType w:val="multilevel"/>
     <w:tmpl w:val="1756B308"/>
@@ -49984,7 +51992,7 @@
       </w:rPr>
     </w:lvl>
   </w:abstractNum>
-  <w:abstractNum w:abstractNumId="140" w15:restartNumberingAfterBreak="0">
+  <w:abstractNum w:abstractNumId="145" w15:restartNumberingAfterBreak="0">
     <w:nsid w:val="66F80A6D"/>
     <w:multiLevelType w:val="multilevel"/>
     <w:tmpl w:val="31862EF4"/>
@@ -50133,7 +52141,7 @@
       </w:rPr>
     </w:lvl>
   </w:abstractNum>
-  <w:abstractNum w:abstractNumId="141" w15:restartNumberingAfterBreak="0">
+  <w:abstractNum w:abstractNumId="146" w15:restartNumberingAfterBreak="0">
     <w:nsid w:val="678934E3"/>
     <w:multiLevelType w:val="multilevel"/>
     <w:tmpl w:val="5E38E4AC"/>
@@ -50282,7 +52290,7 @@
       </w:rPr>
     </w:lvl>
   </w:abstractNum>
-  <w:abstractNum w:abstractNumId="142" w15:restartNumberingAfterBreak="0">
+  <w:abstractNum w:abstractNumId="147" w15:restartNumberingAfterBreak="0">
     <w:nsid w:val="6B155A5B"/>
     <w:multiLevelType w:val="multilevel"/>
     <w:tmpl w:val="DEACF4A6"/>
@@ -50431,7 +52439,7 @@
       </w:rPr>
     </w:lvl>
   </w:abstractNum>
-  <w:abstractNum w:abstractNumId="143" w15:restartNumberingAfterBreak="0">
+  <w:abstractNum w:abstractNumId="148" w15:restartNumberingAfterBreak="0">
     <w:nsid w:val="6B660339"/>
     <w:multiLevelType w:val="multilevel"/>
     <w:tmpl w:val="8A4CFEBC"/>
@@ -50580,7 +52588,7 @@
       </w:rPr>
     </w:lvl>
   </w:abstractNum>
-  <w:abstractNum w:abstractNumId="144" w15:restartNumberingAfterBreak="0">
+  <w:abstractNum w:abstractNumId="149" w15:restartNumberingAfterBreak="0">
     <w:nsid w:val="6BC53BB3"/>
     <w:multiLevelType w:val="multilevel"/>
     <w:tmpl w:val="1AAA5DEA"/>
@@ -50729,7 +52737,7 @@
       </w:rPr>
     </w:lvl>
   </w:abstractNum>
-  <w:abstractNum w:abstractNumId="145" w15:restartNumberingAfterBreak="0">
+  <w:abstractNum w:abstractNumId="150" w15:restartNumberingAfterBreak="0">
     <w:nsid w:val="6BF2702D"/>
     <w:multiLevelType w:val="multilevel"/>
     <w:tmpl w:val="DEACF4A6"/>
@@ -50878,7 +52886,7 @@
       </w:rPr>
     </w:lvl>
   </w:abstractNum>
-  <w:abstractNum w:abstractNumId="146" w15:restartNumberingAfterBreak="0">
+  <w:abstractNum w:abstractNumId="151" w15:restartNumberingAfterBreak="0">
     <w:nsid w:val="6C3A2C06"/>
     <w:multiLevelType w:val="multilevel"/>
     <w:tmpl w:val="60424A78"/>
@@ -51027,7 +53035,7 @@
       </w:rPr>
     </w:lvl>
   </w:abstractNum>
-  <w:abstractNum w:abstractNumId="147" w15:restartNumberingAfterBreak="0">
+  <w:abstractNum w:abstractNumId="152" w15:restartNumberingAfterBreak="0">
     <w:nsid w:val="6C95580B"/>
     <w:multiLevelType w:val="multilevel"/>
     <w:tmpl w:val="C8A61D28"/>
@@ -51176,7 +53184,7 @@
       </w:rPr>
     </w:lvl>
   </w:abstractNum>
-  <w:abstractNum w:abstractNumId="148" w15:restartNumberingAfterBreak="0">
+  <w:abstractNum w:abstractNumId="153" w15:restartNumberingAfterBreak="0">
     <w:nsid w:val="6EF74731"/>
     <w:multiLevelType w:val="multilevel"/>
     <w:tmpl w:val="DEACF4A6"/>
@@ -51325,7 +53333,7 @@
       </w:rPr>
     </w:lvl>
   </w:abstractNum>
-  <w:abstractNum w:abstractNumId="149" w15:restartNumberingAfterBreak="0">
+  <w:abstractNum w:abstractNumId="154" w15:restartNumberingAfterBreak="0">
     <w:nsid w:val="6F1676F9"/>
     <w:multiLevelType w:val="multilevel"/>
     <w:tmpl w:val="FF9EEDB0"/>
@@ -51474,7 +53482,156 @@
       </w:rPr>
     </w:lvl>
   </w:abstractNum>
-  <w:abstractNum w:abstractNumId="150" w15:restartNumberingAfterBreak="0">
+  <w:abstractNum w:abstractNumId="155" w15:restartNumberingAfterBreak="0">
+    <w:nsid w:val="701111D0"/>
+    <w:multiLevelType w:val="multilevel"/>
+    <w:tmpl w:val="F470F642"/>
+    <w:lvl w:ilvl="0">
+      <w:start w:val="1"/>
+      <w:numFmt w:val="bullet"/>
+      <w:lvlText w:val=""/>
+      <w:lvlJc w:val="left"/>
+      <w:pPr>
+        <w:tabs>
+          <w:tab w:val="num" w:pos="720"/>
+        </w:tabs>
+        <w:ind w:left="720" w:hanging="360"/>
+      </w:pPr>
+      <w:rPr>
+        <w:rFonts w:ascii="Symbol" w:hAnsi="Symbol" w:hint="default"/>
+        <w:sz w:val="20"/>
+      </w:rPr>
+    </w:lvl>
+    <w:lvl w:ilvl="1">
+      <w:start w:val="1"/>
+      <w:numFmt w:val="bullet"/>
+      <w:lvlText w:val="o"/>
+      <w:lvlJc w:val="left"/>
+      <w:pPr>
+        <w:tabs>
+          <w:tab w:val="num" w:pos="1440"/>
+        </w:tabs>
+        <w:ind w:left="1440" w:hanging="360"/>
+      </w:pPr>
+      <w:rPr>
+        <w:rFonts w:ascii="Courier New" w:hAnsi="Courier New" w:hint="default"/>
+        <w:sz w:val="20"/>
+      </w:rPr>
+    </w:lvl>
+    <w:lvl w:ilvl="2" w:tentative="1">
+      <w:start w:val="1"/>
+      <w:numFmt w:val="bullet"/>
+      <w:lvlText w:val=""/>
+      <w:lvlJc w:val="left"/>
+      <w:pPr>
+        <w:tabs>
+          <w:tab w:val="num" w:pos="2160"/>
+        </w:tabs>
+        <w:ind w:left="2160" w:hanging="360"/>
+      </w:pPr>
+      <w:rPr>
+        <w:rFonts w:ascii="Wingdings" w:hAnsi="Wingdings" w:hint="default"/>
+        <w:sz w:val="20"/>
+      </w:rPr>
+    </w:lvl>
+    <w:lvl w:ilvl="3" w:tentative="1">
+      <w:start w:val="1"/>
+      <w:numFmt w:val="bullet"/>
+      <w:lvlText w:val=""/>
+      <w:lvlJc w:val="left"/>
+      <w:pPr>
+        <w:tabs>
+          <w:tab w:val="num" w:pos="2880"/>
+        </w:tabs>
+        <w:ind w:left="2880" w:hanging="360"/>
+      </w:pPr>
+      <w:rPr>
+        <w:rFonts w:ascii="Wingdings" w:hAnsi="Wingdings" w:hint="default"/>
+        <w:sz w:val="20"/>
+      </w:rPr>
+    </w:lvl>
+    <w:lvl w:ilvl="4" w:tentative="1">
+      <w:start w:val="1"/>
+      <w:numFmt w:val="bullet"/>
+      <w:lvlText w:val=""/>
+      <w:lvlJc w:val="left"/>
+      <w:pPr>
+        <w:tabs>
+          <w:tab w:val="num" w:pos="3600"/>
+        </w:tabs>
+        <w:ind w:left="3600" w:hanging="360"/>
+      </w:pPr>
+      <w:rPr>
+        <w:rFonts w:ascii="Wingdings" w:hAnsi="Wingdings" w:hint="default"/>
+        <w:sz w:val="20"/>
+      </w:rPr>
+    </w:lvl>
+    <w:lvl w:ilvl="5" w:tentative="1">
+      <w:start w:val="1"/>
+      <w:numFmt w:val="bullet"/>
+      <w:lvlText w:val=""/>
+      <w:lvlJc w:val="left"/>
+      <w:pPr>
+        <w:tabs>
+          <w:tab w:val="num" w:pos="4320"/>
+        </w:tabs>
+        <w:ind w:left="4320" w:hanging="360"/>
+      </w:pPr>
+      <w:rPr>
+        <w:rFonts w:ascii="Wingdings" w:hAnsi="Wingdings" w:hint="default"/>
+        <w:sz w:val="20"/>
+      </w:rPr>
+    </w:lvl>
+    <w:lvl w:ilvl="6" w:tentative="1">
+      <w:start w:val="1"/>
+      <w:numFmt w:val="bullet"/>
+      <w:lvlText w:val=""/>
+      <w:lvlJc w:val="left"/>
+      <w:pPr>
+        <w:tabs>
+          <w:tab w:val="num" w:pos="5040"/>
+        </w:tabs>
+        <w:ind w:left="5040" w:hanging="360"/>
+      </w:pPr>
+      <w:rPr>
+        <w:rFonts w:ascii="Wingdings" w:hAnsi="Wingdings" w:hint="default"/>
+        <w:sz w:val="20"/>
+      </w:rPr>
+    </w:lvl>
+    <w:lvl w:ilvl="7" w:tentative="1">
+      <w:start w:val="1"/>
+      <w:numFmt w:val="bullet"/>
+      <w:lvlText w:val=""/>
+      <w:lvlJc w:val="left"/>
+      <w:pPr>
+        <w:tabs>
+          <w:tab w:val="num" w:pos="5760"/>
+        </w:tabs>
+        <w:ind w:left="5760" w:hanging="360"/>
+      </w:pPr>
+      <w:rPr>
+        <w:rFonts w:ascii="Wingdings" w:hAnsi="Wingdings" w:hint="default"/>
+        <w:sz w:val="20"/>
+      </w:rPr>
+    </w:lvl>
+    <w:lvl w:ilvl="8" w:tentative="1">
+      <w:start w:val="1"/>
+      <w:numFmt w:val="bullet"/>
+      <w:lvlText w:val=""/>
+      <w:lvlJc w:val="left"/>
+      <w:pPr>
+        <w:tabs>
+          <w:tab w:val="num" w:pos="6480"/>
+        </w:tabs>
+        <w:ind w:left="6480" w:hanging="360"/>
+      </w:pPr>
+      <w:rPr>
+        <w:rFonts w:ascii="Wingdings" w:hAnsi="Wingdings" w:hint="default"/>
+        <w:sz w:val="20"/>
+      </w:rPr>
+    </w:lvl>
+  </w:abstractNum>
+  <w:abstractNum w:abstractNumId="156" w15:restartNumberingAfterBreak="0">
     <w:nsid w:val="706A6F20"/>
     <w:multiLevelType w:val="multilevel"/>
     <w:tmpl w:val="C4F21CF6"/>
@@ -51623,7 +53780,7 @@
       </w:rPr>
     </w:lvl>
   </w:abstractNum>
-  <w:abstractNum w:abstractNumId="151" w15:restartNumberingAfterBreak="0">
+  <w:abstractNum w:abstractNumId="157" w15:restartNumberingAfterBreak="0">
     <w:nsid w:val="713A1BFE"/>
     <w:multiLevelType w:val="multilevel"/>
     <w:tmpl w:val="190E8908"/>
@@ -51772,7 +53929,156 @@
       </w:rPr>
     </w:lvl>
   </w:abstractNum>
-  <w:abstractNum w:abstractNumId="152" w15:restartNumberingAfterBreak="0">
+  <w:abstractNum w:abstractNumId="158" w15:restartNumberingAfterBreak="0">
+    <w:nsid w:val="72224813"/>
+    <w:multiLevelType w:val="multilevel"/>
+    <w:tmpl w:val="9E665AE2"/>
+    <w:lvl w:ilvl="0">
+      <w:start w:val="1"/>
+      <w:numFmt w:val="bullet"/>
+      <w:lvlText w:val=""/>
+      <w:lvlJc w:val="left"/>
+      <w:pPr>
+        <w:tabs>
+          <w:tab w:val="num" w:pos="720"/>
+        </w:tabs>
+        <w:ind w:left="720" w:hanging="360"/>
+      </w:pPr>
+      <w:rPr>
+        <w:rFonts w:ascii="Symbol" w:hAnsi="Symbol" w:hint="default"/>
+        <w:sz w:val="20"/>
+      </w:rPr>
+    </w:lvl>
+    <w:lvl w:ilvl="1" w:tentative="1">
+      <w:start w:val="1"/>
+      <w:numFmt w:val="bullet"/>
+      <w:lvlText w:val="o"/>
+      <w:lvlJc w:val="left"/>
+      <w:pPr>
+        <w:tabs>
+          <w:tab w:val="num" w:pos="1440"/>
+        </w:tabs>
+        <w:ind w:left="1440" w:hanging="360"/>
+      </w:pPr>
+      <w:rPr>
+        <w:rFonts w:ascii="Courier New" w:hAnsi="Courier New" w:hint="default"/>
+        <w:sz w:val="20"/>
+      </w:rPr>
+    </w:lvl>
+    <w:lvl w:ilvl="2" w:tentative="1">
+      <w:start w:val="1"/>
+      <w:numFmt w:val="bullet"/>
+      <w:lvlText w:val=""/>
+      <w:lvlJc w:val="left"/>
+      <w:pPr>
+        <w:tabs>
+          <w:tab w:val="num" w:pos="2160"/>
+        </w:tabs>
+        <w:ind w:left="2160" w:hanging="360"/>
+      </w:pPr>
+      <w:rPr>
+        <w:rFonts w:ascii="Wingdings" w:hAnsi="Wingdings" w:hint="default"/>
+        <w:sz w:val="20"/>
+      </w:rPr>
+    </w:lvl>
+    <w:lvl w:ilvl="3" w:tentative="1">
+      <w:start w:val="1"/>
+      <w:numFmt w:val="bullet"/>
+      <w:lvlText w:val=""/>
+      <w:lvlJc w:val="left"/>
+      <w:pPr>
+        <w:tabs>
+          <w:tab w:val="num" w:pos="2880"/>
+        </w:tabs>
+        <w:ind w:left="2880" w:hanging="360"/>
+      </w:pPr>
+      <w:rPr>
+        <w:rFonts w:ascii="Wingdings" w:hAnsi="Wingdings" w:hint="default"/>
+        <w:sz w:val="20"/>
+      </w:rPr>
+    </w:lvl>
+    <w:lvl w:ilvl="4" w:tentative="1">
+      <w:start w:val="1"/>
+      <w:numFmt w:val="bullet"/>
+      <w:lvlText w:val=""/>
+      <w:lvlJc w:val="left"/>
+      <w:pPr>
+        <w:tabs>
+          <w:tab w:val="num" w:pos="3600"/>
+        </w:tabs>
+        <w:ind w:left="3600" w:hanging="360"/>
+      </w:pPr>
+      <w:rPr>
+        <w:rFonts w:ascii="Wingdings" w:hAnsi="Wingdings" w:hint="default"/>
+        <w:sz w:val="20"/>
+      </w:rPr>
+    </w:lvl>
+    <w:lvl w:ilvl="5" w:tentative="1">
+      <w:start w:val="1"/>
+      <w:numFmt w:val="bullet"/>
+      <w:lvlText w:val=""/>
+      <w:lvlJc w:val="left"/>
+      <w:pPr>
+        <w:tabs>
+          <w:tab w:val="num" w:pos="4320"/>
+        </w:tabs>
+        <w:ind w:left="4320" w:hanging="360"/>
+      </w:pPr>
+      <w:rPr>
+        <w:rFonts w:ascii="Wingdings" w:hAnsi="Wingdings" w:hint="default"/>
+        <w:sz w:val="20"/>
+      </w:rPr>
+    </w:lvl>
+    <w:lvl w:ilvl="6" w:tentative="1">
+      <w:start w:val="1"/>
+      <w:numFmt w:val="bullet"/>
+      <w:lvlText w:val=""/>
+      <w:lvlJc w:val="left"/>
+      <w:pPr>
+        <w:tabs>
+          <w:tab w:val="num" w:pos="5040"/>
+        </w:tabs>
+        <w:ind w:left="5040" w:hanging="360"/>
+      </w:pPr>
+      <w:rPr>
+        <w:rFonts w:ascii="Wingdings" w:hAnsi="Wingdings" w:hint="default"/>
+        <w:sz w:val="20"/>
+      </w:rPr>
+    </w:lvl>
+    <w:lvl w:ilvl="7" w:tentative="1">
+      <w:start w:val="1"/>
+      <w:numFmt w:val="bullet"/>
+      <w:lvlText w:val=""/>
+      <w:lvlJc w:val="left"/>
+      <w:pPr>
+        <w:tabs>
+          <w:tab w:val="num" w:pos="5760"/>
+        </w:tabs>
+        <w:ind w:left="5760" w:hanging="360"/>
+      </w:pPr>
+      <w:rPr>
+        <w:rFonts w:ascii="Wingdings" w:hAnsi="Wingdings" w:hint="default"/>
+        <w:sz w:val="20"/>
+      </w:rPr>
+    </w:lvl>
+    <w:lvl w:ilvl="8" w:tentative="1">
+      <w:start w:val="1"/>
+      <w:numFmt w:val="bullet"/>
+      <w:lvlText w:val=""/>
+      <w:lvlJc w:val="left"/>
+      <w:pPr>
+        <w:tabs>
+          <w:tab w:val="num" w:pos="6480"/>
+        </w:tabs>
+        <w:ind w:left="6480" w:hanging="360"/>
+      </w:pPr>
+      <w:rPr>
+        <w:rFonts w:ascii="Wingdings" w:hAnsi="Wingdings" w:hint="default"/>
+        <w:sz w:val="20"/>
+      </w:rPr>
+    </w:lvl>
+  </w:abstractNum>
+  <w:abstractNum w:abstractNumId="159" w15:restartNumberingAfterBreak="0">
     <w:nsid w:val="723767A4"/>
     <w:multiLevelType w:val="multilevel"/>
     <w:tmpl w:val="DEACF4A6"/>
@@ -51921,7 +54227,7 @@
       </w:rPr>
     </w:lvl>
   </w:abstractNum>
-  <w:abstractNum w:abstractNumId="153" w15:restartNumberingAfterBreak="0">
+  <w:abstractNum w:abstractNumId="160" w15:restartNumberingAfterBreak="0">
     <w:nsid w:val="7343291E"/>
     <w:multiLevelType w:val="multilevel"/>
     <w:tmpl w:val="627810EA"/>
@@ -52070,7 +54376,7 @@
       </w:rPr>
     </w:lvl>
   </w:abstractNum>
-  <w:abstractNum w:abstractNumId="154" w15:restartNumberingAfterBreak="0">
+  <w:abstractNum w:abstractNumId="161" w15:restartNumberingAfterBreak="0">
     <w:nsid w:val="74384A88"/>
     <w:multiLevelType w:val="multilevel"/>
     <w:tmpl w:val="0AF22E1E"/>
@@ -52187,7 +54493,7 @@
       </w:pPr>
     </w:lvl>
   </w:abstractNum>
-  <w:abstractNum w:abstractNumId="155" w15:restartNumberingAfterBreak="0">
+  <w:abstractNum w:abstractNumId="162" w15:restartNumberingAfterBreak="0">
     <w:nsid w:val="748B48AC"/>
     <w:multiLevelType w:val="multilevel"/>
     <w:tmpl w:val="6BC4C746"/>
@@ -52336,7 +54642,7 @@
       </w:rPr>
     </w:lvl>
   </w:abstractNum>
-  <w:abstractNum w:abstractNumId="156" w15:restartNumberingAfterBreak="0">
+  <w:abstractNum w:abstractNumId="163" w15:restartNumberingAfterBreak="0">
     <w:nsid w:val="753718BF"/>
     <w:multiLevelType w:val="multilevel"/>
     <w:tmpl w:val="DEACF4A6"/>
@@ -52485,7 +54791,7 @@
       </w:rPr>
     </w:lvl>
   </w:abstractNum>
-  <w:abstractNum w:abstractNumId="157" w15:restartNumberingAfterBreak="0">
+  <w:abstractNum w:abstractNumId="164" w15:restartNumberingAfterBreak="0">
     <w:nsid w:val="78DE38B2"/>
     <w:multiLevelType w:val="multilevel"/>
     <w:tmpl w:val="A14C85F6"/>
@@ -52634,7 +54940,7 @@
       </w:rPr>
     </w:lvl>
   </w:abstractNum>
-  <w:abstractNum w:abstractNumId="158" w15:restartNumberingAfterBreak="0">
+  <w:abstractNum w:abstractNumId="165" w15:restartNumberingAfterBreak="0">
     <w:nsid w:val="78F113F9"/>
     <w:multiLevelType w:val="multilevel"/>
     <w:tmpl w:val="E6640F2E"/>
@@ -52783,7 +55089,7 @@
       </w:rPr>
     </w:lvl>
   </w:abstractNum>
-  <w:abstractNum w:abstractNumId="159" w15:restartNumberingAfterBreak="0">
+  <w:abstractNum w:abstractNumId="166" w15:restartNumberingAfterBreak="0">
     <w:nsid w:val="7A17119F"/>
     <w:multiLevelType w:val="multilevel"/>
     <w:tmpl w:val="7EDA17CA"/>
@@ -52932,7 +55238,7 @@
       </w:rPr>
     </w:lvl>
   </w:abstractNum>
-  <w:abstractNum w:abstractNumId="160" w15:restartNumberingAfterBreak="0">
+  <w:abstractNum w:abstractNumId="167" w15:restartNumberingAfterBreak="0">
     <w:nsid w:val="7B956861"/>
     <w:multiLevelType w:val="multilevel"/>
     <w:tmpl w:val="3A38D396"/>
@@ -53081,7 +55387,7 @@
       </w:rPr>
     </w:lvl>
   </w:abstractNum>
-  <w:abstractNum w:abstractNumId="161" w15:restartNumberingAfterBreak="0">
+  <w:abstractNum w:abstractNumId="168" w15:restartNumberingAfterBreak="0">
     <w:nsid w:val="7D1F670C"/>
     <w:multiLevelType w:val="multilevel"/>
     <w:tmpl w:val="E65CDAE8"/>
@@ -53230,7 +55536,7 @@
       </w:rPr>
     </w:lvl>
   </w:abstractNum>
-  <w:abstractNum w:abstractNumId="162" w15:restartNumberingAfterBreak="0">
+  <w:abstractNum w:abstractNumId="169" w15:restartNumberingAfterBreak="0">
     <w:nsid w:val="7DDD5161"/>
     <w:multiLevelType w:val="multilevel"/>
     <w:tmpl w:val="8C2E362C"/>
@@ -53379,7 +55685,7 @@
       </w:rPr>
     </w:lvl>
   </w:abstractNum>
-  <w:abstractNum w:abstractNumId="163" w15:restartNumberingAfterBreak="0">
+  <w:abstractNum w:abstractNumId="170" w15:restartNumberingAfterBreak="0">
     <w:nsid w:val="7E0008E5"/>
     <w:multiLevelType w:val="multilevel"/>
     <w:tmpl w:val="D056215A"/>
@@ -53492,7 +55798,7 @@
       </w:pPr>
     </w:lvl>
   </w:abstractNum>
-  <w:abstractNum w:abstractNumId="164" w15:restartNumberingAfterBreak="0">
+  <w:abstractNum w:abstractNumId="171" w15:restartNumberingAfterBreak="0">
     <w:nsid w:val="7ED807A1"/>
     <w:multiLevelType w:val="multilevel"/>
     <w:tmpl w:val="C788330E"/>
@@ -53642,10 +55948,10 @@
     </w:lvl>
   </w:abstractNum>
   <w:num w:numId="1" w16cid:durableId="942803316">
-    <w:abstractNumId w:val="154"/>
+    <w:abstractNumId w:val="161"/>
   </w:num>
   <w:num w:numId="2" w16cid:durableId="270747766">
-    <w:abstractNumId w:val="137"/>
+    <w:abstractNumId w:val="142"/>
   </w:num>
   <w:num w:numId="3" w16cid:durableId="1032075383">
     <w:abstractNumId w:val="1"/>
@@ -53654,31 +55960,31 @@
     <w:abstractNumId w:val="27"/>
   </w:num>
   <w:num w:numId="5" w16cid:durableId="1179151838">
-    <w:abstractNumId w:val="136"/>
+    <w:abstractNumId w:val="141"/>
   </w:num>
   <w:num w:numId="6" w16cid:durableId="544101733">
-    <w:abstractNumId w:val="97"/>
+    <w:abstractNumId w:val="101"/>
   </w:num>
   <w:num w:numId="7" w16cid:durableId="4283976">
-    <w:abstractNumId w:val="160"/>
+    <w:abstractNumId w:val="167"/>
   </w:num>
   <w:num w:numId="8" w16cid:durableId="245917338">
-    <w:abstractNumId w:val="86"/>
+    <w:abstractNumId w:val="90"/>
   </w:num>
   <w:num w:numId="9" w16cid:durableId="609435230">
-    <w:abstractNumId w:val="99"/>
+    <w:abstractNumId w:val="103"/>
   </w:num>
   <w:num w:numId="10" w16cid:durableId="1472097361">
-    <w:abstractNumId w:val="106"/>
+    <w:abstractNumId w:val="110"/>
   </w:num>
   <w:num w:numId="11" w16cid:durableId="1364328853">
     <w:abstractNumId w:val="22"/>
   </w:num>
   <w:num w:numId="12" w16cid:durableId="316425971">
-    <w:abstractNumId w:val="124"/>
+    <w:abstractNumId w:val="129"/>
   </w:num>
   <w:num w:numId="13" w16cid:durableId="431825394">
-    <w:abstractNumId w:val="135"/>
+    <w:abstractNumId w:val="140"/>
   </w:num>
   <w:num w:numId="14" w16cid:durableId="834343080">
     <w:abstractNumId w:val="13"/>
@@ -53687,7 +55993,7 @@
     <w:abstractNumId w:val="5"/>
   </w:num>
   <w:num w:numId="16" w16cid:durableId="1432430141">
-    <w:abstractNumId w:val="39"/>
+    <w:abstractNumId w:val="40"/>
   </w:num>
   <w:num w:numId="17" w16cid:durableId="2146846462">
     <w:abstractNumId w:val="34"/>
@@ -53696,139 +56002,139 @@
     <w:abstractNumId w:val="31"/>
   </w:num>
   <w:num w:numId="19" w16cid:durableId="2119134066">
-    <w:abstractNumId w:val="140"/>
+    <w:abstractNumId w:val="145"/>
   </w:num>
   <w:num w:numId="20" w16cid:durableId="579292118">
-    <w:abstractNumId w:val="128"/>
+    <w:abstractNumId w:val="133"/>
   </w:num>
   <w:num w:numId="21" w16cid:durableId="1781337550">
-    <w:abstractNumId w:val="53"/>
+    <w:abstractNumId w:val="54"/>
   </w:num>
   <w:num w:numId="22" w16cid:durableId="173957045">
     <w:abstractNumId w:val="26"/>
   </w:num>
   <w:num w:numId="23" w16cid:durableId="1053696051">
-    <w:abstractNumId w:val="125"/>
+    <w:abstractNumId w:val="130"/>
   </w:num>
   <w:num w:numId="24" w16cid:durableId="1229724906">
-    <w:abstractNumId w:val="65"/>
+    <w:abstractNumId w:val="66"/>
   </w:num>
   <w:num w:numId="25" w16cid:durableId="1105270786">
     <w:abstractNumId w:val="24"/>
   </w:num>
   <w:num w:numId="26" w16cid:durableId="181013303">
-    <w:abstractNumId w:val="57"/>
+    <w:abstractNumId w:val="58"/>
   </w:num>
   <w:num w:numId="27" w16cid:durableId="1005090841">
-    <w:abstractNumId w:val="118"/>
+    <w:abstractNumId w:val="122"/>
   </w:num>
   <w:num w:numId="28" w16cid:durableId="756709327">
-    <w:abstractNumId w:val="88"/>
+    <w:abstractNumId w:val="92"/>
   </w:num>
   <w:num w:numId="29" w16cid:durableId="1175075060">
     <w:abstractNumId w:val="30"/>
   </w:num>
   <w:num w:numId="30" w16cid:durableId="816338617">
-    <w:abstractNumId w:val="100"/>
+    <w:abstractNumId w:val="104"/>
   </w:num>
   <w:num w:numId="31" w16cid:durableId="811018014">
-    <w:abstractNumId w:val="104"/>
+    <w:abstractNumId w:val="108"/>
   </w:num>
   <w:num w:numId="32" w16cid:durableId="2007442846">
     <w:abstractNumId w:val="7"/>
   </w:num>
   <w:num w:numId="33" w16cid:durableId="557594128">
-    <w:abstractNumId w:val="42"/>
+    <w:abstractNumId w:val="43"/>
   </w:num>
   <w:num w:numId="34" w16cid:durableId="2058358458">
-    <w:abstractNumId w:val="130"/>
+    <w:abstractNumId w:val="135"/>
   </w:num>
   <w:num w:numId="35" w16cid:durableId="664430994">
-    <w:abstractNumId w:val="76"/>
+    <w:abstractNumId w:val="80"/>
   </w:num>
   <w:num w:numId="36" w16cid:durableId="1858736738">
-    <w:abstractNumId w:val="121"/>
+    <w:abstractNumId w:val="125"/>
   </w:num>
   <w:num w:numId="37" w16cid:durableId="1793285636">
-    <w:abstractNumId w:val="127"/>
+    <w:abstractNumId w:val="132"/>
   </w:num>
   <w:num w:numId="38" w16cid:durableId="49766020">
-    <w:abstractNumId w:val="141"/>
+    <w:abstractNumId w:val="146"/>
   </w:num>
   <w:num w:numId="39" w16cid:durableId="1444303552">
     <w:abstractNumId w:val="35"/>
   </w:num>
   <w:num w:numId="40" w16cid:durableId="1190021365">
-    <w:abstractNumId w:val="147"/>
+    <w:abstractNumId w:val="152"/>
   </w:num>
   <w:num w:numId="41" w16cid:durableId="624238255">
-    <w:abstractNumId w:val="157"/>
+    <w:abstractNumId w:val="164"/>
   </w:num>
   <w:num w:numId="42" w16cid:durableId="1806924102">
-    <w:abstractNumId w:val="94"/>
+    <w:abstractNumId w:val="98"/>
   </w:num>
   <w:num w:numId="43" w16cid:durableId="1782604561">
-    <w:abstractNumId w:val="117"/>
+    <w:abstractNumId w:val="121"/>
   </w:num>
   <w:num w:numId="44" w16cid:durableId="1816292712">
-    <w:abstractNumId w:val="139"/>
+    <w:abstractNumId w:val="144"/>
   </w:num>
   <w:num w:numId="45" w16cid:durableId="873080635">
-    <w:abstractNumId w:val="109"/>
+    <w:abstractNumId w:val="113"/>
   </w:num>
   <w:num w:numId="46" w16cid:durableId="1561865549">
-    <w:abstractNumId w:val="112"/>
+    <w:abstractNumId w:val="116"/>
   </w:num>
   <w:num w:numId="47" w16cid:durableId="1555769635">
-    <w:abstractNumId w:val="49"/>
+    <w:abstractNumId w:val="50"/>
   </w:num>
   <w:num w:numId="48" w16cid:durableId="1605575889">
-    <w:abstractNumId w:val="158"/>
+    <w:abstractNumId w:val="165"/>
   </w:num>
   <w:num w:numId="49" w16cid:durableId="213855190">
-    <w:abstractNumId w:val="91"/>
+    <w:abstractNumId w:val="95"/>
   </w:num>
   <w:num w:numId="50" w16cid:durableId="69619266">
     <w:abstractNumId w:val="36"/>
   </w:num>
   <w:num w:numId="51" w16cid:durableId="25254510">
-    <w:abstractNumId w:val="41"/>
+    <w:abstractNumId w:val="42"/>
   </w:num>
   <w:num w:numId="52" w16cid:durableId="813301875">
-    <w:abstractNumId w:val="159"/>
+    <w:abstractNumId w:val="166"/>
   </w:num>
   <w:num w:numId="53" w16cid:durableId="349066359">
-    <w:abstractNumId w:val="63"/>
+    <w:abstractNumId w:val="64"/>
   </w:num>
   <w:num w:numId="54" w16cid:durableId="1827240326">
+    <w:abstractNumId w:val="71"/>
+  </w:num>
+  <w:num w:numId="55" w16cid:durableId="1067726837">
+    <w:abstractNumId w:val="143"/>
+  </w:num>
+  <w:num w:numId="56" w16cid:durableId="1145976340">
+    <w:abstractNumId w:val="62"/>
+  </w:num>
+  <w:num w:numId="57" w16cid:durableId="328758546">
+    <w:abstractNumId w:val="57"/>
+  </w:num>
+  <w:num w:numId="58" w16cid:durableId="354310452">
     <w:abstractNumId w:val="69"/>
   </w:num>
-  <w:num w:numId="55" w16cid:durableId="1067726837">
-    <w:abstractNumId w:val="138"/>
-  </w:num>
-  <w:num w:numId="56" w16cid:durableId="1145976340">
-    <w:abstractNumId w:val="61"/>
-  </w:num>
-  <w:num w:numId="57" w16cid:durableId="328758546">
-    <w:abstractNumId w:val="56"/>
-  </w:num>
-  <w:num w:numId="58" w16cid:durableId="354310452">
-    <w:abstractNumId w:val="67"/>
-  </w:num>
   <w:num w:numId="59" w16cid:durableId="1777402173">
-    <w:abstractNumId w:val="111"/>
+    <w:abstractNumId w:val="115"/>
   </w:num>
   <w:num w:numId="60" w16cid:durableId="1878082184">
-    <w:abstractNumId w:val="149"/>
+    <w:abstractNumId w:val="154"/>
   </w:num>
   <w:num w:numId="61" w16cid:durableId="257717478">
     <w:abstractNumId w:val="23"/>
   </w:num>
   <w:num w:numId="62" w16cid:durableId="290208252">
-    <w:abstractNumId w:val="122"/>
+    <w:abstractNumId w:val="126"/>
   </w:num>
   <w:num w:numId="63" w16cid:durableId="921568839">
-    <w:abstractNumId w:val="47"/>
+    <w:abstractNumId w:val="48"/>
   </w:num>
   <w:num w:numId="64" w16cid:durableId="1601639283">
     <w:abstractNumId w:val="15"/>
@@ -53837,73 +56143,73 @@
     <w:abstractNumId w:val="11"/>
   </w:num>
   <w:num w:numId="66" w16cid:durableId="715392561">
-    <w:abstractNumId w:val="82"/>
+    <w:abstractNumId w:val="86"/>
   </w:num>
   <w:num w:numId="67" w16cid:durableId="2056079112">
-    <w:abstractNumId w:val="80"/>
+    <w:abstractNumId w:val="84"/>
   </w:num>
   <w:num w:numId="68" w16cid:durableId="2080126014">
-    <w:abstractNumId w:val="144"/>
+    <w:abstractNumId w:val="149"/>
   </w:num>
   <w:num w:numId="69" w16cid:durableId="1310135776">
-    <w:abstractNumId w:val="51"/>
+    <w:abstractNumId w:val="52"/>
   </w:num>
   <w:num w:numId="70" w16cid:durableId="1028986258">
-    <w:abstractNumId w:val="115"/>
+    <w:abstractNumId w:val="119"/>
   </w:num>
   <w:num w:numId="71" w16cid:durableId="1785491322">
-    <w:abstractNumId w:val="68"/>
+    <w:abstractNumId w:val="70"/>
   </w:num>
   <w:num w:numId="72" w16cid:durableId="230359834">
-    <w:abstractNumId w:val="143"/>
+    <w:abstractNumId w:val="148"/>
   </w:num>
   <w:num w:numId="73" w16cid:durableId="97215562">
     <w:abstractNumId w:val="21"/>
   </w:num>
   <w:num w:numId="74" w16cid:durableId="168567758">
-    <w:abstractNumId w:val="52"/>
+    <w:abstractNumId w:val="53"/>
   </w:num>
   <w:num w:numId="75" w16cid:durableId="130028596">
-    <w:abstractNumId w:val="152"/>
+    <w:abstractNumId w:val="159"/>
   </w:num>
   <w:num w:numId="76" w16cid:durableId="2045401898">
-    <w:abstractNumId w:val="72"/>
+    <w:abstractNumId w:val="75"/>
   </w:num>
   <w:num w:numId="77" w16cid:durableId="1810897170">
-    <w:abstractNumId w:val="79"/>
+    <w:abstractNumId w:val="83"/>
   </w:num>
   <w:num w:numId="78" w16cid:durableId="1994092115">
-    <w:abstractNumId w:val="66"/>
+    <w:abstractNumId w:val="68"/>
   </w:num>
   <w:num w:numId="79" w16cid:durableId="1675691065">
-    <w:abstractNumId w:val="101"/>
+    <w:abstractNumId w:val="105"/>
   </w:num>
   <w:num w:numId="80" w16cid:durableId="1682316995">
-    <w:abstractNumId w:val="55"/>
+    <w:abstractNumId w:val="56"/>
   </w:num>
   <w:num w:numId="81" w16cid:durableId="1522040136">
-    <w:abstractNumId w:val="145"/>
+    <w:abstractNumId w:val="150"/>
   </w:num>
   <w:num w:numId="82" w16cid:durableId="592789119">
-    <w:abstractNumId w:val="60"/>
+    <w:abstractNumId w:val="61"/>
   </w:num>
   <w:num w:numId="83" w16cid:durableId="1100443382">
-    <w:abstractNumId w:val="148"/>
+    <w:abstractNumId w:val="153"/>
   </w:num>
   <w:num w:numId="84" w16cid:durableId="495994496">
-    <w:abstractNumId w:val="113"/>
+    <w:abstractNumId w:val="117"/>
   </w:num>
   <w:num w:numId="85" w16cid:durableId="1548757019">
     <w:abstractNumId w:val="4"/>
   </w:num>
   <w:num w:numId="86" w16cid:durableId="1047218572">
-    <w:abstractNumId w:val="70"/>
+    <w:abstractNumId w:val="73"/>
   </w:num>
   <w:num w:numId="87" w16cid:durableId="735973842">
-    <w:abstractNumId w:val="85"/>
+    <w:abstractNumId w:val="89"/>
   </w:num>
   <w:num w:numId="88" w16cid:durableId="627516981">
-    <w:abstractNumId w:val="40"/>
+    <w:abstractNumId w:val="41"/>
   </w:num>
   <w:num w:numId="89" w16cid:durableId="1932010567">
     <w:abstractNumId w:val="20"/>
@@ -53912,37 +56218,37 @@
     <w:abstractNumId w:val="6"/>
   </w:num>
   <w:num w:numId="91" w16cid:durableId="243686588">
-    <w:abstractNumId w:val="73"/>
+    <w:abstractNumId w:val="76"/>
   </w:num>
   <w:num w:numId="92" w16cid:durableId="1287276980">
-    <w:abstractNumId w:val="89"/>
+    <w:abstractNumId w:val="93"/>
   </w:num>
   <w:num w:numId="93" w16cid:durableId="2051223741">
-    <w:abstractNumId w:val="156"/>
+    <w:abstractNumId w:val="163"/>
   </w:num>
   <w:num w:numId="94" w16cid:durableId="1708751724">
-    <w:abstractNumId w:val="163"/>
+    <w:abstractNumId w:val="170"/>
   </w:num>
   <w:num w:numId="95" w16cid:durableId="2138178102">
-    <w:abstractNumId w:val="43"/>
+    <w:abstractNumId w:val="44"/>
   </w:num>
   <w:num w:numId="96" w16cid:durableId="299188647">
     <w:abstractNumId w:val="37"/>
   </w:num>
   <w:num w:numId="97" w16cid:durableId="951012475">
-    <w:abstractNumId w:val="142"/>
+    <w:abstractNumId w:val="147"/>
   </w:num>
   <w:num w:numId="98" w16cid:durableId="1274361570">
-    <w:abstractNumId w:val="105"/>
+    <w:abstractNumId w:val="109"/>
   </w:num>
   <w:num w:numId="99" w16cid:durableId="1306357555">
-    <w:abstractNumId w:val="78"/>
+    <w:abstractNumId w:val="82"/>
   </w:num>
   <w:num w:numId="100" w16cid:durableId="327290992">
-    <w:abstractNumId w:val="120"/>
+    <w:abstractNumId w:val="124"/>
   </w:num>
   <w:num w:numId="101" w16cid:durableId="1990866381">
-    <w:abstractNumId w:val="119"/>
+    <w:abstractNumId w:val="123"/>
   </w:num>
   <w:num w:numId="102" w16cid:durableId="371266948">
     <w:abstractNumId w:val="18"/>
@@ -53951,70 +56257,70 @@
     <w:abstractNumId w:val="28"/>
   </w:num>
   <w:num w:numId="104" w16cid:durableId="1397819114">
-    <w:abstractNumId w:val="133"/>
+    <w:abstractNumId w:val="138"/>
   </w:num>
   <w:num w:numId="105" w16cid:durableId="1012728081">
-    <w:abstractNumId w:val="134"/>
+    <w:abstractNumId w:val="139"/>
   </w:num>
   <w:num w:numId="106" w16cid:durableId="1036468611">
     <w:abstractNumId w:val="32"/>
   </w:num>
   <w:num w:numId="107" w16cid:durableId="293871772">
-    <w:abstractNumId w:val="108"/>
+    <w:abstractNumId w:val="112"/>
   </w:num>
   <w:num w:numId="108" w16cid:durableId="1766875230">
-    <w:abstractNumId w:val="62"/>
+    <w:abstractNumId w:val="63"/>
   </w:num>
   <w:num w:numId="109" w16cid:durableId="695815868">
     <w:abstractNumId w:val="33"/>
   </w:num>
   <w:num w:numId="110" w16cid:durableId="1980648420">
-    <w:abstractNumId w:val="98"/>
+    <w:abstractNumId w:val="102"/>
   </w:num>
   <w:num w:numId="111" w16cid:durableId="204099977">
-    <w:abstractNumId w:val="107"/>
+    <w:abstractNumId w:val="111"/>
   </w:num>
   <w:num w:numId="112" w16cid:durableId="566377572">
-    <w:abstractNumId w:val="75"/>
+    <w:abstractNumId w:val="79"/>
   </w:num>
   <w:num w:numId="113" w16cid:durableId="845172666">
     <w:abstractNumId w:val="14"/>
   </w:num>
   <w:num w:numId="114" w16cid:durableId="1132092914">
-    <w:abstractNumId w:val="96"/>
+    <w:abstractNumId w:val="100"/>
   </w:num>
   <w:num w:numId="115" w16cid:durableId="683092990">
-    <w:abstractNumId w:val="131"/>
+    <w:abstractNumId w:val="136"/>
   </w:num>
   <w:num w:numId="116" w16cid:durableId="1244877407">
-    <w:abstractNumId w:val="132"/>
+    <w:abstractNumId w:val="137"/>
   </w:num>
   <w:num w:numId="117" w16cid:durableId="726148022">
-    <w:abstractNumId w:val="83"/>
+    <w:abstractNumId w:val="87"/>
   </w:num>
   <w:num w:numId="118" w16cid:durableId="1448769905">
-    <w:abstractNumId w:val="74"/>
+    <w:abstractNumId w:val="77"/>
   </w:num>
   <w:num w:numId="119" w16cid:durableId="1248341273">
-    <w:abstractNumId w:val="95"/>
+    <w:abstractNumId w:val="99"/>
   </w:num>
   <w:num w:numId="120" w16cid:durableId="562370162">
-    <w:abstractNumId w:val="116"/>
+    <w:abstractNumId w:val="120"/>
   </w:num>
   <w:num w:numId="121" w16cid:durableId="160629884">
     <w:abstractNumId w:val="16"/>
   </w:num>
   <w:num w:numId="122" w16cid:durableId="474568737">
-    <w:abstractNumId w:val="48"/>
+    <w:abstractNumId w:val="49"/>
   </w:num>
   <w:num w:numId="123" w16cid:durableId="768964622">
-    <w:abstractNumId w:val="44"/>
+    <w:abstractNumId w:val="45"/>
   </w:num>
   <w:num w:numId="124" w16cid:durableId="1335910887">
-    <w:abstractNumId w:val="161"/>
+    <w:abstractNumId w:val="168"/>
   </w:num>
   <w:num w:numId="125" w16cid:durableId="1905530579">
-    <w:abstractNumId w:val="59"/>
+    <w:abstractNumId w:val="60"/>
   </w:num>
   <w:num w:numId="126" w16cid:durableId="565188705">
     <w:abstractNumId w:val="12"/>
@@ -54023,37 +56329,37 @@
     <w:abstractNumId w:val="8"/>
   </w:num>
   <w:num w:numId="128" w16cid:durableId="1373310907">
-    <w:abstractNumId w:val="81"/>
+    <w:abstractNumId w:val="85"/>
   </w:num>
   <w:num w:numId="129" w16cid:durableId="984776096">
-    <w:abstractNumId w:val="46"/>
+    <w:abstractNumId w:val="47"/>
   </w:num>
   <w:num w:numId="130" w16cid:durableId="1123306180">
-    <w:abstractNumId w:val="151"/>
+    <w:abstractNumId w:val="157"/>
   </w:num>
   <w:num w:numId="131" w16cid:durableId="304550907">
     <w:abstractNumId w:val="3"/>
   </w:num>
   <w:num w:numId="132" w16cid:durableId="855731337">
-    <w:abstractNumId w:val="87"/>
+    <w:abstractNumId w:val="91"/>
   </w:num>
   <w:num w:numId="133" w16cid:durableId="1098528262">
     <w:abstractNumId w:val="17"/>
   </w:num>
   <w:num w:numId="134" w16cid:durableId="1355619462">
-    <w:abstractNumId w:val="110"/>
+    <w:abstractNumId w:val="114"/>
   </w:num>
   <w:num w:numId="135" w16cid:durableId="937908552">
-    <w:abstractNumId w:val="103"/>
+    <w:abstractNumId w:val="107"/>
   </w:num>
   <w:num w:numId="136" w16cid:durableId="1048651440">
-    <w:abstractNumId w:val="126"/>
+    <w:abstractNumId w:val="131"/>
   </w:num>
   <w:num w:numId="137" w16cid:durableId="1625428331">
-    <w:abstractNumId w:val="123"/>
+    <w:abstractNumId w:val="128"/>
   </w:num>
   <w:num w:numId="138" w16cid:durableId="1061559164">
-    <w:abstractNumId w:val="150"/>
+    <w:abstractNumId w:val="156"/>
   </w:num>
   <w:num w:numId="139" w16cid:durableId="1710061249">
     <w:abstractNumId w:val="25"/>
@@ -54065,76 +56371,97 @@
     <w:abstractNumId w:val="0"/>
   </w:num>
   <w:num w:numId="142" w16cid:durableId="1841459746">
-    <w:abstractNumId w:val="90"/>
+    <w:abstractNumId w:val="94"/>
   </w:num>
   <w:num w:numId="143" w16cid:durableId="952327285">
-    <w:abstractNumId w:val="93"/>
+    <w:abstractNumId w:val="97"/>
   </w:num>
   <w:num w:numId="144" w16cid:durableId="1686399214">
-    <w:abstractNumId w:val="102"/>
+    <w:abstractNumId w:val="106"/>
   </w:num>
   <w:num w:numId="145" w16cid:durableId="437409285">
-    <w:abstractNumId w:val="50"/>
+    <w:abstractNumId w:val="51"/>
   </w:num>
   <w:num w:numId="146" w16cid:durableId="2056654596">
-    <w:abstractNumId w:val="164"/>
+    <w:abstractNumId w:val="171"/>
   </w:num>
   <w:num w:numId="147" w16cid:durableId="21365038">
-    <w:abstractNumId w:val="92"/>
+    <w:abstractNumId w:val="96"/>
   </w:num>
   <w:num w:numId="148" w16cid:durableId="863711799">
-    <w:abstractNumId w:val="146"/>
+    <w:abstractNumId w:val="151"/>
   </w:num>
   <w:num w:numId="149" w16cid:durableId="398553183">
-    <w:abstractNumId w:val="153"/>
+    <w:abstractNumId w:val="160"/>
   </w:num>
   <w:num w:numId="150" w16cid:durableId="565261923">
-    <w:abstractNumId w:val="77"/>
+    <w:abstractNumId w:val="81"/>
   </w:num>
   <w:num w:numId="151" w16cid:durableId="1868058141">
-    <w:abstractNumId w:val="71"/>
+    <w:abstractNumId w:val="74"/>
   </w:num>
   <w:num w:numId="152" w16cid:durableId="1211527827">
     <w:abstractNumId w:val="2"/>
   </w:num>
   <w:num w:numId="153" w16cid:durableId="1070427344">
-    <w:abstractNumId w:val="58"/>
+    <w:abstractNumId w:val="59"/>
   </w:num>
   <w:num w:numId="154" w16cid:durableId="275450133">
     <w:abstractNumId w:val="19"/>
   </w:num>
   <w:num w:numId="155" w16cid:durableId="1026760595">
-    <w:abstractNumId w:val="38"/>
+    <w:abstractNumId w:val="39"/>
   </w:num>
   <w:num w:numId="156" w16cid:durableId="1652371550">
-    <w:abstractNumId w:val="162"/>
+    <w:abstractNumId w:val="169"/>
   </w:num>
   <w:num w:numId="157" w16cid:durableId="1831288666">
-    <w:abstractNumId w:val="114"/>
+    <w:abstractNumId w:val="118"/>
   </w:num>
   <w:num w:numId="158" w16cid:durableId="1237008956">
     <w:abstractNumId w:val="29"/>
   </w:num>
   <w:num w:numId="159" w16cid:durableId="1828285610">
-    <w:abstractNumId w:val="64"/>
+    <w:abstractNumId w:val="65"/>
   </w:num>
   <w:num w:numId="160" w16cid:durableId="981689433">
-    <w:abstractNumId w:val="54"/>
+    <w:abstractNumId w:val="55"/>
   </w:num>
   <w:num w:numId="161" w16cid:durableId="645089159">
-    <w:abstractNumId w:val="155"/>
+    <w:abstractNumId w:val="162"/>
   </w:num>
   <w:num w:numId="162" w16cid:durableId="626200997">
-    <w:abstractNumId w:val="84"/>
+    <w:abstractNumId w:val="88"/>
   </w:num>
   <w:num w:numId="163" w16cid:durableId="621231093">
     <w:abstractNumId w:val="9"/>
   </w:num>
   <w:num w:numId="164" w16cid:durableId="433477575">
-    <w:abstractNumId w:val="129"/>
+    <w:abstractNumId w:val="134"/>
   </w:num>
   <w:num w:numId="165" w16cid:durableId="1492285050">
-    <w:abstractNumId w:val="45"/>
+    <w:abstractNumId w:val="46"/>
+  </w:num>
+  <w:num w:numId="166" w16cid:durableId="1135299126">
+    <w:abstractNumId w:val="72"/>
+  </w:num>
+  <w:num w:numId="167" w16cid:durableId="998270306">
+    <w:abstractNumId w:val="78"/>
+  </w:num>
+  <w:num w:numId="168" w16cid:durableId="549418703">
+    <w:abstractNumId w:val="67"/>
+  </w:num>
+  <w:num w:numId="169" w16cid:durableId="906381349">
+    <w:abstractNumId w:val="38"/>
+  </w:num>
+  <w:num w:numId="170" w16cid:durableId="35587546">
+    <w:abstractNumId w:val="155"/>
+  </w:num>
+  <w:num w:numId="171" w16cid:durableId="243612814">
+    <w:abstractNumId w:val="158"/>
+  </w:num>
+  <w:num w:numId="172" w16cid:durableId="132336114">
+    <w:abstractNumId w:val="127"/>
   </w:num>
   <w:numIdMacAtCleanup w:val="103"/>
 </w:numbering>
@@ -54917,7 +57244,7 @@
     <w:basedOn w:val="Normal"/>
     <w:autoRedefine/>
     <w:qFormat/>
-    <w:rsid w:val="00240B19"/>
+    <w:rsid w:val="00CA63CB"/>
     <w:pPr>
       <w:tabs>
         <w:tab w:val="left" w:leader="dot" w:pos="916"/>
@@ -54944,6 +57271,7 @@
       <w:rFonts w:ascii="Courier New" w:eastAsiaTheme="majorEastAsia" w:hAnsi="Courier New" w:cs="Courier New"/>
       <w:b/>
       <w:color w:val="00B050"/>
+      <w:sz w:val="20"/>
       <w:szCs w:val="20"/>
     </w:rPr>
   </w:style>

</xml_diff>